<commit_message>
Teatro alla Scala questionnaire: country lists, government factor, English labels
- Country dropdowns read from the portal video: EU member state (26),
  group registered-office country (34), delegated company's country (34).
- Government bond selection: the second factor's list is now recognised
  (its title had a space after the dash); all three factors have 19 options.
- Every option label translated to English; header question has no field.
- Verification notes updated with video timings and what remains to check.

Claude-Session: https://claude.ai/code/session_01Kh4RWNEbM9iRNhAaBfutke
</commit_message>
<xml_diff>
--- a/Questionnaire_Teatro_alla_Scala_EN.docx
+++ b/Questionnaire_Teatro_alla_Scala_EN.docx
@@ -253,38 +253,6 @@
     </w:p>
     <w:p>
       <w:pPr>
-        <w:keepNext/>
-        <w:spacing w:before="0" w:after="40"/>
-      </w:pPr>
-      <w:r>
-        <w:rPr>
-          <w:rFonts w:ascii="Arial" w:hAnsi="Arial" w:cs="Arial" w:eastAsia="Arial"/>
-          <w:b w:val="0"/>
-          <w:i/>
-          <w:color w:val="595959"/>
-          <w:sz w:val="18"/>
-        </w:rPr>
-        <w:t>France</w:t>
-      </w:r>
-    </w:p>
-    <w:p>
-      <w:pPr>
-        <w:keepNext/>
-        <w:spacing w:before="0" w:after="40"/>
-      </w:pPr>
-      <w:r>
-        <w:rPr>
-          <w:rFonts w:ascii="Arial" w:hAnsi="Arial" w:cs="Arial" w:eastAsia="Arial"/>
-          <w:b w:val="0"/>
-          <w:i/>
-          <w:color w:val="595959"/>
-          <w:sz w:val="18"/>
-        </w:rPr>
-        <w:t>Options not visible in the video: complete from the portal list.</w:t>
-      </w:r>
-    </w:p>
-    <w:p>
-      <w:pPr>
         <w:keepNext w:val="0"/>
         <w:spacing w:before="40" w:after="120"/>
         <w:shd w:val="clear" w:color="auto" w:fill="F2F2F2"/>
@@ -296,6 +264,32 @@
           <w:showingPlcHdr/>
           <w:dropDownList>
             <w:listItem w:displayText="Choose an item." w:value=""/>
+            <w:listItem w:displayText="Austria" w:value="Austria"/>
+            <w:listItem w:displayText="Belgium" w:value="Belgium"/>
+            <w:listItem w:displayText="Cyprus" w:value="Cyprus"/>
+            <w:listItem w:displayText="Denmark" w:value="Denmark"/>
+            <w:listItem w:displayText="Estonia" w:value="Estonia"/>
+            <w:listItem w:displayText="Finland" w:value="Finland"/>
+            <w:listItem w:displayText="France" w:value="France"/>
+            <w:listItem w:displayText="Germany" w:value="Germany"/>
+            <w:listItem w:displayText="Greece" w:value="Greece"/>
+            <w:listItem w:displayText="Ireland" w:value="Ireland"/>
+            <w:listItem w:displayText="Italy" w:value="Italy"/>
+            <w:listItem w:displayText="Latvia" w:value="Latvia"/>
+            <w:listItem w:displayText="Lithuania" w:value="Lithuania"/>
+            <w:listItem w:displayText="Luxembourg" w:value="Luxembourg"/>
+            <w:listItem w:displayText="Malta" w:value="Malta"/>
+            <w:listItem w:displayText="Netherlands" w:value="Netherlands"/>
+            <w:listItem w:displayText="Poland" w:value="Poland"/>
+            <w:listItem w:displayText="Portugal" w:value="Portugal"/>
+            <w:listItem w:displayText="United Kingdom" w:value="United Kingdom"/>
+            <w:listItem w:displayText="Czech Republic" w:value="Czech Republic"/>
+            <w:listItem w:displayText="Slovakia" w:value="Slovakia"/>
+            <w:listItem w:displayText="Slovenia" w:value="Slovenia"/>
+            <w:listItem w:displayText="Spain" w:value="Spain"/>
+            <w:listItem w:displayText="Sweden" w:value="Sweden"/>
+            <w:listItem w:displayText="Hungary" w:value="Hungary"/>
+            <w:listItem w:displayText="Other EU country" w:value="Other EU country"/>
           </w:dropDownList>
         </w:sdtPr>
         <w:sdtContent>
@@ -1143,6 +1137,88 @@
     </w:p>
     <w:p>
       <w:pPr>
+        <w:keepNext w:val="0"/>
+        <w:spacing w:before="40" w:after="120"/>
+        <w:shd w:val="clear" w:color="auto" w:fill="F2F2F2"/>
+      </w:pPr>
+      <w:sdt>
+        <w:sdtPr>
+          <w:alias w:val="082GEA1250635"/>
+          <w:id w:val="100017"/>
+          <w:showingPlcHdr/>
+          <w:dropDownList>
+            <w:listItem w:displayText="Choose an item." w:value=""/>
+            <w:listItem w:displayText="Australia" w:value="Australia"/>
+            <w:listItem w:displayText="Austria" w:value="Austria"/>
+            <w:listItem w:displayText="Belgium" w:value="Belgium"/>
+            <w:listItem w:displayText="Canada" w:value="Canada"/>
+            <w:listItem w:displayText="Cyprus" w:value="Cyprus"/>
+            <w:listItem w:displayText="Denmark" w:value="Denmark"/>
+            <w:listItem w:displayText="Estonia" w:value="Estonia"/>
+            <w:listItem w:displayText="Finland" w:value="Finland"/>
+            <w:listItem w:displayText="France" w:value="France"/>
+            <w:listItem w:displayText="Germany" w:value="Germany"/>
+            <w:listItem w:displayText="Japan" w:value="Japan"/>
+            <w:listItem w:displayText="Greece" w:value="Greece"/>
+            <w:listItem w:displayText="Ireland" w:value="Ireland"/>
+            <w:listItem w:displayText="Iceland" w:value="Iceland"/>
+            <w:listItem w:displayText="Italy" w:value="Italy"/>
+            <w:listItem w:displayText="Latvia" w:value="Latvia"/>
+            <w:listItem w:displayText="Liechtenstein" w:value="Liechtenstein"/>
+            <w:listItem w:displayText="Lithuania" w:value="Lithuania"/>
+            <w:listItem w:displayText="Luxembourg" w:value="Luxembourg"/>
+            <w:listItem w:displayText="Malta" w:value="Malta"/>
+            <w:listItem w:displayText="Norway" w:value="Norway"/>
+            <w:listItem w:displayText="Netherlands" w:value="Netherlands"/>
+            <w:listItem w:displayText="Poland" w:value="Poland"/>
+            <w:listItem w:displayText="Portugal" w:value="Portugal"/>
+            <w:listItem w:displayText="United Kingdom" w:value="United Kingdom"/>
+            <w:listItem w:displayText="Czech Republic" w:value="Czech Republic"/>
+            <w:listItem w:displayText="Slovakia" w:value="Slovakia"/>
+            <w:listItem w:displayText="Slovenia" w:value="Slovenia"/>
+            <w:listItem w:displayText="Spain" w:value="Spain"/>
+            <w:listItem w:displayText="United States" w:value="United States"/>
+            <w:listItem w:displayText="Sweden" w:value="Sweden"/>
+            <w:listItem w:displayText="Switzerland" w:value="Switzerland"/>
+            <w:listItem w:displayText="Hungary" w:value="Hungary"/>
+            <w:listItem w:displayText="Other country" w:value="Other country"/>
+          </w:dropDownList>
+        </w:sdtPr>
+        <w:sdtContent>
+          <w:r>
+            <w:t>Choose an item.</w:t>
+          </w:r>
+        </w:sdtContent>
+      </w:sdt>
+    </w:p>
+    <w:p>
+      <w:pPr>
+        <w:keepNext/>
+        <w:spacing w:before="200" w:after="40"/>
+      </w:pPr>
+      <w:r>
+        <w:rPr>
+          <w:rFonts w:ascii="Arial" w:hAnsi="Arial" w:cs="Arial" w:eastAsia="Arial"/>
+          <w:b/>
+          <w:i w:val="0"/>
+          <w:color w:val="000000"/>
+          <w:sz w:val="20"/>
+        </w:rPr>
+        <w:t xml:space="preserve">Provide details of the breakdown of the business areas of the group to which the company belongs, with reference to financial and insurance activities. </w:t>
+      </w:r>
+      <w:r>
+        <w:rPr>
+          <w:rFonts w:ascii="Arial" w:hAnsi="Arial" w:cs="Arial" w:eastAsia="Arial"/>
+          <w:b/>
+          <w:i w:val="0"/>
+          <w:color w:val="1C355E"/>
+          <w:sz w:val="17"/>
+        </w:rPr>
+        <w:t>-082GEA1250636-</w:t>
+      </w:r>
+    </w:p>
+    <w:p>
+      <w:pPr>
         <w:keepNext/>
         <w:spacing w:before="0" w:after="40"/>
       </w:pPr>
@@ -1154,55 +1230,7 @@
           <w:color w:val="595959"/>
           <w:sz w:val="18"/>
         </w:rPr>
-        <w:t>Options not visible in the video: complete from the portal list.</w:t>
-      </w:r>
-    </w:p>
-    <w:p>
-      <w:pPr>
-        <w:keepNext w:val="0"/>
-        <w:spacing w:before="40" w:after="120"/>
-        <w:shd w:val="clear" w:color="auto" w:fill="F2F2F2"/>
-      </w:pPr>
-      <w:sdt>
-        <w:sdtPr>
-          <w:alias w:val="082GEA1250635"/>
-          <w:id w:val="100017"/>
-          <w:showingPlcHdr/>
-          <w:dropDownList>
-            <w:listItem w:displayText="Choose an item." w:value=""/>
-          </w:dropDownList>
-        </w:sdtPr>
-        <w:sdtContent>
-          <w:r>
-            <w:t>Choose an item.</w:t>
-          </w:r>
-        </w:sdtContent>
-      </w:sdt>
-    </w:p>
-    <w:p>
-      <w:pPr>
-        <w:keepNext/>
-        <w:spacing w:before="200" w:after="40"/>
-      </w:pPr>
-      <w:r>
-        <w:rPr>
-          <w:rFonts w:ascii="Arial" w:hAnsi="Arial" w:cs="Arial" w:eastAsia="Arial"/>
-          <w:b/>
-          <w:i w:val="0"/>
-          <w:color w:val="000000"/>
-          <w:sz w:val="20"/>
-        </w:rPr>
-        <w:t xml:space="preserve">Provide details of the breakdown of the business areas of the group to which the company belongs, with reference to financial and insurance activities. </w:t>
-      </w:r>
-      <w:r>
-        <w:rPr>
-          <w:rFonts w:ascii="Arial" w:hAnsi="Arial" w:cs="Arial" w:eastAsia="Arial"/>
-          <w:b/>
-          <w:i w:val="0"/>
-          <w:color w:val="1C355E"/>
-          <w:sz w:val="17"/>
-        </w:rPr>
-        <w:t>-082GEA1250636-</w:t>
+        <w:t>For each business area, state its percentage share of total revenue. If the candidate company does not belong to a group, the data must relate to the company itself.</w:t>
       </w:r>
     </w:p>
     <w:p>
@@ -1218,7 +1246,53 @@
           <w:color w:val="595959"/>
           <w:sz w:val="18"/>
         </w:rPr>
-        <w:t>For each business area, state its percentage share of total revenue. If the candidate company does not belong to a group, the data must relate to the company itself.</w:t>
+        <w:t>Important: Pay attention to the numerical value entered in the field. The value MUST be entered in the format X,XX% to enable automatic data processing. The total of the values entered must equal 100%.</w:t>
+      </w:r>
+    </w:p>
+    <w:p>
+      <w:pPr>
+        <w:keepNext w:val="0"/>
+        <w:spacing w:before="40" w:after="120"/>
+        <w:shd w:val="clear" w:color="auto" w:fill="F2F2F2"/>
+      </w:pPr>
+      <w:sdt>
+        <w:sdtPr>
+          <w:alias w:val="082GEA1250636"/>
+          <w:id w:val="100018"/>
+          <w:showingPlcHdr/>
+          <w:text/>
+        </w:sdtPr>
+        <w:sdtContent>
+          <w:r>
+            <w:t>Click or tap here to enter text.</w:t>
+          </w:r>
+        </w:sdtContent>
+      </w:sdt>
+    </w:p>
+    <w:p>
+      <w:pPr>
+        <w:keepNext/>
+        <w:spacing w:before="200" w:after="40"/>
+      </w:pPr>
+      <w:r>
+        <w:rPr>
+          <w:rFonts w:ascii="Arial" w:hAnsi="Arial" w:cs="Arial" w:eastAsia="Arial"/>
+          <w:b/>
+          <w:i w:val="0"/>
+          <w:color w:val="000000"/>
+          <w:sz w:val="20"/>
+        </w:rPr>
+        <w:t xml:space="preserve">- Business areas - Asset management </w:t>
+      </w:r>
+      <w:r>
+        <w:rPr>
+          <w:rFonts w:ascii="Arial" w:hAnsi="Arial" w:cs="Arial" w:eastAsia="Arial"/>
+          <w:b/>
+          <w:i w:val="0"/>
+          <w:color w:val="1C355E"/>
+          <w:sz w:val="17"/>
+        </w:rPr>
+        <w:t>-082GEA1250637-</w:t>
       </w:r>
     </w:p>
     <w:p>
@@ -1234,53 +1308,53 @@
           <w:color w:val="595959"/>
           <w:sz w:val="18"/>
         </w:rPr>
-        <w:t>Important: Pay attention to the numerical value entered in the field. The value MUST be entered in the format X,XX% to enable automatic data processing. The total of the values entered must equal 100%.</w:t>
-      </w:r>
-    </w:p>
-    <w:p>
-      <w:pPr>
-        <w:keepNext w:val="0"/>
-        <w:spacing w:before="40" w:after="120"/>
-        <w:shd w:val="clear" w:color="auto" w:fill="F2F2F2"/>
-      </w:pPr>
-      <w:sdt>
-        <w:sdtPr>
-          <w:alias w:val="082GEA1250636"/>
-          <w:id w:val="100018"/>
-          <w:showingPlcHdr/>
-          <w:text/>
-        </w:sdtPr>
-        <w:sdtContent>
-          <w:r>
-            <w:t>Click or tap here to enter text.</w:t>
-          </w:r>
-        </w:sdtContent>
-      </w:sdt>
-    </w:p>
-    <w:p>
-      <w:pPr>
-        <w:keepNext/>
-        <w:spacing w:before="200" w:after="40"/>
-      </w:pPr>
-      <w:r>
-        <w:rPr>
-          <w:rFonts w:ascii="Arial" w:hAnsi="Arial" w:cs="Arial" w:eastAsia="Arial"/>
-          <w:b/>
-          <w:i w:val="0"/>
-          <w:color w:val="000000"/>
-          <w:sz w:val="20"/>
-        </w:rPr>
-        <w:t xml:space="preserve">- Business areas - Asset management </w:t>
-      </w:r>
-      <w:r>
-        <w:rPr>
-          <w:rFonts w:ascii="Arial" w:hAnsi="Arial" w:cs="Arial" w:eastAsia="Arial"/>
-          <w:b/>
-          <w:i w:val="0"/>
-          <w:color w:val="1C355E"/>
-          <w:sz w:val="17"/>
-        </w:rPr>
-        <w:t>-082GEA1250637-</w:t>
+        <w:t>% 2 decimal places</w:t>
+      </w:r>
+    </w:p>
+    <w:p>
+      <w:pPr>
+        <w:keepNext w:val="0"/>
+        <w:spacing w:before="40" w:after="120"/>
+        <w:shd w:val="clear" w:color="auto" w:fill="F2F2F2"/>
+      </w:pPr>
+      <w:sdt>
+        <w:sdtPr>
+          <w:alias w:val="082GEA1250637"/>
+          <w:id w:val="100019"/>
+          <w:showingPlcHdr/>
+          <w:text/>
+        </w:sdtPr>
+        <w:sdtContent>
+          <w:r>
+            <w:t>Click or tap here to enter text.</w:t>
+          </w:r>
+        </w:sdtContent>
+      </w:sdt>
+    </w:p>
+    <w:p>
+      <w:pPr>
+        <w:keepNext/>
+        <w:spacing w:before="200" w:after="40"/>
+      </w:pPr>
+      <w:r>
+        <w:rPr>
+          <w:rFonts w:ascii="Arial" w:hAnsi="Arial" w:cs="Arial" w:eastAsia="Arial"/>
+          <w:b/>
+          <w:i w:val="0"/>
+          <w:color w:val="000000"/>
+          <w:sz w:val="20"/>
+        </w:rPr>
+        <w:t xml:space="preserve">- Business areas - Traditional banking </w:t>
+      </w:r>
+      <w:r>
+        <w:rPr>
+          <w:rFonts w:ascii="Arial" w:hAnsi="Arial" w:cs="Arial" w:eastAsia="Arial"/>
+          <w:b/>
+          <w:i w:val="0"/>
+          <w:color w:val="1C355E"/>
+          <w:sz w:val="17"/>
+        </w:rPr>
+        <w:t>-082GEA1250638-</w:t>
       </w:r>
     </w:p>
     <w:p>
@@ -1307,42 +1381,42 @@
       </w:pPr>
       <w:sdt>
         <w:sdtPr>
-          <w:alias w:val="082GEA1250637"/>
-          <w:id w:val="100019"/>
-          <w:showingPlcHdr/>
-          <w:text/>
-        </w:sdtPr>
-        <w:sdtContent>
-          <w:r>
-            <w:t>Click or tap here to enter text.</w:t>
-          </w:r>
-        </w:sdtContent>
-      </w:sdt>
-    </w:p>
-    <w:p>
-      <w:pPr>
-        <w:keepNext/>
-        <w:spacing w:before="200" w:after="40"/>
-      </w:pPr>
-      <w:r>
-        <w:rPr>
-          <w:rFonts w:ascii="Arial" w:hAnsi="Arial" w:cs="Arial" w:eastAsia="Arial"/>
-          <w:b/>
-          <w:i w:val="0"/>
-          <w:color w:val="000000"/>
-          <w:sz w:val="20"/>
-        </w:rPr>
-        <w:t xml:space="preserve">- Business areas - Traditional banking </w:t>
-      </w:r>
-      <w:r>
-        <w:rPr>
-          <w:rFonts w:ascii="Arial" w:hAnsi="Arial" w:cs="Arial" w:eastAsia="Arial"/>
-          <w:b/>
-          <w:i w:val="0"/>
-          <w:color w:val="1C355E"/>
-          <w:sz w:val="17"/>
-        </w:rPr>
-        <w:t>-082GEA1250638-</w:t>
+          <w:alias w:val="082GEA1250638"/>
+          <w:id w:val="100020"/>
+          <w:showingPlcHdr/>
+          <w:text/>
+        </w:sdtPr>
+        <w:sdtContent>
+          <w:r>
+            <w:t>Click or tap here to enter text.</w:t>
+          </w:r>
+        </w:sdtContent>
+      </w:sdt>
+    </w:p>
+    <w:p>
+      <w:pPr>
+        <w:keepNext/>
+        <w:spacing w:before="200" w:after="40"/>
+      </w:pPr>
+      <w:r>
+        <w:rPr>
+          <w:rFonts w:ascii="Arial" w:hAnsi="Arial" w:cs="Arial" w:eastAsia="Arial"/>
+          <w:b/>
+          <w:i w:val="0"/>
+          <w:color w:val="000000"/>
+          <w:sz w:val="20"/>
+        </w:rPr>
+        <w:t xml:space="preserve">- Business areas - Investment Banking </w:t>
+      </w:r>
+      <w:r>
+        <w:rPr>
+          <w:rFonts w:ascii="Arial" w:hAnsi="Arial" w:cs="Arial" w:eastAsia="Arial"/>
+          <w:b/>
+          <w:i w:val="0"/>
+          <w:color w:val="1C355E"/>
+          <w:sz w:val="17"/>
+        </w:rPr>
+        <w:t>-082GEA1250639-</w:t>
       </w:r>
     </w:p>
     <w:p>
@@ -1369,42 +1443,42 @@
       </w:pPr>
       <w:sdt>
         <w:sdtPr>
-          <w:alias w:val="082GEA1250638"/>
-          <w:id w:val="100020"/>
-          <w:showingPlcHdr/>
-          <w:text/>
-        </w:sdtPr>
-        <w:sdtContent>
-          <w:r>
-            <w:t>Click or tap here to enter text.</w:t>
-          </w:r>
-        </w:sdtContent>
-      </w:sdt>
-    </w:p>
-    <w:p>
-      <w:pPr>
-        <w:keepNext/>
-        <w:spacing w:before="200" w:after="40"/>
-      </w:pPr>
-      <w:r>
-        <w:rPr>
-          <w:rFonts w:ascii="Arial" w:hAnsi="Arial" w:cs="Arial" w:eastAsia="Arial"/>
-          <w:b/>
-          <w:i w:val="0"/>
-          <w:color w:val="000000"/>
-          <w:sz w:val="20"/>
-        </w:rPr>
-        <w:t xml:space="preserve">- Business areas - Investment Banking </w:t>
-      </w:r>
-      <w:r>
-        <w:rPr>
-          <w:rFonts w:ascii="Arial" w:hAnsi="Arial" w:cs="Arial" w:eastAsia="Arial"/>
-          <w:b/>
-          <w:i w:val="0"/>
-          <w:color w:val="1C355E"/>
-          <w:sz w:val="17"/>
-        </w:rPr>
-        <w:t>-082GEA1250639-</w:t>
+          <w:alias w:val="082GEA1250639"/>
+          <w:id w:val="100021"/>
+          <w:showingPlcHdr/>
+          <w:text/>
+        </w:sdtPr>
+        <w:sdtContent>
+          <w:r>
+            <w:t>Click or tap here to enter text.</w:t>
+          </w:r>
+        </w:sdtContent>
+      </w:sdt>
+    </w:p>
+    <w:p>
+      <w:pPr>
+        <w:keepNext/>
+        <w:spacing w:before="200" w:after="40"/>
+      </w:pPr>
+      <w:r>
+        <w:rPr>
+          <w:rFonts w:ascii="Arial" w:hAnsi="Arial" w:cs="Arial" w:eastAsia="Arial"/>
+          <w:b/>
+          <w:i w:val="0"/>
+          <w:color w:val="000000"/>
+          <w:sz w:val="20"/>
+        </w:rPr>
+        <w:t xml:space="preserve">- Business areas - Insurance </w:t>
+      </w:r>
+      <w:r>
+        <w:rPr>
+          <w:rFonts w:ascii="Arial" w:hAnsi="Arial" w:cs="Arial" w:eastAsia="Arial"/>
+          <w:b/>
+          <w:i w:val="0"/>
+          <w:color w:val="1C355E"/>
+          <w:sz w:val="17"/>
+        </w:rPr>
+        <w:t>-082GEA1250640-</w:t>
       </w:r>
     </w:p>
     <w:p>
@@ -1431,42 +1505,42 @@
       </w:pPr>
       <w:sdt>
         <w:sdtPr>
-          <w:alias w:val="082GEA1250639"/>
-          <w:id w:val="100021"/>
-          <w:showingPlcHdr/>
-          <w:text/>
-        </w:sdtPr>
-        <w:sdtContent>
-          <w:r>
-            <w:t>Click or tap here to enter text.</w:t>
-          </w:r>
-        </w:sdtContent>
-      </w:sdt>
-    </w:p>
-    <w:p>
-      <w:pPr>
-        <w:keepNext/>
-        <w:spacing w:before="200" w:after="40"/>
-      </w:pPr>
-      <w:r>
-        <w:rPr>
-          <w:rFonts w:ascii="Arial" w:hAnsi="Arial" w:cs="Arial" w:eastAsia="Arial"/>
-          <w:b/>
-          <w:i w:val="0"/>
-          <w:color w:val="000000"/>
-          <w:sz w:val="20"/>
-        </w:rPr>
-        <w:t xml:space="preserve">- Business areas - Insurance </w:t>
-      </w:r>
-      <w:r>
-        <w:rPr>
-          <w:rFonts w:ascii="Arial" w:hAnsi="Arial" w:cs="Arial" w:eastAsia="Arial"/>
-          <w:b/>
-          <w:i w:val="0"/>
-          <w:color w:val="1C355E"/>
-          <w:sz w:val="17"/>
-        </w:rPr>
-        <w:t>-082GEA1250640-</w:t>
+          <w:alias w:val="082GEA1250640"/>
+          <w:id w:val="100022"/>
+          <w:showingPlcHdr/>
+          <w:text/>
+        </w:sdtPr>
+        <w:sdtContent>
+          <w:r>
+            <w:t>Click or tap here to enter text.</w:t>
+          </w:r>
+        </w:sdtContent>
+      </w:sdt>
+    </w:p>
+    <w:p>
+      <w:pPr>
+        <w:keepNext/>
+        <w:spacing w:before="200" w:after="40"/>
+      </w:pPr>
+      <w:r>
+        <w:rPr>
+          <w:rFonts w:ascii="Arial" w:hAnsi="Arial" w:cs="Arial" w:eastAsia="Arial"/>
+          <w:b/>
+          <w:i w:val="0"/>
+          <w:color w:val="000000"/>
+          <w:sz w:val="20"/>
+        </w:rPr>
+        <w:t xml:space="preserve">- Business areas - Other </w:t>
+      </w:r>
+      <w:r>
+        <w:rPr>
+          <w:rFonts w:ascii="Arial" w:hAnsi="Arial" w:cs="Arial" w:eastAsia="Arial"/>
+          <w:b/>
+          <w:i w:val="0"/>
+          <w:color w:val="1C355E"/>
+          <w:sz w:val="17"/>
+        </w:rPr>
+        <w:t>-082GEA1250641-</w:t>
       </w:r>
     </w:p>
     <w:p>
@@ -1482,53 +1556,7 @@
           <w:color w:val="595959"/>
           <w:sz w:val="18"/>
         </w:rPr>
-        <w:t>% 2 decimal places</w:t>
-      </w:r>
-    </w:p>
-    <w:p>
-      <w:pPr>
-        <w:keepNext w:val="0"/>
-        <w:spacing w:before="40" w:after="120"/>
-        <w:shd w:val="clear" w:color="auto" w:fill="F2F2F2"/>
-      </w:pPr>
-      <w:sdt>
-        <w:sdtPr>
-          <w:alias w:val="082GEA1250640"/>
-          <w:id w:val="100022"/>
-          <w:showingPlcHdr/>
-          <w:text/>
-        </w:sdtPr>
-        <w:sdtContent>
-          <w:r>
-            <w:t>Click or tap here to enter text.</w:t>
-          </w:r>
-        </w:sdtContent>
-      </w:sdt>
-    </w:p>
-    <w:p>
-      <w:pPr>
-        <w:keepNext/>
-        <w:spacing w:before="200" w:after="40"/>
-      </w:pPr>
-      <w:r>
-        <w:rPr>
-          <w:rFonts w:ascii="Arial" w:hAnsi="Arial" w:cs="Arial" w:eastAsia="Arial"/>
-          <w:b/>
-          <w:i w:val="0"/>
-          <w:color w:val="000000"/>
-          <w:sz w:val="20"/>
-        </w:rPr>
-        <w:t xml:space="preserve">- Business areas - Other </w:t>
-      </w:r>
-      <w:r>
-        <w:rPr>
-          <w:rFonts w:ascii="Arial" w:hAnsi="Arial" w:cs="Arial" w:eastAsia="Arial"/>
-          <w:b/>
-          <w:i w:val="0"/>
-          <w:color w:val="1C355E"/>
-          <w:sz w:val="17"/>
-        </w:rPr>
-        <w:t>-082GEA1250641-</w:t>
+        <w:t>This category includes, for example, depositary activities.</w:t>
       </w:r>
     </w:p>
     <w:p>
@@ -1544,13 +1572,49 @@
           <w:color w:val="595959"/>
           <w:sz w:val="18"/>
         </w:rPr>
-        <w:t>This category includes, for example, depositary activities.</w:t>
-      </w:r>
-    </w:p>
-    <w:p>
-      <w:pPr>
-        <w:keepNext/>
-        <w:spacing w:before="0" w:after="40"/>
+        <w:t>% 2 decimal places</w:t>
+      </w:r>
+    </w:p>
+    <w:p>
+      <w:pPr>
+        <w:keepNext w:val="0"/>
+        <w:spacing w:before="40" w:after="120"/>
+        <w:shd w:val="clear" w:color="auto" w:fill="F2F2F2"/>
+      </w:pPr>
+      <w:sdt>
+        <w:sdtPr>
+          <w:alias w:val="082GEA1250641"/>
+          <w:id w:val="100023"/>
+          <w:showingPlcHdr/>
+          <w:text/>
+        </w:sdtPr>
+        <w:sdtContent>
+          <w:r>
+            <w:t>Click or tap here to enter text.</w:t>
+          </w:r>
+        </w:sdtContent>
+      </w:sdt>
+    </w:p>
+    <w:p>
+      <w:pPr>
+        <w:keepNext/>
+        <w:spacing w:before="240" w:after="80"/>
+      </w:pPr>
+      <w:r>
+        <w:rPr>
+          <w:rFonts w:ascii="Arial" w:hAnsi="Arial" w:cs="Arial" w:eastAsia="Arial"/>
+          <w:b/>
+          <w:i w:val="0"/>
+          <w:color w:val="1C355E"/>
+          <w:sz w:val="21"/>
+        </w:rPr>
+        <w:t>6. Ownership structure</w:t>
+      </w:r>
+    </w:p>
+    <w:p>
+      <w:pPr>
+        <w:keepNext w:val="0"/>
+        <w:spacing w:before="40" w:after="80"/>
       </w:pPr>
       <w:r>
         <w:rPr>
@@ -1560,43 +1624,7 @@
           <w:color w:val="595959"/>
           <w:sz w:val="18"/>
         </w:rPr>
-        <w:t>% 2 decimal places</w:t>
-      </w:r>
-    </w:p>
-    <w:p>
-      <w:pPr>
-        <w:keepNext w:val="0"/>
-        <w:spacing w:before="40" w:after="120"/>
-        <w:shd w:val="clear" w:color="auto" w:fill="F2F2F2"/>
-      </w:pPr>
-      <w:sdt>
-        <w:sdtPr>
-          <w:alias w:val="082GEA1250641"/>
-          <w:id w:val="100023"/>
-          <w:showingPlcHdr/>
-          <w:text/>
-        </w:sdtPr>
-        <w:sdtContent>
-          <w:r>
-            <w:t>Click or tap here to enter text.</w:t>
-          </w:r>
-        </w:sdtContent>
-      </w:sdt>
-    </w:p>
-    <w:p>
-      <w:pPr>
-        <w:keepNext/>
-        <w:spacing w:before="240" w:after="80"/>
-      </w:pPr>
-      <w:r>
-        <w:rPr>
-          <w:rFonts w:ascii="Arial" w:hAnsi="Arial" w:cs="Arial" w:eastAsia="Arial"/>
-          <w:b/>
-          <w:i w:val="0"/>
-          <w:color w:val="1C355E"/>
-          <w:sz w:val="21"/>
-        </w:rPr>
-        <w:t>6. Ownership structure</w:t>
+        <w:t>The questions in this section are intended to collect contextual information and are not assessed for the purposes of the comparative process; however, completing them remains mandatory to ensure that the requested information is complete.</w:t>
       </w:r>
     </w:p>
     <w:p>
@@ -1612,13 +1640,39 @@
           <w:color w:val="595959"/>
           <w:sz w:val="18"/>
         </w:rPr>
-        <w:t>The questions in this section are intended to collect contextual information and are not assessed for the purposes of the comparative process; however, completing them remains mandatory to ensure that the requested information is complete.</w:t>
-      </w:r>
-    </w:p>
-    <w:p>
-      <w:pPr>
-        <w:keepNext w:val="0"/>
-        <w:spacing w:before="40" w:after="80"/>
+        <w:t>Role of the candidate company within the group</w:t>
+      </w:r>
+    </w:p>
+    <w:p>
+      <w:pPr>
+        <w:keepNext/>
+        <w:spacing w:before="200" w:after="40"/>
+      </w:pPr>
+      <w:r>
+        <w:rPr>
+          <w:rFonts w:ascii="Arial" w:hAnsi="Arial" w:cs="Arial" w:eastAsia="Arial"/>
+          <w:b/>
+          <w:i w:val="0"/>
+          <w:color w:val="000000"/>
+          <w:sz w:val="20"/>
+        </w:rPr>
+        <w:t xml:space="preserve">Is the candidate company the parent company? </w:t>
+      </w:r>
+      <w:r>
+        <w:rPr>
+          <w:rFonts w:ascii="Arial" w:hAnsi="Arial" w:cs="Arial" w:eastAsia="Arial"/>
+          <w:b/>
+          <w:i w:val="0"/>
+          <w:color w:val="1C355E"/>
+          <w:sz w:val="17"/>
+        </w:rPr>
+        <w:t>-082GEA1520642-</w:t>
+      </w:r>
+    </w:p>
+    <w:p>
+      <w:pPr>
+        <w:keepNext/>
+        <w:spacing w:before="0" w:after="40"/>
       </w:pPr>
       <w:r>
         <w:rPr>
@@ -1628,33 +1682,7 @@
           <w:color w:val="595959"/>
           <w:sz w:val="18"/>
         </w:rPr>
-        <w:t>Role of the candidate company within the group</w:t>
-      </w:r>
-    </w:p>
-    <w:p>
-      <w:pPr>
-        <w:keepNext/>
-        <w:spacing w:before="200" w:after="40"/>
-      </w:pPr>
-      <w:r>
-        <w:rPr>
-          <w:rFonts w:ascii="Arial" w:hAnsi="Arial" w:cs="Arial" w:eastAsia="Arial"/>
-          <w:b/>
-          <w:i w:val="0"/>
-          <w:color w:val="000000"/>
-          <w:sz w:val="20"/>
-        </w:rPr>
-        <w:t xml:space="preserve">Is the candidate company the parent company? </w:t>
-      </w:r>
-      <w:r>
-        <w:rPr>
-          <w:rFonts w:ascii="Arial" w:hAnsi="Arial" w:cs="Arial" w:eastAsia="Arial"/>
-          <w:b/>
-          <w:i w:val="0"/>
-          <w:color w:val="1C355E"/>
-          <w:sz w:val="17"/>
-        </w:rPr>
-        <w:t>-082GEA1520642-</w:t>
+        <w:t>The parent company means the entity that exercises direct or indirect control over the other companies in the group.</w:t>
       </w:r>
     </w:p>
     <w:p>
@@ -1670,7 +1698,7 @@
           <w:color w:val="595959"/>
           <w:sz w:val="18"/>
         </w:rPr>
-        <w:t>The parent company means the entity that exercises direct or indirect control over the other companies in the group.</w:t>
+        <w:t>A. Yes, the candidate company is the parent company</w:t>
       </w:r>
     </w:p>
     <w:p>
@@ -1686,7 +1714,7 @@
           <w:color w:val="595959"/>
           <w:sz w:val="18"/>
         </w:rPr>
-        <w:t>A. Yes, the candidate company is the parent company</w:t>
+        <w:t>B. No, the candidate company belongs to a group and is controlled by a parent company</w:t>
       </w:r>
     </w:p>
     <w:p>
@@ -1702,7 +1730,53 @@
           <w:color w:val="595959"/>
           <w:sz w:val="18"/>
         </w:rPr>
-        <w:t>B. No, the candidate company belongs to a group and is controlled by a parent company</w:t>
+        <w:t>C. The candidate company does not belong to any group</w:t>
+      </w:r>
+    </w:p>
+    <w:p>
+      <w:pPr>
+        <w:keepNext w:val="0"/>
+        <w:spacing w:before="40" w:after="120"/>
+        <w:shd w:val="clear" w:color="auto" w:fill="F2F2F2"/>
+      </w:pPr>
+      <w:sdt>
+        <w:sdtPr>
+          <w:alias w:val="082GEA1520642"/>
+          <w:id w:val="100024"/>
+          <w:showingPlcHdr/>
+          <w:text/>
+        </w:sdtPr>
+        <w:sdtContent>
+          <w:r>
+            <w:t>Click or tap here to enter text.</w:t>
+          </w:r>
+        </w:sdtContent>
+      </w:sdt>
+    </w:p>
+    <w:p>
+      <w:pPr>
+        <w:keepNext/>
+        <w:spacing w:before="200" w:after="40"/>
+      </w:pPr>
+      <w:r>
+        <w:rPr>
+          <w:rFonts w:ascii="Arial" w:hAnsi="Arial" w:cs="Arial" w:eastAsia="Arial"/>
+          <w:b/>
+          <w:i w:val="0"/>
+          <w:color w:val="000000"/>
+          <w:sz w:val="20"/>
+        </w:rPr>
+        <w:t xml:space="preserve">Main shareholders of the parent company or the candidate company State the top 5 shareholders of the parent company. </w:t>
+      </w:r>
+      <w:r>
+        <w:rPr>
+          <w:rFonts w:ascii="Arial" w:hAnsi="Arial" w:cs="Arial" w:eastAsia="Arial"/>
+          <w:b/>
+          <w:i w:val="0"/>
+          <w:color w:val="1C355E"/>
+          <w:sz w:val="17"/>
+        </w:rPr>
+        <w:t>-082GEA1520643-</w:t>
       </w:r>
     </w:p>
     <w:p>
@@ -1718,53 +1792,7 @@
           <w:color w:val="595959"/>
           <w:sz w:val="18"/>
         </w:rPr>
-        <w:t>C. The candidate company does not belong to any group</w:t>
-      </w:r>
-    </w:p>
-    <w:p>
-      <w:pPr>
-        <w:keepNext w:val="0"/>
-        <w:spacing w:before="40" w:after="120"/>
-        <w:shd w:val="clear" w:color="auto" w:fill="F2F2F2"/>
-      </w:pPr>
-      <w:sdt>
-        <w:sdtPr>
-          <w:alias w:val="082GEA1520642"/>
-          <w:id w:val="100024"/>
-          <w:showingPlcHdr/>
-          <w:text/>
-        </w:sdtPr>
-        <w:sdtContent>
-          <w:r>
-            <w:t>Click or tap here to enter text.</w:t>
-          </w:r>
-        </w:sdtContent>
-      </w:sdt>
-    </w:p>
-    <w:p>
-      <w:pPr>
-        <w:keepNext/>
-        <w:spacing w:before="200" w:after="40"/>
-      </w:pPr>
-      <w:r>
-        <w:rPr>
-          <w:rFonts w:ascii="Arial" w:hAnsi="Arial" w:cs="Arial" w:eastAsia="Arial"/>
-          <w:b/>
-          <w:i w:val="0"/>
-          <w:color w:val="000000"/>
-          <w:sz w:val="20"/>
-        </w:rPr>
-        <w:t xml:space="preserve">Main shareholders of the parent company or the candidate company State the top 5 shareholders of the parent company. </w:t>
-      </w:r>
-      <w:r>
-        <w:rPr>
-          <w:rFonts w:ascii="Arial" w:hAnsi="Arial" w:cs="Arial" w:eastAsia="Arial"/>
-          <w:b/>
-          <w:i w:val="0"/>
-          <w:color w:val="1C355E"/>
-          <w:sz w:val="17"/>
-        </w:rPr>
-        <w:t>-082GEA1520643-</w:t>
+        <w:t>If the candidate company does not belong to a group, state the main shareholders of the candidate company.</w:t>
       </w:r>
     </w:p>
     <w:p>
@@ -1780,7 +1808,53 @@
           <w:color w:val="595959"/>
           <w:sz w:val="18"/>
         </w:rPr>
-        <w:t>If the candidate company does not belong to a group, state the main shareholders of the candidate company.</w:t>
+        <w:t>For each shareholder, state the name and ownership interest (Shareholder 1 – Name / Interest (%); Shareholder 2, etc.) - (Enter the value in the format X,XX%)</w:t>
+      </w:r>
+    </w:p>
+    <w:p>
+      <w:pPr>
+        <w:keepNext w:val="0"/>
+        <w:spacing w:before="40" w:after="120"/>
+        <w:shd w:val="clear" w:color="auto" w:fill="F2F2F2"/>
+      </w:pPr>
+      <w:sdt>
+        <w:sdtPr>
+          <w:alias w:val="082GEA1520643"/>
+          <w:id w:val="100025"/>
+          <w:showingPlcHdr/>
+          <w:text/>
+        </w:sdtPr>
+        <w:sdtContent>
+          <w:r>
+            <w:t>Click or tap here to enter text.</w:t>
+          </w:r>
+        </w:sdtContent>
+      </w:sdt>
+    </w:p>
+    <w:p>
+      <w:pPr>
+        <w:keepNext/>
+        <w:spacing w:before="200" w:after="40"/>
+      </w:pPr>
+      <w:r>
+        <w:rPr>
+          <w:rFonts w:ascii="Arial" w:hAnsi="Arial" w:cs="Arial" w:eastAsia="Arial"/>
+          <w:b/>
+          <w:i w:val="0"/>
+          <w:color w:val="000000"/>
+          <w:sz w:val="20"/>
+        </w:rPr>
+        <w:t xml:space="preserve">Presence of other relevant entities State whether there are any financial, banking or insurance companies (other than those already listed among the main shareholders) that: • hold significant ownership interests in the candidate company; or • are parties to shareholder agreements relating to it. </w:t>
+      </w:r>
+      <w:r>
+        <w:rPr>
+          <w:rFonts w:ascii="Arial" w:hAnsi="Arial" w:cs="Arial" w:eastAsia="Arial"/>
+          <w:b/>
+          <w:i w:val="0"/>
+          <w:color w:val="1C355E"/>
+          <w:sz w:val="17"/>
+        </w:rPr>
+        <w:t>-082GEA1520644-</w:t>
       </w:r>
     </w:p>
     <w:p>
@@ -1796,53 +1870,7 @@
           <w:color w:val="595959"/>
           <w:sz w:val="18"/>
         </w:rPr>
-        <w:t>For each shareholder, state the name and ownership interest (Shareholder 1 – Name / Interest (%); Shareholder 2, etc.) - (Enter the value in the format X,XX%)</w:t>
-      </w:r>
-    </w:p>
-    <w:p>
-      <w:pPr>
-        <w:keepNext w:val="0"/>
-        <w:spacing w:before="40" w:after="120"/>
-        <w:shd w:val="clear" w:color="auto" w:fill="F2F2F2"/>
-      </w:pPr>
-      <w:sdt>
-        <w:sdtPr>
-          <w:alias w:val="082GEA1520643"/>
-          <w:id w:val="100025"/>
-          <w:showingPlcHdr/>
-          <w:text/>
-        </w:sdtPr>
-        <w:sdtContent>
-          <w:r>
-            <w:t>Click or tap here to enter text.</w:t>
-          </w:r>
-        </w:sdtContent>
-      </w:sdt>
-    </w:p>
-    <w:p>
-      <w:pPr>
-        <w:keepNext/>
-        <w:spacing w:before="200" w:after="40"/>
-      </w:pPr>
-      <w:r>
-        <w:rPr>
-          <w:rFonts w:ascii="Arial" w:hAnsi="Arial" w:cs="Arial" w:eastAsia="Arial"/>
-          <w:b/>
-          <w:i w:val="0"/>
-          <w:color w:val="000000"/>
-          <w:sz w:val="20"/>
-        </w:rPr>
-        <w:t xml:space="preserve">Presence of other relevant entities State whether there are any financial, banking or insurance companies (other than those already listed among the main shareholders) that: • hold significant ownership interests in the candidate company; or • are parties to shareholder agreements relating to it. </w:t>
-      </w:r>
-      <w:r>
-        <w:rPr>
-          <w:rFonts w:ascii="Arial" w:hAnsi="Arial" w:cs="Arial" w:eastAsia="Arial"/>
-          <w:b/>
-          <w:i w:val="0"/>
-          <w:color w:val="1C355E"/>
-          <w:sz w:val="17"/>
-        </w:rPr>
-        <w:t>-082GEA1520644-</w:t>
+        <w:t>A. No, there are no additional relevant entities</w:t>
       </w:r>
     </w:p>
     <w:p>
@@ -1858,7 +1886,53 @@
           <w:color w:val="595959"/>
           <w:sz w:val="18"/>
         </w:rPr>
-        <w:t>A. No, there are no additional relevant entities</w:t>
+        <w:t>B. Yes, there are additional relevant entities</w:t>
+      </w:r>
+    </w:p>
+    <w:p>
+      <w:pPr>
+        <w:keepNext w:val="0"/>
+        <w:spacing w:before="40" w:after="120"/>
+        <w:shd w:val="clear" w:color="auto" w:fill="F2F2F2"/>
+      </w:pPr>
+      <w:sdt>
+        <w:sdtPr>
+          <w:alias w:val="082GEA1520644"/>
+          <w:id w:val="100026"/>
+          <w:showingPlcHdr/>
+          <w:text/>
+        </w:sdtPr>
+        <w:sdtContent>
+          <w:r>
+            <w:t>Click or tap here to enter text.</w:t>
+          </w:r>
+        </w:sdtContent>
+      </w:sdt>
+    </w:p>
+    <w:p>
+      <w:pPr>
+        <w:keepNext/>
+        <w:spacing w:before="200" w:after="40"/>
+      </w:pPr>
+      <w:r>
+        <w:rPr>
+          <w:rFonts w:ascii="Arial" w:hAnsi="Arial" w:cs="Arial" w:eastAsia="Arial"/>
+          <w:b/>
+          <w:i w:val="0"/>
+          <w:color w:val="000000"/>
+          <w:sz w:val="20"/>
+        </w:rPr>
+        <w:t xml:space="preserve">Details of other relevant entities </w:t>
+      </w:r>
+      <w:r>
+        <w:rPr>
+          <w:rFonts w:ascii="Arial" w:hAnsi="Arial" w:cs="Arial" w:eastAsia="Arial"/>
+          <w:b/>
+          <w:i w:val="0"/>
+          <w:color w:val="1C355E"/>
+          <w:sz w:val="17"/>
+        </w:rPr>
+        <w:t>-082GEA1520645-</w:t>
       </w:r>
     </w:p>
     <w:p>
@@ -1874,53 +1948,7 @@
           <w:color w:val="595959"/>
           <w:sz w:val="18"/>
         </w:rPr>
-        <w:t>B. Yes, there are additional relevant entities</w:t>
-      </w:r>
-    </w:p>
-    <w:p>
-      <w:pPr>
-        <w:keepNext w:val="0"/>
-        <w:spacing w:before="40" w:after="120"/>
-        <w:shd w:val="clear" w:color="auto" w:fill="F2F2F2"/>
-      </w:pPr>
-      <w:sdt>
-        <w:sdtPr>
-          <w:alias w:val="082GEA1520644"/>
-          <w:id w:val="100026"/>
-          <w:showingPlcHdr/>
-          <w:text/>
-        </w:sdtPr>
-        <w:sdtContent>
-          <w:r>
-            <w:t>Click or tap here to enter text.</w:t>
-          </w:r>
-        </w:sdtContent>
-      </w:sdt>
-    </w:p>
-    <w:p>
-      <w:pPr>
-        <w:keepNext/>
-        <w:spacing w:before="200" w:after="40"/>
-      </w:pPr>
-      <w:r>
-        <w:rPr>
-          <w:rFonts w:ascii="Arial" w:hAnsi="Arial" w:cs="Arial" w:eastAsia="Arial"/>
-          <w:b/>
-          <w:i w:val="0"/>
-          <w:color w:val="000000"/>
-          <w:sz w:val="20"/>
-        </w:rPr>
-        <w:t xml:space="preserve">Details of other relevant entities </w:t>
-      </w:r>
-      <w:r>
-        <w:rPr>
-          <w:rFonts w:ascii="Arial" w:hAnsi="Arial" w:cs="Arial" w:eastAsia="Arial"/>
-          <w:b/>
-          <w:i w:val="0"/>
-          <w:color w:val="1C355E"/>
-          <w:sz w:val="17"/>
-        </w:rPr>
-        <w:t>-082GEA1520645-</w:t>
+        <w:t>For each entity, state:</w:t>
       </w:r>
     </w:p>
     <w:p>
@@ -1936,7 +1964,7 @@
           <w:color w:val="595959"/>
           <w:sz w:val="18"/>
         </w:rPr>
-        <w:t>For each entity, state:</w:t>
+        <w:t>• name</w:t>
       </w:r>
     </w:p>
     <w:p>
@@ -1952,7 +1980,7 @@
           <w:color w:val="595959"/>
           <w:sz w:val="18"/>
         </w:rPr>
-        <w:t>• name</w:t>
+        <w:t>• type of relationship (ownership interest / shareholder agreement)</w:t>
       </w:r>
     </w:p>
     <w:p>
@@ -1968,7 +1996,7 @@
           <w:color w:val="595959"/>
           <w:sz w:val="18"/>
         </w:rPr>
-        <w:t>• type of relationship (ownership interest / shareholder agreement)</w:t>
+        <w:t>• interest held (if applicable)</w:t>
       </w:r>
     </w:p>
     <w:p>
@@ -1984,13 +2012,49 @@
           <w:color w:val="595959"/>
           <w:sz w:val="18"/>
         </w:rPr>
-        <w:t>• interest held (if applicable)</w:t>
-      </w:r>
-    </w:p>
-    <w:p>
-      <w:pPr>
-        <w:keepNext/>
-        <w:spacing w:before="0" w:after="40"/>
+        <w:t>(Complete only if the answer to Question 4 is B)</w:t>
+      </w:r>
+    </w:p>
+    <w:p>
+      <w:pPr>
+        <w:keepNext w:val="0"/>
+        <w:spacing w:before="40" w:after="120"/>
+        <w:shd w:val="clear" w:color="auto" w:fill="F2F2F2"/>
+      </w:pPr>
+      <w:sdt>
+        <w:sdtPr>
+          <w:alias w:val="082GEA1520645"/>
+          <w:id w:val="100027"/>
+          <w:showingPlcHdr/>
+          <w:text/>
+        </w:sdtPr>
+        <w:sdtContent>
+          <w:r>
+            <w:t>Click or tap here to enter text.</w:t>
+          </w:r>
+        </w:sdtContent>
+      </w:sdt>
+    </w:p>
+    <w:p>
+      <w:pPr>
+        <w:keepNext/>
+        <w:spacing w:before="240" w:after="80"/>
+      </w:pPr>
+      <w:r>
+        <w:rPr>
+          <w:rFonts w:ascii="Arial" w:hAnsi="Arial" w:cs="Arial" w:eastAsia="Arial"/>
+          <w:b/>
+          <w:i w:val="0"/>
+          <w:color w:val="1C355E"/>
+          <w:sz w:val="21"/>
+        </w:rPr>
+        <w:t>11. Net equity</w:t>
+      </w:r>
+    </w:p>
+    <w:p>
+      <w:pPr>
+        <w:keepNext w:val="0"/>
+        <w:spacing w:before="40" w:after="80"/>
       </w:pPr>
       <w:r>
         <w:rPr>
@@ -2000,43 +2064,7 @@
           <w:color w:val="595959"/>
           <w:sz w:val="18"/>
         </w:rPr>
-        <w:t>(Complete only if the answer to Question 4 is B)</w:t>
-      </w:r>
-    </w:p>
-    <w:p>
-      <w:pPr>
-        <w:keepNext w:val="0"/>
-        <w:spacing w:before="40" w:after="120"/>
-        <w:shd w:val="clear" w:color="auto" w:fill="F2F2F2"/>
-      </w:pPr>
-      <w:sdt>
-        <w:sdtPr>
-          <w:alias w:val="082GEA1520645"/>
-          <w:id w:val="100027"/>
-          <w:showingPlcHdr/>
-          <w:text/>
-        </w:sdtPr>
-        <w:sdtContent>
-          <w:r>
-            <w:t>Click or tap here to enter text.</w:t>
-          </w:r>
-        </w:sdtContent>
-      </w:sdt>
-    </w:p>
-    <w:p>
-      <w:pPr>
-        <w:keepNext/>
-        <w:spacing w:before="240" w:after="80"/>
-      </w:pPr>
-      <w:r>
-        <w:rPr>
-          <w:rFonts w:ascii="Arial" w:hAnsi="Arial" w:cs="Arial" w:eastAsia="Arial"/>
-          <w:b/>
-          <w:i w:val="0"/>
-          <w:color w:val="1C355E"/>
-          <w:sz w:val="21"/>
-        </w:rPr>
-        <w:t>11. Net equity</w:t>
+        <w:t>The figures must be expressed in millions of euros. Enter numerical values only. If the figure is unavailable, leave the field blank and do not enter “N/A” or similar annotations.</w:t>
       </w:r>
     </w:p>
     <w:p>
@@ -2052,13 +2080,39 @@
           <w:color w:val="595959"/>
           <w:sz w:val="18"/>
         </w:rPr>
-        <w:t>The figures must be expressed in millions of euros. Enter numerical values only. If the figure is unavailable, leave the field blank and do not enter “N/A” or similar annotations.</w:t>
-      </w:r>
-    </w:p>
-    <w:p>
-      <w:pPr>
-        <w:keepNext w:val="0"/>
-        <w:spacing w:before="40" w:after="80"/>
+        <w:t>WARNING: Information that cannot be interpreted unambiguously will result in a score of zero.</w:t>
+      </w:r>
+    </w:p>
+    <w:p>
+      <w:pPr>
+        <w:keepNext/>
+        <w:spacing w:before="200" w:after="40"/>
+      </w:pPr>
+      <w:r>
+        <w:rPr>
+          <w:rFonts w:ascii="Arial" w:hAnsi="Arial" w:cs="Arial" w:eastAsia="Arial"/>
+          <w:b/>
+          <w:i w:val="0"/>
+          <w:color w:val="000000"/>
+          <w:sz w:val="20"/>
+        </w:rPr>
+        <w:t xml:space="preserve">Candidate company net equity </w:t>
+      </w:r>
+      <w:r>
+        <w:rPr>
+          <w:rFonts w:ascii="Arial" w:hAnsi="Arial" w:cs="Arial" w:eastAsia="Arial"/>
+          <w:b/>
+          <w:i w:val="0"/>
+          <w:color w:val="1C355E"/>
+          <w:sz w:val="17"/>
+        </w:rPr>
+        <w:t>-082GEA1740696-</w:t>
+      </w:r>
+    </w:p>
+    <w:p>
+      <w:pPr>
+        <w:keepNext/>
+        <w:spacing w:before="0" w:after="40"/>
       </w:pPr>
       <w:r>
         <w:rPr>
@@ -2068,33 +2122,53 @@
           <w:color w:val="595959"/>
           <w:sz w:val="18"/>
         </w:rPr>
-        <w:t>WARNING: Information that cannot be interpreted unambiguously will result in a score of zero.</w:t>
-      </w:r>
-    </w:p>
-    <w:p>
-      <w:pPr>
-        <w:keepNext/>
-        <w:spacing w:before="200" w:after="40"/>
-      </w:pPr>
-      <w:r>
-        <w:rPr>
-          <w:rFonts w:ascii="Arial" w:hAnsi="Arial" w:cs="Arial" w:eastAsia="Arial"/>
-          <w:b/>
-          <w:i w:val="0"/>
-          <w:color w:val="000000"/>
-          <w:sz w:val="20"/>
-        </w:rPr>
-        <w:t xml:space="preserve">Candidate company net equity </w:t>
-      </w:r>
-      <w:r>
-        <w:rPr>
-          <w:rFonts w:ascii="Arial" w:hAnsi="Arial" w:cs="Arial" w:eastAsia="Arial"/>
-          <w:b/>
-          <w:i w:val="0"/>
-          <w:color w:val="1C355E"/>
-          <w:sz w:val="17"/>
-        </w:rPr>
-        <w:t>-082GEA1740696-</w:t>
+        <w:t>State the candidate company’s net equity for the specified years.</w:t>
+      </w:r>
+    </w:p>
+    <w:p>
+      <w:pPr>
+        <w:keepNext w:val="0"/>
+        <w:spacing w:before="40" w:after="120"/>
+        <w:shd w:val="clear" w:color="auto" w:fill="F2F2F2"/>
+      </w:pPr>
+      <w:sdt>
+        <w:sdtPr>
+          <w:alias w:val="082GEA1740696"/>
+          <w:id w:val="100028"/>
+          <w:showingPlcHdr/>
+          <w:text/>
+        </w:sdtPr>
+        <w:sdtContent>
+          <w:r>
+            <w:t>Click or tap here to enter text.</w:t>
+          </w:r>
+        </w:sdtContent>
+      </w:sdt>
+    </w:p>
+    <w:p>
+      <w:pPr>
+        <w:keepNext/>
+        <w:spacing w:before="200" w:after="40"/>
+      </w:pPr>
+      <w:r>
+        <w:rPr>
+          <w:rFonts w:ascii="Arial" w:hAnsi="Arial" w:cs="Arial" w:eastAsia="Arial"/>
+          <w:b/>
+          <w:i w:val="0"/>
+          <w:color w:val="000000"/>
+          <w:sz w:val="20"/>
+        </w:rPr>
+        <w:t xml:space="preserve">- Net equity - Candidate company - Year 2023 </w:t>
+      </w:r>
+      <w:r>
+        <w:rPr>
+          <w:rFonts w:ascii="Arial" w:hAnsi="Arial" w:cs="Arial" w:eastAsia="Arial"/>
+          <w:b/>
+          <w:i w:val="0"/>
+          <w:color w:val="1C355E"/>
+          <w:sz w:val="17"/>
+        </w:rPr>
+        <w:t>-082GEA1745052-</w:t>
       </w:r>
     </w:p>
     <w:p>
@@ -2110,53 +2184,7 @@
           <w:color w:val="595959"/>
           <w:sz w:val="18"/>
         </w:rPr>
-        <w:t>State the candidate company’s net equity for the specified years.</w:t>
-      </w:r>
-    </w:p>
-    <w:p>
-      <w:pPr>
-        <w:keepNext w:val="0"/>
-        <w:spacing w:before="40" w:after="120"/>
-        <w:shd w:val="clear" w:color="auto" w:fill="F2F2F2"/>
-      </w:pPr>
-      <w:sdt>
-        <w:sdtPr>
-          <w:alias w:val="082GEA1740696"/>
-          <w:id w:val="100028"/>
-          <w:showingPlcHdr/>
-          <w:text/>
-        </w:sdtPr>
-        <w:sdtContent>
-          <w:r>
-            <w:t>Click or tap here to enter text.</w:t>
-          </w:r>
-        </w:sdtContent>
-      </w:sdt>
-    </w:p>
-    <w:p>
-      <w:pPr>
-        <w:keepNext/>
-        <w:spacing w:before="200" w:after="40"/>
-      </w:pPr>
-      <w:r>
-        <w:rPr>
-          <w:rFonts w:ascii="Arial" w:hAnsi="Arial" w:cs="Arial" w:eastAsia="Arial"/>
-          <w:b/>
-          <w:i w:val="0"/>
-          <w:color w:val="000000"/>
-          <w:sz w:val="20"/>
-        </w:rPr>
-        <w:t xml:space="preserve">- Net equity - Candidate company - Year 2023 </w:t>
-      </w:r>
-      <w:r>
-        <w:rPr>
-          <w:rFonts w:ascii="Arial" w:hAnsi="Arial" w:cs="Arial" w:eastAsia="Arial"/>
-          <w:b/>
-          <w:i w:val="0"/>
-          <w:color w:val="1C355E"/>
-          <w:sz w:val="17"/>
-        </w:rPr>
-        <w:t>-082GEA1745052-</w:t>
+        <w:t>The figures must be expressed in millions of euros. Enter numerical values only. If the figure is unavailable, leave the field blank and do not enter “N/A” or similar annotations.</w:t>
       </w:r>
     </w:p>
     <w:p>
@@ -2172,7 +2200,7 @@
           <w:color w:val="595959"/>
           <w:sz w:val="18"/>
         </w:rPr>
-        <w:t>The figures must be expressed in millions of euros. Enter numerical values only. If the figure is unavailable, leave the field blank and do not enter “N/A” or similar annotations.</w:t>
+        <w:t>WARNING: Information that cannot be interpreted unambiguously will result in a score of zero.</w:t>
       </w:r>
     </w:p>
     <w:p>
@@ -2188,7 +2216,53 @@
           <w:color w:val="595959"/>
           <w:sz w:val="18"/>
         </w:rPr>
-        <w:t>WARNING: Information that cannot be interpreted unambiguously will result in a score of zero.</w:t>
+        <w:t>XX 2 decimal places</w:t>
+      </w:r>
+    </w:p>
+    <w:p>
+      <w:pPr>
+        <w:keepNext w:val="0"/>
+        <w:spacing w:before="40" w:after="120"/>
+        <w:shd w:val="clear" w:color="auto" w:fill="F2F2F2"/>
+      </w:pPr>
+      <w:sdt>
+        <w:sdtPr>
+          <w:alias w:val="082GEA1745052"/>
+          <w:id w:val="100029"/>
+          <w:showingPlcHdr/>
+          <w:text/>
+        </w:sdtPr>
+        <w:sdtContent>
+          <w:r>
+            <w:t>Click or tap here to enter text.</w:t>
+          </w:r>
+        </w:sdtContent>
+      </w:sdt>
+    </w:p>
+    <w:p>
+      <w:pPr>
+        <w:keepNext/>
+        <w:spacing w:before="200" w:after="40"/>
+      </w:pPr>
+      <w:r>
+        <w:rPr>
+          <w:rFonts w:ascii="Arial" w:hAnsi="Arial" w:cs="Arial" w:eastAsia="Arial"/>
+          <w:b/>
+          <w:i w:val="0"/>
+          <w:color w:val="000000"/>
+          <w:sz w:val="20"/>
+        </w:rPr>
+        <w:t xml:space="preserve">- Net equity - Candidate company - Year 2024 </w:t>
+      </w:r>
+      <w:r>
+        <w:rPr>
+          <w:rFonts w:ascii="Arial" w:hAnsi="Arial" w:cs="Arial" w:eastAsia="Arial"/>
+          <w:b/>
+          <w:i w:val="0"/>
+          <w:color w:val="1C355E"/>
+          <w:sz w:val="17"/>
+        </w:rPr>
+        <w:t>-082GEA1745250-</w:t>
       </w:r>
     </w:p>
     <w:p>
@@ -2204,53 +2278,7 @@
           <w:color w:val="595959"/>
           <w:sz w:val="18"/>
         </w:rPr>
-        <w:t>XX 2 decimal places</w:t>
-      </w:r>
-    </w:p>
-    <w:p>
-      <w:pPr>
-        <w:keepNext w:val="0"/>
-        <w:spacing w:before="40" w:after="120"/>
-        <w:shd w:val="clear" w:color="auto" w:fill="F2F2F2"/>
-      </w:pPr>
-      <w:sdt>
-        <w:sdtPr>
-          <w:alias w:val="082GEA1745052"/>
-          <w:id w:val="100029"/>
-          <w:showingPlcHdr/>
-          <w:text/>
-        </w:sdtPr>
-        <w:sdtContent>
-          <w:r>
-            <w:t>Click or tap here to enter text.</w:t>
-          </w:r>
-        </w:sdtContent>
-      </w:sdt>
-    </w:p>
-    <w:p>
-      <w:pPr>
-        <w:keepNext/>
-        <w:spacing w:before="200" w:after="40"/>
-      </w:pPr>
-      <w:r>
-        <w:rPr>
-          <w:rFonts w:ascii="Arial" w:hAnsi="Arial" w:cs="Arial" w:eastAsia="Arial"/>
-          <w:b/>
-          <w:i w:val="0"/>
-          <w:color w:val="000000"/>
-          <w:sz w:val="20"/>
-        </w:rPr>
-        <w:t xml:space="preserve">- Net equity - Candidate company - Year 2024 </w:t>
-      </w:r>
-      <w:r>
-        <w:rPr>
-          <w:rFonts w:ascii="Arial" w:hAnsi="Arial" w:cs="Arial" w:eastAsia="Arial"/>
-          <w:b/>
-          <w:i w:val="0"/>
-          <w:color w:val="1C355E"/>
-          <w:sz w:val="17"/>
-        </w:rPr>
-        <w:t>-082GEA1745250-</w:t>
+        <w:t>The figures must be expressed in millions of euros. Enter numerical values only. If the figure is unavailable, leave the field blank and do not enter “N/A” or similar annotations.</w:t>
       </w:r>
     </w:p>
     <w:p>
@@ -2266,7 +2294,7 @@
           <w:color w:val="595959"/>
           <w:sz w:val="18"/>
         </w:rPr>
-        <w:t>The figures must be expressed in millions of euros. Enter numerical values only. If the figure is unavailable, leave the field blank and do not enter “N/A” or similar annotations.</w:t>
+        <w:t>WARNING: Information that cannot be interpreted unambiguously will result in a score of zero.</w:t>
       </w:r>
     </w:p>
     <w:p>
@@ -2282,7 +2310,53 @@
           <w:color w:val="595959"/>
           <w:sz w:val="18"/>
         </w:rPr>
-        <w:t>WARNING: Information that cannot be interpreted unambiguously will result in a score of zero.</w:t>
+        <w:t>XX 2 decimal places</w:t>
+      </w:r>
+    </w:p>
+    <w:p>
+      <w:pPr>
+        <w:keepNext w:val="0"/>
+        <w:spacing w:before="40" w:after="120"/>
+        <w:shd w:val="clear" w:color="auto" w:fill="F2F2F2"/>
+      </w:pPr>
+      <w:sdt>
+        <w:sdtPr>
+          <w:alias w:val="082GEA1745250"/>
+          <w:id w:val="100030"/>
+          <w:showingPlcHdr/>
+          <w:text/>
+        </w:sdtPr>
+        <w:sdtContent>
+          <w:r>
+            <w:t>Click or tap here to enter text.</w:t>
+          </w:r>
+        </w:sdtContent>
+      </w:sdt>
+    </w:p>
+    <w:p>
+      <w:pPr>
+        <w:keepNext/>
+        <w:spacing w:before="200" w:after="40"/>
+      </w:pPr>
+      <w:r>
+        <w:rPr>
+          <w:rFonts w:ascii="Arial" w:hAnsi="Arial" w:cs="Arial" w:eastAsia="Arial"/>
+          <w:b/>
+          <w:i w:val="0"/>
+          <w:color w:val="000000"/>
+          <w:sz w:val="20"/>
+        </w:rPr>
+        <w:t xml:space="preserve">- Net equity - Candidate company - Year 2025 </w:t>
+      </w:r>
+      <w:r>
+        <w:rPr>
+          <w:rFonts w:ascii="Arial" w:hAnsi="Arial" w:cs="Arial" w:eastAsia="Arial"/>
+          <w:b/>
+          <w:i w:val="0"/>
+          <w:color w:val="1C355E"/>
+          <w:sz w:val="17"/>
+        </w:rPr>
+        <w:t>-082GEA1745472-</w:t>
       </w:r>
     </w:p>
     <w:p>
@@ -2298,53 +2372,7 @@
           <w:color w:val="595959"/>
           <w:sz w:val="18"/>
         </w:rPr>
-        <w:t>XX 2 decimal places</w:t>
-      </w:r>
-    </w:p>
-    <w:p>
-      <w:pPr>
-        <w:keepNext w:val="0"/>
-        <w:spacing w:before="40" w:after="120"/>
-        <w:shd w:val="clear" w:color="auto" w:fill="F2F2F2"/>
-      </w:pPr>
-      <w:sdt>
-        <w:sdtPr>
-          <w:alias w:val="082GEA1745250"/>
-          <w:id w:val="100030"/>
-          <w:showingPlcHdr/>
-          <w:text/>
-        </w:sdtPr>
-        <w:sdtContent>
-          <w:r>
-            <w:t>Click or tap here to enter text.</w:t>
-          </w:r>
-        </w:sdtContent>
-      </w:sdt>
-    </w:p>
-    <w:p>
-      <w:pPr>
-        <w:keepNext/>
-        <w:spacing w:before="200" w:after="40"/>
-      </w:pPr>
-      <w:r>
-        <w:rPr>
-          <w:rFonts w:ascii="Arial" w:hAnsi="Arial" w:cs="Arial" w:eastAsia="Arial"/>
-          <w:b/>
-          <w:i w:val="0"/>
-          <w:color w:val="000000"/>
-          <w:sz w:val="20"/>
-        </w:rPr>
-        <w:t xml:space="preserve">- Net equity - Candidate company - Year 2025 </w:t>
-      </w:r>
-      <w:r>
-        <w:rPr>
-          <w:rFonts w:ascii="Arial" w:hAnsi="Arial" w:cs="Arial" w:eastAsia="Arial"/>
-          <w:b/>
-          <w:i w:val="0"/>
-          <w:color w:val="1C355E"/>
-          <w:sz w:val="17"/>
-        </w:rPr>
-        <w:t>-082GEA1745472-</w:t>
+        <w:t>The figures must be expressed in millions of euros. Enter numerical values only. If the figure is unavailable, leave the field blank and do not enter “N/A” or similar annotations.</w:t>
       </w:r>
     </w:p>
     <w:p>
@@ -2360,7 +2388,7 @@
           <w:color w:val="595959"/>
           <w:sz w:val="18"/>
         </w:rPr>
-        <w:t>The figures must be expressed in millions of euros. Enter numerical values only. If the figure is unavailable, leave the field blank and do not enter “N/A” or similar annotations.</w:t>
+        <w:t>WARNING: Information that cannot be interpreted unambiguously will result in a score of zero.</w:t>
       </w:r>
     </w:p>
     <w:p>
@@ -2376,7 +2404,149 @@
           <w:color w:val="595959"/>
           <w:sz w:val="18"/>
         </w:rPr>
-        <w:t>WARNING: Information that cannot be interpreted unambiguously will result in a score of zero.</w:t>
+        <w:t>XX 2 decimal places</w:t>
+      </w:r>
+    </w:p>
+    <w:p>
+      <w:pPr>
+        <w:keepNext w:val="0"/>
+        <w:spacing w:before="40" w:after="120"/>
+        <w:shd w:val="clear" w:color="auto" w:fill="F2F2F2"/>
+      </w:pPr>
+      <w:sdt>
+        <w:sdtPr>
+          <w:alias w:val="082GEA1745472"/>
+          <w:id w:val="100031"/>
+          <w:showingPlcHdr/>
+          <w:text/>
+        </w:sdtPr>
+        <w:sdtContent>
+          <w:r>
+            <w:t>Click or tap here to enter text.</w:t>
+          </w:r>
+        </w:sdtContent>
+      </w:sdt>
+    </w:p>
+    <w:p>
+      <w:pPr>
+        <w:keepNext/>
+        <w:spacing w:before="200" w:after="40"/>
+      </w:pPr>
+      <w:r>
+        <w:rPr>
+          <w:rFonts w:ascii="Arial" w:hAnsi="Arial" w:cs="Arial" w:eastAsia="Arial"/>
+          <w:b/>
+          <w:i w:val="0"/>
+          <w:color w:val="000000"/>
+          <w:sz w:val="20"/>
+        </w:rPr>
+        <w:t xml:space="preserve">State whether the figures above relating to the candidate company were affected by significant events (mergers, acquisitions, demergers, etc.) </w:t>
+      </w:r>
+      <w:r>
+        <w:rPr>
+          <w:rFonts w:ascii="Arial" w:hAnsi="Arial" w:cs="Arial" w:eastAsia="Arial"/>
+          <w:b/>
+          <w:i w:val="0"/>
+          <w:color w:val="1C355E"/>
+          <w:sz w:val="17"/>
+        </w:rPr>
+        <w:t>-082GEA1740688-</w:t>
+      </w:r>
+    </w:p>
+    <w:p>
+      <w:pPr>
+        <w:keepNext w:val="0"/>
+        <w:spacing w:before="40" w:after="120"/>
+        <w:shd w:val="clear" w:color="auto" w:fill="F2F2F2"/>
+      </w:pPr>
+      <w:sdt>
+        <w:sdtPr>
+          <w:alias w:val="082GEA1740688"/>
+          <w:id w:val="100032"/>
+          <w:showingPlcHdr/>
+          <w:dropDownList>
+            <w:listItem w:displayText="Choose an item." w:value=""/>
+            <w:listItem w:displayText="1 - The reported figures were affected by significant events" w:value="1 - The reported figures were affected by significant events"/>
+            <w:listItem w:displayText="2 - The reported figures were not affected by significant events" w:value="2 - The reported figures were not affected by significant events"/>
+          </w:dropDownList>
+        </w:sdtPr>
+        <w:sdtContent>
+          <w:r>
+            <w:t>Choose an item.</w:t>
+          </w:r>
+        </w:sdtContent>
+      </w:sdt>
+    </w:p>
+    <w:p>
+      <w:pPr>
+        <w:keepNext/>
+        <w:spacing w:before="200" w:after="40"/>
+      </w:pPr>
+      <w:r>
+        <w:rPr>
+          <w:rFonts w:ascii="Arial" w:hAnsi="Arial" w:cs="Arial" w:eastAsia="Arial"/>
+          <w:b/>
+          <w:i w:val="0"/>
+          <w:color w:val="000000"/>
+          <w:sz w:val="20"/>
+        </w:rPr>
+        <w:t xml:space="preserve">If the candidate company’s net equity figures were affected by significant events, specify which events </w:t>
+      </w:r>
+      <w:r>
+        <w:rPr>
+          <w:rFonts w:ascii="Arial" w:hAnsi="Arial" w:cs="Arial" w:eastAsia="Arial"/>
+          <w:b/>
+          <w:i w:val="0"/>
+          <w:color w:val="1C355E"/>
+          <w:sz w:val="17"/>
+        </w:rPr>
+        <w:t>-082GEA1742152-</w:t>
+      </w:r>
+    </w:p>
+    <w:p>
+      <w:pPr>
+        <w:keepNext w:val="0"/>
+        <w:spacing w:before="40" w:after="120"/>
+        <w:shd w:val="clear" w:color="auto" w:fill="F2F2F2"/>
+      </w:pPr>
+      <w:sdt>
+        <w:sdtPr>
+          <w:alias w:val="082GEA1742152"/>
+          <w:id w:val="100033"/>
+          <w:showingPlcHdr/>
+          <w:text/>
+        </w:sdtPr>
+        <w:sdtContent>
+          <w:r>
+            <w:t>Click or tap here to enter text.</w:t>
+          </w:r>
+        </w:sdtContent>
+      </w:sdt>
+    </w:p>
+    <w:p>
+      <w:pPr>
+        <w:keepNext/>
+        <w:spacing w:before="200" w:after="40"/>
+      </w:pPr>
+      <w:r>
+        <w:rPr>
+          <w:rFonts w:ascii="Arial" w:hAnsi="Arial" w:cs="Arial" w:eastAsia="Arial"/>
+          <w:b/>
+          <w:i w:val="0"/>
+          <w:color w:val="000000"/>
+          <w:sz w:val="20"/>
+        </w:rPr>
+        <w:t xml:space="preserve">Net equity of the group to which the company belongs </w:t>
+      </w:r>
+      <w:r>
+        <w:rPr>
+          <w:rFonts w:ascii="Arial" w:hAnsi="Arial" w:cs="Arial" w:eastAsia="Arial"/>
+          <w:b/>
+          <w:i w:val="0"/>
+          <w:color w:val="1C355E"/>
+          <w:sz w:val="17"/>
+        </w:rPr>
+        <w:t>-082GEA1740692-</w:t>
       </w:r>
     </w:p>
     <w:p>
@@ -2392,145 +2562,7 @@
           <w:color w:val="595959"/>
           <w:sz w:val="18"/>
         </w:rPr>
-        <w:t>XX 2 decimal places</w:t>
-      </w:r>
-    </w:p>
-    <w:p>
-      <w:pPr>
-        <w:keepNext w:val="0"/>
-        <w:spacing w:before="40" w:after="120"/>
-        <w:shd w:val="clear" w:color="auto" w:fill="F2F2F2"/>
-      </w:pPr>
-      <w:sdt>
-        <w:sdtPr>
-          <w:alias w:val="082GEA1745472"/>
-          <w:id w:val="100031"/>
-          <w:showingPlcHdr/>
-          <w:text/>
-        </w:sdtPr>
-        <w:sdtContent>
-          <w:r>
-            <w:t>Click or tap here to enter text.</w:t>
-          </w:r>
-        </w:sdtContent>
-      </w:sdt>
-    </w:p>
-    <w:p>
-      <w:pPr>
-        <w:keepNext/>
-        <w:spacing w:before="200" w:after="40"/>
-      </w:pPr>
-      <w:r>
-        <w:rPr>
-          <w:rFonts w:ascii="Arial" w:hAnsi="Arial" w:cs="Arial" w:eastAsia="Arial"/>
-          <w:b/>
-          <w:i w:val="0"/>
-          <w:color w:val="000000"/>
-          <w:sz w:val="20"/>
-        </w:rPr>
-        <w:t xml:space="preserve">State whether the figures above relating to the candidate company were affected by significant events (mergers, acquisitions, demergers, etc.) </w:t>
-      </w:r>
-      <w:r>
-        <w:rPr>
-          <w:rFonts w:ascii="Arial" w:hAnsi="Arial" w:cs="Arial" w:eastAsia="Arial"/>
-          <w:b/>
-          <w:i w:val="0"/>
-          <w:color w:val="1C355E"/>
-          <w:sz w:val="17"/>
-        </w:rPr>
-        <w:t>-082GEA1740688-</w:t>
-      </w:r>
-    </w:p>
-    <w:p>
-      <w:pPr>
-        <w:keepNext w:val="0"/>
-        <w:spacing w:before="40" w:after="120"/>
-        <w:shd w:val="clear" w:color="auto" w:fill="F2F2F2"/>
-      </w:pPr>
-      <w:sdt>
-        <w:sdtPr>
-          <w:alias w:val="082GEA1740688"/>
-          <w:id w:val="100032"/>
-          <w:showingPlcHdr/>
-          <w:text/>
-        </w:sdtPr>
-        <w:sdtContent>
-          <w:r>
-            <w:t>Click or tap here to enter text.</w:t>
-          </w:r>
-        </w:sdtContent>
-      </w:sdt>
-    </w:p>
-    <w:p>
-      <w:pPr>
-        <w:keepNext/>
-        <w:spacing w:before="200" w:after="40"/>
-      </w:pPr>
-      <w:r>
-        <w:rPr>
-          <w:rFonts w:ascii="Arial" w:hAnsi="Arial" w:cs="Arial" w:eastAsia="Arial"/>
-          <w:b/>
-          <w:i w:val="0"/>
-          <w:color w:val="000000"/>
-          <w:sz w:val="20"/>
-        </w:rPr>
-        <w:t xml:space="preserve">If the candidate company’s net equity figures were affected by significant events, specify which events </w:t>
-      </w:r>
-      <w:r>
-        <w:rPr>
-          <w:rFonts w:ascii="Arial" w:hAnsi="Arial" w:cs="Arial" w:eastAsia="Arial"/>
-          <w:b/>
-          <w:i w:val="0"/>
-          <w:color w:val="1C355E"/>
-          <w:sz w:val="17"/>
-        </w:rPr>
-        <w:t>-082GEA1742152-</w:t>
-      </w:r>
-    </w:p>
-    <w:p>
-      <w:pPr>
-        <w:keepNext w:val="0"/>
-        <w:spacing w:before="40" w:after="120"/>
-        <w:shd w:val="clear" w:color="auto" w:fill="F2F2F2"/>
-      </w:pPr>
-      <w:sdt>
-        <w:sdtPr>
-          <w:alias w:val="082GEA1742152"/>
-          <w:id w:val="100033"/>
-          <w:showingPlcHdr/>
-          <w:text/>
-        </w:sdtPr>
-        <w:sdtContent>
-          <w:r>
-            <w:t>Click or tap here to enter text.</w:t>
-          </w:r>
-        </w:sdtContent>
-      </w:sdt>
-    </w:p>
-    <w:p>
-      <w:pPr>
-        <w:keepNext/>
-        <w:spacing w:before="200" w:after="40"/>
-      </w:pPr>
-      <w:r>
-        <w:rPr>
-          <w:rFonts w:ascii="Arial" w:hAnsi="Arial" w:cs="Arial" w:eastAsia="Arial"/>
-          <w:b/>
-          <w:i w:val="0"/>
-          <w:color w:val="000000"/>
-          <w:sz w:val="20"/>
-        </w:rPr>
-        <w:t xml:space="preserve">Net equity of the group to which the company belongs </w:t>
-      </w:r>
-      <w:r>
-        <w:rPr>
-          <w:rFonts w:ascii="Arial" w:hAnsi="Arial" w:cs="Arial" w:eastAsia="Arial"/>
-          <w:b/>
-          <w:i w:val="0"/>
-          <w:color w:val="1C355E"/>
-          <w:sz w:val="17"/>
-        </w:rPr>
-        <w:t>-082GEA1740692-</w:t>
+        <w:t>State the net equity of the group to which the company belongs for the specified years.</w:t>
       </w:r>
     </w:p>
     <w:p>
@@ -2546,7 +2578,53 @@
           <w:color w:val="595959"/>
           <w:sz w:val="18"/>
         </w:rPr>
-        <w:t>State the net equity of the group to which the company belongs for the specified years.</w:t>
+        <w:t>Where there is a complex corporate structure involving, for example, a financial or insurance group that is itself controlled by another group, for this question—as for all questions requesting group-related information—refer to the group to which the candidate company directly belongs.</w:t>
+      </w:r>
+    </w:p>
+    <w:p>
+      <w:pPr>
+        <w:keepNext w:val="0"/>
+        <w:spacing w:before="40" w:after="120"/>
+        <w:shd w:val="clear" w:color="auto" w:fill="F2F2F2"/>
+      </w:pPr>
+      <w:sdt>
+        <w:sdtPr>
+          <w:alias w:val="082GEA1740692"/>
+          <w:id w:val="100034"/>
+          <w:showingPlcHdr/>
+          <w:text/>
+        </w:sdtPr>
+        <w:sdtContent>
+          <w:r>
+            <w:t>Click or tap here to enter text.</w:t>
+          </w:r>
+        </w:sdtContent>
+      </w:sdt>
+    </w:p>
+    <w:p>
+      <w:pPr>
+        <w:keepNext/>
+        <w:spacing w:before="200" w:after="40"/>
+      </w:pPr>
+      <w:r>
+        <w:rPr>
+          <w:rFonts w:ascii="Arial" w:hAnsi="Arial" w:cs="Arial" w:eastAsia="Arial"/>
+          <w:b/>
+          <w:i w:val="0"/>
+          <w:color w:val="000000"/>
+          <w:sz w:val="20"/>
+        </w:rPr>
+        <w:t xml:space="preserve">- Net equity - Group to which the company belongs - Year 2023 </w:t>
+      </w:r>
+      <w:r>
+        <w:rPr>
+          <w:rFonts w:ascii="Arial" w:hAnsi="Arial" w:cs="Arial" w:eastAsia="Arial"/>
+          <w:b/>
+          <w:i w:val="0"/>
+          <w:color w:val="1C355E"/>
+          <w:sz w:val="17"/>
+        </w:rPr>
+        <w:t>-082GEA1745053-</w:t>
       </w:r>
     </w:p>
     <w:p>
@@ -2562,53 +2640,7 @@
           <w:color w:val="595959"/>
           <w:sz w:val="18"/>
         </w:rPr>
-        <w:t>Where there is a complex corporate structure involving, for example, a financial or insurance group that is itself controlled by another group, for this question—as for all questions requesting group-related information—refer to the group to which the candidate company directly belongs.</w:t>
-      </w:r>
-    </w:p>
-    <w:p>
-      <w:pPr>
-        <w:keepNext w:val="0"/>
-        <w:spacing w:before="40" w:after="120"/>
-        <w:shd w:val="clear" w:color="auto" w:fill="F2F2F2"/>
-      </w:pPr>
-      <w:sdt>
-        <w:sdtPr>
-          <w:alias w:val="082GEA1740692"/>
-          <w:id w:val="100034"/>
-          <w:showingPlcHdr/>
-          <w:text/>
-        </w:sdtPr>
-        <w:sdtContent>
-          <w:r>
-            <w:t>Click or tap here to enter text.</w:t>
-          </w:r>
-        </w:sdtContent>
-      </w:sdt>
-    </w:p>
-    <w:p>
-      <w:pPr>
-        <w:keepNext/>
-        <w:spacing w:before="200" w:after="40"/>
-      </w:pPr>
-      <w:r>
-        <w:rPr>
-          <w:rFonts w:ascii="Arial" w:hAnsi="Arial" w:cs="Arial" w:eastAsia="Arial"/>
-          <w:b/>
-          <w:i w:val="0"/>
-          <w:color w:val="000000"/>
-          <w:sz w:val="20"/>
-        </w:rPr>
-        <w:t xml:space="preserve">- Net equity - Group to which the company belongs - Year 2023 </w:t>
-      </w:r>
-      <w:r>
-        <w:rPr>
-          <w:rFonts w:ascii="Arial" w:hAnsi="Arial" w:cs="Arial" w:eastAsia="Arial"/>
-          <w:b/>
-          <w:i w:val="0"/>
-          <w:color w:val="1C355E"/>
-          <w:sz w:val="17"/>
-        </w:rPr>
-        <w:t>-082GEA1745053-</w:t>
+        <w:t>The figures must be expressed in millions of euros. Enter numerical values only. If the figure is unavailable, leave the field blank and do not enter “N/A” or similar annotations.</w:t>
       </w:r>
     </w:p>
     <w:p>
@@ -2624,7 +2656,7 @@
           <w:color w:val="595959"/>
           <w:sz w:val="18"/>
         </w:rPr>
-        <w:t>The figures must be expressed in millions of euros. Enter numerical values only. If the figure is unavailable, leave the field blank and do not enter “N/A” or similar annotations.</w:t>
+        <w:t>WARNING: Information that cannot be interpreted unambiguously will result in a score of zero.</w:t>
       </w:r>
     </w:p>
     <w:p>
@@ -2640,7 +2672,53 @@
           <w:color w:val="595959"/>
           <w:sz w:val="18"/>
         </w:rPr>
-        <w:t>WARNING: Information that cannot be interpreted unambiguously will result in a score of zero.</w:t>
+        <w:t>XX 2 decimal places</w:t>
+      </w:r>
+    </w:p>
+    <w:p>
+      <w:pPr>
+        <w:keepNext w:val="0"/>
+        <w:spacing w:before="40" w:after="120"/>
+        <w:shd w:val="clear" w:color="auto" w:fill="F2F2F2"/>
+      </w:pPr>
+      <w:sdt>
+        <w:sdtPr>
+          <w:alias w:val="082GEA1745053"/>
+          <w:id w:val="100035"/>
+          <w:showingPlcHdr/>
+          <w:text/>
+        </w:sdtPr>
+        <w:sdtContent>
+          <w:r>
+            <w:t>Click or tap here to enter text.</w:t>
+          </w:r>
+        </w:sdtContent>
+      </w:sdt>
+    </w:p>
+    <w:p>
+      <w:pPr>
+        <w:keepNext/>
+        <w:spacing w:before="200" w:after="40"/>
+      </w:pPr>
+      <w:r>
+        <w:rPr>
+          <w:rFonts w:ascii="Arial" w:hAnsi="Arial" w:cs="Arial" w:eastAsia="Arial"/>
+          <w:b/>
+          <w:i w:val="0"/>
+          <w:color w:val="000000"/>
+          <w:sz w:val="20"/>
+        </w:rPr>
+        <w:t xml:space="preserve">- Net equity - Group to which the company belongs - Year 2024 </w:t>
+      </w:r>
+      <w:r>
+        <w:rPr>
+          <w:rFonts w:ascii="Arial" w:hAnsi="Arial" w:cs="Arial" w:eastAsia="Arial"/>
+          <w:b/>
+          <w:i w:val="0"/>
+          <w:color w:val="1C355E"/>
+          <w:sz w:val="17"/>
+        </w:rPr>
+        <w:t>-082GEA1745251-</w:t>
       </w:r>
     </w:p>
     <w:p>
@@ -2656,53 +2734,7 @@
           <w:color w:val="595959"/>
           <w:sz w:val="18"/>
         </w:rPr>
-        <w:t>XX 2 decimal places</w:t>
-      </w:r>
-    </w:p>
-    <w:p>
-      <w:pPr>
-        <w:keepNext w:val="0"/>
-        <w:spacing w:before="40" w:after="120"/>
-        <w:shd w:val="clear" w:color="auto" w:fill="F2F2F2"/>
-      </w:pPr>
-      <w:sdt>
-        <w:sdtPr>
-          <w:alias w:val="082GEA1745053"/>
-          <w:id w:val="100035"/>
-          <w:showingPlcHdr/>
-          <w:text/>
-        </w:sdtPr>
-        <w:sdtContent>
-          <w:r>
-            <w:t>Click or tap here to enter text.</w:t>
-          </w:r>
-        </w:sdtContent>
-      </w:sdt>
-    </w:p>
-    <w:p>
-      <w:pPr>
-        <w:keepNext/>
-        <w:spacing w:before="200" w:after="40"/>
-      </w:pPr>
-      <w:r>
-        <w:rPr>
-          <w:rFonts w:ascii="Arial" w:hAnsi="Arial" w:cs="Arial" w:eastAsia="Arial"/>
-          <w:b/>
-          <w:i w:val="0"/>
-          <w:color w:val="000000"/>
-          <w:sz w:val="20"/>
-        </w:rPr>
-        <w:t xml:space="preserve">- Net equity - Group to which the company belongs - Year 2024 </w:t>
-      </w:r>
-      <w:r>
-        <w:rPr>
-          <w:rFonts w:ascii="Arial" w:hAnsi="Arial" w:cs="Arial" w:eastAsia="Arial"/>
-          <w:b/>
-          <w:i w:val="0"/>
-          <w:color w:val="1C355E"/>
-          <w:sz w:val="17"/>
-        </w:rPr>
-        <w:t>-082GEA1745251-</w:t>
+        <w:t>The figures must be expressed in millions of euros. Enter numerical values only. If the figure is unavailable, leave the field blank and do not enter “N/A” or similar annotations.</w:t>
       </w:r>
     </w:p>
     <w:p>
@@ -2718,7 +2750,7 @@
           <w:color w:val="595959"/>
           <w:sz w:val="18"/>
         </w:rPr>
-        <w:t>The figures must be expressed in millions of euros. Enter numerical values only. If the figure is unavailable, leave the field blank and do not enter “N/A” or similar annotations.</w:t>
+        <w:t>WARNING: Information that cannot be interpreted unambiguously will result in a score of zero.</w:t>
       </w:r>
     </w:p>
     <w:p>
@@ -2734,7 +2766,53 @@
           <w:color w:val="595959"/>
           <w:sz w:val="18"/>
         </w:rPr>
-        <w:t>WARNING: Information that cannot be interpreted unambiguously will result in a score of zero.</w:t>
+        <w:t>XX 2 decimal places</w:t>
+      </w:r>
+    </w:p>
+    <w:p>
+      <w:pPr>
+        <w:keepNext w:val="0"/>
+        <w:spacing w:before="40" w:after="120"/>
+        <w:shd w:val="clear" w:color="auto" w:fill="F2F2F2"/>
+      </w:pPr>
+      <w:sdt>
+        <w:sdtPr>
+          <w:alias w:val="082GEA1745251"/>
+          <w:id w:val="100036"/>
+          <w:showingPlcHdr/>
+          <w:text/>
+        </w:sdtPr>
+        <w:sdtContent>
+          <w:r>
+            <w:t>Click or tap here to enter text.</w:t>
+          </w:r>
+        </w:sdtContent>
+      </w:sdt>
+    </w:p>
+    <w:p>
+      <w:pPr>
+        <w:keepNext/>
+        <w:spacing w:before="200" w:after="40"/>
+      </w:pPr>
+      <w:r>
+        <w:rPr>
+          <w:rFonts w:ascii="Arial" w:hAnsi="Arial" w:cs="Arial" w:eastAsia="Arial"/>
+          <w:b/>
+          <w:i w:val="0"/>
+          <w:color w:val="000000"/>
+          <w:sz w:val="20"/>
+        </w:rPr>
+        <w:t xml:space="preserve">- Net equity - Group to which the company belongs - Year 2025 </w:t>
+      </w:r>
+      <w:r>
+        <w:rPr>
+          <w:rFonts w:ascii="Arial" w:hAnsi="Arial" w:cs="Arial" w:eastAsia="Arial"/>
+          <w:b/>
+          <w:i w:val="0"/>
+          <w:color w:val="1C355E"/>
+          <w:sz w:val="17"/>
+        </w:rPr>
+        <w:t>-082GEA1745473-</w:t>
       </w:r>
     </w:p>
     <w:p>
@@ -2750,53 +2828,7 @@
           <w:color w:val="595959"/>
           <w:sz w:val="18"/>
         </w:rPr>
-        <w:t>XX 2 decimal places</w:t>
-      </w:r>
-    </w:p>
-    <w:p>
-      <w:pPr>
-        <w:keepNext w:val="0"/>
-        <w:spacing w:before="40" w:after="120"/>
-        <w:shd w:val="clear" w:color="auto" w:fill="F2F2F2"/>
-      </w:pPr>
-      <w:sdt>
-        <w:sdtPr>
-          <w:alias w:val="082GEA1745251"/>
-          <w:id w:val="100036"/>
-          <w:showingPlcHdr/>
-          <w:text/>
-        </w:sdtPr>
-        <w:sdtContent>
-          <w:r>
-            <w:t>Click or tap here to enter text.</w:t>
-          </w:r>
-        </w:sdtContent>
-      </w:sdt>
-    </w:p>
-    <w:p>
-      <w:pPr>
-        <w:keepNext/>
-        <w:spacing w:before="200" w:after="40"/>
-      </w:pPr>
-      <w:r>
-        <w:rPr>
-          <w:rFonts w:ascii="Arial" w:hAnsi="Arial" w:cs="Arial" w:eastAsia="Arial"/>
-          <w:b/>
-          <w:i w:val="0"/>
-          <w:color w:val="000000"/>
-          <w:sz w:val="20"/>
-        </w:rPr>
-        <w:t xml:space="preserve">- Net equity - Group to which the company belongs - Year 2025 </w:t>
-      </w:r>
-      <w:r>
-        <w:rPr>
-          <w:rFonts w:ascii="Arial" w:hAnsi="Arial" w:cs="Arial" w:eastAsia="Arial"/>
-          <w:b/>
-          <w:i w:val="0"/>
-          <w:color w:val="1C355E"/>
-          <w:sz w:val="17"/>
-        </w:rPr>
-        <w:t>-082GEA1745473-</w:t>
+        <w:t>The figures must be expressed in millions of euros. Enter numerical values only. If the figure is unavailable, leave the field blank and do not enter “N/A” or similar annotations.</w:t>
       </w:r>
     </w:p>
     <w:p>
@@ -2812,7 +2844,7 @@
           <w:color w:val="595959"/>
           <w:sz w:val="18"/>
         </w:rPr>
-        <w:t>The figures must be expressed in millions of euros. Enter numerical values only. If the figure is unavailable, leave the field blank and do not enter “N/A” or similar annotations.</w:t>
+        <w:t>WARNING: Information that cannot be interpreted unambiguously will result in a score of zero.</w:t>
       </w:r>
     </w:p>
     <w:p>
@@ -2828,22 +2860,6 @@
           <w:color w:val="595959"/>
           <w:sz w:val="18"/>
         </w:rPr>
-        <w:t>WARNING: Information that cannot be interpreted unambiguously will result in a score of zero.</w:t>
-      </w:r>
-    </w:p>
-    <w:p>
-      <w:pPr>
-        <w:keepNext/>
-        <w:spacing w:before="0" w:after="40"/>
-      </w:pPr>
-      <w:r>
-        <w:rPr>
-          <w:rFonts w:ascii="Arial" w:hAnsi="Arial" w:cs="Arial" w:eastAsia="Arial"/>
-          <w:b w:val="0"/>
-          <w:i/>
-          <w:color w:val="595959"/>
-          <w:sz w:val="18"/>
-        </w:rPr>
         <w:t>XX 2 decimal places</w:t>
       </w:r>
     </w:p>
@@ -2904,11 +2920,15 @@
           <w:alias w:val="082GEA1740712"/>
           <w:id w:val="100038"/>
           <w:showingPlcHdr/>
-          <w:text/>
-        </w:sdtPr>
-        <w:sdtContent>
-          <w:r>
-            <w:t>Click or tap here to enter text.</w:t>
+          <w:dropDownList>
+            <w:listItem w:displayText="Choose an item." w:value=""/>
+            <w:listItem w:displayText="1 - The reported figures were affected by significant events" w:value="1 - The reported figures were affected by significant events"/>
+            <w:listItem w:displayText="2 - The reported figures were not affected by significant events" w:value="2 - The reported figures were not affected by significant events"/>
+          </w:dropDownList>
+        </w:sdtPr>
+        <w:sdtContent>
+          <w:r>
+            <w:t>Choose an item.</w:t>
           </w:r>
         </w:sdtContent>
       </w:sdt>
@@ -3172,11 +3192,15 @@
           <w:alias w:val="082GEA1730667"/>
           <w:id w:val="100042"/>
           <w:showingPlcHdr/>
-          <w:text/>
-        </w:sdtPr>
-        <w:sdtContent>
-          <w:r>
-            <w:t>Click or tap here to enter text.</w:t>
+          <w:dropDownList>
+            <w:listItem w:displayText="Choose an item." w:value=""/>
+            <w:listItem w:displayText="1 - No processes to review the corporate structure are under way" w:value="1 - No processes to review the corporate structure are under way"/>
+            <w:listItem w:displayText="2 - Processes to review the corporate structure are under way" w:value="2 - Processes to review the corporate structure are under way"/>
+          </w:dropDownList>
+        </w:sdtPr>
+        <w:sdtContent>
+          <w:r>
+            <w:t>Choose an item.</w:t>
           </w:r>
         </w:sdtContent>
       </w:sdt>
@@ -4696,11 +4720,47 @@
           <w:alias w:val="082GEK2201718"/>
           <w:id w:val="100066"/>
           <w:showingPlcHdr/>
-          <w:text/>
-        </w:sdtPr>
-        <w:sdtContent>
-          <w:r>
-            <w:t>Click or tap here to enter text.</w:t>
+          <w:dropDownList>
+            <w:listItem w:displayText="Choose an item." w:value=""/>
+            <w:listItem w:displayText="Australia" w:value="Australia"/>
+            <w:listItem w:displayText="Austria" w:value="Austria"/>
+            <w:listItem w:displayText="Belgium" w:value="Belgium"/>
+            <w:listItem w:displayText="Canada" w:value="Canada"/>
+            <w:listItem w:displayText="Cyprus" w:value="Cyprus"/>
+            <w:listItem w:displayText="Denmark" w:value="Denmark"/>
+            <w:listItem w:displayText="Estonia" w:value="Estonia"/>
+            <w:listItem w:displayText="Finland" w:value="Finland"/>
+            <w:listItem w:displayText="France" w:value="France"/>
+            <w:listItem w:displayText="Germany" w:value="Germany"/>
+            <w:listItem w:displayText="Japan" w:value="Japan"/>
+            <w:listItem w:displayText="Greece" w:value="Greece"/>
+            <w:listItem w:displayText="Ireland" w:value="Ireland"/>
+            <w:listItem w:displayText="Iceland" w:value="Iceland"/>
+            <w:listItem w:displayText="Italy" w:value="Italy"/>
+            <w:listItem w:displayText="Latvia" w:value="Latvia"/>
+            <w:listItem w:displayText="Liechtenstein" w:value="Liechtenstein"/>
+            <w:listItem w:displayText="Lithuania" w:value="Lithuania"/>
+            <w:listItem w:displayText="Luxembourg" w:value="Luxembourg"/>
+            <w:listItem w:displayText="Malta" w:value="Malta"/>
+            <w:listItem w:displayText="Norway" w:value="Norway"/>
+            <w:listItem w:displayText="Netherlands" w:value="Netherlands"/>
+            <w:listItem w:displayText="Poland" w:value="Poland"/>
+            <w:listItem w:displayText="Portugal" w:value="Portugal"/>
+            <w:listItem w:displayText="United Kingdom" w:value="United Kingdom"/>
+            <w:listItem w:displayText="Czech Republic" w:value="Czech Republic"/>
+            <w:listItem w:displayText="Slovakia" w:value="Slovakia"/>
+            <w:listItem w:displayText="Slovenia" w:value="Slovenia"/>
+            <w:listItem w:displayText="Spain" w:value="Spain"/>
+            <w:listItem w:displayText="United States" w:value="United States"/>
+            <w:listItem w:displayText="Sweden" w:value="Sweden"/>
+            <w:listItem w:displayText="Switzerland" w:value="Switzerland"/>
+            <w:listItem w:displayText="Hungary" w:value="Hungary"/>
+            <w:listItem w:displayText="Other country" w:value="Other country"/>
+          </w:dropDownList>
+        </w:sdtPr>
+        <w:sdtContent>
+          <w:r>
+            <w:t>Choose an item.</w:t>
           </w:r>
         </w:sdtContent>
       </w:sdt>
@@ -7304,8 +7364,8 @@
           <w:showingPlcHdr/>
           <w:dropDownList>
             <w:listItem w:displayText="Choose an item." w:value=""/>
-            <w:listItem w:displayText="1 - I valori riportati sono stati influenzati da fatti rilevanti" w:value="1 - I valori riportati sono stati influenzati da fatti rilevanti"/>
-            <w:listItem w:displayText="2 - I valori riportati non sono stati influenzati da fatti rilevanti" w:value="2 - I valori riportati non sono stati influenzati da fatti rilevanti"/>
+            <w:listItem w:displayText="1 - The reported figures were affected by significant events" w:value="1 - The reported figures were affected by significant events"/>
+            <w:listItem w:displayText="2 - The reported figures were not affected by significant events" w:value="2 - The reported figures were not affected by significant events"/>
           </w:dropDownList>
         </w:sdtPr>
         <w:sdtContent>
@@ -7636,8 +7696,8 @@
           <w:showingPlcHdr/>
           <w:dropDownList>
             <w:listItem w:displayText="Choose an item." w:value=""/>
-            <w:listItem w:displayText="1 - I valori riportati sono stati influenzati da fatti rilevanti" w:value="1 - I valori riportati sono stati influenzati da fatti rilevanti"/>
-            <w:listItem w:displayText="2 - I valori riportati non sono stati influenzati da fatti rilevanti" w:value="2 - I valori riportati non sono stati influenzati da fatti rilevanti"/>
+            <w:listItem w:displayText="1 - The reported figures were affected by significant events" w:value="1 - The reported figures were affected by significant events"/>
+            <w:listItem w:displayText="2 - The reported figures were not affected by significant events" w:value="2 - The reported figures were not affected by significant events"/>
           </w:dropDownList>
         </w:sdtPr>
         <w:sdtContent>
@@ -9894,11 +9954,11 @@
           <w:showingPlcHdr/>
           <w:dropDownList>
             <w:listItem w:displayText="Choose an item." w:value=""/>
-            <w:listItem w:displayText="1 - Non viene seguito uno stile specifico in modo prevalente" w:value="1 - Non viene seguito uno stile specifico in modo prevalente"/>
-            <w:listItem w:displayText="2 - Gestione growth" w:value="2 - Gestione growth"/>
-            <w:listItem w:displayText="3 - Gestione value" w:value="3 - Gestione value"/>
-            <w:listItem w:displayText="4 - Gestione blended" w:value="4 - Gestione blended"/>
-            <w:listItem w:displayText="5 - Altro" w:value="5 - Altro"/>
+            <w:listItem w:displayText="1 - No specific style is predominantly followed" w:value="1 - No specific style is predominantly followed"/>
+            <w:listItem w:displayText="2 - Growth management" w:value="2 - Growth management"/>
+            <w:listItem w:displayText="3 - Value management" w:value="3 - Value management"/>
+            <w:listItem w:displayText="4 - Blended management" w:value="4 - Blended management"/>
+            <w:listItem w:displayText="5 - Other" w:value="5 - Other"/>
           </w:dropDownList>
         </w:sdtPr>
         <w:sdtContent>
@@ -10039,8 +10099,8 @@
           <w:showingPlcHdr/>
           <w:dropDownList>
             <w:listItem w:displayText="Choose an item." w:value=""/>
-            <w:listItem w:displayText="1 - Lo stile che verra adottato nel mandato corrisponde a quello prevalente che caratterizza la gestione della societa candidata" w:value="1 - Lo stile che verra adottato nel mandato corrisponde a quello prevalente che caratterizza la gestione della societa candidata"/>
-            <w:listItem w:displayText="2 - Lo stile che verra adottato nel mandato non corrisponde a quello prevalente che caratterizza la gestione della societa candidata" w:value="2 - Lo stile che verra adottato nel mandato non corrisponde a quello prevalente che caratterizza la gestione della societa candidata"/>
+            <w:listItem w:displayText="1 - The style adopted for the mandate corresponds to the predominant style of the candidate company's management" w:value="1 - The style adopted for the mandate corresponds to the predominant style of the candidate company's management"/>
+            <w:listItem w:displayText="2 - The style adopted for the mandate does not correspond to the predominant style of the candidate company's management" w:value="2 - The style adopted for the mandate does not correspond to the predominant style of the candidate company's management"/>
           </w:dropDownList>
         </w:sdtPr>
         <w:sdtContent>
@@ -10121,8 +10181,8 @@
           <w:showingPlcHdr/>
           <w:dropDownList>
             <w:listItem w:displayText="Choose an item." w:value=""/>
-            <w:listItem w:displayText="1 - Si, il mandato verra eseguito coinvolgendo direttamente piu di un team di gestione" w:value="1 - Si, il mandato verra eseguito coinvolgendo direttamente piu di un team di gestione"/>
-            <w:listItem w:displayText="2 - No, il mandato verra eseguito coinvolgendo direttamente un unico team di gestione" w:value="2 - No, il mandato verra eseguito coinvolgendo direttamente un unico team di gestione"/>
+            <w:listItem w:displayText="1 - Yes, the mandate will be carried out with direct involvement of more than one management team" w:value="1 - Yes, the mandate will be carried out with direct involvement of more than one management team"/>
+            <w:listItem w:displayText="2 - No, the mandate will be carried out with direct involvement of a single management team" w:value="2 - No, the mandate will be carried out with direct involvement of a single management team"/>
           </w:dropDownList>
         </w:sdtPr>
         <w:sdtContent>
@@ -10389,8 +10449,8 @@
           <w:showingPlcHdr/>
           <w:dropDownList>
             <w:listItem w:displayText="Choose an item." w:value=""/>
-            <w:listItem w:displayText="1 - Esiste un team di gestione dedicato alla clientela istituzionale" w:value="1 - Esiste un team di gestione dedicato alla clientela istituzionale"/>
-            <w:listItem w:displayText="2 - Non esiste un team di gestione dedicato alla clientela istituzionale" w:value="2 - Non esiste un team di gestione dedicato alla clientela istituzionale"/>
+            <w:listItem w:displayText="1 - A management team dedicated to institutional clients exists" w:value="1 - A management team dedicated to institutional clients exists"/>
+            <w:listItem w:displayText="2 - No management team dedicated to institutional clients exists" w:value="2 - No management team dedicated to institutional clients exists"/>
           </w:dropDownList>
         </w:sdtPr>
         <w:sdtContent>
@@ -10485,8 +10545,8 @@
           <w:showingPlcHdr/>
           <w:dropDownList>
             <w:listItem w:displayText="Choose an item." w:value=""/>
-            <w:listItem w:displayText="1 - Il team gestisce esclusivamente mandati segregati" w:value="1 - Il team gestisce esclusivamente mandati segregati"/>
-            <w:listItem w:displayText="2 - Il team gestisce anche OICR/gestioni in monte/gestioni del ramo vita" w:value="2 - Il team gestisce anche OICR/gestioni in monte/gestioni del ramo vita"/>
+            <w:listItem w:displayText="1 - The team manages exclusively segregated mandates" w:value="1 - The team manages exclusively segregated mandates"/>
+            <w:listItem w:displayText="2 - The team also manages UCITS / pooled funds / life insurance portfolios" w:value="2 - The team also manages UCITS / pooled funds / life insurance portfolios"/>
           </w:dropDownList>
         </w:sdtPr>
         <w:sdtContent>
@@ -12185,9 +12245,9 @@
           <w:showingPlcHdr/>
           <w:dropDownList>
             <w:listItem w:displayText="Choose an item." w:value=""/>
-            <w:listItem w:displayText="1 - Si, all'interno della societa esiste un team specialistico al quale e affidata la gestione del rischio cambio" w:value="1 - Si, all'interno della societa esiste un team specialistico al quale e affidata la gestione del rischio cambio"/>
-            <w:listItem w:displayText="2 - No, all'interno della societa non esiste un team specialistico sui cambi, ma lo stesso e presente a livello di gruppo" w:value="2 - No, all'interno della societa non esiste un team specialistico sui cambi, ma lo stesso e presente a livello di gruppo"/>
-            <w:listItem w:displayText="3 - No, all'interno della societa non esiste un team specialistico al quale e affidato la gestione del rischio cambio" w:value="3 - No, all'interno della societa non esiste un team specialistico al quale e affidato la gestione del rischio cambio"/>
+            <w:listItem w:displayText="1 - Yes, the company has a specialist team to which currency risk management is assigned" w:value="1 - Yes, the company has a specialist team to which currency risk management is assigned"/>
+            <w:listItem w:displayText="2 - No, the company has no specialist currency team, but one exists at group level" w:value="2 - No, the company has no specialist currency team, but one exists at group level"/>
+            <w:listItem w:displayText="3 - No, the company has no specialist team to which currency risk management is assigned" w:value="3 - No, the company has no specialist team to which currency risk management is assigned"/>
           </w:dropDownList>
         </w:sdtPr>
         <w:sdtContent>
@@ -12236,8 +12296,8 @@
           <w:showingPlcHdr/>
           <w:dropDownList>
             <w:listItem w:displayText="Choose an item." w:value=""/>
-            <w:listItem w:displayText="1 - Si, il team sara direttamente coinvolto nella gestione del mandato" w:value="1 - Si, il team sara direttamente coinvolto nella gestione del mandato"/>
-            <w:listItem w:displayText="2 - No, il team non sara direttamente coinvolto nella gestione del mandato" w:value="2 - No, il team non sara direttamente coinvolto nella gestione del mandato"/>
+            <w:listItem w:displayText="1 - Yes, the team will be directly involved in managing the mandate" w:value="1 - Yes, the team will be directly involved in managing the mandate"/>
+            <w:listItem w:displayText="2 - No, the team will not be directly involved in managing the mandate" w:value="2 - No, the team will not be directly involved in managing the mandate"/>
           </w:dropDownList>
         </w:sdtPr>
         <w:sdtContent>
@@ -12948,8 +13008,8 @@
           <w:showingPlcHdr/>
           <w:dropDownList>
             <w:listItem w:displayText="Choose an item." w:value=""/>
-            <w:listItem w:displayText="1 - Si, i gestori dispongono di strumenti on line in grado di monitorare il grado di esposizione al rischio dei portafogli gestiti" w:value="1 - Si, i gestori dispongono di strumenti on line in grado di monitorare il grado di esposizione al rischio dei portafogli gestiti"/>
-            <w:listItem w:displayText="2 - No, i gestori non dispongono di strumenti on line in grado di monitorare il grado di esposizione al rischio dei portafogli gestiti" w:value="2 - No, i gestori non dispongono di strumenti on line in grado di monitorare il grado di esposizione al rischio dei portafogli gestiti"/>
+            <w:listItem w:displayText="1 - Yes, managers have online tools to monitor the risk exposure of the managed portfolios" w:value="1 - Yes, managers have online tools to monitor the risk exposure of the managed portfolios"/>
+            <w:listItem w:displayText="2 - No, managers do not have online tools to monitor the risk exposure of the managed portfolios" w:value="2 - No, managers do not have online tools to monitor the risk exposure of the managed portfolios"/>
           </w:dropDownList>
         </w:sdtPr>
         <w:sdtContent>
@@ -12998,8 +13058,8 @@
           <w:showingPlcHdr/>
           <w:dropDownList>
             <w:listItem w:displayText="Choose an item." w:value=""/>
-            <w:listItem w:displayText="1 - Si, i gestori dispongono di strumento on line in grado di evidenziare l'impatto sul rischio nassunto dell'introduzione di singoli titoli nel portafoglio" w:value="1 - Si, i gestori dispongono di strumento on line in grado di evidenziare l'impatto sul rischio nassunto dell'introduzione di singoli titoli nel portafoglio"/>
-            <w:listItem w:displayText="2 - No, i gestori non dispongono di strumento on line in grado di evidenziare l'impatto sul rischio nassunto dell'introduzione di singoli titoli nel portafoglio" w:value="2 - No, i gestori non dispongono di strumento on line in grado di evidenziare l'impatto sul rischio nassunto dell'introduzione di singoli titoli nel portafoglio"/>
+            <w:listItem w:displayText="1 - Yes, managers have an online tool showing the impact on risk taken of introducing individual securities into the portfolio" w:value="1 - Yes, managers have an online tool showing the impact on risk taken of introducing individual securities into the portfolio"/>
+            <w:listItem w:displayText="2 - No, managers do not have an online tool showing the impact on risk taken of introducing individual securities into the portfolio" w:value="2 - No, managers do not have an online tool showing the impact on risk taken of introducing individual securities into the portfolio"/>
           </w:dropDownList>
         </w:sdtPr>
         <w:sdtContent>
@@ -13048,8 +13108,8 @@
           <w:showingPlcHdr/>
           <w:dropDownList>
             <w:listItem w:displayText="Choose an item." w:value=""/>
-            <w:listItem w:displayText="1 - Il sistema con il quale operano i gestori prevede dei meccanismi bloccanti automatici legati all'esposizione al rischio" w:value="1 - Il sistema con il quale operano i gestori prevede dei meccanismi bloccanti automatici legati all'esposizione al rischio"/>
-            <w:listItem w:displayText="2 - Il sistema con il quale operano i gestori non prevede dei meccanismi bloccanti automatici legati all'esposizione al rischio" w:value="2 - Il sistema con il quale operano i gestori non prevede dei meccanismi bloccanti automatici legati all'esposizione al rischio"/>
+            <w:listItem w:displayText="1 - The system used by managers provides for automatic blocking mechanisms linked to risk exposure" w:value="1 - The system used by managers provides for automatic blocking mechanisms linked to risk exposure"/>
+            <w:listItem w:displayText="2 - The system used by managers does not provide for automatic blocking mechanisms linked to risk exposure" w:value="2 - The system used by managers does not provide for automatic blocking mechanisms linked to risk exposure"/>
           </w:dropDownList>
         </w:sdtPr>
         <w:sdtContent>
@@ -13098,8 +13158,8 @@
           <w:showingPlcHdr/>
           <w:dropDownList>
             <w:listItem w:displayText="Choose an item." w:value=""/>
-            <w:listItem w:displayText="1 - Gli incentivi retributivi dei gestori prevedono un indicatore legato al rischio assunto nei portafogli" w:value="1 - Gli incentivi retributivi dei gestori prevedono un indicatore legato al rischio assunto nei portafogli"/>
-            <w:listItem w:displayText="2 - Gli incentivi retributivi dei gestori non prevedono un indicatore legato al rischio assunto nei portafogli" w:value="2 - Gli incentivi retributivi dei gestori non prevedono un indicatore legato al rischio assunto nei portafogli"/>
+            <w:listItem w:displayText="1 - Managers' remuneration incentives include an indicator linked to the risk taken in the portfolios" w:value="1 - Managers' remuneration incentives include an indicator linked to the risk taken in the portfolios"/>
+            <w:listItem w:displayText="2 - Managers' remuneration incentives do not include an indicator linked to the risk taken in the portfolios" w:value="2 - Managers' remuneration incentives do not include an indicator linked to the risk taken in the portfolios"/>
           </w:dropDownList>
         </w:sdtPr>
         <w:sdtContent>
@@ -13196,8 +13256,8 @@
           <w:showingPlcHdr/>
           <w:dropDownList>
             <w:listItem w:displayText="Choose an item." w:value=""/>
-            <w:listItem w:displayText="1 - Si, la gestione prevede l'applicazione di meccanismi di stop loss e gli stessi saranno applicati al mandato in oggetto" w:value="1 - Si, la gestione prevede l'applicazione di meccanismi di stop loss e gli stessi saranno applicati al mandato in oggetto"/>
-            <w:listItem w:displayText="2 - No, la gestione non prevede l'applicazione di meccanismi di stop loss" w:value="2 - No, la gestione non prevede l'applicazione di meccanismi di stop loss"/>
+            <w:listItem w:displayText="1 - Yes, the management provides for stop-loss mechanisms, which will be applied to the mandate concerned" w:value="1 - Yes, the management provides for stop-loss mechanisms, which will be applied to the mandate concerned"/>
+            <w:listItem w:displayText="2 - No, the management does not provide for stop-loss mechanisms" w:value="2 - No, the management does not provide for stop-loss mechanisms"/>
           </w:dropDownList>
         </w:sdtPr>
         <w:sdtContent>
@@ -13424,8 +13484,8 @@
           <w:showingPlcHdr/>
           <w:dropDownList>
             <w:listItem w:displayText="Choose an item." w:value=""/>
-            <w:listItem w:displayText="1 - Si, esistono due strutture distinte per la gestione dell'obbligazionario governativo e corporate" w:value="1 - Si, esistono due strutture distinte per la gestione dell'obbligazionario governativo e corporate"/>
-            <w:listItem w:displayText="2 - No, obbligazionario governativo e corporate vengono gestite all'interno della stessa struttura" w:value="2 - No, obbligazionario governativo e corporate vengono gestite all'interno della stessa struttura"/>
+            <w:listItem w:displayText="1 - Yes, there are two separate structures for managing government and corporate bonds" w:value="1 - Yes, there are two separate structures for managing government and corporate bonds"/>
+            <w:listItem w:displayText="2 - No, government and corporate bonds are managed within the same structure" w:value="2 - No, government and corporate bonds are managed within the same structure"/>
           </w:dropDownList>
         </w:sdtPr>
         <w:sdtContent>
@@ -13490,9 +13550,9 @@
           <w:showingPlcHdr/>
           <w:dropDownList>
             <w:listItem w:displayText="Choose an item." w:value=""/>
-            <w:listItem w:displayText="1 - La struttura di gestione e articolata per aree geografiche" w:value="1 - La struttura di gestione e articolata per aree geografiche"/>
-            <w:listItem w:displayText="2 - La struttura di gestione e articolata per tratti di curva" w:value="2 - La struttura di gestione e articolata per tratti di curva"/>
-            <w:listItem w:displayText="3 - Altro" w:value="3 - Altro"/>
+            <w:listItem w:displayText="1 - The management structure is organised by geographic area" w:value="1 - The management structure is organised by geographic area"/>
+            <w:listItem w:displayText="2 - The management structure is organised by yield-curve segments" w:value="2 - The management structure is organised by yield-curve segments"/>
+            <w:listItem w:displayText="3 - Other" w:value="3 - Other"/>
           </w:dropDownList>
         </w:sdtPr>
         <w:sdtContent>
@@ -14408,38 +14468,6 @@
           <w:sz w:val="17"/>
         </w:rPr>
         <w:t>-082GED1981351-</w:t>
-      </w:r>
-    </w:p>
-    <w:p>
-      <w:pPr>
-        <w:keepNext/>
-        <w:spacing w:before="0" w:after="40"/>
-      </w:pPr>
-      <w:r>
-        <w:rPr>
-          <w:rFonts w:ascii="Arial" w:hAnsi="Arial" w:cs="Arial" w:eastAsia="Arial"/>
-          <w:b w:val="0"/>
-          <w:i/>
-          <w:color w:val="595959"/>
-          <w:sz w:val="18"/>
-        </w:rPr>
-        <w:t>Respond using only the list provided. Any notes must be entered in the Word file to be attached.</w:t>
-      </w:r>
-    </w:p>
-    <w:p>
-      <w:pPr>
-        <w:keepNext/>
-        <w:spacing w:before="0" w:after="40"/>
-      </w:pPr>
-      <w:r>
-        <w:rPr>
-          <w:rFonts w:ascii="Arial" w:hAnsi="Arial" w:cs="Arial" w:eastAsia="Arial"/>
-          <w:b w:val="0"/>
-          <w:i/>
-          <w:color w:val="595959"/>
-          <w:sz w:val="18"/>
-        </w:rPr>
-        <w:t>Options not visible in the video: complete from the portal list.</w:t>
       </w:r>
     </w:p>
     <w:p>
@@ -14522,7 +14550,7 @@
           <w:color w:val="000000"/>
           <w:sz w:val="20"/>
         </w:rPr>
-        <w:t xml:space="preserve">Government bonds – Selection – Second factor </w:t>
+        <w:t xml:space="preserve">- Government bonds - Selection - Second factor </w:t>
       </w:r>
       <w:r>
         <w:rPr>
@@ -14578,326 +14606,6 @@
     </w:p>
     <w:p>
       <w:pPr>
-        <w:keepNext w:val="0"/>
-        <w:spacing w:before="40" w:after="80"/>
-      </w:pPr>
-      <w:r>
-        <w:rPr>
-          <w:rFonts w:ascii="Arial" w:hAnsi="Arial" w:cs="Arial" w:eastAsia="Arial"/>
-          <w:b w:val="0"/>
-          <w:i/>
-          <w:color w:val="595959"/>
-          <w:sz w:val="18"/>
-        </w:rPr>
-        <w:t>- Government bonds - Selection - Second factor - 082GED1981354-</w:t>
-      </w:r>
-    </w:p>
-    <w:p>
-      <w:pPr>
-        <w:keepNext w:val="0"/>
-        <w:spacing w:before="40" w:after="80"/>
-      </w:pPr>
-      <w:r>
-        <w:rPr>
-          <w:rFonts w:ascii="Arial" w:hAnsi="Arial" w:cs="Arial" w:eastAsia="Arial"/>
-          <w:b w:val="0"/>
-          <w:i/>
-          <w:color w:val="595959"/>
-          <w:sz w:val="18"/>
-        </w:rPr>
-        <w:t>Macroeconomic and fundamental analysis</w:t>
-      </w:r>
-    </w:p>
-    <w:p>
-      <w:pPr>
-        <w:keepNext w:val="0"/>
-        <w:spacing w:before="40" w:after="80"/>
-      </w:pPr>
-      <w:r>
-        <w:rPr>
-          <w:rFonts w:ascii="Arial" w:hAnsi="Arial" w:cs="Arial" w:eastAsia="Arial"/>
-          <w:b w:val="0"/>
-          <w:i/>
-          <w:color w:val="595959"/>
-          <w:sz w:val="18"/>
-        </w:rPr>
-        <w:t>Technical analysis</w:t>
-      </w:r>
-    </w:p>
-    <w:p>
-      <w:pPr>
-        <w:keepNext w:val="0"/>
-        <w:spacing w:before="40" w:after="80"/>
-      </w:pPr>
-      <w:r>
-        <w:rPr>
-          <w:rFonts w:ascii="Arial" w:hAnsi="Arial" w:cs="Arial" w:eastAsia="Arial"/>
-          <w:b w:val="0"/>
-          <w:i/>
-          <w:color w:val="595959"/>
-          <w:sz w:val="18"/>
-        </w:rPr>
-        <w:t>Portfolio manager's investment convictions</w:t>
-      </w:r>
-    </w:p>
-    <w:p>
-      <w:pPr>
-        <w:keepNext w:val="0"/>
-        <w:spacing w:before="40" w:after="80"/>
-      </w:pPr>
-      <w:r>
-        <w:rPr>
-          <w:rFonts w:ascii="Arial" w:hAnsi="Arial" w:cs="Arial" w:eastAsia="Arial"/>
-          <w:b w:val="0"/>
-          <w:i/>
-          <w:color w:val="595959"/>
-          <w:sz w:val="18"/>
-        </w:rPr>
-        <w:t>Market direction</w:t>
-      </w:r>
-    </w:p>
-    <w:p>
-      <w:pPr>
-        <w:keepNext w:val="0"/>
-        <w:spacing w:before="40" w:after="80"/>
-      </w:pPr>
-      <w:r>
-        <w:rPr>
-          <w:rFonts w:ascii="Arial" w:hAnsi="Arial" w:cs="Arial" w:eastAsia="Arial"/>
-          <w:b w:val="0"/>
-          <w:i/>
-          <w:color w:val="595959"/>
-          <w:sz w:val="18"/>
-        </w:rPr>
-        <w:t>Geographical diversification</w:t>
-      </w:r>
-    </w:p>
-    <w:p>
-      <w:pPr>
-        <w:keepNext w:val="0"/>
-        <w:spacing w:before="40" w:after="80"/>
-      </w:pPr>
-      <w:r>
-        <w:rPr>
-          <w:rFonts w:ascii="Arial" w:hAnsi="Arial" w:cs="Arial" w:eastAsia="Arial"/>
-          <w:b w:val="0"/>
-          <w:i/>
-          <w:color w:val="595959"/>
-          <w:sz w:val="18"/>
-        </w:rPr>
-        <w:t>Sensitivity factors</w:t>
-      </w:r>
-    </w:p>
-    <w:p>
-      <w:pPr>
-        <w:keepNext w:val="0"/>
-        <w:spacing w:before="40" w:after="80"/>
-      </w:pPr>
-      <w:r>
-        <w:rPr>
-          <w:rFonts w:ascii="Arial" w:hAnsi="Arial" w:cs="Arial" w:eastAsia="Arial"/>
-          <w:b w:val="0"/>
-          <w:i/>
-          <w:color w:val="595959"/>
-          <w:sz w:val="18"/>
-        </w:rPr>
-        <w:t>Coupon income</w:t>
-      </w:r>
-    </w:p>
-    <w:p>
-      <w:pPr>
-        <w:keepNext w:val="0"/>
-        <w:spacing w:before="40" w:after="80"/>
-      </w:pPr>
-      <w:r>
-        <w:rPr>
-          <w:rFonts w:ascii="Arial" w:hAnsi="Arial" w:cs="Arial" w:eastAsia="Arial"/>
-          <w:b w:val="0"/>
-          <w:i/>
-          <w:color w:val="595959"/>
-          <w:sz w:val="18"/>
-        </w:rPr>
-        <w:t>Expected inflation level</w:t>
-      </w:r>
-    </w:p>
-    <w:p>
-      <w:pPr>
-        <w:keepNext w:val="0"/>
-        <w:spacing w:before="40" w:after="80"/>
-      </w:pPr>
-      <w:r>
-        <w:rPr>
-          <w:rFonts w:ascii="Arial" w:hAnsi="Arial" w:cs="Arial" w:eastAsia="Arial"/>
-          <w:b w:val="0"/>
-          <w:i/>
-          <w:color w:val="595959"/>
-          <w:sz w:val="18"/>
-        </w:rPr>
-        <w:t>Liquidity of the selected security</w:t>
-      </w:r>
-    </w:p>
-    <w:p>
-      <w:pPr>
-        <w:keepNext w:val="0"/>
-        <w:spacing w:before="40" w:after="80"/>
-      </w:pPr>
-      <w:r>
-        <w:rPr>
-          <w:rFonts w:ascii="Arial" w:hAnsi="Arial" w:cs="Arial" w:eastAsia="Arial"/>
-          <w:b w:val="0"/>
-          <w:i/>
-          <w:color w:val="595959"/>
-          <w:sz w:val="18"/>
-        </w:rPr>
-        <w:t>Market timing</w:t>
-      </w:r>
-    </w:p>
-    <w:p>
-      <w:pPr>
-        <w:keepNext w:val="0"/>
-        <w:spacing w:before="40" w:after="80"/>
-      </w:pPr>
-      <w:r>
-        <w:rPr>
-          <w:rFonts w:ascii="Arial" w:hAnsi="Arial" w:cs="Arial" w:eastAsia="Arial"/>
-          <w:b w:val="0"/>
-          <w:i/>
-          <w:color w:val="595959"/>
-          <w:sz w:val="18"/>
-        </w:rPr>
-        <w:t>Curve positioning / Duration</w:t>
-      </w:r>
-    </w:p>
-    <w:p>
-      <w:pPr>
-        <w:keepNext w:val="0"/>
-        <w:spacing w:before="40" w:after="80"/>
-      </w:pPr>
-      <w:r>
-        <w:rPr>
-          <w:rFonts w:ascii="Arial" w:hAnsi="Arial" w:cs="Arial" w:eastAsia="Arial"/>
-          <w:b w:val="0"/>
-          <w:i/>
-          <w:color w:val="595959"/>
-          <w:sz w:val="18"/>
-        </w:rPr>
-        <w:t>Interest-rate forecasts and forward curve</w:t>
-      </w:r>
-    </w:p>
-    <w:p>
-      <w:pPr>
-        <w:keepNext w:val="0"/>
-        <w:spacing w:before="40" w:after="80"/>
-      </w:pPr>
-      <w:r>
-        <w:rPr>
-          <w:rFonts w:ascii="Arial" w:hAnsi="Arial" w:cs="Arial" w:eastAsia="Arial"/>
-          <w:b w:val="0"/>
-          <w:i/>
-          <w:color w:val="595959"/>
-          <w:sz w:val="18"/>
-        </w:rPr>
-        <w:t>Yield to maturity</w:t>
-      </w:r>
-    </w:p>
-    <w:p>
-      <w:pPr>
-        <w:keepNext w:val="0"/>
-        <w:spacing w:before="40" w:after="80"/>
-      </w:pPr>
-      <w:r>
-        <w:rPr>
-          <w:rFonts w:ascii="Arial" w:hAnsi="Arial" w:cs="Arial" w:eastAsia="Arial"/>
-          <w:b w:val="0"/>
-          <w:i/>
-          <w:color w:val="595959"/>
-          <w:sz w:val="18"/>
-        </w:rPr>
-        <w:t>Relative yield and relative value</w:t>
-      </w:r>
-    </w:p>
-    <w:p>
-      <w:pPr>
-        <w:keepNext w:val="0"/>
-        <w:spacing w:before="40" w:after="80"/>
-      </w:pPr>
-      <w:r>
-        <w:rPr>
-          <w:rFonts w:ascii="Arial" w:hAnsi="Arial" w:cs="Arial" w:eastAsia="Arial"/>
-          <w:b w:val="0"/>
-          <w:i/>
-          <w:color w:val="595959"/>
-          <w:sz w:val="18"/>
-        </w:rPr>
-        <w:t>Swap spread analysis</w:t>
-      </w:r>
-    </w:p>
-    <w:p>
-      <w:pPr>
-        <w:keepNext w:val="0"/>
-        <w:spacing w:before="40" w:after="80"/>
-      </w:pPr>
-      <w:r>
-        <w:rPr>
-          <w:rFonts w:ascii="Arial" w:hAnsi="Arial" w:cs="Arial" w:eastAsia="Arial"/>
-          <w:b w:val="0"/>
-          <w:i/>
-          <w:color w:val="595959"/>
-          <w:sz w:val="18"/>
-        </w:rPr>
-        <w:t>Issuer assessment</w:t>
-      </w:r>
-    </w:p>
-    <w:p>
-      <w:pPr>
-        <w:keepNext w:val="0"/>
-        <w:spacing w:before="40" w:after="80"/>
-      </w:pPr>
-      <w:r>
-        <w:rPr>
-          <w:rFonts w:ascii="Arial" w:hAnsi="Arial" w:cs="Arial" w:eastAsia="Arial"/>
-          <w:b w:val="0"/>
-          <w:i/>
-          <w:color w:val="595959"/>
-          <w:sz w:val="18"/>
-        </w:rPr>
-        <w:t>Volatility</w:t>
-      </w:r>
-    </w:p>
-    <w:p>
-      <w:pPr>
-        <w:keepNext w:val="0"/>
-        <w:spacing w:before="40" w:after="80"/>
-      </w:pPr>
-      <w:r>
-        <w:rPr>
-          <w:rFonts w:ascii="Arial" w:hAnsi="Arial" w:cs="Arial" w:eastAsia="Arial"/>
-          <w:b w:val="0"/>
-          <w:i/>
-          <w:color w:val="595959"/>
-          <w:sz w:val="18"/>
-        </w:rPr>
-        <w:t>Yield Curve shape (steepening/flattening, hump)</w:t>
-      </w:r>
-    </w:p>
-    <w:p>
-      <w:pPr>
-        <w:keepNext w:val="0"/>
-        <w:spacing w:before="40" w:after="80"/>
-      </w:pPr>
-      <w:r>
-        <w:rPr>
-          <w:rFonts w:ascii="Arial" w:hAnsi="Arial" w:cs="Arial" w:eastAsia="Arial"/>
-          <w:b w:val="0"/>
-          <w:i/>
-          <w:color w:val="595959"/>
-          <w:sz w:val="18"/>
-        </w:rPr>
-        <w:t>Z-score of the individual security</w:t>
-      </w:r>
-    </w:p>
-    <w:p>
-      <w:pPr>
         <w:keepNext/>
         <w:spacing w:before="200" w:after="40"/>
       </w:pPr>
@@ -15018,8 +14726,8 @@
           <w:showingPlcHdr/>
           <w:dropDownList>
             <w:listItem w:displayText="Choose an item." w:value=""/>
-            <w:listItem w:displayText="1 - Si, si intende utilizzare futures o altri strumenti derivati al fine di determinare o modificare il posizionamento sulla curva dei tassi" w:value="1 - Si, si intende utilizzare futures o altri strumenti derivati al fine di determinare o modificare il posizionamento sulla curva dei tassi"/>
-            <w:listItem w:displayText="2 - No, non si intende utilizzare futures o altri strumenti derivati al fine di determinare o modificare il posizionamento sulla curva dei tassi" w:value="2 - No, non si intende utilizzare futures o altri strumenti derivati al fine di determinare o modificare il posizionamento sulla curva dei tassi"/>
+            <w:listItem w:displayText="1 - Yes, futures or other derivative instruments are intended to be used to determine or modify positioning on the interest-rate curve" w:value="1 - Yes, futures or other derivative instruments are intended to be used to determine or modify positioning on the interest-rate curve"/>
+            <w:listItem w:displayText="2 - No, futures or other derivative instruments are not intended to be used to determine or modify positioning on the interest-rate curve" w:value="2 - No, futures or other derivative instruments are not intended to be used to determine or modify positioning on the interest-rate curve"/>
           </w:dropDownList>
         </w:sdtPr>
         <w:sdtContent>
@@ -15068,8 +14776,8 @@
           <w:showingPlcHdr/>
           <w:dropDownList>
             <w:listItem w:displayText="Choose an item." w:value=""/>
-            <w:listItem w:displayText="1 - Si, si intende utilizzare futures o altri strumenti derivati al fine di determinare o modificare l'esposizione verso singoli emittenti" w:value="1 - Si, si intende utilizzare futures o altri strumenti derivati al fine di determinare o modificare l'esposizione verso singoli emittenti"/>
-            <w:listItem w:displayText="2 - No, non si intende utilizzare futures o altri strumenti derivati al fine di determinare o modificare l'esposizione verso singoli emittenti" w:value="2 - No, non si intende utilizzare futures o altri strumenti derivati al fine di determinare o modificare l'esposizione verso singoli emittenti"/>
+            <w:listItem w:displayText="1 - Yes, futures or other derivative instruments are intended to be used to determine or modify exposure to individual issuers" w:value="1 - Yes, futures or other derivative instruments are intended to be used to determine or modify exposure to individual issuers"/>
+            <w:listItem w:displayText="2 - No, futures or other derivative instruments are not intended to be used to determine or modify exposure to individual issuers" w:value="2 - No, futures or other derivative instruments are not intended to be used to determine or modify exposure to individual issuers"/>
           </w:dropDownList>
         </w:sdtPr>
         <w:sdtContent>
@@ -15134,10 +14842,10 @@
           <w:showingPlcHdr/>
           <w:dropDownList>
             <w:listItem w:displayText="Choose an item." w:value=""/>
-            <w:listItem w:displayText="1 - La struttura di gestione e articolata per aree geografiche" w:value="1 - La struttura di gestione e articolata per aree geografiche"/>
-            <w:listItem w:displayText="2 - La struttura di gestione e articolata per segmenti di mercato" w:value="2 - La struttura di gestione e articolata per segmenti di mercato"/>
-            <w:listItem w:displayText="3 - La struttura di gestione e articolata per settori" w:value="3 - La struttura di gestione e articolata per settori"/>
-            <w:listItem w:displayText="4 - Altro" w:value="4 - Altro"/>
+            <w:listItem w:displayText="1 - The management structure is organised by geographic area" w:value="1 - The management structure is organised by geographic area"/>
+            <w:listItem w:displayText="2 - The management structure is organised by market segments" w:value="2 - The management structure is organised by market segments"/>
+            <w:listItem w:displayText="3 - The management structure is organised by sectors" w:value="3 - The management structure is organised by sectors"/>
+            <w:listItem w:displayText="4 - Other" w:value="4 - Other"/>
           </w:dropDownList>
         </w:sdtPr>
         <w:sdtContent>
@@ -15585,182 +15293,6 @@
         <w:sdtPr>
           <w:alias w:val="082GED2031472"/>
           <w:id w:val="100259"/>
-          <w:showingPlcHdr/>
-          <w:dropDownList>
-            <w:listItem w:displayText="Choose an item." w:value=""/>
-            <w:listItem w:displayText="1 - suddivisione geografica" w:value="1 - suddivisione geografica"/>
-            <w:listItem w:displayText="2 - suddivisione settoriale (es. financial vs non financial)" w:value="2 - suddivisione settoriale (es. financial vs non financial)"/>
-            <w:listItem w:displayText="3 - suddivisione rating (es. High Yield)" w:value="3 - suddivisione rating (es. High Yield)"/>
-            <w:listItem w:displayText="4 - Altro" w:value="4 - Altro"/>
-          </w:dropDownList>
-        </w:sdtPr>
-        <w:sdtContent>
-          <w:r>
-            <w:t>Choose an item.</w:t>
-          </w:r>
-        </w:sdtContent>
-      </w:sdt>
-    </w:p>
-    <w:p>
-      <w:pPr>
-        <w:keepNext/>
-        <w:spacing w:before="200" w:after="40"/>
-      </w:pPr>
-      <w:r>
-        <w:rPr>
-          <w:rFonts w:ascii="Arial" w:hAnsi="Arial" w:cs="Arial" w:eastAsia="Arial"/>
-          <w:b/>
-          <w:i w:val="0"/>
-          <w:color w:val="000000"/>
-          <w:sz w:val="20"/>
-        </w:rPr>
-        <w:t xml:space="preserve">- Corporate bonds - Organisation by segment - First subdivision - Location </w:t>
-      </w:r>
-      <w:r>
-        <w:rPr>
-          <w:rFonts w:ascii="Arial" w:hAnsi="Arial" w:cs="Arial" w:eastAsia="Arial"/>
-          <w:b/>
-          <w:i w:val="0"/>
-          <w:color w:val="1C355E"/>
-          <w:sz w:val="17"/>
-        </w:rPr>
-        <w:t>-082GED2031473-</w:t>
-      </w:r>
-    </w:p>
-    <w:p>
-      <w:pPr>
-        <w:keepNext w:val="0"/>
-        <w:spacing w:before="40" w:after="120"/>
-        <w:shd w:val="clear" w:color="auto" w:fill="F2F2F2"/>
-      </w:pPr>
-      <w:sdt>
-        <w:sdtPr>
-          <w:alias w:val="082GED2031473"/>
-          <w:id w:val="100260"/>
-          <w:showingPlcHdr/>
-          <w:text/>
-        </w:sdtPr>
-        <w:sdtContent>
-          <w:r>
-            <w:t>Click or tap here to enter text.</w:t>
-          </w:r>
-        </w:sdtContent>
-      </w:sdt>
-    </w:p>
-    <w:p>
-      <w:pPr>
-        <w:keepNext/>
-        <w:spacing w:before="200" w:after="40"/>
-      </w:pPr>
-      <w:r>
-        <w:rPr>
-          <w:rFonts w:ascii="Arial" w:hAnsi="Arial" w:cs="Arial" w:eastAsia="Arial"/>
-          <w:b/>
-          <w:i w:val="0"/>
-          <w:color w:val="000000"/>
-          <w:sz w:val="20"/>
-        </w:rPr>
-        <w:t xml:space="preserve">- Corporate bonds - Organisation by segment - First subdivision - Number of resources </w:t>
-      </w:r>
-      <w:r>
-        <w:rPr>
-          <w:rFonts w:ascii="Arial" w:hAnsi="Arial" w:cs="Arial" w:eastAsia="Arial"/>
-          <w:b/>
-          <w:i w:val="0"/>
-          <w:color w:val="1C355E"/>
-          <w:sz w:val="17"/>
-        </w:rPr>
-        <w:t>-082GED2031474-</w:t>
-      </w:r>
-    </w:p>
-    <w:p>
-      <w:pPr>
-        <w:keepNext/>
-        <w:spacing w:before="0" w:after="40"/>
-      </w:pPr>
-      <w:r>
-        <w:rPr>
-          <w:rFonts w:ascii="Arial" w:hAnsi="Arial" w:cs="Arial" w:eastAsia="Arial"/>
-          <w:b w:val="0"/>
-          <w:i/>
-          <w:color w:val="595959"/>
-          <w:sz w:val="18"/>
-        </w:rPr>
-        <w:t>Do not duplicate data where resources are shared</w:t>
-      </w:r>
-    </w:p>
-    <w:p>
-      <w:pPr>
-        <w:keepNext/>
-        <w:spacing w:before="0" w:after="40"/>
-      </w:pPr>
-      <w:r>
-        <w:rPr>
-          <w:rFonts w:ascii="Arial" w:hAnsi="Arial" w:cs="Arial" w:eastAsia="Arial"/>
-          <w:b w:val="0"/>
-          <w:i/>
-          <w:color w:val="595959"/>
-          <w:sz w:val="18"/>
-        </w:rPr>
-        <w:t>WARNING: Information that cannot be interpreted unambiguously will result in a score of zero.</w:t>
-      </w:r>
-    </w:p>
-    <w:p>
-      <w:pPr>
-        <w:keepNext w:val="0"/>
-        <w:spacing w:before="40" w:after="120"/>
-        <w:shd w:val="clear" w:color="auto" w:fill="F2F2F2"/>
-      </w:pPr>
-      <w:sdt>
-        <w:sdtPr>
-          <w:alias w:val="082GED2031474"/>
-          <w:id w:val="100261"/>
-          <w:showingPlcHdr/>
-          <w:text/>
-        </w:sdtPr>
-        <w:sdtContent>
-          <w:r>
-            <w:t>Click or tap here to enter text.</w:t>
-          </w:r>
-        </w:sdtContent>
-      </w:sdt>
-    </w:p>
-    <w:p>
-      <w:pPr>
-        <w:keepNext/>
-        <w:spacing w:before="200" w:after="40"/>
-      </w:pPr>
-      <w:r>
-        <w:rPr>
-          <w:rFonts w:ascii="Arial" w:hAnsi="Arial" w:cs="Arial" w:eastAsia="Arial"/>
-          <w:b/>
-          <w:i w:val="0"/>
-          <w:color w:val="000000"/>
-          <w:sz w:val="20"/>
-        </w:rPr>
-        <w:t xml:space="preserve">- Corporate bonds - Organisation by segment - Second subdivision </w:t>
-      </w:r>
-      <w:r>
-        <w:rPr>
-          <w:rFonts w:ascii="Arial" w:hAnsi="Arial" w:cs="Arial" w:eastAsia="Arial"/>
-          <w:b/>
-          <w:i w:val="0"/>
-          <w:color w:val="1C355E"/>
-          <w:sz w:val="17"/>
-        </w:rPr>
-        <w:t>-082GED2031475-</w:t>
-      </w:r>
-    </w:p>
-    <w:p>
-      <w:pPr>
-        <w:keepNext w:val="0"/>
-        <w:spacing w:before="40" w:after="120"/>
-        <w:shd w:val="clear" w:color="auto" w:fill="F2F2F2"/>
-      </w:pPr>
-      <w:sdt>
-        <w:sdtPr>
-          <w:alias w:val="082GED2031475"/>
-          <w:id w:val="100262"/>
           <w:showingPlcHdr/>
           <w:dropDownList>
             <w:listItem w:displayText="Choose an item." w:value=""/>
@@ -15790,63 +15322,63 @@
           <w:color w:val="000000"/>
           <w:sz w:val="20"/>
         </w:rPr>
-        <w:t xml:space="preserve">- Corporate bonds - Organisation by segment - Second subdivision - Location </w:t>
-      </w:r>
-      <w:r>
-        <w:rPr>
-          <w:rFonts w:ascii="Arial" w:hAnsi="Arial" w:cs="Arial" w:eastAsia="Arial"/>
-          <w:b/>
-          <w:i w:val="0"/>
-          <w:color w:val="1C355E"/>
-          <w:sz w:val="17"/>
-        </w:rPr>
-        <w:t>-082GED2031476-</w:t>
-      </w:r>
-    </w:p>
-    <w:p>
-      <w:pPr>
-        <w:keepNext w:val="0"/>
-        <w:spacing w:before="40" w:after="120"/>
-        <w:shd w:val="clear" w:color="auto" w:fill="F2F2F2"/>
-      </w:pPr>
-      <w:sdt>
-        <w:sdtPr>
-          <w:alias w:val="082GED2031476"/>
-          <w:id w:val="100263"/>
-          <w:showingPlcHdr/>
-          <w:text/>
-        </w:sdtPr>
-        <w:sdtContent>
-          <w:r>
-            <w:t>Click or tap here to enter text.</w:t>
-          </w:r>
-        </w:sdtContent>
-      </w:sdt>
-    </w:p>
-    <w:p>
-      <w:pPr>
-        <w:keepNext/>
-        <w:spacing w:before="200" w:after="40"/>
-      </w:pPr>
-      <w:r>
-        <w:rPr>
-          <w:rFonts w:ascii="Arial" w:hAnsi="Arial" w:cs="Arial" w:eastAsia="Arial"/>
-          <w:b/>
-          <w:i w:val="0"/>
-          <w:color w:val="000000"/>
-          <w:sz w:val="20"/>
-        </w:rPr>
-        <w:t xml:space="preserve">- Corporate bonds - Organisation by segment - Second subdivision - Number of resources </w:t>
-      </w:r>
-      <w:r>
-        <w:rPr>
-          <w:rFonts w:ascii="Arial" w:hAnsi="Arial" w:cs="Arial" w:eastAsia="Arial"/>
-          <w:b/>
-          <w:i w:val="0"/>
-          <w:color w:val="1C355E"/>
-          <w:sz w:val="17"/>
-        </w:rPr>
-        <w:t>-082GED2031477-</w:t>
+        <w:t xml:space="preserve">- Corporate bonds - Organisation by segment - First subdivision - Location </w:t>
+      </w:r>
+      <w:r>
+        <w:rPr>
+          <w:rFonts w:ascii="Arial" w:hAnsi="Arial" w:cs="Arial" w:eastAsia="Arial"/>
+          <w:b/>
+          <w:i w:val="0"/>
+          <w:color w:val="1C355E"/>
+          <w:sz w:val="17"/>
+        </w:rPr>
+        <w:t>-082GED2031473-</w:t>
+      </w:r>
+    </w:p>
+    <w:p>
+      <w:pPr>
+        <w:keepNext w:val="0"/>
+        <w:spacing w:before="40" w:after="120"/>
+        <w:shd w:val="clear" w:color="auto" w:fill="F2F2F2"/>
+      </w:pPr>
+      <w:sdt>
+        <w:sdtPr>
+          <w:alias w:val="082GED2031473"/>
+          <w:id w:val="100260"/>
+          <w:showingPlcHdr/>
+          <w:text/>
+        </w:sdtPr>
+        <w:sdtContent>
+          <w:r>
+            <w:t>Click or tap here to enter text.</w:t>
+          </w:r>
+        </w:sdtContent>
+      </w:sdt>
+    </w:p>
+    <w:p>
+      <w:pPr>
+        <w:keepNext/>
+        <w:spacing w:before="200" w:after="40"/>
+      </w:pPr>
+      <w:r>
+        <w:rPr>
+          <w:rFonts w:ascii="Arial" w:hAnsi="Arial" w:cs="Arial" w:eastAsia="Arial"/>
+          <w:b/>
+          <w:i w:val="0"/>
+          <w:color w:val="000000"/>
+          <w:sz w:val="20"/>
+        </w:rPr>
+        <w:t xml:space="preserve">- Corporate bonds - Organisation by segment - First subdivision - Number of resources </w:t>
+      </w:r>
+      <w:r>
+        <w:rPr>
+          <w:rFonts w:ascii="Arial" w:hAnsi="Arial" w:cs="Arial" w:eastAsia="Arial"/>
+          <w:b/>
+          <w:i w:val="0"/>
+          <w:color w:val="1C355E"/>
+          <w:sz w:val="17"/>
+        </w:rPr>
+        <w:t>-082GED2031474-</w:t>
       </w:r>
     </w:p>
     <w:p>
@@ -15889,6 +15421,182 @@
       </w:pPr>
       <w:sdt>
         <w:sdtPr>
+          <w:alias w:val="082GED2031474"/>
+          <w:id w:val="100261"/>
+          <w:showingPlcHdr/>
+          <w:text/>
+        </w:sdtPr>
+        <w:sdtContent>
+          <w:r>
+            <w:t>Click or tap here to enter text.</w:t>
+          </w:r>
+        </w:sdtContent>
+      </w:sdt>
+    </w:p>
+    <w:p>
+      <w:pPr>
+        <w:keepNext/>
+        <w:spacing w:before="200" w:after="40"/>
+      </w:pPr>
+      <w:r>
+        <w:rPr>
+          <w:rFonts w:ascii="Arial" w:hAnsi="Arial" w:cs="Arial" w:eastAsia="Arial"/>
+          <w:b/>
+          <w:i w:val="0"/>
+          <w:color w:val="000000"/>
+          <w:sz w:val="20"/>
+        </w:rPr>
+        <w:t xml:space="preserve">- Corporate bonds - Organisation by segment - Second subdivision </w:t>
+      </w:r>
+      <w:r>
+        <w:rPr>
+          <w:rFonts w:ascii="Arial" w:hAnsi="Arial" w:cs="Arial" w:eastAsia="Arial"/>
+          <w:b/>
+          <w:i w:val="0"/>
+          <w:color w:val="1C355E"/>
+          <w:sz w:val="17"/>
+        </w:rPr>
+        <w:t>-082GED2031475-</w:t>
+      </w:r>
+    </w:p>
+    <w:p>
+      <w:pPr>
+        <w:keepNext w:val="0"/>
+        <w:spacing w:before="40" w:after="120"/>
+        <w:shd w:val="clear" w:color="auto" w:fill="F2F2F2"/>
+      </w:pPr>
+      <w:sdt>
+        <w:sdtPr>
+          <w:alias w:val="082GED2031475"/>
+          <w:id w:val="100262"/>
+          <w:showingPlcHdr/>
+          <w:dropDownList>
+            <w:listItem w:displayText="Choose an item." w:value=""/>
+            <w:listItem w:displayText="1 - Geographic breakdown" w:value="1 - Geographic breakdown"/>
+            <w:listItem w:displayText="2 - Sector breakdown (e.g. financial vs non-financial)" w:value="2 - Sector breakdown (e.g. financial vs non-financial)"/>
+            <w:listItem w:displayText="3 - Rating breakdown (e.g. High Yield)" w:value="3 - Rating breakdown (e.g. High Yield)"/>
+            <w:listItem w:displayText="4 - Other" w:value="4 - Other"/>
+          </w:dropDownList>
+        </w:sdtPr>
+        <w:sdtContent>
+          <w:r>
+            <w:t>Choose an item.</w:t>
+          </w:r>
+        </w:sdtContent>
+      </w:sdt>
+    </w:p>
+    <w:p>
+      <w:pPr>
+        <w:keepNext/>
+        <w:spacing w:before="200" w:after="40"/>
+      </w:pPr>
+      <w:r>
+        <w:rPr>
+          <w:rFonts w:ascii="Arial" w:hAnsi="Arial" w:cs="Arial" w:eastAsia="Arial"/>
+          <w:b/>
+          <w:i w:val="0"/>
+          <w:color w:val="000000"/>
+          <w:sz w:val="20"/>
+        </w:rPr>
+        <w:t xml:space="preserve">- Corporate bonds - Organisation by segment - Second subdivision - Location </w:t>
+      </w:r>
+      <w:r>
+        <w:rPr>
+          <w:rFonts w:ascii="Arial" w:hAnsi="Arial" w:cs="Arial" w:eastAsia="Arial"/>
+          <w:b/>
+          <w:i w:val="0"/>
+          <w:color w:val="1C355E"/>
+          <w:sz w:val="17"/>
+        </w:rPr>
+        <w:t>-082GED2031476-</w:t>
+      </w:r>
+    </w:p>
+    <w:p>
+      <w:pPr>
+        <w:keepNext w:val="0"/>
+        <w:spacing w:before="40" w:after="120"/>
+        <w:shd w:val="clear" w:color="auto" w:fill="F2F2F2"/>
+      </w:pPr>
+      <w:sdt>
+        <w:sdtPr>
+          <w:alias w:val="082GED2031476"/>
+          <w:id w:val="100263"/>
+          <w:showingPlcHdr/>
+          <w:text/>
+        </w:sdtPr>
+        <w:sdtContent>
+          <w:r>
+            <w:t>Click or tap here to enter text.</w:t>
+          </w:r>
+        </w:sdtContent>
+      </w:sdt>
+    </w:p>
+    <w:p>
+      <w:pPr>
+        <w:keepNext/>
+        <w:spacing w:before="200" w:after="40"/>
+      </w:pPr>
+      <w:r>
+        <w:rPr>
+          <w:rFonts w:ascii="Arial" w:hAnsi="Arial" w:cs="Arial" w:eastAsia="Arial"/>
+          <w:b/>
+          <w:i w:val="0"/>
+          <w:color w:val="000000"/>
+          <w:sz w:val="20"/>
+        </w:rPr>
+        <w:t xml:space="preserve">- Corporate bonds - Organisation by segment - Second subdivision - Number of resources </w:t>
+      </w:r>
+      <w:r>
+        <w:rPr>
+          <w:rFonts w:ascii="Arial" w:hAnsi="Arial" w:cs="Arial" w:eastAsia="Arial"/>
+          <w:b/>
+          <w:i w:val="0"/>
+          <w:color w:val="1C355E"/>
+          <w:sz w:val="17"/>
+        </w:rPr>
+        <w:t>-082GED2031477-</w:t>
+      </w:r>
+    </w:p>
+    <w:p>
+      <w:pPr>
+        <w:keepNext/>
+        <w:spacing w:before="0" w:after="40"/>
+      </w:pPr>
+      <w:r>
+        <w:rPr>
+          <w:rFonts w:ascii="Arial" w:hAnsi="Arial" w:cs="Arial" w:eastAsia="Arial"/>
+          <w:b w:val="0"/>
+          <w:i/>
+          <w:color w:val="595959"/>
+          <w:sz w:val="18"/>
+        </w:rPr>
+        <w:t>Do not duplicate data where resources are shared</w:t>
+      </w:r>
+    </w:p>
+    <w:p>
+      <w:pPr>
+        <w:keepNext/>
+        <w:spacing w:before="0" w:after="40"/>
+      </w:pPr>
+      <w:r>
+        <w:rPr>
+          <w:rFonts w:ascii="Arial" w:hAnsi="Arial" w:cs="Arial" w:eastAsia="Arial"/>
+          <w:b w:val="0"/>
+          <w:i/>
+          <w:color w:val="595959"/>
+          <w:sz w:val="18"/>
+        </w:rPr>
+        <w:t>WARNING: Information that cannot be interpreted unambiguously will result in a score of zero.</w:t>
+      </w:r>
+    </w:p>
+    <w:p>
+      <w:pPr>
+        <w:keepNext w:val="0"/>
+        <w:spacing w:before="40" w:after="120"/>
+        <w:shd w:val="clear" w:color="auto" w:fill="F2F2F2"/>
+      </w:pPr>
+      <w:sdt>
+        <w:sdtPr>
           <w:alias w:val="082GED2031477"/>
           <w:id w:val="100264"/>
           <w:showingPlcHdr/>
@@ -15940,10 +15648,10 @@
           <w:showingPlcHdr/>
           <w:dropDownList>
             <w:listItem w:displayText="Choose an item." w:value=""/>
-            <w:listItem w:displayText="1 - suddivisione geografica" w:value="1 - suddivisione geografica"/>
-            <w:listItem w:displayText="2 - suddivisione settoriale (es. financial vs non financial)" w:value="2 - suddivisione settoriale (es. financial vs non financial)"/>
-            <w:listItem w:displayText="3 - suddivisione rating (es. High Yield)" w:value="3 - suddivisione rating (es. High Yield)"/>
-            <w:listItem w:displayText="4 - Altro" w:value="4 - Altro"/>
+            <w:listItem w:displayText="1 - Geographic breakdown" w:value="1 - Geographic breakdown"/>
+            <w:listItem w:displayText="2 - Sector breakdown (e.g. financial vs non-financial)" w:value="2 - Sector breakdown (e.g. financial vs non-financial)"/>
+            <w:listItem w:displayText="3 - Rating breakdown (e.g. High Yield)" w:value="3 - Rating breakdown (e.g. High Yield)"/>
+            <w:listItem w:displayText="4 - Other" w:value="4 - Other"/>
           </w:dropDownList>
         </w:sdtPr>
         <w:sdtContent>
@@ -17796,9 +17504,9 @@
           <w:showingPlcHdr/>
           <w:dropDownList>
             <w:listItem w:displayText="Choose an item." w:value=""/>
-            <w:listItem w:displayText="1 - La struttura di gestione e articolata per mercati / aree geografiche" w:value="1 - La struttura di gestione e articolata per mercati / aree geografiche"/>
-            <w:listItem w:displayText="2 - La struttura di gestione e articolata per settori" w:value="2 - La struttura di gestione e articolata per settori"/>
-            <w:listItem w:displayText="3 - Altro" w:value="3 - Altro"/>
+            <w:listItem w:displayText="1 - The management structure is organised by markets / geographic areas" w:value="1 - The management structure is organised by markets / geographic areas"/>
+            <w:listItem w:displayText="2 - The management structure is organised by sectors" w:value="2 - The management structure is organised by sectors"/>
+            <w:listItem w:displayText="3 - Other" w:value="3 - Other"/>
           </w:dropDownList>
         </w:sdtPr>
         <w:sdtContent>
@@ -18573,17 +18281,17 @@
           <w:showingPlcHdr/>
           <w:dropDownList>
             <w:listItem w:displayText="Choose an item." w:value=""/>
-            <w:listItem w:displayText="1 - Settore energia" w:value="1 - Settore energia"/>
-            <w:listItem w:displayText="2 - Settore dei materiali" w:value="2 - Settore dei materiali"/>
-            <w:listItem w:displayText="3 - settore industriale" w:value="3 - settore industriale"/>
-            <w:listItem w:displayText="4 - Settore dei beni di consumo ciclici" w:value="4 - Settore dei beni di consumo ciclici"/>
-            <w:listItem w:displayText="5 - Settore dei beni di consumo non ciclici" w:value="5 - Settore dei beni di consumo non ciclici"/>
-            <w:listItem w:displayText="6 - Settore sanitario" w:value="6 - Settore sanitario"/>
-            <w:listItem w:displayText="7 - Settore finanziario" w:value="7 - Settore finanziario"/>
-            <w:listItem w:displayText="8 - Settore IT" w:value="8 - Settore IT"/>
-            <w:listItem w:displayText="9 - Settore dei servizi per telecomunicazioni" w:value="9 - Settore dei servizi per telecomunicazioni"/>
-            <w:listItem w:displayText="10 - Settore utilities" w:value="10 - Settore utilities"/>
-            <w:listItem w:displayText="11 - Altro" w:value="11 - Altro"/>
+            <w:listItem w:displayText="1 - Energy sector" w:value="1 - Energy sector"/>
+            <w:listItem w:displayText="2 - Materials sector" w:value="2 - Materials sector"/>
+            <w:listItem w:displayText="3 - Industrial sector" w:value="3 - Industrial sector"/>
+            <w:listItem w:displayText="4 - Consumer cyclicals sector" w:value="4 - Consumer cyclicals sector"/>
+            <w:listItem w:displayText="5 - Consumer non-cyclicals sector" w:value="5 - Consumer non-cyclicals sector"/>
+            <w:listItem w:displayText="6 - Healthcare sector" w:value="6 - Healthcare sector"/>
+            <w:listItem w:displayText="7 - Financial sector" w:value="7 - Financial sector"/>
+            <w:listItem w:displayText="8 - IT sector" w:value="8 - IT sector"/>
+            <w:listItem w:displayText="9 - Telecommunication services sector" w:value="9 - Telecommunication services sector"/>
+            <w:listItem w:displayText="10 - Utilities sector" w:value="10 - Utilities sector"/>
+            <w:listItem w:displayText="11 - Other" w:value="11 - Other"/>
           </w:dropDownList>
         </w:sdtPr>
         <w:sdtContent>
@@ -18740,17 +18448,17 @@
           <w:showingPlcHdr/>
           <w:dropDownList>
             <w:listItem w:displayText="Choose an item." w:value=""/>
-            <w:listItem w:displayText="1 - Settore energia" w:value="1 - Settore energia"/>
-            <w:listItem w:displayText="2 - Settore dei materiali" w:value="2 - Settore dei materiali"/>
-            <w:listItem w:displayText="3 - settore industriale" w:value="3 - settore industriale"/>
-            <w:listItem w:displayText="4 - Settore dei beni di consumo ciclici" w:value="4 - Settore dei beni di consumo ciclici"/>
-            <w:listItem w:displayText="5 - Settore dei beni di consumo non ciclici" w:value="5 - Settore dei beni di consumo non ciclici"/>
-            <w:listItem w:displayText="6 - Settore sanitario" w:value="6 - Settore sanitario"/>
-            <w:listItem w:displayText="7 - Settore finanziario" w:value="7 - Settore finanziario"/>
-            <w:listItem w:displayText="8 - Settore IT" w:value="8 - Settore IT"/>
-            <w:listItem w:displayText="9 - Settore dei servizi per telecomunicazioni" w:value="9 - Settore dei servizi per telecomunicazioni"/>
-            <w:listItem w:displayText="10 - Settore utilities" w:value="10 - Settore utilities"/>
-            <w:listItem w:displayText="11 - Altro" w:value="11 - Altro"/>
+            <w:listItem w:displayText="1 - Energy sector" w:value="1 - Energy sector"/>
+            <w:listItem w:displayText="2 - Materials sector" w:value="2 - Materials sector"/>
+            <w:listItem w:displayText="3 - Industrial sector" w:value="3 - Industrial sector"/>
+            <w:listItem w:displayText="4 - Consumer cyclicals sector" w:value="4 - Consumer cyclicals sector"/>
+            <w:listItem w:displayText="5 - Consumer non-cyclicals sector" w:value="5 - Consumer non-cyclicals sector"/>
+            <w:listItem w:displayText="6 - Healthcare sector" w:value="6 - Healthcare sector"/>
+            <w:listItem w:displayText="7 - Financial sector" w:value="7 - Financial sector"/>
+            <w:listItem w:displayText="8 - IT sector" w:value="8 - IT sector"/>
+            <w:listItem w:displayText="9 - Telecommunication services sector" w:value="9 - Telecommunication services sector"/>
+            <w:listItem w:displayText="10 - Utilities sector" w:value="10 - Utilities sector"/>
+            <w:listItem w:displayText="11 - Other" w:value="11 - Other"/>
           </w:dropDownList>
         </w:sdtPr>
         <w:sdtContent>
@@ -20067,12 +19775,12 @@
           <w:showingPlcHdr/>
           <w:dropDownList>
             <w:listItem w:displayText="Choose an item." w:value=""/>
-            <w:listItem w:displayText="1 - In ogni caso attraverso una selezione di titoli fisici" w:value="1 - In ogni caso attraverso una selezione di titoli fisici"/>
-            <w:listItem w:displayText="2 - Attraverso la negoziazione di futures su indici azionari" w:value="2 - Attraverso la negoziazione di futures su indici azionari"/>
-            <w:listItem w:displayText="3 - Attraverso la negoziazione di Etf" w:value="3 - Attraverso la negoziazione di Etf"/>
-            <w:listItem w:displayText="4 - Attraverso la negoziazione di Oicr" w:value="4 - Attraverso la negoziazione di Oicr"/>
-            <w:listItem w:displayText="5 - Si prevede tendenzialmente l'esclusione dell'esposizione verso tali mercati" w:value="5 - Si prevede tendenzialmente l'esclusione dell'esposizione verso tali mercati"/>
-            <w:listItem w:displayText="6 - Altro" w:value="6 - Altro"/>
+            <w:listItem w:displayText="1 - In any case, through selection of physical securities" w:value="1 - In any case, through selection of physical securities"/>
+            <w:listItem w:displayText="2 - Through trading of futures on equity indices" w:value="2 - Through trading of futures on equity indices"/>
+            <w:listItem w:displayText="3 - Through trading of ETFs" w:value="3 - Through trading of ETFs"/>
+            <w:listItem w:displayText="4 - Through trading of UCITS funds" w:value="4 - Through trading of UCITS funds"/>
+            <w:listItem w:displayText="5 - Exposure to these markets is generally expected to be excluded" w:value="5 - Exposure to these markets is generally expected to be excluded"/>
+            <w:listItem w:displayText="6 - Other" w:value="6 - Other"/>
           </w:dropDownList>
         </w:sdtPr>
         <w:sdtContent>
@@ -20249,8 +19957,8 @@
           <w:showingPlcHdr/>
           <w:dropDownList>
             <w:listItem w:displayText="Choose an item." w:value=""/>
-            <w:listItem w:displayText="La societa candidata ha un trading desk che svolge attivita esclusiva per conto della clientela istituzionale" w:value="La societa candidata ha un trading desk che svolge attivita esclusiva per conto della clientela istituzionale"/>
-            <w:listItem w:displayText="La societa non ha un trading desk che svolge attivita esclusiva per conto della clientela istituzionale" w:value="La societa non ha un trading desk che svolge attivita esclusiva per conto della clientela istituzionale"/>
+            <w:listItem w:displayText="The candidate company has a trading desk working exclusively for institutional clients" w:value="The candidate company has a trading desk working exclusively for institutional clients"/>
+            <w:listItem w:displayText="The company does not have a trading desk working exclusively for institutional clients" w:value="The company does not have a trading desk working exclusively for institutional clients"/>
           </w:dropDownList>
         </w:sdtPr>
         <w:sdtContent>
@@ -20929,8 +20637,8 @@
           <w:showingPlcHdr/>
           <w:dropDownList>
             <w:listItem w:displayText="Choose an item." w:value=""/>
-            <w:listItem w:displayText="La lista delle controparti e definita esclusivamente dalla societa candidata" w:value="La lista delle controparti e definita esclusivamente dalla societa candidata"/>
-            <w:listItem w:displayText="La lista delle controparti e definita al livello del gruppo" w:value="La lista delle controparti e definita al livello del gruppo"/>
+            <w:listItem w:displayText="The counterparty list is defined exclusively by the candidate company" w:value="The counterparty list is defined exclusively by the candidate company"/>
+            <w:listItem w:displayText="The counterparty list is defined at group level" w:value="The counterparty list is defined at group level"/>
           </w:dropDownList>
         </w:sdtPr>
         <w:sdtContent>
@@ -20995,9 +20703,9 @@
           <w:showingPlcHdr/>
           <w:dropDownList>
             <w:listItem w:displayText="Choose an item." w:value=""/>
-            <w:listItem w:displayText="La societa candidata ha in essere rapporti di soft commission con intermediari italiani ed esteri" w:value="La societa candidata ha in essere rapporti di soft commission con intermediari italiani ed esteri"/>
-            <w:listItem w:displayText="La societa candidata non ha in essere rapporti di soft commission con intermediari italiani ed esteri ma operano rapporti a livello di gruppo" w:value="La societa candidata non ha in essere rapporti di soft commission con intermediari italiani ed esteri ma operano rapporti a livello di gruppo"/>
-            <w:listItem w:displayText="La societa candidata non ha in essere rapporti di soft commission con intermediari italiani ed esteri e non operano rapporti a livello di gruppo" w:value="La societa candidata non ha in essere rapporti di soft commission con intermediari italiani ed esteri e non operano rapporti a livello di gruppo"/>
+            <w:listItem w:displayText="The candidate company has soft commission arrangements with Italian and foreign intermediaries" w:value="The candidate company has soft commission arrangements with Italian and foreign intermediaries"/>
+            <w:listItem w:displayText="The candidate company has no soft commission arrangements with Italian and foreign intermediaries, but such arrangements exist at group level" w:value="The candidate company has no soft commission arrangements with Italian and foreign intermediaries, but such arrangements exist at group level"/>
+            <w:listItem w:displayText="The candidate company has no soft commission arrangements with Italian and foreign intermediaries, and none exist at group level" w:value="The candidate company has no soft commission arrangements with Italian and foreign intermediaries, and none exist at group level"/>
           </w:dropDownList>
         </w:sdtPr>
         <w:sdtContent>
@@ -22516,10 +22224,10 @@
           <w:showingPlcHdr/>
           <w:dropDownList>
             <w:listItem w:displayText="Choose an item." w:value=""/>
-            <w:listItem w:displayText="E' operativo un sistema per il controllo dei costi e dei tempi di transazione (pre e post trade analysis)" w:value="E' operativo un sistema per il controllo dei costi e dei tempi di transazione (pre e post trade analysis)"/>
-            <w:listItem w:displayText="E' operativo un sistema per il controllo dei costi e dei tempi di transazione (solo pre trade analysis)" w:value="E' operativo un sistema per il controllo dei costi e dei tempi di transazione (solo pre trade analysis)"/>
-            <w:listItem w:displayText="E' operativo un sistema per il controllo dei costi e dei tempi di transazione (solo post trade analysis)" w:value="E' operativo un sistema per il controllo dei costi e dei tempi di transazione (solo post trade analysis)"/>
-            <w:listItem w:displayText="Non e operativo un sistema per il controllo dei costi e dei tempi di transazione" w:value="Non e operativo un sistema per il controllo dei costi e dei tempi di transazione"/>
+            <w:listItem w:displayText="A system for controlling transaction costs and times is in operation (pre- and post-trade analysis)" w:value="A system for controlling transaction costs and times is in operation (pre- and post-trade analysis)"/>
+            <w:listItem w:displayText="A system for controlling transaction costs and times is in operation (pre-trade analysis only)" w:value="A system for controlling transaction costs and times is in operation (pre-trade analysis only)"/>
+            <w:listItem w:displayText="A system for controlling transaction costs and times is in operation (post-trade analysis only)" w:value="A system for controlling transaction costs and times is in operation (post-trade analysis only)"/>
+            <w:listItem w:displayText="No system for controlling transaction costs and times is in operation" w:value="No system for controlling transaction costs and times is in operation"/>
           </w:dropDownList>
         </w:sdtPr>
         <w:sdtContent>
@@ -22568,9 +22276,9 @@
           <w:showingPlcHdr/>
           <w:dropDownList>
             <w:listItem w:displayText="Choose an item." w:value=""/>
-            <w:listItem w:displayText="E' prevista una certificazione di detto sistema di controllo da parte di un soggetto esterno" w:value="E' prevista una certificazione di detto sistema di controllo da parte di un soggetto esterno"/>
-            <w:listItem w:displayText="E' prevista una verifica interna attuata mediante l'adozione di benchmark di mercato atta a valutare la qualita dell'attivita svolta" w:value="E' prevista una verifica interna attuata mediante l'adozione di benchmark di mercato atta a valutare la qualita dell'attivita svolta"/>
-            <w:listItem w:displayText="Non e operativo un processo di validazione del sistema" w:value="Non e operativo un processo di validazione del sistema"/>
+            <w:listItem w:displayText="The control system is certified by an external party" w:value="The control system is certified by an external party"/>
+            <w:listItem w:displayText="An internal review is provided, using market benchmarks to assess the quality of the activity carried out" w:value="An internal review is provided, using market benchmarks to assess the quality of the activity carried out"/>
+            <w:listItem w:displayText="No validation process for the system is in operation" w:value="No validation process for the system is in operation"/>
           </w:dropDownList>
         </w:sdtPr>
         <w:sdtContent>
@@ -22911,9 +22619,9 @@
           <w:showingPlcHdr/>
           <w:dropDownList>
             <w:listItem w:displayText="Choose an item." w:value=""/>
-            <w:listItem w:displayText="1 - Il servizio di back office e collocato nella societa candidata" w:value="1 - Il servizio di back office e collocato nella societa candidata"/>
-            <w:listItem w:displayText="2 - Il servizio di back office e centralizzato a livello di gruppo" w:value="2 - Il servizio di back office e centralizzato a livello di gruppo"/>
-            <w:listItem w:displayText="3 - Il servizio di back office e affidato in service a societa esterna al gruppo" w:value="3 - Il servizio di back office e affidato in service a societa esterna al gruppo"/>
+            <w:listItem w:displayText="1 - The back office service is located within the candidate company" w:value="1 - The back office service is located within the candidate company"/>
+            <w:listItem w:displayText="2 - The back office service is centralised at group level" w:value="2 - The back office service is centralised at group level"/>
+            <w:listItem w:displayText="3 - The back office service is outsourced to a company outside the group" w:value="3 - The back office service is outsourced to a company outside the group"/>
           </w:dropDownList>
         </w:sdtPr>
         <w:sdtContent>
@@ -23008,8 +22716,8 @@
           <w:showingPlcHdr/>
           <w:dropDownList>
             <w:listItem w:displayText="Choose an item." w:value=""/>
-            <w:listItem w:displayText="1 - Il rapporto viene gestito dalla societa candidata" w:value="1 - Il rapporto viene gestito dalla societa candidata"/>
-            <w:listItem w:displayText="2 - Il rapporto viene gestito dalla societa incaricata del gruppo ovvero dalla societa esterna che opera il servizio" w:value="2 - Il rapporto viene gestito dalla societa incaricata del gruppo ovvero dalla societa esterna che opera il servizio"/>
+            <w:listItem w:displayText="1 - The relationship is managed by the candidate company" w:value="1 - The relationship is managed by the candidate company"/>
+            <w:listItem w:displayText="2 - The relationship is managed by the group company in charge or by the external company providing the service" w:value="2 - The relationship is managed by the group company in charge or by the external company providing the service"/>
           </w:dropDownList>
         </w:sdtPr>
         <w:sdtContent>
@@ -23104,8 +22812,8 @@
           <w:showingPlcHdr/>
           <w:dropDownList>
             <w:listItem w:displayText="Choose an item." w:value=""/>
-            <w:listItem w:displayText="1 - Si, esiste un back office che svolge attivita esclusiva per conto della clientela istituzionale" w:value="1 - Si, esiste un back office che svolge attivita esclusiva per conto della clientela istituzionale"/>
-            <w:listItem w:displayText="2 - No, non esiste un back office che svolge attivita esclusiva per conto della clientela istituzionale" w:value="2 - No, non esiste un back office che svolge attivita esclusiva per conto della clientela istituzionale"/>
+            <w:listItem w:displayText="1 - Yes, there is a back office working exclusively for institutional clients" w:value="1 - Yes, there is a back office working exclusively for institutional clients"/>
+            <w:listItem w:displayText="2 - No, there is no back office working exclusively for institutional clients" w:value="2 - No, there is no back office working exclusively for institutional clients"/>
           </w:dropDownList>
         </w:sdtPr>
         <w:sdtContent>
@@ -23978,9 +23686,9 @@
           <w:showingPlcHdr/>
           <w:dropDownList>
             <w:listItem w:displayText="Choose an item." w:value=""/>
-            <w:listItem w:displayText="La societa candidata utilizza un database/ricerca esterna" w:value="La societa candidata utilizza un database/ricerca esterna"/>
-            <w:listItem w:displayText="La societa candidata utilizza ricerca propria" w:value="La societa candidata utilizza ricerca propria"/>
-            <w:listItem w:displayText="La societa candidata utilizza sia ricerca propria che database/ricerca esterna" w:value="La societa candidata utilizza sia ricerca propria che database/ricerca esterna"/>
+            <w:listItem w:displayText="The candidate company uses an external database / external research" w:value="The candidate company uses an external database / external research"/>
+            <w:listItem w:displayText="The candidate company uses its own research" w:value="The candidate company uses its own research"/>
+            <w:listItem w:displayText="The candidate company uses both its own research and an external database / external research" w:value="The candidate company uses both its own research and an external database / external research"/>
           </w:dropDownList>
         </w:sdtPr>
         <w:sdtContent>
@@ -24321,8 +24029,8 @@
           <w:showingPlcHdr/>
           <w:dropDownList>
             <w:listItem w:displayText="Choose an item." w:value=""/>
-            <w:listItem w:displayText="1 - La struttura e collocata nella societa candidata" w:value="1 - La struttura e collocata nella societa candidata"/>
-            <w:listItem w:displayText="2 - La struttura e collocata a livello di gruppo in una societa specializzata" w:value="2 - La struttura e collocata a livello di gruppo in una societa specializzata"/>
+            <w:listItem w:displayText="1 - The structure is located within the candidate company" w:value="1 - The structure is located within the candidate company"/>
+            <w:listItem w:displayText="2 - The structure is located at group level, in a specialised company" w:value="2 - The structure is located at group level, in a specialised company"/>
           </w:dropDownList>
         </w:sdtPr>
         <w:sdtContent>
@@ -24479,8 +24187,8 @@
           <w:showingPlcHdr/>
           <w:dropDownList>
             <w:listItem w:displayText="Choose an item." w:value=""/>
-            <w:listItem w:displayText="1 - La societa candidata gestisce prodotti caratterizzati come ESG e/o investimenti socialmente responsabili" w:value="1 - La societa candidata gestisce prodotti caratterizzati come ESG e/o investimenti socialmente responsabili"/>
-            <w:listItem w:displayText="2 - La societa candidata non gestisce prodotti caratterizzati come ESG e/o investimenti socialmente responsabili" w:value="2 - La societa candidata non gestisce prodotti caratterizzati come ESG e/o investimenti socialmente responsabili"/>
+            <w:listItem w:displayText="1 - The candidate company manages products characterised as ESG and/or socially responsible investments" w:value="1 - The candidate company manages products characterised as ESG and/or socially responsible investments"/>
+            <w:listItem w:displayText="2 - The candidate company does not manage products characterised as ESG and/or socially responsible investments" w:value="2 - The candidate company does not manage products characterised as ESG and/or socially responsible investments"/>
           </w:dropDownList>
         </w:sdtPr>
         <w:sdtContent>
@@ -25023,8 +24731,8 @@
           <w:showingPlcHdr/>
           <w:dropDownList>
             <w:listItem w:displayText="Choose an item." w:value=""/>
-            <w:listItem w:displayText="1 - Esiste un comitato di sostenibilita o sugli ISR che presiede alle politiche degli investimenti socialmente responsabili" w:value="1 - Esiste un comitato di sostenibilita o sugli ISR che presiede alle politiche degli investimenti socialmente responsabili"/>
-            <w:listItem w:displayText="2 - Non esiste un comitato di sostenibilita o sugli ISR che presiede alle politiche degli investimenti socialmente responsabili" w:value="2 - Non esiste un comitato di sostenibilita o sugli ISR che presiede alle politiche degli investimenti socialmente responsabili"/>
+            <w:listItem w:displayText="1 - A sustainability or SRI committee exists which oversees socially responsible investment policies" w:value="1 - A sustainability or SRI committee exists which oversees socially responsible investment policies"/>
+            <w:listItem w:displayText="2 - No sustainability or SRI committee exists which oversees socially responsible investment policies" w:value="2 - No sustainability or SRI committee exists which oversees socially responsible investment policies"/>
           </w:dropDownList>
         </w:sdtPr>
         <w:sdtContent>
@@ -25487,8 +25195,8 @@
           <w:showingPlcHdr/>
           <w:dropDownList>
             <w:listItem w:displayText="Choose an item." w:value=""/>
-            <w:listItem w:displayText="1 - Il giudizio del Comitato etico e vincolante per il gestore" w:value="1 - Il giudizio del Comitato etico e vincolante per il gestore"/>
-            <w:listItem w:displayText="2 - Il giudizio del Comitato etico non e vincolante per il gestore" w:value="2 - Il giudizio del Comitato etico non e vincolante per il gestore"/>
+            <w:listItem w:displayText="1 - The Ethics Committee's opinion is binding on the manager" w:value="1 - The Ethics Committee's opinion is binding on the manager"/>
+            <w:listItem w:displayText="2 - The Ethics Committee's opinion is not binding on the manager" w:value="2 - The Ethics Committee's opinion is not binding on the manager"/>
           </w:dropDownList>
         </w:sdtPr>
         <w:sdtContent>
@@ -25847,10 +25555,10 @@
           <w:showingPlcHdr/>
           <w:dropDownList>
             <w:listItem w:displayText="Choose an item." w:value=""/>
-            <w:listItem w:displayText="Si, si avvale di liste pubbliche" w:value="Si, si avvale di liste pubbliche"/>
-            <w:listItem w:displayText="Si, si avvale del servizio di un provider" w:value="Si, si avvale del servizio di un provider"/>
-            <w:listItem w:displayText="Si, si avvale di liste pubbliche e del servizio di un provider" w:value="Si, si avvale di liste pubbliche e del servizio di un provider"/>
-            <w:listItem w:displayText="No, costruisce le liste esclusivamente attraverso la propria ricerca" w:value="No, costruisce le liste esclusivamente attraverso la propria ricerca"/>
+            <w:listItem w:displayText="Yes, uses public lists" w:value="Yes, uses public lists"/>
+            <w:listItem w:displayText="Yes, uses the service of a provider" w:value="Yes, uses the service of a provider"/>
+            <w:listItem w:displayText="Yes, uses public lists and the service of a provider" w:value="Yes, uses public lists and the service of a provider"/>
+            <w:listItem w:displayText="No, builds the lists exclusively through its own research" w:value="No, builds the lists exclusively through its own research"/>
             <w:listItem w:displayText="No" w:value="No"/>
           </w:dropDownList>
         </w:sdtPr>
@@ -26416,9 +26124,9 @@
           <w:showingPlcHdr/>
           <w:dropDownList>
             <w:listItem w:displayText="Choose an item." w:value=""/>
-            <w:listItem w:displayText="Una funzione interna alla societa candidata" w:value="Una funzione interna alla societa candidata"/>
-            <w:listItem w:displayText="Altra societa del gruppo" w:value="Altra societa del gruppo"/>
-            <w:listItem w:displayText="Altra societa in outsourcing" w:value="Altra societa in outsourcing"/>
+            <w:listItem w:displayText="An internal function of the candidate company" w:value="An internal function of the candidate company"/>
+            <w:listItem w:displayText="Another group company" w:value="Another group company"/>
+            <w:listItem w:displayText="Another company, outsourced" w:value="Another company, outsourced"/>
           </w:dropDownList>
         </w:sdtPr>
         <w:sdtContent>
@@ -26513,8 +26221,8 @@
           <w:showingPlcHdr/>
           <w:dropDownList>
             <w:listItem w:displayText="Choose an item." w:value=""/>
-            <w:listItem w:displayText="La riconciliazione avviene su base giornaliera indipendentemente dal numero di operazioni in essere con la controparte" w:value="La riconciliazione avviene su base giornaliera indipendentemente dal numero di operazioni in essere con la controparte"/>
-            <w:listItem w:displayText="Sulla base della cadenza definita dalla normativa in funzione dei contratti in essere con la controparte" w:value="Sulla base della cadenza definita dalla normativa in funzione dei contratti in essere con la controparte"/>
+            <w:listItem w:displayText="Reconciliation takes place daily, regardless of the number of transactions outstanding with the counterparty" w:value="Reconciliation takes place daily, regardless of the number of transactions outstanding with the counterparty"/>
+            <w:listItem w:displayText="Based on the frequency defined by regulation, depending on the contracts outstanding with the counterparty" w:value="Based on the frequency defined by regulation, depending on the contracts outstanding with the counterparty"/>
           </w:dropDownList>
         </w:sdtPr>
         <w:sdtContent>
@@ -26735,9 +26443,9 @@
             <w:listItem w:displayText="Choose an item." w:value=""/>
             <w:listItem w:displayText="ISDA" w:value="ISDA"/>
             <w:listItem w:displayText="EMA" w:value="EMA"/>
-            <w:listItem w:displayText="Contrattualistica definita da entita nazionali (es. DERV Germania, FBF Francia, ecc.)" w:value="Contrattualistica definita da entita nazionali (es. DERV Germania, FBF Francia, ecc.)"/>
-            <w:listItem w:displayText="Altra contrattualistica" w:value="Altra contrattualistica"/>
-            <w:listItem w:displayText="La societa non adotta alcuna contrattualistica standard" w:value="La societa non adotta alcuna contrattualistica standard"/>
+            <w:listItem w:displayText="Contractual terms defined by national entities (e.g. DERV Germany, FBF France, etc.)" w:value="Contractual terms defined by national entities (e.g. DERV Germany, FBF France, etc.)"/>
+            <w:listItem w:displayText="Other contractual terms" w:value="Other contractual terms"/>
+            <w:listItem w:displayText="The company does not adopt any standard contractual terms" w:value="The company does not adopt any standard contractual terms"/>
           </w:dropDownList>
         </w:sdtPr>
         <w:sdtContent>
@@ -27130,8 +26838,8 @@
           <w:showingPlcHdr/>
           <w:dropDownList>
             <w:listItem w:displayText="Choose an item." w:value=""/>
-            <w:listItem w:displayText="1 - Il gruppo svolge attivita che rientrano tra quelle di collocamento titoli per conto di terzi" w:value="1 - Il gruppo svolge attivita che rientrano tra quelle di collocamento titoli per conto di terzi"/>
-            <w:listItem w:displayText="2 - Il gruppo non svolge attivita che rientrano tra quelle di collocamento titoli per conto di terzi" w:value="2 - Il gruppo non svolge attivita che rientrano tra quelle di collocamento titoli per conto di terzi"/>
+            <w:listItem w:displayText="1 - The group carries out activities falling within the placement of securities on behalf of third parties" w:value="1 - The group carries out activities falling within the placement of securities on behalf of third parties"/>
+            <w:listItem w:displayText="2 - The group does not carry out activities falling within the placement of securities on behalf of third parties" w:value="2 - The group does not carry out activities falling within the placement of securities on behalf of third parties"/>
           </w:dropDownList>
         </w:sdtPr>
         <w:sdtContent>
@@ -28048,9 +27756,9 @@
           <w:showingPlcHdr/>
           <w:dropDownList>
             <w:listItem w:displayText="Choose an item." w:value=""/>
-            <w:listItem w:displayText="1 - La societa ha adottato un codice etico proposto da un'associazione di categoria" w:value="1 - La societa ha adottato un codice etico proposto da un'associazione di categoria"/>
-            <w:listItem w:displayText="2 - La societa ha adottato un codice etico proprio in alternativa a quello predisposto da un'associazione di categoria" w:value="2 - La societa ha adottato un codice etico proprio in alternativa a quello predisposto da un'associazione di categoria"/>
-            <w:listItem w:displayText="3 - La societa ha adottato un codice etico proprio in aggiunta a quello predisposto da un'associazione di categoria" w:value="3 - La societa ha adottato un codice etico proprio in aggiunta a quello predisposto da un'associazione di categoria"/>
+            <w:listItem w:displayText="1 - The company has adopted an ethical code proposed by a trade association" w:value="1 - The company has adopted an ethical code proposed by a trade association"/>
+            <w:listItem w:displayText="2 - The company has adopted its own ethical code as an alternative to the one prepared by a trade association" w:value="2 - The company has adopted its own ethical code as an alternative to the one prepared by a trade association"/>
+            <w:listItem w:displayText="3 - The company has adopted its own ethical code in addition to the one prepared by a trade association" w:value="3 - The company has adopted its own ethical code in addition to the one prepared by a trade association"/>
           </w:dropDownList>
         </w:sdtPr>
         <w:sdtContent>
@@ -28263,8 +27971,8 @@
           <w:showingPlcHdr/>
           <w:dropDownList>
             <w:listItem w:displayText="Choose an item." w:value=""/>
-            <w:listItem w:displayText="1 - Esiste un team dedicato alla gestione delle relazioni con la clientela istituzionale" w:value="1 - Esiste un team dedicato alla gestione delle relazioni con la clientela istituzionale"/>
-            <w:listItem w:displayText="2 - Non esiste un team dedicato alla gestione delle relazioni con la clientela istituzionale" w:value="2 - Non esiste un team dedicato alla gestione delle relazioni con la clientela istituzionale"/>
+            <w:listItem w:displayText="1 - A team dedicated to managing relations with institutional clients exists" w:value="1 - A team dedicated to managing relations with institutional clients exists"/>
+            <w:listItem w:displayText="2 - No team dedicated to managing relations with institutional clients exists" w:value="2 - No team dedicated to managing relations with institutional clients exists"/>
           </w:dropDownList>
         </w:sdtPr>
         <w:sdtContent>
@@ -28835,8 +28543,8 @@
           <w:showingPlcHdr/>
           <w:dropDownList>
             <w:listItem w:displayText="Choose an item." w:value=""/>
-            <w:listItem w:displayText="1 - La societa candidata gestisce direttamente i rapporti con l'investitore" w:value="1 - La societa candidata gestisce direttamente i rapporti con l'investitore"/>
-            <w:listItem w:displayText="2 - La societa candidata affida a terzi la gestione dei rapporti con l'investitore" w:value="2 - La societa candidata affida a terzi la gestione dei rapporti con l'investitore"/>
+            <w:listItem w:displayText="1 - The candidate company manages investor relations directly" w:value="1 - The candidate company manages investor relations directly"/>
+            <w:listItem w:displayText="2 - The candidate company entrusts investor relations to third parties" w:value="2 - The candidate company entrusts investor relations to third parties"/>
           </w:dropDownList>
         </w:sdtPr>
         <w:sdtContent>
@@ -28901,9 +28609,9 @@
           <w:showingPlcHdr/>
           <w:dropDownList>
             <w:listItem w:displayText="Choose an item." w:value=""/>
-            <w:listItem w:displayText="1 - Si, la societa si impegna a fornire le informazioni sopraindicate" w:value="1 - Si, la societa si impegna a fornire le informazioni sopraindicate"/>
-            <w:listItem w:displayText="2 - No, la societa non fornisce i dati sopraindicati" w:value="2 - No, la societa non fornisce i dati sopraindicati"/>
-            <w:listItem w:displayText="3 - No, la societa non fornisce i dati sopraindicati su base giornaliera, ma li fornisce con minor frequenza" w:value="3 - No, la societa non fornisce i dati sopraindicati su base giornaliera, ma li fornisce con minor frequenza"/>
+            <w:listItem w:displayText="1 - Yes, the company undertakes to provide the above information" w:value="1 - Yes, the company undertakes to provide the above information"/>
+            <w:listItem w:displayText="2 - No, the company does not provide the above data" w:value="2 - No, the company does not provide the above data"/>
+            <w:listItem w:displayText="3 - No, the company does not provide the above data daily, but provides it less frequently" w:value="3 - No, the company does not provide the above data daily, but provides it less frequently"/>
           </w:dropDownList>
         </w:sdtPr>
         <w:sdtContent>
@@ -28968,8 +28676,8 @@
           <w:showingPlcHdr/>
           <w:dropDownList>
             <w:listItem w:displayText="Choose an item." w:value=""/>
-            <w:listItem w:displayText="1 - Si, la societa candidata si impegna a fornire una completa disclosure sui componenti degli OICR presenti nel portafoglio" w:value="1 - Si, la societa candidata si impegna a fornire una completa disclosure sui componenti degli OICR presenti nel portafoglio"/>
-            <w:listItem w:displayText="2 - No, la societa candidata non puo fornire una completa disclosure sui componenti degli OICR presenti nel portafoglio" w:value="2 - No, la societa candidata non puo fornire una completa disclosure sui componenti degli OICR presenti nel portafoglio"/>
+            <w:listItem w:displayText="1 - Yes, the candidate company undertakes to provide full disclosure of the components of the UCITS held in the portfolio" w:value="1 - Yes, the candidate company undertakes to provide full disclosure of the components of the UCITS held in the portfolio"/>
+            <w:listItem w:displayText="2 - No, the candidate company cannot provide full disclosure of the components of the UCITS held in the portfolio" w:value="2 - No, the candidate company cannot provide full disclosure of the components of the UCITS held in the portfolio"/>
           </w:dropDownList>
         </w:sdtPr>
         <w:sdtContent>
@@ -29018,9 +28726,9 @@
           <w:showingPlcHdr/>
           <w:dropDownList>
             <w:listItem w:displayText="Choose an item." w:value=""/>
-            <w:listItem w:displayText="1 - Si, la societa si impegna a fornire le informazioni sopraindicate" w:value="1 - Si, la societa si impegna a fornire le informazioni sopraindicate"/>
-            <w:listItem w:displayText="2 - No, la societa non fornisce i dati sopraindicati" w:value="2 - No, la societa non fornisce i dati sopraindicati"/>
-            <w:listItem w:displayText="3 - No, la societa non fornisce i dati sopraindicati su base giornaliera, ma li fornisce con minor frequenza" w:value="3 - No, la societa non fornisce i dati sopraindicati su base giornaliera, ma li fornisce con minor frequenza"/>
+            <w:listItem w:displayText="1 - Yes, the company undertakes to provide the above information" w:value="1 - Yes, the company undertakes to provide the above information"/>
+            <w:listItem w:displayText="2 - No, the company does not provide the above data" w:value="2 - No, the company does not provide the above data"/>
+            <w:listItem w:displayText="3 - No, the company does not provide the above data daily, but provides it less frequently" w:value="3 - No, the company does not provide the above data daily, but provides it less frequently"/>
           </w:dropDownList>
         </w:sdtPr>
         <w:sdtContent>
@@ -30021,8 +29729,8 @@
           <w:showingPlcHdr/>
           <w:dropDownList>
             <w:listItem w:displayText="Choose an item." w:value=""/>
-            <w:listItem w:displayText="Il benchmark utilizzato coincide con quello proposto nel questionario" w:value="Il benchmark utilizzato coincide con quello proposto nel questionario"/>
-            <w:listItem w:displayText="Il benchmark utilizzato e diverso da quello indicato dal questionario" w:value="Il benchmark utilizzato e diverso da quello indicato dal questionario"/>
+            <w:listItem w:displayText="The benchmark used matches the one proposed in the questionnaire" w:value="The benchmark used matches the one proposed in the questionnaire"/>
+            <w:listItem w:displayText="The benchmark used differs from the one indicated in the questionnaire" w:value="The benchmark used differs from the one indicated in the questionnaire"/>
           </w:dropDownList>
         </w:sdtPr>
         <w:sdtContent>
@@ -30367,8 +30075,8 @@
           <w:showingPlcHdr/>
           <w:dropDownList>
             <w:listItem w:displayText="Choose an item." w:value=""/>
-            <w:listItem w:displayText="Il riferimento (ISIN e Ticker Thomson) dell'OICR individua una classe di quota istituzionale senza commissioni" w:value="Il riferimento (ISIN e Ticker Thomson) dell'OICR individua una classe di quota istituzionale senza commissioni"/>
-            <w:listItem w:displayText="Il riferimento (ISIN e Ticker Thomson) dell'OICR individua una classe di quota comprensiva di commissioni di gestione" w:value="Il riferimento (ISIN e Ticker Thomson) dell'OICR individua una classe di quota comprensiva di commissioni di gestione"/>
+            <w:listItem w:displayText="The reference (ISIN and Thomson ticker) of the UCITS identifies an institutional share class without fees" w:value="The reference (ISIN and Thomson ticker) of the UCITS identifies an institutional share class without fees"/>
+            <w:listItem w:displayText="The reference (ISIN and Thomson ticker) of the UCITS identifies a share class including management fees" w:value="The reference (ISIN and Thomson ticker) of the UCITS identifies a share class including management fees"/>
           </w:dropDownList>
         </w:sdtPr>
         <w:sdtContent>
@@ -31895,8 +31603,8 @@
           <w:showingPlcHdr/>
           <w:dropDownList>
             <w:listItem w:displayText="Choose an item." w:value=""/>
-            <w:listItem w:displayText="Il benchmark utilizzato coincide con quello proposto nel questionario" w:value="Il benchmark utilizzato coincide con quello proposto nel questionario"/>
-            <w:listItem w:displayText="Il benchmark utilizzato e diverso da quello indicato dal questionario" w:value="Il benchmark utilizzato e diverso da quello indicato dal questionario"/>
+            <w:listItem w:displayText="The benchmark used matches the one proposed in the questionnaire" w:value="The benchmark used matches the one proposed in the questionnaire"/>
+            <w:listItem w:displayText="The benchmark used differs from the one indicated in the questionnaire" w:value="The benchmark used differs from the one indicated in the questionnaire"/>
           </w:dropDownList>
         </w:sdtPr>
         <w:sdtContent>
@@ -32209,8 +31917,8 @@
           <w:showingPlcHdr/>
           <w:dropDownList>
             <w:listItem w:displayText="Choose an item." w:value=""/>
-            <w:listItem w:displayText="Il riferimento (ISIN e Ticker Thomson) dell'OICR individua una classe di quota istituzionale senza commissioni" w:value="Il riferimento (ISIN e Ticker Thomson) dell'OICR individua una classe di quota istituzionale senza commissioni"/>
-            <w:listItem w:displayText="Il riferimento (ISIN e Ticker Thomson) dell'OICR individua una classe di quota comprensiva di commissioni di gestione" w:value="Il riferimento (ISIN e Ticker Thomson) dell'OICR individua una classe di quota comprensiva di commissioni di gestione"/>
+            <w:listItem w:displayText="The reference (ISIN and Thomson ticker) of the UCITS identifies an institutional share class without fees" w:value="The reference (ISIN and Thomson ticker) of the UCITS identifies an institutional share class without fees"/>
+            <w:listItem w:displayText="The reference (ISIN and Thomson ticker) of the UCITS identifies a share class including management fees" w:value="The reference (ISIN and Thomson ticker) of the UCITS identifies a share class including management fees"/>
           </w:dropDownList>
         </w:sdtPr>
         <w:sdtContent>
@@ -32491,9 +32199,9 @@
           <w:showingPlcHdr/>
           <w:dropDownList>
             <w:listItem w:displayText="Choose an item." w:value=""/>
-            <w:listItem w:displayText="L'OICR e gestito con lo stesso stile di gestione che sara applicato nel mandato" w:value="L'OICR e gestito con lo stesso stile di gestione che sara applicato nel mandato"/>
-            <w:listItem w:displayText="L'OICR e gestito con uno stile di gestione simile in prevalenza a quello che sara applicato nel mandato" w:value="L'OICR e gestito con uno stile di gestione simile in prevalenza a quello che sara applicato nel mandato"/>
-            <w:listItem w:displayText="L'OICR e gestito con uno stile di gestione differente da quello che sara applicato nel mandato" w:value="L'OICR e gestito con uno stile di gestione differente da quello che sara applicato nel mandato"/>
+            <w:listItem w:displayText="The UCITS is managed with the same management style that will be applied in the mandate" w:value="The UCITS is managed with the same management style that will be applied in the mandate"/>
+            <w:listItem w:displayText="The UCITS is managed with a management style mainly similar to the one that will be applied in the mandate" w:value="The UCITS is managed with a management style mainly similar to the one that will be applied in the mandate"/>
+            <w:listItem w:displayText="The UCITS is managed with a management style different from the one that will be applied in the mandate" w:value="The UCITS is managed with a management style different from the one that will be applied in the mandate"/>
           </w:dropDownList>
         </w:sdtPr>
         <w:sdtContent>
@@ -34458,9 +34166,9 @@
           <w:showingPlcHdr/>
           <w:dropDownList>
             <w:listItem w:displayText="Choose an item." w:value=""/>
-            <w:listItem w:displayText="L'OICR e gestito con lo stesso stile di gestione che sara applicato nel mandato" w:value="L'OICR e gestito con lo stesso stile di gestione che sara applicato nel mandato"/>
-            <w:listItem w:displayText="L'OICR e gestito con uno stile di gestione simile in prevalenza a quello che sara applicato nel mandato" w:value="L'OICR e gestito con uno stile di gestione simile in prevalenza a quello che sara applicato nel mandato"/>
-            <w:listItem w:displayText="L'OICR e gestito con uno stile di gestione differente da quello che sara applicato nel mandato" w:value="L'OICR e gestito con uno stile di gestione differente da quello che sara applicato nel mandato"/>
+            <w:listItem w:displayText="The UCITS is managed with the same management style that will be applied in the mandate" w:value="The UCITS is managed with the same management style that will be applied in the mandate"/>
+            <w:listItem w:displayText="The UCITS is managed with a management style mainly similar to the one that will be applied in the mandate" w:value="The UCITS is managed with a management style mainly similar to the one that will be applied in the mandate"/>
+            <w:listItem w:displayText="The UCITS is managed with a management style different from the one that will be applied in the mandate" w:value="The UCITS is managed with a management style different from the one that will be applied in the mandate"/>
           </w:dropDownList>
         </w:sdtPr>
         <w:sdtContent>
@@ -35895,8 +35603,8 @@
           <w:showingPlcHdr/>
           <w:dropDownList>
             <w:listItem w:displayText="Choose an item." w:value=""/>
-            <w:listItem w:displayText="Il benchmark utilizzato coincide con quello proposto nel questionario" w:value="Il benchmark utilizzato coincide con quello proposto nel questionario"/>
-            <w:listItem w:displayText="Il benchmark utilizzato e diverso da quello indicato dal questionario" w:value="Il benchmark utilizzato e diverso da quello indicato dal questionario"/>
+            <w:listItem w:displayText="The benchmark used matches the one proposed in the questionnaire" w:value="The benchmark used matches the one proposed in the questionnaire"/>
+            <w:listItem w:displayText="The benchmark used differs from the one indicated in the questionnaire" w:value="The benchmark used differs from the one indicated in the questionnaire"/>
           </w:dropDownList>
         </w:sdtPr>
         <w:sdtContent>
@@ -36209,8 +35917,8 @@
           <w:showingPlcHdr/>
           <w:dropDownList>
             <w:listItem w:displayText="Choose an item." w:value=""/>
-            <w:listItem w:displayText="Il riferimento (ISIN e Ticker Thomson) dell'OICR individua una classe di quota istituzionale senza commissioni" w:value="Il riferimento (ISIN e Ticker Thomson) dell'OICR individua una classe di quota istituzionale senza commissioni"/>
-            <w:listItem w:displayText="Il riferimento (ISIN e Ticker Thomson) dell'OICR individua una classe di quota comprensiva di commissioni di gestione" w:value="Il riferimento (ISIN e Ticker Thomson) dell'OICR individua una classe di quota comprensiva di commissioni di gestione"/>
+            <w:listItem w:displayText="The reference (ISIN and Thomson ticker) of the UCITS identifies an institutional share class without fees" w:value="The reference (ISIN and Thomson ticker) of the UCITS identifies an institutional share class without fees"/>
+            <w:listItem w:displayText="The reference (ISIN and Thomson ticker) of the UCITS identifies a share class including management fees" w:value="The reference (ISIN and Thomson ticker) of the UCITS identifies a share class including management fees"/>
           </w:dropDownList>
         </w:sdtPr>
         <w:sdtContent>
@@ -36491,9 +36199,9 @@
           <w:showingPlcHdr/>
           <w:dropDownList>
             <w:listItem w:displayText="Choose an item." w:value=""/>
-            <w:listItem w:displayText="L'OICR e gestito con lo stesso stile di gestione che sara applicato nel mandato" w:value="L'OICR e gestito con lo stesso stile di gestione che sara applicato nel mandato"/>
-            <w:listItem w:displayText="L'OICR e gestito con uno stile di gestione simile in prevalenza a quello che sara applicato nel mandato" w:value="L'OICR e gestito con uno stile di gestione simile in prevalenza a quello che sara applicato nel mandato"/>
-            <w:listItem w:displayText="L'OICR e gestito con uno stile di gestione differente da quello che sara applicato nel mandato" w:value="L'OICR e gestito con uno stile di gestione differente da quello che sara applicato nel mandato"/>
+            <w:listItem w:displayText="The UCITS is managed with the same management style that will be applied in the mandate" w:value="The UCITS is managed with the same management style that will be applied in the mandate"/>
+            <w:listItem w:displayText="The UCITS is managed with a management style mainly similar to the one that will be applied in the mandate" w:value="The UCITS is managed with a management style mainly similar to the one that will be applied in the mandate"/>
+            <w:listItem w:displayText="The UCITS is managed with a management style different from the one that will be applied in the mandate" w:value="The UCITS is managed with a management style different from the one that will be applied in the mandate"/>
           </w:dropDownList>
         </w:sdtPr>
         <w:sdtContent>
@@ -38114,8 +37822,8 @@
           <w:showingPlcHdr/>
           <w:dropDownList>
             <w:listItem w:displayText="Choose an item." w:value=""/>
-            <w:listItem w:displayText="Il riferimento (ISIN e Ticker Thomson) dell'OICR individua una classe di quota istituzionale senza commissioni" w:value="Il riferimento (ISIN e Ticker Thomson) dell'OICR individua una classe di quota istituzionale senza commissioni"/>
-            <w:listItem w:displayText="Il riferimento (ISIN e Ticker Thomson) dell'OICR individua una classe di quota comprensiva di commissioni di gestione" w:value="Il riferimento (ISIN e Ticker Thomson) dell'OICR individua una classe di quota comprensiva di commissioni di gestione"/>
+            <w:listItem w:displayText="The reference (ISIN and Thomson ticker) of the UCITS identifies an institutional share class without fees" w:value="The reference (ISIN and Thomson ticker) of the UCITS identifies an institutional share class without fees"/>
+            <w:listItem w:displayText="The reference (ISIN and Thomson ticker) of the UCITS identifies a share class including management fees" w:value="The reference (ISIN and Thomson ticker) of the UCITS identifies a share class including management fees"/>
           </w:dropDownList>
         </w:sdtPr>
         <w:sdtContent>
@@ -38396,9 +38104,9 @@
           <w:showingPlcHdr/>
           <w:dropDownList>
             <w:listItem w:displayText="Choose an item." w:value=""/>
-            <w:listItem w:displayText="L'OICR e gestito con lo stesso stile di gestione che sara applicato nel mandato" w:value="L'OICR e gestito con lo stesso stile di gestione che sara applicato nel mandato"/>
-            <w:listItem w:displayText="L'OICR e gestito con uno stile di gestione simile in prevalenza a quello che sara applicato nel mandato" w:value="L'OICR e gestito con uno stile di gestione simile in prevalenza a quello che sara applicato nel mandato"/>
-            <w:listItem w:displayText="L'OICR e gestito con uno stile di gestione differente da quello che sara applicato nel mandato" w:value="L'OICR e gestito con uno stile di gestione differente da quello che sara applicato nel mandato"/>
+            <w:listItem w:displayText="The UCITS is managed with the same management style that will be applied in the mandate" w:value="The UCITS is managed with the same management style that will be applied in the mandate"/>
+            <w:listItem w:displayText="The UCITS is managed with a management style mainly similar to the one that will be applied in the mandate" w:value="The UCITS is managed with a management style mainly similar to the one that will be applied in the mandate"/>
+            <w:listItem w:displayText="The UCITS is managed with a management style different from the one that will be applied in the mandate" w:value="The UCITS is managed with a management style different from the one that will be applied in the mandate"/>
           </w:dropDownList>
         </w:sdtPr>
         <w:sdtContent>
@@ -39709,8 +39417,8 @@
           <w:showingPlcHdr/>
           <w:dropDownList>
             <w:listItem w:displayText="Choose an item." w:value=""/>
-            <w:listItem w:displayText="Il benchmark utilizzato coincide con quello proposto nel questionario" w:value="Il benchmark utilizzato coincide con quello proposto nel questionario"/>
-            <w:listItem w:displayText="Il benchmark utilizzato e diverso da quello indicato dal questionario" w:value="Il benchmark utilizzato e diverso da quello indicato dal questionario"/>
+            <w:listItem w:displayText="The benchmark used matches the one proposed in the questionnaire" w:value="The benchmark used matches the one proposed in the questionnaire"/>
+            <w:listItem w:displayText="The benchmark used differs from the one indicated in the questionnaire" w:value="The benchmark used differs from the one indicated in the questionnaire"/>
           </w:dropDownList>
         </w:sdtPr>
         <w:sdtContent>
@@ -40301,9 +40009,9 @@
           <w:showingPlcHdr/>
           <w:dropDownList>
             <w:listItem w:displayText="Choose an item." w:value=""/>
-            <w:listItem w:displayText="L'OICR e gestito con lo stesso stile di gestione che sara applicato nel mandato" w:value="L'OICR e gestito con lo stesso stile di gestione che sara applicato nel mandato"/>
-            <w:listItem w:displayText="L'OICR e gestito con uno stile di gestione simile in prevalenza a quello che sara applicato nel mandato" w:value="L'OICR e gestito con uno stile di gestione simile in prevalenza a quello che sara applicato nel mandato"/>
-            <w:listItem w:displayText="L'OICR e gestito con uno stile di gestione differente da quello che sara applicato nel mandato" w:value="L'OICR e gestito con uno stile di gestione differente da quello che sara applicato nel mandato"/>
+            <w:listItem w:displayText="The UCITS is managed with the same management style that will be applied in the mandate" w:value="The UCITS is managed with the same management style that will be applied in the mandate"/>
+            <w:listItem w:displayText="The UCITS is managed with a management style mainly similar to the one that will be applied in the mandate" w:value="The UCITS is managed with a management style mainly similar to the one that will be applied in the mandate"/>
+            <w:listItem w:displayText="The UCITS is managed with a management style different from the one that will be applied in the mandate" w:value="The UCITS is managed with a management style different from the one that will be applied in the mandate"/>
           </w:dropDownList>
         </w:sdtPr>
         <w:sdtContent>
@@ -40994,13 +40702,13 @@
           <w:showingPlcHdr/>
           <w:dropDownList>
             <w:listItem w:displayText="Choose an item." w:value=""/>
-            <w:listItem w:displayText="1-3 anni" w:value="1-3 anni"/>
-            <w:listItem w:displayText="1-5 anni" w:value="1-5 anni"/>
-            <w:listItem w:displayText="1-10 anni" w:value="1-10 anni"/>
-            <w:listItem w:displayText="3-5 anni" w:value="3-5 anni"/>
-            <w:listItem w:displayText="Tratto intermedio (es. 5-7 anni)" w:value="Tratto intermedio (es. 5-7 anni)"/>
-            <w:listItem w:displayText="Maggiore di 10 anni" w:value="Maggiore di 10 anni"/>
-            <w:listItem w:displayText="All Maturities" w:value="All Maturities"/>
+            <w:listItem w:displayText="1-3 years" w:value="1-3 years"/>
+            <w:listItem w:displayText="1-5 years" w:value="1-5 years"/>
+            <w:listItem w:displayText="1-10 years" w:value="1-10 years"/>
+            <w:listItem w:displayText="3-5 years" w:value="3-5 years"/>
+            <w:listItem w:displayText="Intermediate segment (e.g. 5-7 years)" w:value="Intermediate segment (e.g. 5-7 years)"/>
+            <w:listItem w:displayText="Over 10 years" w:value="Over 10 years"/>
+            <w:listItem w:displayText="All maturities" w:value="All maturities"/>
           </w:dropDownList>
         </w:sdtPr>
         <w:sdtContent>
@@ -41987,13 +41695,13 @@
           <w:showingPlcHdr/>
           <w:dropDownList>
             <w:listItem w:displayText="Choose an item." w:value=""/>
-            <w:listItem w:displayText="1-3 anni" w:value="1-3 anni"/>
-            <w:listItem w:displayText="1-5 anni" w:value="1-5 anni"/>
-            <w:listItem w:displayText="1-10 anni" w:value="1-10 anni"/>
-            <w:listItem w:displayText="3-5 anni" w:value="3-5 anni"/>
-            <w:listItem w:displayText="Tratto intermedio (es. 5-7 anni)" w:value="Tratto intermedio (es. 5-7 anni)"/>
-            <w:listItem w:displayText="Maggiore di 10 anni" w:value="Maggiore di 10 anni"/>
-            <w:listItem w:displayText="All Maturities" w:value="All Maturities"/>
+            <w:listItem w:displayText="1-3 years" w:value="1-3 years"/>
+            <w:listItem w:displayText="1-5 years" w:value="1-5 years"/>
+            <w:listItem w:displayText="1-10 years" w:value="1-10 years"/>
+            <w:listItem w:displayText="3-5 years" w:value="3-5 years"/>
+            <w:listItem w:displayText="Intermediate segment (e.g. 5-7 years)" w:value="Intermediate segment (e.g. 5-7 years)"/>
+            <w:listItem w:displayText="Over 10 years" w:value="Over 10 years"/>
+            <w:listItem w:displayText="All maturities" w:value="All maturities"/>
           </w:dropDownList>
         </w:sdtPr>
         <w:sdtContent>
@@ -42734,13 +42442,13 @@
           <w:showingPlcHdr/>
           <w:dropDownList>
             <w:listItem w:displayText="Choose an item." w:value=""/>
-            <w:listItem w:displayText="1-3 anni" w:value="1-3 anni"/>
-            <w:listItem w:displayText="1-5 anni" w:value="1-5 anni"/>
-            <w:listItem w:displayText="1-10 anni" w:value="1-10 anni"/>
-            <w:listItem w:displayText="3-5 anni" w:value="3-5 anni"/>
-            <w:listItem w:displayText="Tratto intermedio (es. 5-7 anni)" w:value="Tratto intermedio (es. 5-7 anni)"/>
-            <w:listItem w:displayText="Maggiore di 10 anni" w:value="Maggiore di 10 anni"/>
-            <w:listItem w:displayText="All Maturities" w:value="All Maturities"/>
+            <w:listItem w:displayText="1-3 years" w:value="1-3 years"/>
+            <w:listItem w:displayText="1-5 years" w:value="1-5 years"/>
+            <w:listItem w:displayText="1-10 years" w:value="1-10 years"/>
+            <w:listItem w:displayText="3-5 years" w:value="3-5 years"/>
+            <w:listItem w:displayText="Intermediate segment (e.g. 5-7 years)" w:value="Intermediate segment (e.g. 5-7 years)"/>
+            <w:listItem w:displayText="Over 10 years" w:value="Over 10 years"/>
+            <w:listItem w:displayText="All maturities" w:value="All maturities"/>
           </w:dropDownList>
         </w:sdtPr>
         <w:sdtContent>

</xml_diff>

<commit_message>
Teatro questionnaire: options for 7 dropdowns (rating scale, provider lists, management style)
Claude-Session: https://claude.ai/code/session_01Kh4RWNEbM9iRNhAaBfutke
</commit_message>
<xml_diff>
--- a/Questionnaire_Teatro_alla_Scala_EN.docx
+++ b/Questionnaire_Teatro_alla_Scala_EN.docx
@@ -3975,11 +3975,35 @@
           <w:alias w:val="082GEA2802055"/>
           <w:id w:val="100054"/>
           <w:showingPlcHdr/>
-          <w:text/>
-        </w:sdtPr>
-        <w:sdtContent>
-          <w:r>
-            <w:t>Click or tap here to enter text.</w:t>
+          <w:dropDownList>
+            <w:listItem w:displayText="Choose an item." w:value=""/>
+            <w:listItem w:displayText="AAA" w:value="AAA"/>
+            <w:listItem w:displayText="AA+" w:value="AA+"/>
+            <w:listItem w:displayText="AA" w:value="AA"/>
+            <w:listItem w:displayText="AA-" w:value="AA-"/>
+            <w:listItem w:displayText="A+" w:value="A+"/>
+            <w:listItem w:displayText="A" w:value="A"/>
+            <w:listItem w:displayText="A-" w:value="A-"/>
+            <w:listItem w:displayText="BBB+" w:value="BBB+"/>
+            <w:listItem w:displayText="BBB" w:value="BBB"/>
+            <w:listItem w:displayText="BBB-" w:value="BBB-"/>
+            <w:listItem w:displayText="BB+" w:value="BB+"/>
+            <w:listItem w:displayText="BB" w:value="BB"/>
+            <w:listItem w:displayText="BB-" w:value="BB-"/>
+            <w:listItem w:displayText="B+" w:value="B+"/>
+            <w:listItem w:displayText="B" w:value="B"/>
+            <w:listItem w:displayText="B-" w:value="B-"/>
+            <w:listItem w:displayText="CCC+" w:value="CCC+"/>
+            <w:listItem w:displayText="CCC" w:value="CCC"/>
+            <w:listItem w:displayText="CCC-" w:value="CCC-"/>
+            <w:listItem w:displayText="CC" w:value="CC"/>
+            <w:listItem w:displayText="C" w:value="C"/>
+            <w:listItem w:displayText="D" w:value="D"/>
+          </w:dropDownList>
+        </w:sdtPr>
+        <w:sdtContent>
+          <w:r>
+            <w:t>Choose an item.</w:t>
           </w:r>
         </w:sdtContent>
       </w:sdt>
@@ -9896,11 +9920,16 @@
           <w:alias w:val="082GEC1100513"/>
           <w:id w:val="100162"/>
           <w:showingPlcHdr/>
-          <w:text/>
-        </w:sdtPr>
-        <w:sdtContent>
-          <w:r>
-            <w:t>Click or tap here to enter text.</w:t>
+          <w:dropDownList>
+            <w:listItem w:displayText="Choose an item." w:value=""/>
+            <w:listItem w:displayText="Active management" w:value="Active management"/>
+            <w:listItem w:displayText="Passive management" w:value="Passive management"/>
+            <w:listItem w:displayText="Semi-passive management" w:value="Semi-passive management"/>
+          </w:dropDownList>
+        </w:sdtPr>
+        <w:sdtContent>
+          <w:r>
+            <w:t>Choose an item.</w:t>
           </w:r>
         </w:sdtContent>
       </w:sdt>
@@ -10087,11 +10116,15 @@
           <w:alias w:val="082GEC1101130"/>
           <w:id w:val="100166"/>
           <w:showingPlcHdr/>
-          <w:text/>
-        </w:sdtPr>
-        <w:sdtContent>
-          <w:r>
-            <w:t>Click or tap here to enter text.</w:t>
+          <w:dropDownList>
+            <w:listItem w:displayText="Choose an item." w:value=""/>
+            <w:listItem w:displayText="Passive management (index)" w:value="Passive management (index)"/>
+            <w:listItem w:displayText="Other" w:value="Other"/>
+          </w:dropDownList>
+        </w:sdtPr>
+        <w:sdtContent>
+          <w:r>
+            <w:t>Choose an item.</w:t>
           </w:r>
         </w:sdtContent>
       </w:sdt>
@@ -11388,98 +11421,6 @@
         <w:sdtPr>
           <w:alias w:val="082GEC1941259"/>
           <w:id w:val="100187"/>
-          <w:showingPlcHdr/>
-          <w:text/>
-        </w:sdtPr>
-        <w:sdtContent>
-          <w:r>
-            <w:t>Click or tap here to enter text.</w:t>
-          </w:r>
-        </w:sdtContent>
-      </w:sdt>
-    </w:p>
-    <w:p>
-      <w:pPr>
-        <w:keepNext/>
-        <w:spacing w:before="200" w:after="40"/>
-      </w:pPr>
-      <w:r>
-        <w:rPr>
-          <w:rFonts w:ascii="Arial" w:hAnsi="Arial" w:cs="Arial" w:eastAsia="Arial"/>
-          <w:b/>
-          <w:i w:val="0"/>
-          <w:color w:val="000000"/>
-          <w:sz w:val="20"/>
-        </w:rPr>
-        <w:t xml:space="preserve">Macroeconomic data - Research source/provider - Second </w:t>
-      </w:r>
-      <w:r>
-        <w:rPr>
-          <w:rFonts w:ascii="Arial" w:hAnsi="Arial" w:cs="Arial" w:eastAsia="Arial"/>
-          <w:b/>
-          <w:i w:val="0"/>
-          <w:color w:val="1C355E"/>
-          <w:sz w:val="17"/>
-        </w:rPr>
-        <w:t>-082GEC1941260-</w:t>
-      </w:r>
-    </w:p>
-    <w:p>
-      <w:pPr>
-        <w:keepNext w:val="0"/>
-        <w:spacing w:before="40" w:after="120"/>
-        <w:shd w:val="clear" w:color="auto" w:fill="F2F2F2"/>
-      </w:pPr>
-      <w:sdt>
-        <w:sdtPr>
-          <w:alias w:val="082GEC1941260"/>
-          <w:id w:val="100188"/>
-          <w:showingPlcHdr/>
-          <w:text/>
-        </w:sdtPr>
-        <w:sdtContent>
-          <w:r>
-            <w:t>Click or tap here to enter text.</w:t>
-          </w:r>
-        </w:sdtContent>
-      </w:sdt>
-    </w:p>
-    <w:p>
-      <w:pPr>
-        <w:keepNext/>
-        <w:spacing w:before="200" w:after="40"/>
-      </w:pPr>
-      <w:r>
-        <w:rPr>
-          <w:rFonts w:ascii="Arial" w:hAnsi="Arial" w:cs="Arial" w:eastAsia="Arial"/>
-          <w:b/>
-          <w:i w:val="0"/>
-          <w:color w:val="000000"/>
-          <w:sz w:val="20"/>
-        </w:rPr>
-        <w:t xml:space="preserve">Macroeconomic data - Provider type - Second </w:t>
-      </w:r>
-      <w:r>
-        <w:rPr>
-          <w:rFonts w:ascii="Arial" w:hAnsi="Arial" w:cs="Arial" w:eastAsia="Arial"/>
-          <w:b/>
-          <w:i w:val="0"/>
-          <w:color w:val="1C355E"/>
-          <w:sz w:val="17"/>
-        </w:rPr>
-        <w:t>-082GEC1941261-</w:t>
-      </w:r>
-    </w:p>
-    <w:p>
-      <w:pPr>
-        <w:keepNext w:val="0"/>
-        <w:spacing w:before="40" w:after="120"/>
-        <w:shd w:val="clear" w:color="auto" w:fill="F2F2F2"/>
-      </w:pPr>
-      <w:sdt>
-        <w:sdtPr>
-          <w:alias w:val="082GEC1941261"/>
-          <w:id w:val="100189"/>
           <w:showingPlcHdr/>
           <w:dropDownList>
             <w:listItem w:displayText="Choose an item." w:value=""/>
@@ -11511,75 +11452,75 @@
           <w:color w:val="000000"/>
           <w:sz w:val="20"/>
         </w:rPr>
-        <w:t xml:space="preserve">Macroeconomic data - Research source/provider - Third </w:t>
-      </w:r>
-      <w:r>
-        <w:rPr>
-          <w:rFonts w:ascii="Arial" w:hAnsi="Arial" w:cs="Arial" w:eastAsia="Arial"/>
-          <w:b/>
-          <w:i w:val="0"/>
-          <w:color w:val="1C355E"/>
-          <w:sz w:val="17"/>
-        </w:rPr>
-        <w:t>-082GEC1941267-</w:t>
-      </w:r>
-    </w:p>
-    <w:p>
-      <w:pPr>
-        <w:keepNext w:val="0"/>
-        <w:spacing w:before="40" w:after="120"/>
-        <w:shd w:val="clear" w:color="auto" w:fill="F2F2F2"/>
-      </w:pPr>
-      <w:sdt>
-        <w:sdtPr>
-          <w:alias w:val="082GEC1941267"/>
-          <w:id w:val="100190"/>
-          <w:showingPlcHdr/>
-          <w:text/>
-        </w:sdtPr>
-        <w:sdtContent>
-          <w:r>
-            <w:t>Click or tap here to enter text.</w:t>
-          </w:r>
-        </w:sdtContent>
-      </w:sdt>
-    </w:p>
-    <w:p>
-      <w:pPr>
-        <w:keepNext/>
-        <w:spacing w:before="200" w:after="40"/>
-      </w:pPr>
-      <w:r>
-        <w:rPr>
-          <w:rFonts w:ascii="Arial" w:hAnsi="Arial" w:cs="Arial" w:eastAsia="Arial"/>
-          <w:b/>
-          <w:i w:val="0"/>
-          <w:color w:val="000000"/>
-          <w:sz w:val="20"/>
-        </w:rPr>
-        <w:t xml:space="preserve">Macroeconomic data - Provider type - Third </w:t>
-      </w:r>
-      <w:r>
-        <w:rPr>
-          <w:rFonts w:ascii="Arial" w:hAnsi="Arial" w:cs="Arial" w:eastAsia="Arial"/>
-          <w:b/>
-          <w:i w:val="0"/>
-          <w:color w:val="1C355E"/>
-          <w:sz w:val="17"/>
-        </w:rPr>
-        <w:t>-082GEC1941269-</w:t>
-      </w:r>
-    </w:p>
-    <w:p>
-      <w:pPr>
-        <w:keepNext w:val="0"/>
-        <w:spacing w:before="40" w:after="120"/>
-        <w:shd w:val="clear" w:color="auto" w:fill="F2F2F2"/>
-      </w:pPr>
-      <w:sdt>
-        <w:sdtPr>
-          <w:alias w:val="082GEC1941269"/>
-          <w:id w:val="100191"/>
+        <w:t xml:space="preserve">Macroeconomic data - Research source/provider - Second </w:t>
+      </w:r>
+      <w:r>
+        <w:rPr>
+          <w:rFonts w:ascii="Arial" w:hAnsi="Arial" w:cs="Arial" w:eastAsia="Arial"/>
+          <w:b/>
+          <w:i w:val="0"/>
+          <w:color w:val="1C355E"/>
+          <w:sz w:val="17"/>
+        </w:rPr>
+        <w:t>-082GEC1941260-</w:t>
+      </w:r>
+    </w:p>
+    <w:p>
+      <w:pPr>
+        <w:keepNext w:val="0"/>
+        <w:spacing w:before="40" w:after="120"/>
+        <w:shd w:val="clear" w:color="auto" w:fill="F2F2F2"/>
+      </w:pPr>
+      <w:sdt>
+        <w:sdtPr>
+          <w:alias w:val="082GEC1941260"/>
+          <w:id w:val="100188"/>
+          <w:showingPlcHdr/>
+          <w:text/>
+        </w:sdtPr>
+        <w:sdtContent>
+          <w:r>
+            <w:t>Click or tap here to enter text.</w:t>
+          </w:r>
+        </w:sdtContent>
+      </w:sdt>
+    </w:p>
+    <w:p>
+      <w:pPr>
+        <w:keepNext/>
+        <w:spacing w:before="200" w:after="40"/>
+      </w:pPr>
+      <w:r>
+        <w:rPr>
+          <w:rFonts w:ascii="Arial" w:hAnsi="Arial" w:cs="Arial" w:eastAsia="Arial"/>
+          <w:b/>
+          <w:i w:val="0"/>
+          <w:color w:val="000000"/>
+          <w:sz w:val="20"/>
+        </w:rPr>
+        <w:t xml:space="preserve">Macroeconomic data - Provider type - Second </w:t>
+      </w:r>
+      <w:r>
+        <w:rPr>
+          <w:rFonts w:ascii="Arial" w:hAnsi="Arial" w:cs="Arial" w:eastAsia="Arial"/>
+          <w:b/>
+          <w:i w:val="0"/>
+          <w:color w:val="1C355E"/>
+          <w:sz w:val="17"/>
+        </w:rPr>
+        <w:t>-082GEC1941261-</w:t>
+      </w:r>
+    </w:p>
+    <w:p>
+      <w:pPr>
+        <w:keepNext w:val="0"/>
+        <w:spacing w:before="40" w:after="120"/>
+        <w:shd w:val="clear" w:color="auto" w:fill="F2F2F2"/>
+      </w:pPr>
+      <w:sdt>
+        <w:sdtPr>
+          <w:alias w:val="082GEC1941261"/>
+          <w:id w:val="100189"/>
           <w:showingPlcHdr/>
           <w:dropDownList>
             <w:listItem w:displayText="Choose an item." w:value=""/>
@@ -11611,213 +11552,75 @@
           <w:color w:val="000000"/>
           <w:sz w:val="20"/>
         </w:rPr>
-        <w:t xml:space="preserve">Research sources - Sectors and countries </w:t>
-      </w:r>
-      <w:r>
-        <w:rPr>
-          <w:rFonts w:ascii="Arial" w:hAnsi="Arial" w:cs="Arial" w:eastAsia="Arial"/>
-          <w:b/>
-          <w:i w:val="0"/>
-          <w:color w:val="1C355E"/>
-          <w:sz w:val="17"/>
-        </w:rPr>
-        <w:t>-082GEC1941286-</w:t>
-      </w:r>
-    </w:p>
-    <w:p>
-      <w:pPr>
-        <w:keepNext w:val="0"/>
-        <w:spacing w:before="40" w:after="120"/>
-        <w:shd w:val="clear" w:color="auto" w:fill="F2F2F2"/>
-      </w:pPr>
-      <w:sdt>
-        <w:sdtPr>
-          <w:alias w:val="082GEC1941286"/>
-          <w:id w:val="100192"/>
-          <w:showingPlcHdr/>
-          <w:text/>
-        </w:sdtPr>
-        <w:sdtContent>
-          <w:r>
-            <w:t>Click or tap here to enter text.</w:t>
-          </w:r>
-        </w:sdtContent>
-      </w:sdt>
-    </w:p>
-    <w:p>
-      <w:pPr>
-        <w:keepNext/>
-        <w:spacing w:before="200" w:after="40"/>
-      </w:pPr>
-      <w:r>
-        <w:rPr>
-          <w:rFonts w:ascii="Arial" w:hAnsi="Arial" w:cs="Arial" w:eastAsia="Arial"/>
-          <w:b/>
-          <w:i w:val="0"/>
-          <w:color w:val="000000"/>
-          <w:sz w:val="20"/>
-        </w:rPr>
-        <w:t xml:space="preserve">Sectors and countries - Research source/provider - First </w:t>
-      </w:r>
-      <w:r>
-        <w:rPr>
-          <w:rFonts w:ascii="Arial" w:hAnsi="Arial" w:cs="Arial" w:eastAsia="Arial"/>
-          <w:b/>
-          <w:i w:val="0"/>
-          <w:color w:val="1C355E"/>
-          <w:sz w:val="17"/>
-        </w:rPr>
-        <w:t>-082GEC1941288-</w:t>
-      </w:r>
-    </w:p>
-    <w:p>
-      <w:pPr>
-        <w:keepNext w:val="0"/>
-        <w:spacing w:before="40" w:after="120"/>
-        <w:shd w:val="clear" w:color="auto" w:fill="F2F2F2"/>
-      </w:pPr>
-      <w:sdt>
-        <w:sdtPr>
-          <w:alias w:val="082GEC1941288"/>
-          <w:id w:val="100193"/>
-          <w:showingPlcHdr/>
-          <w:text/>
-        </w:sdtPr>
-        <w:sdtContent>
-          <w:r>
-            <w:t>Click or tap here to enter text.</w:t>
-          </w:r>
-        </w:sdtContent>
-      </w:sdt>
-    </w:p>
-    <w:p>
-      <w:pPr>
-        <w:keepNext/>
-        <w:spacing w:before="200" w:after="40"/>
-      </w:pPr>
-      <w:r>
-        <w:rPr>
-          <w:rFonts w:ascii="Arial" w:hAnsi="Arial" w:cs="Arial" w:eastAsia="Arial"/>
-          <w:b/>
-          <w:i w:val="0"/>
-          <w:color w:val="000000"/>
-          <w:sz w:val="20"/>
-        </w:rPr>
-        <w:t xml:space="preserve">Sectors and countries - Provider type - First </w:t>
-      </w:r>
-      <w:r>
-        <w:rPr>
-          <w:rFonts w:ascii="Arial" w:hAnsi="Arial" w:cs="Arial" w:eastAsia="Arial"/>
-          <w:b/>
-          <w:i w:val="0"/>
-          <w:color w:val="1C355E"/>
-          <w:sz w:val="17"/>
-        </w:rPr>
-        <w:t>-082GEC1941292-</w:t>
-      </w:r>
-    </w:p>
-    <w:p>
-      <w:pPr>
-        <w:keepNext w:val="0"/>
-        <w:spacing w:before="40" w:after="120"/>
-        <w:shd w:val="clear" w:color="auto" w:fill="F2F2F2"/>
-      </w:pPr>
-      <w:sdt>
-        <w:sdtPr>
-          <w:alias w:val="082GEC1941292"/>
-          <w:id w:val="100194"/>
-          <w:showingPlcHdr/>
-          <w:text/>
-        </w:sdtPr>
-        <w:sdtContent>
-          <w:r>
-            <w:t>Click or tap here to enter text.</w:t>
-          </w:r>
-        </w:sdtContent>
-      </w:sdt>
-    </w:p>
-    <w:p>
-      <w:pPr>
-        <w:keepNext/>
-        <w:spacing w:before="200" w:after="40"/>
-      </w:pPr>
-      <w:r>
-        <w:rPr>
-          <w:rFonts w:ascii="Arial" w:hAnsi="Arial" w:cs="Arial" w:eastAsia="Arial"/>
-          <w:b/>
-          <w:i w:val="0"/>
-          <w:color w:val="000000"/>
-          <w:sz w:val="20"/>
-        </w:rPr>
-        <w:t xml:space="preserve">Sectors and countries - Research source/provider - Second </w:t>
-      </w:r>
-      <w:r>
-        <w:rPr>
-          <w:rFonts w:ascii="Arial" w:hAnsi="Arial" w:cs="Arial" w:eastAsia="Arial"/>
-          <w:b/>
-          <w:i w:val="0"/>
-          <w:color w:val="1C355E"/>
-          <w:sz w:val="17"/>
-        </w:rPr>
-        <w:t>-082GEC1941293-</w:t>
-      </w:r>
-    </w:p>
-    <w:p>
-      <w:pPr>
-        <w:keepNext w:val="0"/>
-        <w:spacing w:before="40" w:after="120"/>
-        <w:shd w:val="clear" w:color="auto" w:fill="F2F2F2"/>
-      </w:pPr>
-      <w:sdt>
-        <w:sdtPr>
-          <w:alias w:val="082GEC1941293"/>
-          <w:id w:val="100195"/>
-          <w:showingPlcHdr/>
-          <w:text/>
-        </w:sdtPr>
-        <w:sdtContent>
-          <w:r>
-            <w:t>Click or tap here to enter text.</w:t>
-          </w:r>
-        </w:sdtContent>
-      </w:sdt>
-    </w:p>
-    <w:p>
-      <w:pPr>
-        <w:keepNext/>
-        <w:spacing w:before="200" w:after="40"/>
-      </w:pPr>
-      <w:r>
-        <w:rPr>
-          <w:rFonts w:ascii="Arial" w:hAnsi="Arial" w:cs="Arial" w:eastAsia="Arial"/>
-          <w:b/>
-          <w:i w:val="0"/>
-          <w:color w:val="000000"/>
-          <w:sz w:val="20"/>
-        </w:rPr>
-        <w:t xml:space="preserve">Sectors and countries - Provider type - Second </w:t>
-      </w:r>
-      <w:r>
-        <w:rPr>
-          <w:rFonts w:ascii="Arial" w:hAnsi="Arial" w:cs="Arial" w:eastAsia="Arial"/>
-          <w:b/>
-          <w:i w:val="0"/>
-          <w:color w:val="1C355E"/>
-          <w:sz w:val="17"/>
-        </w:rPr>
-        <w:t>-082GEC1941294-</w:t>
-      </w:r>
-    </w:p>
-    <w:p>
-      <w:pPr>
-        <w:keepNext w:val="0"/>
-        <w:spacing w:before="40" w:after="120"/>
-        <w:shd w:val="clear" w:color="auto" w:fill="F2F2F2"/>
-      </w:pPr>
-      <w:sdt>
-        <w:sdtPr>
-          <w:alias w:val="082GEC1941294"/>
-          <w:id w:val="100196"/>
+        <w:t xml:space="preserve">Macroeconomic data - Research source/provider - Third </w:t>
+      </w:r>
+      <w:r>
+        <w:rPr>
+          <w:rFonts w:ascii="Arial" w:hAnsi="Arial" w:cs="Arial" w:eastAsia="Arial"/>
+          <w:b/>
+          <w:i w:val="0"/>
+          <w:color w:val="1C355E"/>
+          <w:sz w:val="17"/>
+        </w:rPr>
+        <w:t>-082GEC1941267-</w:t>
+      </w:r>
+    </w:p>
+    <w:p>
+      <w:pPr>
+        <w:keepNext w:val="0"/>
+        <w:spacing w:before="40" w:after="120"/>
+        <w:shd w:val="clear" w:color="auto" w:fill="F2F2F2"/>
+      </w:pPr>
+      <w:sdt>
+        <w:sdtPr>
+          <w:alias w:val="082GEC1941267"/>
+          <w:id w:val="100190"/>
+          <w:showingPlcHdr/>
+          <w:text/>
+        </w:sdtPr>
+        <w:sdtContent>
+          <w:r>
+            <w:t>Click or tap here to enter text.</w:t>
+          </w:r>
+        </w:sdtContent>
+      </w:sdt>
+    </w:p>
+    <w:p>
+      <w:pPr>
+        <w:keepNext/>
+        <w:spacing w:before="200" w:after="40"/>
+      </w:pPr>
+      <w:r>
+        <w:rPr>
+          <w:rFonts w:ascii="Arial" w:hAnsi="Arial" w:cs="Arial" w:eastAsia="Arial"/>
+          <w:b/>
+          <w:i w:val="0"/>
+          <w:color w:val="000000"/>
+          <w:sz w:val="20"/>
+        </w:rPr>
+        <w:t xml:space="preserve">Macroeconomic data - Provider type - Third </w:t>
+      </w:r>
+      <w:r>
+        <w:rPr>
+          <w:rFonts w:ascii="Arial" w:hAnsi="Arial" w:cs="Arial" w:eastAsia="Arial"/>
+          <w:b/>
+          <w:i w:val="0"/>
+          <w:color w:val="1C355E"/>
+          <w:sz w:val="17"/>
+        </w:rPr>
+        <w:t>-082GEC1941269-</w:t>
+      </w:r>
+    </w:p>
+    <w:p>
+      <w:pPr>
+        <w:keepNext w:val="0"/>
+        <w:spacing w:before="40" w:after="120"/>
+        <w:shd w:val="clear" w:color="auto" w:fill="F2F2F2"/>
+      </w:pPr>
+      <w:sdt>
+        <w:sdtPr>
+          <w:alias w:val="082GEC1941269"/>
+          <w:id w:val="100191"/>
           <w:showingPlcHdr/>
           <w:dropDownList>
             <w:listItem w:displayText="Choose an item." w:value=""/>
@@ -11849,6 +11652,252 @@
           <w:color w:val="000000"/>
           <w:sz w:val="20"/>
         </w:rPr>
+        <w:t xml:space="preserve">Research sources - Sectors and countries </w:t>
+      </w:r>
+      <w:r>
+        <w:rPr>
+          <w:rFonts w:ascii="Arial" w:hAnsi="Arial" w:cs="Arial" w:eastAsia="Arial"/>
+          <w:b/>
+          <w:i w:val="0"/>
+          <w:color w:val="1C355E"/>
+          <w:sz w:val="17"/>
+        </w:rPr>
+        <w:t>-082GEC1941286-</w:t>
+      </w:r>
+    </w:p>
+    <w:p>
+      <w:pPr>
+        <w:keepNext w:val="0"/>
+        <w:spacing w:before="40" w:after="120"/>
+        <w:shd w:val="clear" w:color="auto" w:fill="F2F2F2"/>
+      </w:pPr>
+      <w:sdt>
+        <w:sdtPr>
+          <w:alias w:val="082GEC1941286"/>
+          <w:id w:val="100192"/>
+          <w:showingPlcHdr/>
+          <w:text/>
+        </w:sdtPr>
+        <w:sdtContent>
+          <w:r>
+            <w:t>Click or tap here to enter text.</w:t>
+          </w:r>
+        </w:sdtContent>
+      </w:sdt>
+    </w:p>
+    <w:p>
+      <w:pPr>
+        <w:keepNext/>
+        <w:spacing w:before="200" w:after="40"/>
+      </w:pPr>
+      <w:r>
+        <w:rPr>
+          <w:rFonts w:ascii="Arial" w:hAnsi="Arial" w:cs="Arial" w:eastAsia="Arial"/>
+          <w:b/>
+          <w:i w:val="0"/>
+          <w:color w:val="000000"/>
+          <w:sz w:val="20"/>
+        </w:rPr>
+        <w:t xml:space="preserve">Sectors and countries - Research source/provider - First </w:t>
+      </w:r>
+      <w:r>
+        <w:rPr>
+          <w:rFonts w:ascii="Arial" w:hAnsi="Arial" w:cs="Arial" w:eastAsia="Arial"/>
+          <w:b/>
+          <w:i w:val="0"/>
+          <w:color w:val="1C355E"/>
+          <w:sz w:val="17"/>
+        </w:rPr>
+        <w:t>-082GEC1941288-</w:t>
+      </w:r>
+    </w:p>
+    <w:p>
+      <w:pPr>
+        <w:keepNext w:val="0"/>
+        <w:spacing w:before="40" w:after="120"/>
+        <w:shd w:val="clear" w:color="auto" w:fill="F2F2F2"/>
+      </w:pPr>
+      <w:sdt>
+        <w:sdtPr>
+          <w:alias w:val="082GEC1941288"/>
+          <w:id w:val="100193"/>
+          <w:showingPlcHdr/>
+          <w:text/>
+        </w:sdtPr>
+        <w:sdtContent>
+          <w:r>
+            <w:t>Click or tap here to enter text.</w:t>
+          </w:r>
+        </w:sdtContent>
+      </w:sdt>
+    </w:p>
+    <w:p>
+      <w:pPr>
+        <w:keepNext/>
+        <w:spacing w:before="200" w:after="40"/>
+      </w:pPr>
+      <w:r>
+        <w:rPr>
+          <w:rFonts w:ascii="Arial" w:hAnsi="Arial" w:cs="Arial" w:eastAsia="Arial"/>
+          <w:b/>
+          <w:i w:val="0"/>
+          <w:color w:val="000000"/>
+          <w:sz w:val="20"/>
+        </w:rPr>
+        <w:t xml:space="preserve">Sectors and countries - Provider type - First </w:t>
+      </w:r>
+      <w:r>
+        <w:rPr>
+          <w:rFonts w:ascii="Arial" w:hAnsi="Arial" w:cs="Arial" w:eastAsia="Arial"/>
+          <w:b/>
+          <w:i w:val="0"/>
+          <w:color w:val="1C355E"/>
+          <w:sz w:val="17"/>
+        </w:rPr>
+        <w:t>-082GEC1941292-</w:t>
+      </w:r>
+    </w:p>
+    <w:p>
+      <w:pPr>
+        <w:keepNext w:val="0"/>
+        <w:spacing w:before="40" w:after="120"/>
+        <w:shd w:val="clear" w:color="auto" w:fill="F2F2F2"/>
+      </w:pPr>
+      <w:sdt>
+        <w:sdtPr>
+          <w:alias w:val="082GEC1941292"/>
+          <w:id w:val="100194"/>
+          <w:showingPlcHdr/>
+          <w:dropDownList>
+            <w:listItem w:displayText="Choose an item." w:value=""/>
+            <w:listItem w:displayText="1 - Broker" w:value="1 - Broker"/>
+            <w:listItem w:displayText="2 - Info/data provider" w:value="2 - Info/data provider"/>
+            <w:listItem w:displayText="3 - Rating agencies" w:value="3 - Rating agencies"/>
+            <w:listItem w:displayText="4 - International organisation" w:value="4 - International organisation"/>
+            <w:listItem w:displayText="5 - University research" w:value="5 - University research"/>
+            <w:listItem w:displayText="6 - Research centre / research company" w:value="6 - Research centre / research company"/>
+          </w:dropDownList>
+        </w:sdtPr>
+        <w:sdtContent>
+          <w:r>
+            <w:t>Choose an item.</w:t>
+          </w:r>
+        </w:sdtContent>
+      </w:sdt>
+    </w:p>
+    <w:p>
+      <w:pPr>
+        <w:keepNext/>
+        <w:spacing w:before="200" w:after="40"/>
+      </w:pPr>
+      <w:r>
+        <w:rPr>
+          <w:rFonts w:ascii="Arial" w:hAnsi="Arial" w:cs="Arial" w:eastAsia="Arial"/>
+          <w:b/>
+          <w:i w:val="0"/>
+          <w:color w:val="000000"/>
+          <w:sz w:val="20"/>
+        </w:rPr>
+        <w:t xml:space="preserve">Sectors and countries - Research source/provider - Second </w:t>
+      </w:r>
+      <w:r>
+        <w:rPr>
+          <w:rFonts w:ascii="Arial" w:hAnsi="Arial" w:cs="Arial" w:eastAsia="Arial"/>
+          <w:b/>
+          <w:i w:val="0"/>
+          <w:color w:val="1C355E"/>
+          <w:sz w:val="17"/>
+        </w:rPr>
+        <w:t>-082GEC1941293-</w:t>
+      </w:r>
+    </w:p>
+    <w:p>
+      <w:pPr>
+        <w:keepNext w:val="0"/>
+        <w:spacing w:before="40" w:after="120"/>
+        <w:shd w:val="clear" w:color="auto" w:fill="F2F2F2"/>
+      </w:pPr>
+      <w:sdt>
+        <w:sdtPr>
+          <w:alias w:val="082GEC1941293"/>
+          <w:id w:val="100195"/>
+          <w:showingPlcHdr/>
+          <w:text/>
+        </w:sdtPr>
+        <w:sdtContent>
+          <w:r>
+            <w:t>Click or tap here to enter text.</w:t>
+          </w:r>
+        </w:sdtContent>
+      </w:sdt>
+    </w:p>
+    <w:p>
+      <w:pPr>
+        <w:keepNext/>
+        <w:spacing w:before="200" w:after="40"/>
+      </w:pPr>
+      <w:r>
+        <w:rPr>
+          <w:rFonts w:ascii="Arial" w:hAnsi="Arial" w:cs="Arial" w:eastAsia="Arial"/>
+          <w:b/>
+          <w:i w:val="0"/>
+          <w:color w:val="000000"/>
+          <w:sz w:val="20"/>
+        </w:rPr>
+        <w:t xml:space="preserve">Sectors and countries - Provider type - Second </w:t>
+      </w:r>
+      <w:r>
+        <w:rPr>
+          <w:rFonts w:ascii="Arial" w:hAnsi="Arial" w:cs="Arial" w:eastAsia="Arial"/>
+          <w:b/>
+          <w:i w:val="0"/>
+          <w:color w:val="1C355E"/>
+          <w:sz w:val="17"/>
+        </w:rPr>
+        <w:t>-082GEC1941294-</w:t>
+      </w:r>
+    </w:p>
+    <w:p>
+      <w:pPr>
+        <w:keepNext w:val="0"/>
+        <w:spacing w:before="40" w:after="120"/>
+        <w:shd w:val="clear" w:color="auto" w:fill="F2F2F2"/>
+      </w:pPr>
+      <w:sdt>
+        <w:sdtPr>
+          <w:alias w:val="082GEC1941294"/>
+          <w:id w:val="100196"/>
+          <w:showingPlcHdr/>
+          <w:dropDownList>
+            <w:listItem w:displayText="Choose an item." w:value=""/>
+            <w:listItem w:displayText="1 - Broker" w:value="1 - Broker"/>
+            <w:listItem w:displayText="2 - Info/data provider" w:value="2 - Info/data provider"/>
+            <w:listItem w:displayText="3 - Rating agencies" w:value="3 - Rating agencies"/>
+            <w:listItem w:displayText="4 - International organisation" w:value="4 - International organisation"/>
+            <w:listItem w:displayText="5 - University research" w:value="5 - University research"/>
+            <w:listItem w:displayText="6 - Research centre / research company" w:value="6 - Research centre / research company"/>
+          </w:dropDownList>
+        </w:sdtPr>
+        <w:sdtContent>
+          <w:r>
+            <w:t>Choose an item.</w:t>
+          </w:r>
+        </w:sdtContent>
+      </w:sdt>
+    </w:p>
+    <w:p>
+      <w:pPr>
+        <w:keepNext/>
+        <w:spacing w:before="200" w:after="40"/>
+      </w:pPr>
+      <w:r>
+        <w:rPr>
+          <w:rFonts w:ascii="Arial" w:hAnsi="Arial" w:cs="Arial" w:eastAsia="Arial"/>
+          <w:b/>
+          <w:i w:val="0"/>
+          <w:color w:val="000000"/>
+          <w:sz w:val="20"/>
+        </w:rPr>
         <w:t xml:space="preserve">Sectors and countries - Research source/provider - Third </w:t>
       </w:r>
       <w:r>
@@ -11919,11 +11968,19 @@
           <w:alias w:val="082GEC1941297"/>
           <w:id w:val="100198"/>
           <w:showingPlcHdr/>
-          <w:text/>
-        </w:sdtPr>
-        <w:sdtContent>
-          <w:r>
-            <w:t>Click or tap here to enter text.</w:t>
+          <w:dropDownList>
+            <w:listItem w:displayText="Choose an item." w:value=""/>
+            <w:listItem w:displayText="1 - Broker" w:value="1 - Broker"/>
+            <w:listItem w:displayText="2 - Info/data provider" w:value="2 - Info/data provider"/>
+            <w:listItem w:displayText="3 - Rating agencies" w:value="3 - Rating agencies"/>
+            <w:listItem w:displayText="4 - International organisation" w:value="4 - International organisation"/>
+            <w:listItem w:displayText="5 - University research" w:value="5 - University research"/>
+            <w:listItem w:displayText="6 - Research centre / research company" w:value="6 - Research centre / research company"/>
+          </w:dropDownList>
+        </w:sdtPr>
+        <w:sdtContent>
+          <w:r>
+            <w:t>Choose an item.</w:t>
           </w:r>
         </w:sdtContent>
       </w:sdt>
@@ -12057,11 +12114,19 @@
           <w:alias w:val="082GEC1941305"/>
           <w:id w:val="100201"/>
           <w:showingPlcHdr/>
-          <w:text/>
-        </w:sdtPr>
-        <w:sdtContent>
-          <w:r>
-            <w:t>Click or tap here to enter text.</w:t>
+          <w:dropDownList>
+            <w:listItem w:displayText="Choose an item." w:value=""/>
+            <w:listItem w:displayText="1 - Broker" w:value="1 - Broker"/>
+            <w:listItem w:displayText="2 - Info/data provider" w:value="2 - Info/data provider"/>
+            <w:listItem w:displayText="3 - Rating agencies" w:value="3 - Rating agencies"/>
+            <w:listItem w:displayText="4 - International organisation" w:value="4 - International organisation"/>
+            <w:listItem w:displayText="5 - University research" w:value="5 - University research"/>
+            <w:listItem w:displayText="6 - Research centre / research company" w:value="6 - Research centre / research company"/>
+          </w:dropDownList>
+        </w:sdtPr>
+        <w:sdtContent>
+          <w:r>
+            <w:t>Choose an item.</w:t>
           </w:r>
         </w:sdtContent>
       </w:sdt>

</xml_diff>

<commit_message>
Teatro questionnaire: fill one empty dropdown from the V2 video
RB1 Index 3, curve segment: 7 options read on the V2 video. No existing option changed.

Claude-Session: https://claude.ai/code/session_01Kh4RWNEbM9iRNhAaBfutke
</commit_message>
<xml_diff>
--- a/Questionnaire_Teatro_alla_Scala_EN.docx
+++ b/Questionnaire_Teatro_alla_Scala_EN.docx
@@ -41390,11 +41390,20 @@
           <w:alias w:val="082RB13002377"/>
           <w:id w:val="100691"/>
           <w:showingPlcHdr/>
-          <w:text/>
-        </w:sdtPr>
-        <w:sdtContent>
-          <w:r>
-            <w:t>Click or tap here to enter text.</w:t>
+          <w:dropDownList>
+            <w:listItem w:displayText="Choose an item." w:value=""/>
+            <w:listItem w:displayText="1-3 years" w:value="1-3 years"/>
+            <w:listItem w:displayText="1-5 years" w:value="1-5 years"/>
+            <w:listItem w:displayText="1-10 years" w:value="1-10 years"/>
+            <w:listItem w:displayText="3-5 years" w:value="3-5 years"/>
+            <w:listItem w:displayText="Intermediate segment (e.g. 5-7 years)" w:value="Intermediate segment (e.g. 5-7 years)"/>
+            <w:listItem w:displayText="Over 10 years" w:value="Over 10 years"/>
+            <w:listItem w:displayText="All maturities" w:value="All maturities"/>
+          </w:dropDownList>
+        </w:sdtPr>
+        <w:sdtContent>
+          <w:r>
+            <w:t>Choose an item.</w:t>
           </w:r>
         </w:sdtContent>
       </w:sdt>

</xml_diff>

<commit_message>
Teatro questionnaire: RB1 benchmark dropdowns filled from the V2 video
42 empty RB1 fields now have options, by field type read from their title
(asset class, curve segment, geographic focus, currency). No existing option changed.

Claude-Session: https://claude.ai/code/session_01Kh4RWNEbM9iRNhAaBfutke
</commit_message>
<xml_diff>
--- a/Questionnaire_Teatro_alla_Scala_EN.docx
+++ b/Questionnaire_Teatro_alla_Scala_EN.docx
@@ -40928,11 +40928,25 @@
           <w:alias w:val="082RB13002374"/>
           <w:id w:val="100682"/>
           <w:showingPlcHdr/>
-          <w:text/>
-        </w:sdtPr>
-        <w:sdtContent>
-          <w:r>
-            <w:t>Click or tap here to enter text.</w:t>
+          <w:dropDownList>
+            <w:listItem w:displayText="Choose an item." w:value=""/>
+            <w:listItem w:displayText="Italy" w:value="Italy"/>
+            <w:listItem w:displayText="United Kingdom" w:value="United Kingdom"/>
+            <w:listItem w:displayText="Eurozone" w:value="Eurozone"/>
+            <w:listItem w:displayText="Europe" w:value="Europe"/>
+            <w:listItem w:displayText="USA" w:value="USA"/>
+            <w:listItem w:displayText="North America" w:value="North America"/>
+            <w:listItem w:displayText="Japan" w:value="Japan"/>
+            <w:listItem w:displayText="Pacific" w:value="Pacific"/>
+            <w:listItem w:displayText="Pacific ex Japan" w:value="Pacific ex Japan"/>
+            <w:listItem w:displayText="Emerging markets (EM)" w:value="Emerging markets (EM)"/>
+            <w:listItem w:displayText="Developed countries (DC)" w:value="Developed countries (DC)"/>
+            <w:listItem w:displayText="Developed countries + EM (DC + EM)" w:value="Developed countries + EM (DC + EM)"/>
+          </w:dropDownList>
+        </w:sdtPr>
+        <w:sdtContent>
+          <w:r>
+            <w:t>Choose an item.</w:t>
           </w:r>
         </w:sdtContent>
       </w:sdt>
@@ -40974,11 +40988,17 @@
           <w:alias w:val="082RB13002375"/>
           <w:id w:val="100683"/>
           <w:showingPlcHdr/>
-          <w:text/>
-        </w:sdtPr>
-        <w:sdtContent>
-          <w:r>
-            <w:t>Click or tap here to enter text.</w:t>
+          <w:dropDownList>
+            <w:listItem w:displayText="Choose an item." w:value=""/>
+            <w:listItem w:displayText="Euro" w:value="Euro"/>
+            <w:listItem w:displayText="USD" w:value="USD"/>
+            <w:listItem w:displayText="Local currency" w:value="Local currency"/>
+            <w:listItem w:displayText="Hedged in Euro" w:value="Hedged in Euro"/>
+          </w:dropDownList>
+        </w:sdtPr>
+        <w:sdtContent>
+          <w:r>
+            <w:t>Choose an item.</w:t>
           </w:r>
         </w:sdtContent>
       </w:sdt>
@@ -41190,11 +41210,25 @@
           <w:alias w:val="082RB13002381"/>
           <w:id w:val="100687"/>
           <w:showingPlcHdr/>
-          <w:text/>
-        </w:sdtPr>
-        <w:sdtContent>
-          <w:r>
-            <w:t>Click or tap here to enter text.</w:t>
+          <w:dropDownList>
+            <w:listItem w:displayText="Choose an item." w:value=""/>
+            <w:listItem w:displayText="Italy" w:value="Italy"/>
+            <w:listItem w:displayText="United Kingdom" w:value="United Kingdom"/>
+            <w:listItem w:displayText="Eurozone" w:value="Eurozone"/>
+            <w:listItem w:displayText="Europe" w:value="Europe"/>
+            <w:listItem w:displayText="USA" w:value="USA"/>
+            <w:listItem w:displayText="North America" w:value="North America"/>
+            <w:listItem w:displayText="Japan" w:value="Japan"/>
+            <w:listItem w:displayText="Pacific" w:value="Pacific"/>
+            <w:listItem w:displayText="Pacific ex Japan" w:value="Pacific ex Japan"/>
+            <w:listItem w:displayText="Emerging markets (EM)" w:value="Emerging markets (EM)"/>
+            <w:listItem w:displayText="Developed countries (DC)" w:value="Developed countries (DC)"/>
+            <w:listItem w:displayText="Developed countries + EM (DC + EM)" w:value="Developed countries + EM (DC + EM)"/>
+          </w:dropDownList>
+        </w:sdtPr>
+        <w:sdtContent>
+          <w:r>
+            <w:t>Choose an item.</w:t>
           </w:r>
         </w:sdtContent>
       </w:sdt>
@@ -41236,11 +41270,17 @@
           <w:alias w:val="082RB13002386"/>
           <w:id w:val="100688"/>
           <w:showingPlcHdr/>
-          <w:text/>
-        </w:sdtPr>
-        <w:sdtContent>
-          <w:r>
-            <w:t>Click or tap here to enter text.</w:t>
+          <w:dropDownList>
+            <w:listItem w:displayText="Choose an item." w:value=""/>
+            <w:listItem w:displayText="Euro" w:value="Euro"/>
+            <w:listItem w:displayText="USD" w:value="USD"/>
+            <w:listItem w:displayText="Local currency" w:value="Local currency"/>
+            <w:listItem w:displayText="Hedged in Euro" w:value="Hedged in Euro"/>
+          </w:dropDownList>
+        </w:sdtPr>
+        <w:sdtContent>
+          <w:r>
+            <w:t>Choose an item.</w:t>
           </w:r>
         </w:sdtContent>
       </w:sdt>
@@ -41344,11 +41384,19 @@
           <w:alias w:val="082RB13002369"/>
           <w:id w:val="100690"/>
           <w:showingPlcHdr/>
-          <w:text/>
-        </w:sdtPr>
-        <w:sdtContent>
-          <w:r>
-            <w:t>Click or tap here to enter text.</w:t>
+          <w:dropDownList>
+            <w:listItem w:displayText="Choose an item." w:value=""/>
+            <w:listItem w:displayText="Cash" w:value="Cash"/>
+            <w:listItem w:displayText="Government bonds" w:value="Government bonds"/>
+            <w:listItem w:displayText="Corporate bonds IG" w:value="Corporate bonds IG"/>
+            <w:listItem w:displayText="Corporate bonds HY" w:value="Corporate bonds HY"/>
+            <w:listItem w:displayText="Broad bonds" w:value="Broad bonds"/>
+            <w:listItem w:displayText="Equities" w:value="Equities"/>
+          </w:dropDownList>
+        </w:sdtPr>
+        <w:sdtContent>
+          <w:r>
+            <w:t>Choose an item.</w:t>
           </w:r>
         </w:sdtContent>
       </w:sdt>
@@ -41445,11 +41493,25 @@
           <w:alias w:val="082RB13002382"/>
           <w:id w:val="100692"/>
           <w:showingPlcHdr/>
-          <w:text/>
-        </w:sdtPr>
-        <w:sdtContent>
-          <w:r>
-            <w:t>Click or tap here to enter text.</w:t>
+          <w:dropDownList>
+            <w:listItem w:displayText="Choose an item." w:value=""/>
+            <w:listItem w:displayText="Italy" w:value="Italy"/>
+            <w:listItem w:displayText="United Kingdom" w:value="United Kingdom"/>
+            <w:listItem w:displayText="Eurozone" w:value="Eurozone"/>
+            <w:listItem w:displayText="Europe" w:value="Europe"/>
+            <w:listItem w:displayText="USA" w:value="USA"/>
+            <w:listItem w:displayText="North America" w:value="North America"/>
+            <w:listItem w:displayText="Japan" w:value="Japan"/>
+            <w:listItem w:displayText="Pacific" w:value="Pacific"/>
+            <w:listItem w:displayText="Pacific ex Japan" w:value="Pacific ex Japan"/>
+            <w:listItem w:displayText="Emerging markets (EM)" w:value="Emerging markets (EM)"/>
+            <w:listItem w:displayText="Developed countries (DC)" w:value="Developed countries (DC)"/>
+            <w:listItem w:displayText="Developed countries + EM (DC + EM)" w:value="Developed countries + EM (DC + EM)"/>
+          </w:dropDownList>
+        </w:sdtPr>
+        <w:sdtContent>
+          <w:r>
+            <w:t>Choose an item.</w:t>
           </w:r>
         </w:sdtContent>
       </w:sdt>
@@ -41491,11 +41553,17 @@
           <w:alias w:val="082RB13002387"/>
           <w:id w:val="100693"/>
           <w:showingPlcHdr/>
-          <w:text/>
-        </w:sdtPr>
-        <w:sdtContent>
-          <w:r>
-            <w:t>Click or tap here to enter text.</w:t>
+          <w:dropDownList>
+            <w:listItem w:displayText="Choose an item." w:value=""/>
+            <w:listItem w:displayText="Euro" w:value="Euro"/>
+            <w:listItem w:displayText="USD" w:value="USD"/>
+            <w:listItem w:displayText="Local currency" w:value="Local currency"/>
+            <w:listItem w:displayText="Hedged in Euro" w:value="Hedged in Euro"/>
+          </w:dropDownList>
+        </w:sdtPr>
+        <w:sdtContent>
+          <w:r>
+            <w:t>Choose an item.</w:t>
           </w:r>
         </w:sdtContent>
       </w:sdt>
@@ -41708,11 +41776,25 @@
           <w:alias w:val="082RB13002383"/>
           <w:id w:val="100697"/>
           <w:showingPlcHdr/>
-          <w:text/>
-        </w:sdtPr>
-        <w:sdtContent>
-          <w:r>
-            <w:t>Click or tap here to enter text.</w:t>
+          <w:dropDownList>
+            <w:listItem w:displayText="Choose an item." w:value=""/>
+            <w:listItem w:displayText="Italy" w:value="Italy"/>
+            <w:listItem w:displayText="United Kingdom" w:value="United Kingdom"/>
+            <w:listItem w:displayText="Eurozone" w:value="Eurozone"/>
+            <w:listItem w:displayText="Europe" w:value="Europe"/>
+            <w:listItem w:displayText="USA" w:value="USA"/>
+            <w:listItem w:displayText="North America" w:value="North America"/>
+            <w:listItem w:displayText="Japan" w:value="Japan"/>
+            <w:listItem w:displayText="Pacific" w:value="Pacific"/>
+            <w:listItem w:displayText="Pacific ex Japan" w:value="Pacific ex Japan"/>
+            <w:listItem w:displayText="Emerging markets (EM)" w:value="Emerging markets (EM)"/>
+            <w:listItem w:displayText="Developed countries (DC)" w:value="Developed countries (DC)"/>
+            <w:listItem w:displayText="Developed countries + EM (DC + EM)" w:value="Developed countries + EM (DC + EM)"/>
+          </w:dropDownList>
+        </w:sdtPr>
+        <w:sdtContent>
+          <w:r>
+            <w:t>Choose an item.</w:t>
           </w:r>
         </w:sdtContent>
       </w:sdt>
@@ -41977,11 +42059,25 @@
           <w:alias w:val="082RB13002384"/>
           <w:id w:val="100702"/>
           <w:showingPlcHdr/>
-          <w:text/>
-        </w:sdtPr>
-        <w:sdtContent>
-          <w:r>
-            <w:t>Click or tap here to enter text.</w:t>
+          <w:dropDownList>
+            <w:listItem w:displayText="Choose an item." w:value=""/>
+            <w:listItem w:displayText="Italy" w:value="Italy"/>
+            <w:listItem w:displayText="United Kingdom" w:value="United Kingdom"/>
+            <w:listItem w:displayText="Eurozone" w:value="Eurozone"/>
+            <w:listItem w:displayText="Europe" w:value="Europe"/>
+            <w:listItem w:displayText="USA" w:value="USA"/>
+            <w:listItem w:displayText="North America" w:value="North America"/>
+            <w:listItem w:displayText="Japan" w:value="Japan"/>
+            <w:listItem w:displayText="Pacific" w:value="Pacific"/>
+            <w:listItem w:displayText="Pacific ex Japan" w:value="Pacific ex Japan"/>
+            <w:listItem w:displayText="Emerging markets (EM)" w:value="Emerging markets (EM)"/>
+            <w:listItem w:displayText="Developed countries (DC)" w:value="Developed countries (DC)"/>
+            <w:listItem w:displayText="Developed countries + EM (DC + EM)" w:value="Developed countries + EM (DC + EM)"/>
+          </w:dropDownList>
+        </w:sdtPr>
+        <w:sdtContent>
+          <w:r>
+            <w:t>Choose an item.</w:t>
           </w:r>
         </w:sdtContent>
       </w:sdt>
@@ -42023,11 +42119,17 @@
           <w:alias w:val="082RB13002389"/>
           <w:id w:val="100703"/>
           <w:showingPlcHdr/>
-          <w:text/>
-        </w:sdtPr>
-        <w:sdtContent>
-          <w:r>
-            <w:t>Click or tap here to enter text.</w:t>
+          <w:dropDownList>
+            <w:listItem w:displayText="Choose an item." w:value=""/>
+            <w:listItem w:displayText="Euro" w:value="Euro"/>
+            <w:listItem w:displayText="USD" w:value="USD"/>
+            <w:listItem w:displayText="Local currency" w:value="Local currency"/>
+            <w:listItem w:displayText="Hedged in Euro" w:value="Hedged in Euro"/>
+          </w:dropDownList>
+        </w:sdtPr>
+        <w:sdtContent>
+          <w:r>
+            <w:t>Choose an item.</w:t>
           </w:r>
         </w:sdtContent>
       </w:sdt>
@@ -42185,11 +42287,17 @@
           <w:alias w:val="082RB13002380"/>
           <w:id w:val="100706"/>
           <w:showingPlcHdr/>
-          <w:text/>
-        </w:sdtPr>
-        <w:sdtContent>
-          <w:r>
-            <w:t>Click or tap here to enter text.</w:t>
+          <w:dropDownList>
+            <w:listItem w:displayText="Choose an item." w:value=""/>
+            <w:listItem w:displayText="Euro" w:value="Euro"/>
+            <w:listItem w:displayText="USD" w:value="USD"/>
+            <w:listItem w:displayText="Local currency" w:value="Local currency"/>
+            <w:listItem w:displayText="Hedged in Euro" w:value="Hedged in Euro"/>
+          </w:dropDownList>
+        </w:sdtPr>
+        <w:sdtContent>
+          <w:r>
+            <w:t>Choose an item.</w:t>
           </w:r>
         </w:sdtContent>
       </w:sdt>
@@ -42231,11 +42339,25 @@
           <w:alias w:val="082RB13002385"/>
           <w:id w:val="100707"/>
           <w:showingPlcHdr/>
-          <w:text/>
-        </w:sdtPr>
-        <w:sdtContent>
-          <w:r>
-            <w:t>Click or tap here to enter text.</w:t>
+          <w:dropDownList>
+            <w:listItem w:displayText="Choose an item." w:value=""/>
+            <w:listItem w:displayText="Italy" w:value="Italy"/>
+            <w:listItem w:displayText="United Kingdom" w:value="United Kingdom"/>
+            <w:listItem w:displayText="Eurozone" w:value="Eurozone"/>
+            <w:listItem w:displayText="Europe" w:value="Europe"/>
+            <w:listItem w:displayText="USA" w:value="USA"/>
+            <w:listItem w:displayText="North America" w:value="North America"/>
+            <w:listItem w:displayText="Japan" w:value="Japan"/>
+            <w:listItem w:displayText="Pacific" w:value="Pacific"/>
+            <w:listItem w:displayText="Pacific ex Japan" w:value="Pacific ex Japan"/>
+            <w:listItem w:displayText="Emerging markets (EM)" w:value="Emerging markets (EM)"/>
+            <w:listItem w:displayText="Developed countries (DC)" w:value="Developed countries (DC)"/>
+            <w:listItem w:displayText="Developed countries + EM (DC + EM)" w:value="Developed countries + EM (DC + EM)"/>
+          </w:dropDownList>
+        </w:sdtPr>
+        <w:sdtContent>
+          <w:r>
+            <w:t>Choose an item.</w:t>
           </w:r>
         </w:sdtContent>
       </w:sdt>
@@ -42444,260 +42566,6 @@
         <w:sdtPr>
           <w:alias w:val="082RB13003020"/>
           <w:id w:val="100711"/>
-          <w:showingPlcHdr/>
-          <w:text/>
-        </w:sdtPr>
-        <w:sdtContent>
-          <w:r>
-            <w:t>Click or tap here to enter text.</w:t>
-          </w:r>
-        </w:sdtContent>
-      </w:sdt>
-    </w:p>
-    <w:p>
-      <w:pPr>
-        <w:keepNext/>
-        <w:spacing w:before="200" w:after="40"/>
-      </w:pPr>
-      <w:r>
-        <w:rPr>
-          <w:rFonts w:ascii="Arial" w:hAnsi="Arial" w:cs="Arial" w:eastAsia="Arial"/>
-          <w:b/>
-          <w:i w:val="0"/>
-          <w:color w:val="000000"/>
-          <w:sz w:val="20"/>
-        </w:rPr>
-        <w:t xml:space="preserve">RB1 - Benchmark - Index 7 - Geographical focus </w:t>
-      </w:r>
-      <w:r>
-        <w:rPr>
-          <w:rFonts w:ascii="Arial" w:hAnsi="Arial" w:cs="Arial" w:eastAsia="Arial"/>
-          <w:b/>
-          <w:i w:val="0"/>
-          <w:color w:val="1C355E"/>
-          <w:sz w:val="17"/>
-        </w:rPr>
-        <w:t>-082RB13003021-</w:t>
-      </w:r>
-    </w:p>
-    <w:p>
-      <w:pPr>
-        <w:keepNext w:val="0"/>
-        <w:spacing w:before="40" w:after="120"/>
-        <w:shd w:val="clear" w:color="auto" w:fill="F2F2F2"/>
-      </w:pPr>
-      <w:sdt>
-        <w:sdtPr>
-          <w:alias w:val="082RB13003021"/>
-          <w:id w:val="100712"/>
-          <w:showingPlcHdr/>
-          <w:text/>
-        </w:sdtPr>
-        <w:sdtContent>
-          <w:r>
-            <w:t>Click or tap here to enter text.</w:t>
-          </w:r>
-        </w:sdtContent>
-      </w:sdt>
-    </w:p>
-    <w:p>
-      <w:pPr>
-        <w:keepNext/>
-        <w:spacing w:before="200" w:after="40"/>
-      </w:pPr>
-      <w:r>
-        <w:rPr>
-          <w:rFonts w:ascii="Arial" w:hAnsi="Arial" w:cs="Arial" w:eastAsia="Arial"/>
-          <w:b/>
-          <w:i w:val="0"/>
-          <w:color w:val="000000"/>
-          <w:sz w:val="20"/>
-        </w:rPr>
-        <w:t xml:space="preserve">RB1 - Benchmark - Index 7 - Currency </w:t>
-      </w:r>
-      <w:r>
-        <w:rPr>
-          <w:rFonts w:ascii="Arial" w:hAnsi="Arial" w:cs="Arial" w:eastAsia="Arial"/>
-          <w:b/>
-          <w:i w:val="0"/>
-          <w:color w:val="1C355E"/>
-          <w:sz w:val="17"/>
-        </w:rPr>
-        <w:t>-082RB13003022-</w:t>
-      </w:r>
-    </w:p>
-    <w:p>
-      <w:pPr>
-        <w:keepNext w:val="0"/>
-        <w:spacing w:before="40" w:after="120"/>
-        <w:shd w:val="clear" w:color="auto" w:fill="F2F2F2"/>
-      </w:pPr>
-      <w:sdt>
-        <w:sdtPr>
-          <w:alias w:val="082RB13003022"/>
-          <w:id w:val="100713"/>
-          <w:showingPlcHdr/>
-          <w:text/>
-        </w:sdtPr>
-        <w:sdtContent>
-          <w:r>
-            <w:t>Click or tap here to enter text.</w:t>
-          </w:r>
-        </w:sdtContent>
-      </w:sdt>
-    </w:p>
-    <w:p>
-      <w:pPr>
-        <w:keepNext/>
-        <w:spacing w:before="200" w:after="40"/>
-      </w:pPr>
-      <w:r>
-        <w:rPr>
-          <w:rFonts w:ascii="Arial" w:hAnsi="Arial" w:cs="Arial" w:eastAsia="Arial"/>
-          <w:b/>
-          <w:i w:val="0"/>
-          <w:color w:val="000000"/>
-          <w:sz w:val="20"/>
-        </w:rPr>
-        <w:t xml:space="preserve">RB1 - Benchmark - Index 7 - Weight </w:t>
-      </w:r>
-      <w:r>
-        <w:rPr>
-          <w:rFonts w:ascii="Arial" w:hAnsi="Arial" w:cs="Arial" w:eastAsia="Arial"/>
-          <w:b/>
-          <w:i w:val="0"/>
-          <w:color w:val="1C355E"/>
-          <w:sz w:val="17"/>
-        </w:rPr>
-        <w:t>-082RB13003023-</w:t>
-      </w:r>
-    </w:p>
-    <w:p>
-      <w:pPr>
-        <w:keepNext/>
-        <w:spacing w:before="0" w:after="40"/>
-      </w:pPr>
-      <w:r>
-        <w:rPr>
-          <w:rFonts w:ascii="Arial" w:hAnsi="Arial" w:cs="Arial" w:eastAsia="Arial"/>
-          <w:b w:val="0"/>
-          <w:i/>
-          <w:color w:val="595959"/>
-          <w:sz w:val="18"/>
-        </w:rPr>
-        <w:t>% with 1 decimal place</w:t>
-      </w:r>
-    </w:p>
-    <w:p>
-      <w:pPr>
-        <w:keepNext w:val="0"/>
-        <w:spacing w:before="40" w:after="120"/>
-        <w:shd w:val="clear" w:color="auto" w:fill="F2F2F2"/>
-      </w:pPr>
-      <w:sdt>
-        <w:sdtPr>
-          <w:alias w:val="082RB13003023"/>
-          <w:id w:val="100714"/>
-          <w:showingPlcHdr/>
-          <w:text/>
-        </w:sdtPr>
-        <w:sdtContent>
-          <w:r>
-            <w:t>Click or tap here to enter text.</w:t>
-          </w:r>
-        </w:sdtContent>
-      </w:sdt>
-    </w:p>
-    <w:p>
-      <w:pPr>
-        <w:keepNext/>
-        <w:spacing w:before="200" w:after="40"/>
-      </w:pPr>
-      <w:r>
-        <w:rPr>
-          <w:rFonts w:ascii="Arial" w:hAnsi="Arial" w:cs="Arial" w:eastAsia="Arial"/>
-          <w:b/>
-          <w:i w:val="0"/>
-          <w:color w:val="000000"/>
-          <w:sz w:val="20"/>
-        </w:rPr>
-        <w:t xml:space="preserve">RB1 - Benchmark - Index 8 - Asset class type </w:t>
-      </w:r>
-      <w:r>
-        <w:rPr>
-          <w:rFonts w:ascii="Arial" w:hAnsi="Arial" w:cs="Arial" w:eastAsia="Arial"/>
-          <w:b/>
-          <w:i w:val="0"/>
-          <w:color w:val="1C355E"/>
-          <w:sz w:val="17"/>
-        </w:rPr>
-        <w:t>-082RB13003024-</w:t>
-      </w:r>
-    </w:p>
-    <w:p>
-      <w:pPr>
-        <w:keepNext w:val="0"/>
-        <w:spacing w:before="40" w:after="120"/>
-        <w:shd w:val="clear" w:color="auto" w:fill="F2F2F2"/>
-      </w:pPr>
-      <w:sdt>
-        <w:sdtPr>
-          <w:alias w:val="082RB13003024"/>
-          <w:id w:val="100715"/>
-          <w:showingPlcHdr/>
-          <w:dropDownList>
-            <w:listItem w:displayText="Choose an item." w:value=""/>
-            <w:listItem w:displayText="Cash" w:value="Cash"/>
-            <w:listItem w:displayText="Government bonds" w:value="Government bonds"/>
-            <w:listItem w:displayText="Corporate bonds IG" w:value="Corporate bonds IG"/>
-            <w:listItem w:displayText="Corporate bonds HY" w:value="Corporate bonds HY"/>
-            <w:listItem w:displayText="Broad bonds" w:value="Broad bonds"/>
-            <w:listItem w:displayText="Equities" w:value="Equities"/>
-          </w:dropDownList>
-        </w:sdtPr>
-        <w:sdtContent>
-          <w:r>
-            <w:t>Choose an item.</w:t>
-          </w:r>
-        </w:sdtContent>
-      </w:sdt>
-    </w:p>
-    <w:p>
-      <w:pPr>
-        <w:keepNext/>
-        <w:spacing w:before="200" w:after="40"/>
-      </w:pPr>
-      <w:r>
-        <w:rPr>
-          <w:rFonts w:ascii="Arial" w:hAnsi="Arial" w:cs="Arial" w:eastAsia="Arial"/>
-          <w:b/>
-          <w:i w:val="0"/>
-          <w:color w:val="000000"/>
-          <w:sz w:val="20"/>
-        </w:rPr>
-        <w:t xml:space="preserve">RB1 - Benchmark - Index 8 - Yield curve segment </w:t>
-      </w:r>
-      <w:r>
-        <w:rPr>
-          <w:rFonts w:ascii="Arial" w:hAnsi="Arial" w:cs="Arial" w:eastAsia="Arial"/>
-          <w:b/>
-          <w:i w:val="0"/>
-          <w:color w:val="1C355E"/>
-          <w:sz w:val="17"/>
-        </w:rPr>
-        <w:t>-082RB13003025-</w:t>
-      </w:r>
-    </w:p>
-    <w:p>
-      <w:pPr>
-        <w:keepNext w:val="0"/>
-        <w:spacing w:before="40" w:after="120"/>
-        <w:shd w:val="clear" w:color="auto" w:fill="F2F2F2"/>
-      </w:pPr>
-      <w:sdt>
-        <w:sdtPr>
-          <w:alias w:val="082RB13003025"/>
-          <w:id w:val="100716"/>
           <w:showingPlcHdr/>
           <w:dropDownList>
             <w:listItem w:displayText="Choose an item." w:value=""/>
@@ -42730,109 +42598,129 @@
           <w:color w:val="000000"/>
           <w:sz w:val="20"/>
         </w:rPr>
-        <w:t xml:space="preserve">RB1 - Benchmark - Index 8 - Geographical focus </w:t>
-      </w:r>
-      <w:r>
-        <w:rPr>
-          <w:rFonts w:ascii="Arial" w:hAnsi="Arial" w:cs="Arial" w:eastAsia="Arial"/>
-          <w:b/>
-          <w:i w:val="0"/>
-          <w:color w:val="1C355E"/>
-          <w:sz w:val="17"/>
-        </w:rPr>
-        <w:t>-082RB13003026-</w:t>
-      </w:r>
-    </w:p>
-    <w:p>
-      <w:pPr>
-        <w:keepNext w:val="0"/>
-        <w:spacing w:before="40" w:after="120"/>
-        <w:shd w:val="clear" w:color="auto" w:fill="F2F2F2"/>
-      </w:pPr>
-      <w:sdt>
-        <w:sdtPr>
-          <w:alias w:val="082RB13003026"/>
-          <w:id w:val="100717"/>
-          <w:showingPlcHdr/>
-          <w:text/>
-        </w:sdtPr>
-        <w:sdtContent>
-          <w:r>
-            <w:t>Click or tap here to enter text.</w:t>
-          </w:r>
-        </w:sdtContent>
-      </w:sdt>
-    </w:p>
-    <w:p>
-      <w:pPr>
-        <w:keepNext/>
-        <w:spacing w:before="200" w:after="40"/>
-      </w:pPr>
-      <w:r>
-        <w:rPr>
-          <w:rFonts w:ascii="Arial" w:hAnsi="Arial" w:cs="Arial" w:eastAsia="Arial"/>
-          <w:b/>
-          <w:i w:val="0"/>
-          <w:color w:val="000000"/>
-          <w:sz w:val="20"/>
-        </w:rPr>
-        <w:t xml:space="preserve">RB1 - Benchmark - Index 8 - Currency </w:t>
-      </w:r>
-      <w:r>
-        <w:rPr>
-          <w:rFonts w:ascii="Arial" w:hAnsi="Arial" w:cs="Arial" w:eastAsia="Arial"/>
-          <w:b/>
-          <w:i w:val="0"/>
-          <w:color w:val="1C355E"/>
-          <w:sz w:val="17"/>
-        </w:rPr>
-        <w:t>-082RB13003027-</w:t>
-      </w:r>
-    </w:p>
-    <w:p>
-      <w:pPr>
-        <w:keepNext w:val="0"/>
-        <w:spacing w:before="40" w:after="120"/>
-        <w:shd w:val="clear" w:color="auto" w:fill="F2F2F2"/>
-      </w:pPr>
-      <w:sdt>
-        <w:sdtPr>
-          <w:alias w:val="082RB13003027"/>
-          <w:id w:val="100718"/>
-          <w:showingPlcHdr/>
-          <w:text/>
-        </w:sdtPr>
-        <w:sdtContent>
-          <w:r>
-            <w:t>Click or tap here to enter text.</w:t>
-          </w:r>
-        </w:sdtContent>
-      </w:sdt>
-    </w:p>
-    <w:p>
-      <w:pPr>
-        <w:keepNext/>
-        <w:spacing w:before="200" w:after="40"/>
-      </w:pPr>
-      <w:r>
-        <w:rPr>
-          <w:rFonts w:ascii="Arial" w:hAnsi="Arial" w:cs="Arial" w:eastAsia="Arial"/>
-          <w:b/>
-          <w:i w:val="0"/>
-          <w:color w:val="000000"/>
-          <w:sz w:val="20"/>
-        </w:rPr>
-        <w:t xml:space="preserve">RB1 - Benchmark - Index 8 - Weight </w:t>
-      </w:r>
-      <w:r>
-        <w:rPr>
-          <w:rFonts w:ascii="Arial" w:hAnsi="Arial" w:cs="Arial" w:eastAsia="Arial"/>
-          <w:b/>
-          <w:i w:val="0"/>
-          <w:color w:val="1C355E"/>
-          <w:sz w:val="17"/>
-        </w:rPr>
-        <w:t>-082RB13003028-</w:t>
+        <w:t xml:space="preserve">RB1 - Benchmark - Index 7 - Geographical focus </w:t>
+      </w:r>
+      <w:r>
+        <w:rPr>
+          <w:rFonts w:ascii="Arial" w:hAnsi="Arial" w:cs="Arial" w:eastAsia="Arial"/>
+          <w:b/>
+          <w:i w:val="0"/>
+          <w:color w:val="1C355E"/>
+          <w:sz w:val="17"/>
+        </w:rPr>
+        <w:t>-082RB13003021-</w:t>
+      </w:r>
+    </w:p>
+    <w:p>
+      <w:pPr>
+        <w:keepNext w:val="0"/>
+        <w:spacing w:before="40" w:after="120"/>
+        <w:shd w:val="clear" w:color="auto" w:fill="F2F2F2"/>
+      </w:pPr>
+      <w:sdt>
+        <w:sdtPr>
+          <w:alias w:val="082RB13003021"/>
+          <w:id w:val="100712"/>
+          <w:showingPlcHdr/>
+          <w:dropDownList>
+            <w:listItem w:displayText="Choose an item." w:value=""/>
+            <w:listItem w:displayText="Italy" w:value="Italy"/>
+            <w:listItem w:displayText="United Kingdom" w:value="United Kingdom"/>
+            <w:listItem w:displayText="Eurozone" w:value="Eurozone"/>
+            <w:listItem w:displayText="Europe" w:value="Europe"/>
+            <w:listItem w:displayText="USA" w:value="USA"/>
+            <w:listItem w:displayText="North America" w:value="North America"/>
+            <w:listItem w:displayText="Japan" w:value="Japan"/>
+            <w:listItem w:displayText="Pacific" w:value="Pacific"/>
+            <w:listItem w:displayText="Pacific ex Japan" w:value="Pacific ex Japan"/>
+            <w:listItem w:displayText="Emerging markets (EM)" w:value="Emerging markets (EM)"/>
+            <w:listItem w:displayText="Developed countries (DC)" w:value="Developed countries (DC)"/>
+            <w:listItem w:displayText="Developed countries + EM (DC + EM)" w:value="Developed countries + EM (DC + EM)"/>
+          </w:dropDownList>
+        </w:sdtPr>
+        <w:sdtContent>
+          <w:r>
+            <w:t>Choose an item.</w:t>
+          </w:r>
+        </w:sdtContent>
+      </w:sdt>
+    </w:p>
+    <w:p>
+      <w:pPr>
+        <w:keepNext/>
+        <w:spacing w:before="200" w:after="40"/>
+      </w:pPr>
+      <w:r>
+        <w:rPr>
+          <w:rFonts w:ascii="Arial" w:hAnsi="Arial" w:cs="Arial" w:eastAsia="Arial"/>
+          <w:b/>
+          <w:i w:val="0"/>
+          <w:color w:val="000000"/>
+          <w:sz w:val="20"/>
+        </w:rPr>
+        <w:t xml:space="preserve">RB1 - Benchmark - Index 7 - Currency </w:t>
+      </w:r>
+      <w:r>
+        <w:rPr>
+          <w:rFonts w:ascii="Arial" w:hAnsi="Arial" w:cs="Arial" w:eastAsia="Arial"/>
+          <w:b/>
+          <w:i w:val="0"/>
+          <w:color w:val="1C355E"/>
+          <w:sz w:val="17"/>
+        </w:rPr>
+        <w:t>-082RB13003022-</w:t>
+      </w:r>
+    </w:p>
+    <w:p>
+      <w:pPr>
+        <w:keepNext w:val="0"/>
+        <w:spacing w:before="40" w:after="120"/>
+        <w:shd w:val="clear" w:color="auto" w:fill="F2F2F2"/>
+      </w:pPr>
+      <w:sdt>
+        <w:sdtPr>
+          <w:alias w:val="082RB13003022"/>
+          <w:id w:val="100713"/>
+          <w:showingPlcHdr/>
+          <w:dropDownList>
+            <w:listItem w:displayText="Choose an item." w:value=""/>
+            <w:listItem w:displayText="Euro" w:value="Euro"/>
+            <w:listItem w:displayText="USD" w:value="USD"/>
+            <w:listItem w:displayText="Local currency" w:value="Local currency"/>
+            <w:listItem w:displayText="Hedged in Euro" w:value="Hedged in Euro"/>
+          </w:dropDownList>
+        </w:sdtPr>
+        <w:sdtContent>
+          <w:r>
+            <w:t>Choose an item.</w:t>
+          </w:r>
+        </w:sdtContent>
+      </w:sdt>
+    </w:p>
+    <w:p>
+      <w:pPr>
+        <w:keepNext/>
+        <w:spacing w:before="200" w:after="40"/>
+      </w:pPr>
+      <w:r>
+        <w:rPr>
+          <w:rFonts w:ascii="Arial" w:hAnsi="Arial" w:cs="Arial" w:eastAsia="Arial"/>
+          <w:b/>
+          <w:i w:val="0"/>
+          <w:color w:val="000000"/>
+          <w:sz w:val="20"/>
+        </w:rPr>
+        <w:t xml:space="preserve">RB1 - Benchmark - Index 7 - Weight </w:t>
+      </w:r>
+      <w:r>
+        <w:rPr>
+          <w:rFonts w:ascii="Arial" w:hAnsi="Arial" w:cs="Arial" w:eastAsia="Arial"/>
+          <w:b/>
+          <w:i w:val="0"/>
+          <w:color w:val="1C355E"/>
+          <w:sz w:val="17"/>
+        </w:rPr>
+        <w:t>-082RB13003023-</w:t>
       </w:r>
     </w:p>
     <w:p>
@@ -42859,54 +42747,54 @@
       </w:pPr>
       <w:sdt>
         <w:sdtPr>
-          <w:alias w:val="082RB13003028"/>
-          <w:id w:val="100719"/>
-          <w:showingPlcHdr/>
-          <w:text/>
-        </w:sdtPr>
-        <w:sdtContent>
-          <w:r>
-            <w:t>Click or tap here to enter text.</w:t>
-          </w:r>
-        </w:sdtContent>
-      </w:sdt>
-    </w:p>
-    <w:p>
-      <w:pPr>
-        <w:keepNext/>
-        <w:spacing w:before="200" w:after="40"/>
-      </w:pPr>
-      <w:r>
-        <w:rPr>
-          <w:rFonts w:ascii="Arial" w:hAnsi="Arial" w:cs="Arial" w:eastAsia="Arial"/>
-          <w:b/>
-          <w:i w:val="0"/>
-          <w:color w:val="000000"/>
-          <w:sz w:val="20"/>
-        </w:rPr>
-        <w:t xml:space="preserve">RB1 - Benchmark - Index 9 - Asset class type </w:t>
-      </w:r>
-      <w:r>
-        <w:rPr>
-          <w:rFonts w:ascii="Arial" w:hAnsi="Arial" w:cs="Arial" w:eastAsia="Arial"/>
-          <w:b/>
-          <w:i w:val="0"/>
-          <w:color w:val="1C355E"/>
-          <w:sz w:val="17"/>
-        </w:rPr>
-        <w:t>-082RB13003029-</w:t>
-      </w:r>
-    </w:p>
-    <w:p>
-      <w:pPr>
-        <w:keepNext w:val="0"/>
-        <w:spacing w:before="40" w:after="120"/>
-        <w:shd w:val="clear" w:color="auto" w:fill="F2F2F2"/>
-      </w:pPr>
-      <w:sdt>
-        <w:sdtPr>
-          <w:alias w:val="082RB13003029"/>
-          <w:id w:val="100720"/>
+          <w:alias w:val="082RB13003023"/>
+          <w:id w:val="100714"/>
+          <w:showingPlcHdr/>
+          <w:text/>
+        </w:sdtPr>
+        <w:sdtContent>
+          <w:r>
+            <w:t>Click or tap here to enter text.</w:t>
+          </w:r>
+        </w:sdtContent>
+      </w:sdt>
+    </w:p>
+    <w:p>
+      <w:pPr>
+        <w:keepNext/>
+        <w:spacing w:before="200" w:after="40"/>
+      </w:pPr>
+      <w:r>
+        <w:rPr>
+          <w:rFonts w:ascii="Arial" w:hAnsi="Arial" w:cs="Arial" w:eastAsia="Arial"/>
+          <w:b/>
+          <w:i w:val="0"/>
+          <w:color w:val="000000"/>
+          <w:sz w:val="20"/>
+        </w:rPr>
+        <w:t xml:space="preserve">RB1 - Benchmark - Index 8 - Asset class type </w:t>
+      </w:r>
+      <w:r>
+        <w:rPr>
+          <w:rFonts w:ascii="Arial" w:hAnsi="Arial" w:cs="Arial" w:eastAsia="Arial"/>
+          <w:b/>
+          <w:i w:val="0"/>
+          <w:color w:val="1C355E"/>
+          <w:sz w:val="17"/>
+        </w:rPr>
+        <w:t>-082RB13003024-</w:t>
+      </w:r>
+    </w:p>
+    <w:p>
+      <w:pPr>
+        <w:keepNext w:val="0"/>
+        <w:spacing w:before="40" w:after="120"/>
+        <w:shd w:val="clear" w:color="auto" w:fill="F2F2F2"/>
+      </w:pPr>
+      <w:sdt>
+        <w:sdtPr>
+          <w:alias w:val="082RB13003024"/>
+          <w:id w:val="100715"/>
           <w:showingPlcHdr/>
           <w:dropDownList>
             <w:listItem w:displayText="Choose an item." w:value=""/>
@@ -42938,29 +42826,29 @@
           <w:color w:val="000000"/>
           <w:sz w:val="20"/>
         </w:rPr>
-        <w:t xml:space="preserve">RB1 - Benchmark - Index 9 - Yield curve segment </w:t>
-      </w:r>
-      <w:r>
-        <w:rPr>
-          <w:rFonts w:ascii="Arial" w:hAnsi="Arial" w:cs="Arial" w:eastAsia="Arial"/>
-          <w:b/>
-          <w:i w:val="0"/>
-          <w:color w:val="1C355E"/>
-          <w:sz w:val="17"/>
-        </w:rPr>
-        <w:t>-082RB13003030-</w:t>
-      </w:r>
-    </w:p>
-    <w:p>
-      <w:pPr>
-        <w:keepNext w:val="0"/>
-        <w:spacing w:before="40" w:after="120"/>
-        <w:shd w:val="clear" w:color="auto" w:fill="F2F2F2"/>
-      </w:pPr>
-      <w:sdt>
-        <w:sdtPr>
-          <w:alias w:val="082RB13003030"/>
-          <w:id w:val="100721"/>
+        <w:t xml:space="preserve">RB1 - Benchmark - Index 8 - Yield curve segment </w:t>
+      </w:r>
+      <w:r>
+        <w:rPr>
+          <w:rFonts w:ascii="Arial" w:hAnsi="Arial" w:cs="Arial" w:eastAsia="Arial"/>
+          <w:b/>
+          <w:i w:val="0"/>
+          <w:color w:val="1C355E"/>
+          <w:sz w:val="17"/>
+        </w:rPr>
+        <w:t>-082RB13003025-</w:t>
+      </w:r>
+    </w:p>
+    <w:p>
+      <w:pPr>
+        <w:keepNext w:val="0"/>
+        <w:spacing w:before="40" w:after="120"/>
+        <w:shd w:val="clear" w:color="auto" w:fill="F2F2F2"/>
+      </w:pPr>
+      <w:sdt>
+        <w:sdtPr>
+          <w:alias w:val="082RB13003025"/>
+          <w:id w:val="100716"/>
           <w:showingPlcHdr/>
           <w:dropDownList>
             <w:listItem w:displayText="Choose an item." w:value=""/>
@@ -42993,109 +42881,129 @@
           <w:color w:val="000000"/>
           <w:sz w:val="20"/>
         </w:rPr>
-        <w:t xml:space="preserve">RB1 - Benchmark - Index 9 - Geographical focus </w:t>
-      </w:r>
-      <w:r>
-        <w:rPr>
-          <w:rFonts w:ascii="Arial" w:hAnsi="Arial" w:cs="Arial" w:eastAsia="Arial"/>
-          <w:b/>
-          <w:i w:val="0"/>
-          <w:color w:val="1C355E"/>
-          <w:sz w:val="17"/>
-        </w:rPr>
-        <w:t>-082RB13003031-</w:t>
-      </w:r>
-    </w:p>
-    <w:p>
-      <w:pPr>
-        <w:keepNext w:val="0"/>
-        <w:spacing w:before="40" w:after="120"/>
-        <w:shd w:val="clear" w:color="auto" w:fill="F2F2F2"/>
-      </w:pPr>
-      <w:sdt>
-        <w:sdtPr>
-          <w:alias w:val="082RB13003031"/>
-          <w:id w:val="100722"/>
-          <w:showingPlcHdr/>
-          <w:text/>
-        </w:sdtPr>
-        <w:sdtContent>
-          <w:r>
-            <w:t>Click or tap here to enter text.</w:t>
-          </w:r>
-        </w:sdtContent>
-      </w:sdt>
-    </w:p>
-    <w:p>
-      <w:pPr>
-        <w:keepNext/>
-        <w:spacing w:before="200" w:after="40"/>
-      </w:pPr>
-      <w:r>
-        <w:rPr>
-          <w:rFonts w:ascii="Arial" w:hAnsi="Arial" w:cs="Arial" w:eastAsia="Arial"/>
-          <w:b/>
-          <w:i w:val="0"/>
-          <w:color w:val="000000"/>
-          <w:sz w:val="20"/>
-        </w:rPr>
-        <w:t xml:space="preserve">RB1 - Benchmark - Index 9 - Currency </w:t>
-      </w:r>
-      <w:r>
-        <w:rPr>
-          <w:rFonts w:ascii="Arial" w:hAnsi="Arial" w:cs="Arial" w:eastAsia="Arial"/>
-          <w:b/>
-          <w:i w:val="0"/>
-          <w:color w:val="1C355E"/>
-          <w:sz w:val="17"/>
-        </w:rPr>
-        <w:t>-082RB13003032-</w:t>
-      </w:r>
-    </w:p>
-    <w:p>
-      <w:pPr>
-        <w:keepNext w:val="0"/>
-        <w:spacing w:before="40" w:after="120"/>
-        <w:shd w:val="clear" w:color="auto" w:fill="F2F2F2"/>
-      </w:pPr>
-      <w:sdt>
-        <w:sdtPr>
-          <w:alias w:val="082RB13003032"/>
-          <w:id w:val="100723"/>
-          <w:showingPlcHdr/>
-          <w:text/>
-        </w:sdtPr>
-        <w:sdtContent>
-          <w:r>
-            <w:t>Click or tap here to enter text.</w:t>
-          </w:r>
-        </w:sdtContent>
-      </w:sdt>
-    </w:p>
-    <w:p>
-      <w:pPr>
-        <w:keepNext/>
-        <w:spacing w:before="200" w:after="40"/>
-      </w:pPr>
-      <w:r>
-        <w:rPr>
-          <w:rFonts w:ascii="Arial" w:hAnsi="Arial" w:cs="Arial" w:eastAsia="Arial"/>
-          <w:b/>
-          <w:i w:val="0"/>
-          <w:color w:val="000000"/>
-          <w:sz w:val="20"/>
-        </w:rPr>
-        <w:t xml:space="preserve">RB1 - Benchmark - Index 9 - Weight </w:t>
-      </w:r>
-      <w:r>
-        <w:rPr>
-          <w:rFonts w:ascii="Arial" w:hAnsi="Arial" w:cs="Arial" w:eastAsia="Arial"/>
-          <w:b/>
-          <w:i w:val="0"/>
-          <w:color w:val="1C355E"/>
-          <w:sz w:val="17"/>
-        </w:rPr>
-        <w:t>-082RB13003033-</w:t>
+        <w:t xml:space="preserve">RB1 - Benchmark - Index 8 - Geographical focus </w:t>
+      </w:r>
+      <w:r>
+        <w:rPr>
+          <w:rFonts w:ascii="Arial" w:hAnsi="Arial" w:cs="Arial" w:eastAsia="Arial"/>
+          <w:b/>
+          <w:i w:val="0"/>
+          <w:color w:val="1C355E"/>
+          <w:sz w:val="17"/>
+        </w:rPr>
+        <w:t>-082RB13003026-</w:t>
+      </w:r>
+    </w:p>
+    <w:p>
+      <w:pPr>
+        <w:keepNext w:val="0"/>
+        <w:spacing w:before="40" w:after="120"/>
+        <w:shd w:val="clear" w:color="auto" w:fill="F2F2F2"/>
+      </w:pPr>
+      <w:sdt>
+        <w:sdtPr>
+          <w:alias w:val="082RB13003026"/>
+          <w:id w:val="100717"/>
+          <w:showingPlcHdr/>
+          <w:dropDownList>
+            <w:listItem w:displayText="Choose an item." w:value=""/>
+            <w:listItem w:displayText="Italy" w:value="Italy"/>
+            <w:listItem w:displayText="United Kingdom" w:value="United Kingdom"/>
+            <w:listItem w:displayText="Eurozone" w:value="Eurozone"/>
+            <w:listItem w:displayText="Europe" w:value="Europe"/>
+            <w:listItem w:displayText="USA" w:value="USA"/>
+            <w:listItem w:displayText="North America" w:value="North America"/>
+            <w:listItem w:displayText="Japan" w:value="Japan"/>
+            <w:listItem w:displayText="Pacific" w:value="Pacific"/>
+            <w:listItem w:displayText="Pacific ex Japan" w:value="Pacific ex Japan"/>
+            <w:listItem w:displayText="Emerging markets (EM)" w:value="Emerging markets (EM)"/>
+            <w:listItem w:displayText="Developed countries (DC)" w:value="Developed countries (DC)"/>
+            <w:listItem w:displayText="Developed countries + EM (DC + EM)" w:value="Developed countries + EM (DC + EM)"/>
+          </w:dropDownList>
+        </w:sdtPr>
+        <w:sdtContent>
+          <w:r>
+            <w:t>Choose an item.</w:t>
+          </w:r>
+        </w:sdtContent>
+      </w:sdt>
+    </w:p>
+    <w:p>
+      <w:pPr>
+        <w:keepNext/>
+        <w:spacing w:before="200" w:after="40"/>
+      </w:pPr>
+      <w:r>
+        <w:rPr>
+          <w:rFonts w:ascii="Arial" w:hAnsi="Arial" w:cs="Arial" w:eastAsia="Arial"/>
+          <w:b/>
+          <w:i w:val="0"/>
+          <w:color w:val="000000"/>
+          <w:sz w:val="20"/>
+        </w:rPr>
+        <w:t xml:space="preserve">RB1 - Benchmark - Index 8 - Currency </w:t>
+      </w:r>
+      <w:r>
+        <w:rPr>
+          <w:rFonts w:ascii="Arial" w:hAnsi="Arial" w:cs="Arial" w:eastAsia="Arial"/>
+          <w:b/>
+          <w:i w:val="0"/>
+          <w:color w:val="1C355E"/>
+          <w:sz w:val="17"/>
+        </w:rPr>
+        <w:t>-082RB13003027-</w:t>
+      </w:r>
+    </w:p>
+    <w:p>
+      <w:pPr>
+        <w:keepNext w:val="0"/>
+        <w:spacing w:before="40" w:after="120"/>
+        <w:shd w:val="clear" w:color="auto" w:fill="F2F2F2"/>
+      </w:pPr>
+      <w:sdt>
+        <w:sdtPr>
+          <w:alias w:val="082RB13003027"/>
+          <w:id w:val="100718"/>
+          <w:showingPlcHdr/>
+          <w:dropDownList>
+            <w:listItem w:displayText="Choose an item." w:value=""/>
+            <w:listItem w:displayText="Euro" w:value="Euro"/>
+            <w:listItem w:displayText="USD" w:value="USD"/>
+            <w:listItem w:displayText="Local currency" w:value="Local currency"/>
+            <w:listItem w:displayText="Hedged in Euro" w:value="Hedged in Euro"/>
+          </w:dropDownList>
+        </w:sdtPr>
+        <w:sdtContent>
+          <w:r>
+            <w:t>Choose an item.</w:t>
+          </w:r>
+        </w:sdtContent>
+      </w:sdt>
+    </w:p>
+    <w:p>
+      <w:pPr>
+        <w:keepNext/>
+        <w:spacing w:before="200" w:after="40"/>
+      </w:pPr>
+      <w:r>
+        <w:rPr>
+          <w:rFonts w:ascii="Arial" w:hAnsi="Arial" w:cs="Arial" w:eastAsia="Arial"/>
+          <w:b/>
+          <w:i w:val="0"/>
+          <w:color w:val="000000"/>
+          <w:sz w:val="20"/>
+        </w:rPr>
+        <w:t xml:space="preserve">RB1 - Benchmark - Index 8 - Weight </w:t>
+      </w:r>
+      <w:r>
+        <w:rPr>
+          <w:rFonts w:ascii="Arial" w:hAnsi="Arial" w:cs="Arial" w:eastAsia="Arial"/>
+          <w:b/>
+          <w:i w:val="0"/>
+          <w:color w:val="1C355E"/>
+          <w:sz w:val="17"/>
+        </w:rPr>
+        <w:t>-082RB13003028-</w:t>
       </w:r>
     </w:p>
     <w:p>
@@ -43122,746 +43030,54 @@
       </w:pPr>
       <w:sdt>
         <w:sdtPr>
-          <w:alias w:val="082RB13003033"/>
-          <w:id w:val="100724"/>
-          <w:showingPlcHdr/>
-          <w:text/>
-        </w:sdtPr>
-        <w:sdtContent>
-          <w:r>
-            <w:t>Click or tap here to enter text.</w:t>
-          </w:r>
-        </w:sdtContent>
-      </w:sdt>
-    </w:p>
-    <w:p>
-      <w:pPr>
-        <w:keepNext/>
-        <w:spacing w:before="200" w:after="40"/>
-      </w:pPr>
-      <w:r>
-        <w:rPr>
-          <w:rFonts w:ascii="Arial" w:hAnsi="Arial" w:cs="Arial" w:eastAsia="Arial"/>
-          <w:b/>
-          <w:i w:val="0"/>
-          <w:color w:val="000000"/>
-          <w:sz w:val="20"/>
-        </w:rPr>
-        <w:t xml:space="preserve">RB1 - Benchmark - Index 10 - Asset class type </w:t>
-      </w:r>
-      <w:r>
-        <w:rPr>
-          <w:rFonts w:ascii="Arial" w:hAnsi="Arial" w:cs="Arial" w:eastAsia="Arial"/>
-          <w:b/>
-          <w:i w:val="0"/>
-          <w:color w:val="1C355E"/>
-          <w:sz w:val="17"/>
-        </w:rPr>
-        <w:t>-082RB13004416-</w:t>
-      </w:r>
-    </w:p>
-    <w:p>
-      <w:pPr>
-        <w:keepNext w:val="0"/>
-        <w:spacing w:before="40" w:after="120"/>
-        <w:shd w:val="clear" w:color="auto" w:fill="F2F2F2"/>
-      </w:pPr>
-      <w:sdt>
-        <w:sdtPr>
-          <w:alias w:val="082RB13004416"/>
-          <w:id w:val="100725"/>
-          <w:showingPlcHdr/>
-          <w:text/>
-        </w:sdtPr>
-        <w:sdtContent>
-          <w:r>
-            <w:t>Click or tap here to enter text.</w:t>
-          </w:r>
-        </w:sdtContent>
-      </w:sdt>
-    </w:p>
-    <w:p>
-      <w:pPr>
-        <w:keepNext/>
-        <w:spacing w:before="200" w:after="40"/>
-      </w:pPr>
-      <w:r>
-        <w:rPr>
-          <w:rFonts w:ascii="Arial" w:hAnsi="Arial" w:cs="Arial" w:eastAsia="Arial"/>
-          <w:b/>
-          <w:i w:val="0"/>
-          <w:color w:val="000000"/>
-          <w:sz w:val="20"/>
-        </w:rPr>
-        <w:t xml:space="preserve">RB1 - Benchmark - Index 10 - Yield curve segment </w:t>
-      </w:r>
-      <w:r>
-        <w:rPr>
-          <w:rFonts w:ascii="Arial" w:hAnsi="Arial" w:cs="Arial" w:eastAsia="Arial"/>
-          <w:b/>
-          <w:i w:val="0"/>
-          <w:color w:val="1C355E"/>
-          <w:sz w:val="17"/>
-        </w:rPr>
-        <w:t>-082RB13004417-</w:t>
-      </w:r>
-    </w:p>
-    <w:p>
-      <w:pPr>
-        <w:keepNext w:val="0"/>
-        <w:spacing w:before="40" w:after="120"/>
-        <w:shd w:val="clear" w:color="auto" w:fill="F2F2F2"/>
-      </w:pPr>
-      <w:sdt>
-        <w:sdtPr>
-          <w:alias w:val="082RB13004417"/>
-          <w:id w:val="100726"/>
-          <w:showingPlcHdr/>
-          <w:text/>
-        </w:sdtPr>
-        <w:sdtContent>
-          <w:r>
-            <w:t>Click or tap here to enter text.</w:t>
-          </w:r>
-        </w:sdtContent>
-      </w:sdt>
-    </w:p>
-    <w:p>
-      <w:pPr>
-        <w:keepNext/>
-        <w:spacing w:before="200" w:after="40"/>
-      </w:pPr>
-      <w:r>
-        <w:rPr>
-          <w:rFonts w:ascii="Arial" w:hAnsi="Arial" w:cs="Arial" w:eastAsia="Arial"/>
-          <w:b/>
-          <w:i w:val="0"/>
-          <w:color w:val="000000"/>
-          <w:sz w:val="20"/>
-        </w:rPr>
-        <w:t xml:space="preserve">RB1 - Benchmark - Index 10 - Geographical focus </w:t>
-      </w:r>
-      <w:r>
-        <w:rPr>
-          <w:rFonts w:ascii="Arial" w:hAnsi="Arial" w:cs="Arial" w:eastAsia="Arial"/>
-          <w:b/>
-          <w:i w:val="0"/>
-          <w:color w:val="1C355E"/>
-          <w:sz w:val="17"/>
-        </w:rPr>
-        <w:t>-082RB13004418-</w:t>
-      </w:r>
-    </w:p>
-    <w:p>
-      <w:pPr>
-        <w:keepNext w:val="0"/>
-        <w:spacing w:before="40" w:after="120"/>
-        <w:shd w:val="clear" w:color="auto" w:fill="F2F2F2"/>
-      </w:pPr>
-      <w:sdt>
-        <w:sdtPr>
-          <w:alias w:val="082RB13004418"/>
-          <w:id w:val="100727"/>
-          <w:showingPlcHdr/>
-          <w:text/>
-        </w:sdtPr>
-        <w:sdtContent>
-          <w:r>
-            <w:t>Click or tap here to enter text.</w:t>
-          </w:r>
-        </w:sdtContent>
-      </w:sdt>
-    </w:p>
-    <w:p>
-      <w:pPr>
-        <w:keepNext/>
-        <w:spacing w:before="200" w:after="40"/>
-      </w:pPr>
-      <w:r>
-        <w:rPr>
-          <w:rFonts w:ascii="Arial" w:hAnsi="Arial" w:cs="Arial" w:eastAsia="Arial"/>
-          <w:b/>
-          <w:i w:val="0"/>
-          <w:color w:val="000000"/>
-          <w:sz w:val="20"/>
-        </w:rPr>
-        <w:t xml:space="preserve">RB1 - Benchmark - Index 10 - Currency </w:t>
-      </w:r>
-      <w:r>
-        <w:rPr>
-          <w:rFonts w:ascii="Arial" w:hAnsi="Arial" w:cs="Arial" w:eastAsia="Arial"/>
-          <w:b/>
-          <w:i w:val="0"/>
-          <w:color w:val="1C355E"/>
-          <w:sz w:val="17"/>
-        </w:rPr>
-        <w:t>-082RB13004419-</w:t>
-      </w:r>
-    </w:p>
-    <w:p>
-      <w:pPr>
-        <w:keepNext w:val="0"/>
-        <w:spacing w:before="40" w:after="120"/>
-        <w:shd w:val="clear" w:color="auto" w:fill="F2F2F2"/>
-      </w:pPr>
-      <w:sdt>
-        <w:sdtPr>
-          <w:alias w:val="082RB13004419"/>
-          <w:id w:val="100728"/>
-          <w:showingPlcHdr/>
-          <w:text/>
-        </w:sdtPr>
-        <w:sdtContent>
-          <w:r>
-            <w:t>Click or tap here to enter text.</w:t>
-          </w:r>
-        </w:sdtContent>
-      </w:sdt>
-    </w:p>
-    <w:p>
-      <w:pPr>
-        <w:keepNext/>
-        <w:spacing w:before="200" w:after="40"/>
-      </w:pPr>
-      <w:r>
-        <w:rPr>
-          <w:rFonts w:ascii="Arial" w:hAnsi="Arial" w:cs="Arial" w:eastAsia="Arial"/>
-          <w:b/>
-          <w:i w:val="0"/>
-          <w:color w:val="000000"/>
-          <w:sz w:val="20"/>
-        </w:rPr>
-        <w:t xml:space="preserve">RB1 - Benchmark - Index 10 - Weight </w:t>
-      </w:r>
-      <w:r>
-        <w:rPr>
-          <w:rFonts w:ascii="Arial" w:hAnsi="Arial" w:cs="Arial" w:eastAsia="Arial"/>
-          <w:b/>
-          <w:i w:val="0"/>
-          <w:color w:val="1C355E"/>
-          <w:sz w:val="17"/>
-        </w:rPr>
-        <w:t>-082RB13004420-</w:t>
-      </w:r>
-    </w:p>
-    <w:p>
-      <w:pPr>
-        <w:keepNext/>
-        <w:spacing w:before="0" w:after="40"/>
-      </w:pPr>
-      <w:r>
-        <w:rPr>
-          <w:rFonts w:ascii="Arial" w:hAnsi="Arial" w:cs="Arial" w:eastAsia="Arial"/>
-          <w:b w:val="0"/>
-          <w:i/>
-          <w:color w:val="595959"/>
-          <w:sz w:val="18"/>
-        </w:rPr>
-        <w:t>% with 1 decimal place</w:t>
-      </w:r>
-    </w:p>
-    <w:p>
-      <w:pPr>
-        <w:keepNext w:val="0"/>
-        <w:spacing w:before="40" w:after="120"/>
-        <w:shd w:val="clear" w:color="auto" w:fill="F2F2F2"/>
-      </w:pPr>
-      <w:sdt>
-        <w:sdtPr>
-          <w:alias w:val="082RB13004420"/>
-          <w:id w:val="100729"/>
-          <w:showingPlcHdr/>
-          <w:text/>
-        </w:sdtPr>
-        <w:sdtContent>
-          <w:r>
-            <w:t>Click or tap here to enter text.</w:t>
-          </w:r>
-        </w:sdtContent>
-      </w:sdt>
-    </w:p>
-    <w:p>
-      <w:pPr>
-        <w:keepNext/>
-        <w:spacing w:before="200" w:after="40"/>
-      </w:pPr>
-      <w:r>
-        <w:rPr>
-          <w:rFonts w:ascii="Arial" w:hAnsi="Arial" w:cs="Arial" w:eastAsia="Arial"/>
-          <w:b/>
-          <w:i w:val="0"/>
-          <w:color w:val="000000"/>
-          <w:sz w:val="20"/>
-        </w:rPr>
-        <w:t xml:space="preserve">RB1 - Benchmark - Index 11 - Asset class type </w:t>
-      </w:r>
-      <w:r>
-        <w:rPr>
-          <w:rFonts w:ascii="Arial" w:hAnsi="Arial" w:cs="Arial" w:eastAsia="Arial"/>
-          <w:b/>
-          <w:i w:val="0"/>
-          <w:color w:val="1C355E"/>
-          <w:sz w:val="17"/>
-        </w:rPr>
-        <w:t>-082RB13004421-</w:t>
-      </w:r>
-    </w:p>
-    <w:p>
-      <w:pPr>
-        <w:keepNext w:val="0"/>
-        <w:spacing w:before="40" w:after="120"/>
-        <w:shd w:val="clear" w:color="auto" w:fill="F2F2F2"/>
-      </w:pPr>
-      <w:sdt>
-        <w:sdtPr>
-          <w:alias w:val="082RB13004421"/>
-          <w:id w:val="100730"/>
-          <w:showingPlcHdr/>
-          <w:text/>
-        </w:sdtPr>
-        <w:sdtContent>
-          <w:r>
-            <w:t>Click or tap here to enter text.</w:t>
-          </w:r>
-        </w:sdtContent>
-      </w:sdt>
-    </w:p>
-    <w:p>
-      <w:pPr>
-        <w:keepNext/>
-        <w:spacing w:before="200" w:after="40"/>
-      </w:pPr>
-      <w:r>
-        <w:rPr>
-          <w:rFonts w:ascii="Arial" w:hAnsi="Arial" w:cs="Arial" w:eastAsia="Arial"/>
-          <w:b/>
-          <w:i w:val="0"/>
-          <w:color w:val="000000"/>
-          <w:sz w:val="20"/>
-        </w:rPr>
-        <w:t xml:space="preserve">RB1 - Benchmark - Index 11 - Yield curve segment </w:t>
-      </w:r>
-      <w:r>
-        <w:rPr>
-          <w:rFonts w:ascii="Arial" w:hAnsi="Arial" w:cs="Arial" w:eastAsia="Arial"/>
-          <w:b/>
-          <w:i w:val="0"/>
-          <w:color w:val="1C355E"/>
-          <w:sz w:val="17"/>
-        </w:rPr>
-        <w:t>-082RB13004422-</w:t>
-      </w:r>
-    </w:p>
-    <w:p>
-      <w:pPr>
-        <w:keepNext w:val="0"/>
-        <w:spacing w:before="40" w:after="120"/>
-        <w:shd w:val="clear" w:color="auto" w:fill="F2F2F2"/>
-      </w:pPr>
-      <w:sdt>
-        <w:sdtPr>
-          <w:alias w:val="082RB13004422"/>
-          <w:id w:val="100731"/>
-          <w:showingPlcHdr/>
-          <w:text/>
-        </w:sdtPr>
-        <w:sdtContent>
-          <w:r>
-            <w:t>Click or tap here to enter text.</w:t>
-          </w:r>
-        </w:sdtContent>
-      </w:sdt>
-    </w:p>
-    <w:p>
-      <w:pPr>
-        <w:keepNext/>
-        <w:spacing w:before="200" w:after="40"/>
-      </w:pPr>
-      <w:r>
-        <w:rPr>
-          <w:rFonts w:ascii="Arial" w:hAnsi="Arial" w:cs="Arial" w:eastAsia="Arial"/>
-          <w:b/>
-          <w:i w:val="0"/>
-          <w:color w:val="000000"/>
-          <w:sz w:val="20"/>
-        </w:rPr>
-        <w:t xml:space="preserve">RB1 - Benchmark - Index 11 - Geographical focus </w:t>
-      </w:r>
-      <w:r>
-        <w:rPr>
-          <w:rFonts w:ascii="Arial" w:hAnsi="Arial" w:cs="Arial" w:eastAsia="Arial"/>
-          <w:b/>
-          <w:i w:val="0"/>
-          <w:color w:val="1C355E"/>
-          <w:sz w:val="17"/>
-        </w:rPr>
-        <w:t>-082RB13004423-</w:t>
-      </w:r>
-    </w:p>
-    <w:p>
-      <w:pPr>
-        <w:keepNext w:val="0"/>
-        <w:spacing w:before="40" w:after="120"/>
-        <w:shd w:val="clear" w:color="auto" w:fill="F2F2F2"/>
-      </w:pPr>
-      <w:sdt>
-        <w:sdtPr>
-          <w:alias w:val="082RB13004423"/>
-          <w:id w:val="100732"/>
-          <w:showingPlcHdr/>
-          <w:text/>
-        </w:sdtPr>
-        <w:sdtContent>
-          <w:r>
-            <w:t>Click or tap here to enter text.</w:t>
-          </w:r>
-        </w:sdtContent>
-      </w:sdt>
-    </w:p>
-    <w:p>
-      <w:pPr>
-        <w:keepNext/>
-        <w:spacing w:before="200" w:after="40"/>
-      </w:pPr>
-      <w:r>
-        <w:rPr>
-          <w:rFonts w:ascii="Arial" w:hAnsi="Arial" w:cs="Arial" w:eastAsia="Arial"/>
-          <w:b/>
-          <w:i w:val="0"/>
-          <w:color w:val="000000"/>
-          <w:sz w:val="20"/>
-        </w:rPr>
-        <w:t xml:space="preserve">RB1 - Benchmark - Index 11 - Currency </w:t>
-      </w:r>
-      <w:r>
-        <w:rPr>
-          <w:rFonts w:ascii="Arial" w:hAnsi="Arial" w:cs="Arial" w:eastAsia="Arial"/>
-          <w:b/>
-          <w:i w:val="0"/>
-          <w:color w:val="1C355E"/>
-          <w:sz w:val="17"/>
-        </w:rPr>
-        <w:t>-082RB13004424-</w:t>
-      </w:r>
-    </w:p>
-    <w:p>
-      <w:pPr>
-        <w:keepNext w:val="0"/>
-        <w:spacing w:before="40" w:after="120"/>
-        <w:shd w:val="clear" w:color="auto" w:fill="F2F2F2"/>
-      </w:pPr>
-      <w:sdt>
-        <w:sdtPr>
-          <w:alias w:val="082RB13004424"/>
-          <w:id w:val="100733"/>
-          <w:showingPlcHdr/>
-          <w:text/>
-        </w:sdtPr>
-        <w:sdtContent>
-          <w:r>
-            <w:t>Click or tap here to enter text.</w:t>
-          </w:r>
-        </w:sdtContent>
-      </w:sdt>
-    </w:p>
-    <w:p>
-      <w:pPr>
-        <w:keepNext/>
-        <w:spacing w:before="200" w:after="40"/>
-      </w:pPr>
-      <w:r>
-        <w:rPr>
-          <w:rFonts w:ascii="Arial" w:hAnsi="Arial" w:cs="Arial" w:eastAsia="Arial"/>
-          <w:b/>
-          <w:i w:val="0"/>
-          <w:color w:val="000000"/>
-          <w:sz w:val="20"/>
-        </w:rPr>
-        <w:t xml:space="preserve">RB1 - Benchmark - Index 11 - Weight </w:t>
-      </w:r>
-      <w:r>
-        <w:rPr>
-          <w:rFonts w:ascii="Arial" w:hAnsi="Arial" w:cs="Arial" w:eastAsia="Arial"/>
-          <w:b/>
-          <w:i w:val="0"/>
-          <w:color w:val="1C355E"/>
-          <w:sz w:val="17"/>
-        </w:rPr>
-        <w:t>-082RB13004425-</w:t>
-      </w:r>
-    </w:p>
-    <w:p>
-      <w:pPr>
-        <w:keepNext/>
-        <w:spacing w:before="0" w:after="40"/>
-      </w:pPr>
-      <w:r>
-        <w:rPr>
-          <w:rFonts w:ascii="Arial" w:hAnsi="Arial" w:cs="Arial" w:eastAsia="Arial"/>
-          <w:b w:val="0"/>
-          <w:i/>
-          <w:color w:val="595959"/>
-          <w:sz w:val="18"/>
-        </w:rPr>
-        <w:t>% with 1 decimal place</w:t>
-      </w:r>
-    </w:p>
-    <w:p>
-      <w:pPr>
-        <w:keepNext w:val="0"/>
-        <w:spacing w:before="40" w:after="120"/>
-        <w:shd w:val="clear" w:color="auto" w:fill="F2F2F2"/>
-      </w:pPr>
-      <w:sdt>
-        <w:sdtPr>
-          <w:alias w:val="082RB13004425"/>
-          <w:id w:val="100734"/>
-          <w:showingPlcHdr/>
-          <w:text/>
-        </w:sdtPr>
-        <w:sdtContent>
-          <w:r>
-            <w:t>Click or tap here to enter text.</w:t>
-          </w:r>
-        </w:sdtContent>
-      </w:sdt>
-    </w:p>
-    <w:p>
-      <w:pPr>
-        <w:keepNext/>
-        <w:spacing w:before="200" w:after="40"/>
-      </w:pPr>
-      <w:r>
-        <w:rPr>
-          <w:rFonts w:ascii="Arial" w:hAnsi="Arial" w:cs="Arial" w:eastAsia="Arial"/>
-          <w:b/>
-          <w:i w:val="0"/>
-          <w:color w:val="000000"/>
-          <w:sz w:val="20"/>
-        </w:rPr>
-        <w:t xml:space="preserve">RB1 - Benchmark - Index 12 - Asset class type </w:t>
-      </w:r>
-      <w:r>
-        <w:rPr>
-          <w:rFonts w:ascii="Arial" w:hAnsi="Arial" w:cs="Arial" w:eastAsia="Arial"/>
-          <w:b/>
-          <w:i w:val="0"/>
-          <w:color w:val="1C355E"/>
-          <w:sz w:val="17"/>
-        </w:rPr>
-        <w:t>-082RB13004426-</w:t>
-      </w:r>
-    </w:p>
-    <w:p>
-      <w:pPr>
-        <w:keepNext w:val="0"/>
-        <w:spacing w:before="40" w:after="120"/>
-        <w:shd w:val="clear" w:color="auto" w:fill="F2F2F2"/>
-      </w:pPr>
-      <w:sdt>
-        <w:sdtPr>
-          <w:alias w:val="082RB13004426"/>
-          <w:id w:val="100735"/>
-          <w:showingPlcHdr/>
-          <w:text/>
-        </w:sdtPr>
-        <w:sdtContent>
-          <w:r>
-            <w:t>Click or tap here to enter text.</w:t>
-          </w:r>
-        </w:sdtContent>
-      </w:sdt>
-    </w:p>
-    <w:p>
-      <w:pPr>
-        <w:keepNext/>
-        <w:spacing w:before="200" w:after="40"/>
-      </w:pPr>
-      <w:r>
-        <w:rPr>
-          <w:rFonts w:ascii="Arial" w:hAnsi="Arial" w:cs="Arial" w:eastAsia="Arial"/>
-          <w:b/>
-          <w:i w:val="0"/>
-          <w:color w:val="000000"/>
-          <w:sz w:val="20"/>
-        </w:rPr>
-        <w:t xml:space="preserve">RB1 - Benchmark - Index 12 - Yield curve segment </w:t>
-      </w:r>
-      <w:r>
-        <w:rPr>
-          <w:rFonts w:ascii="Arial" w:hAnsi="Arial" w:cs="Arial" w:eastAsia="Arial"/>
-          <w:b/>
-          <w:i w:val="0"/>
-          <w:color w:val="1C355E"/>
-          <w:sz w:val="17"/>
-        </w:rPr>
-        <w:t>-082RB13004427-</w:t>
-      </w:r>
-    </w:p>
-    <w:p>
-      <w:pPr>
-        <w:keepNext w:val="0"/>
-        <w:spacing w:before="40" w:after="120"/>
-        <w:shd w:val="clear" w:color="auto" w:fill="F2F2F2"/>
-      </w:pPr>
-      <w:sdt>
-        <w:sdtPr>
-          <w:alias w:val="082RB13004427"/>
-          <w:id w:val="100736"/>
-          <w:showingPlcHdr/>
-          <w:text/>
-        </w:sdtPr>
-        <w:sdtContent>
-          <w:r>
-            <w:t>Click or tap here to enter text.</w:t>
-          </w:r>
-        </w:sdtContent>
-      </w:sdt>
-    </w:p>
-    <w:p>
-      <w:pPr>
-        <w:keepNext/>
-        <w:spacing w:before="200" w:after="40"/>
-      </w:pPr>
-      <w:r>
-        <w:rPr>
-          <w:rFonts w:ascii="Arial" w:hAnsi="Arial" w:cs="Arial" w:eastAsia="Arial"/>
-          <w:b/>
-          <w:i w:val="0"/>
-          <w:color w:val="000000"/>
-          <w:sz w:val="20"/>
-        </w:rPr>
-        <w:t xml:space="preserve">RB1 - Benchmark - Index 12 - Geographical focus </w:t>
-      </w:r>
-      <w:r>
-        <w:rPr>
-          <w:rFonts w:ascii="Arial" w:hAnsi="Arial" w:cs="Arial" w:eastAsia="Arial"/>
-          <w:b/>
-          <w:i w:val="0"/>
-          <w:color w:val="1C355E"/>
-          <w:sz w:val="17"/>
-        </w:rPr>
-        <w:t>-082RB13004428-</w:t>
-      </w:r>
-    </w:p>
-    <w:p>
-      <w:pPr>
-        <w:keepNext w:val="0"/>
-        <w:spacing w:before="40" w:after="120"/>
-        <w:shd w:val="clear" w:color="auto" w:fill="F2F2F2"/>
-      </w:pPr>
-      <w:sdt>
-        <w:sdtPr>
-          <w:alias w:val="082RB13004428"/>
-          <w:id w:val="100737"/>
-          <w:showingPlcHdr/>
-          <w:text/>
-        </w:sdtPr>
-        <w:sdtContent>
-          <w:r>
-            <w:t>Click or tap here to enter text.</w:t>
-          </w:r>
-        </w:sdtContent>
-      </w:sdt>
-    </w:p>
-    <w:p>
-      <w:pPr>
-        <w:keepNext/>
-        <w:spacing w:before="200" w:after="40"/>
-      </w:pPr>
-      <w:r>
-        <w:rPr>
-          <w:rFonts w:ascii="Arial" w:hAnsi="Arial" w:cs="Arial" w:eastAsia="Arial"/>
-          <w:b/>
-          <w:i w:val="0"/>
-          <w:color w:val="000000"/>
-          <w:sz w:val="20"/>
-        </w:rPr>
-        <w:t xml:space="preserve">RB1 - Benchmark - Index 12 - Currency </w:t>
-      </w:r>
-      <w:r>
-        <w:rPr>
-          <w:rFonts w:ascii="Arial" w:hAnsi="Arial" w:cs="Arial" w:eastAsia="Arial"/>
-          <w:b/>
-          <w:i w:val="0"/>
-          <w:color w:val="1C355E"/>
-          <w:sz w:val="17"/>
-        </w:rPr>
-        <w:t>-082RB13004429-</w:t>
-      </w:r>
-    </w:p>
-    <w:p>
-      <w:pPr>
-        <w:keepNext w:val="0"/>
-        <w:spacing w:before="40" w:after="120"/>
-        <w:shd w:val="clear" w:color="auto" w:fill="F2F2F2"/>
-      </w:pPr>
-      <w:sdt>
-        <w:sdtPr>
-          <w:alias w:val="082RB13004429"/>
-          <w:id w:val="100738"/>
-          <w:showingPlcHdr/>
-          <w:text/>
-        </w:sdtPr>
-        <w:sdtContent>
-          <w:r>
-            <w:t>Click or tap here to enter text.</w:t>
-          </w:r>
-        </w:sdtContent>
-      </w:sdt>
-    </w:p>
-    <w:p>
-      <w:pPr>
-        <w:keepNext/>
-        <w:spacing w:before="200" w:after="40"/>
-      </w:pPr>
-      <w:r>
-        <w:rPr>
-          <w:rFonts w:ascii="Arial" w:hAnsi="Arial" w:cs="Arial" w:eastAsia="Arial"/>
-          <w:b/>
-          <w:i w:val="0"/>
-          <w:color w:val="000000"/>
-          <w:sz w:val="20"/>
-        </w:rPr>
-        <w:t xml:space="preserve">RB1 - Benchmark - Index 12 - Weight </w:t>
-      </w:r>
-      <w:r>
-        <w:rPr>
-          <w:rFonts w:ascii="Arial" w:hAnsi="Arial" w:cs="Arial" w:eastAsia="Arial"/>
-          <w:b/>
-          <w:i w:val="0"/>
-          <w:color w:val="1C355E"/>
-          <w:sz w:val="17"/>
-        </w:rPr>
-        <w:t>-082RB13004430-</w:t>
-      </w:r>
-    </w:p>
-    <w:p>
-      <w:pPr>
-        <w:keepNext/>
-        <w:spacing w:before="0" w:after="40"/>
-      </w:pPr>
-      <w:r>
-        <w:rPr>
-          <w:rFonts w:ascii="Arial" w:hAnsi="Arial" w:cs="Arial" w:eastAsia="Arial"/>
-          <w:b w:val="0"/>
-          <w:i/>
-          <w:color w:val="595959"/>
-          <w:sz w:val="18"/>
-        </w:rPr>
-        <w:t>% with 1 decimal place</w:t>
-      </w:r>
-    </w:p>
-    <w:p>
-      <w:pPr>
-        <w:keepNext w:val="0"/>
-        <w:spacing w:before="40" w:after="120"/>
-        <w:shd w:val="clear" w:color="auto" w:fill="F2F2F2"/>
-      </w:pPr>
-      <w:sdt>
-        <w:sdtPr>
-          <w:alias w:val="082RB13004430"/>
-          <w:id w:val="100739"/>
+          <w:alias w:val="082RB13003028"/>
+          <w:id w:val="100719"/>
+          <w:showingPlcHdr/>
+          <w:text/>
+        </w:sdtPr>
+        <w:sdtContent>
+          <w:r>
+            <w:t>Click or tap here to enter text.</w:t>
+          </w:r>
+        </w:sdtContent>
+      </w:sdt>
+    </w:p>
+    <w:p>
+      <w:pPr>
+        <w:keepNext/>
+        <w:spacing w:before="200" w:after="40"/>
+      </w:pPr>
+      <w:r>
+        <w:rPr>
+          <w:rFonts w:ascii="Arial" w:hAnsi="Arial" w:cs="Arial" w:eastAsia="Arial"/>
+          <w:b/>
+          <w:i w:val="0"/>
+          <w:color w:val="000000"/>
+          <w:sz w:val="20"/>
+        </w:rPr>
+        <w:t xml:space="preserve">RB1 - Benchmark - Index 9 - Asset class type </w:t>
+      </w:r>
+      <w:r>
+        <w:rPr>
+          <w:rFonts w:ascii="Arial" w:hAnsi="Arial" w:cs="Arial" w:eastAsia="Arial"/>
+          <w:b/>
+          <w:i w:val="0"/>
+          <w:color w:val="1C355E"/>
+          <w:sz w:val="17"/>
+        </w:rPr>
+        <w:t>-082RB13003029-</w:t>
+      </w:r>
+    </w:p>
+    <w:p>
+      <w:pPr>
+        <w:keepNext w:val="0"/>
+        <w:spacing w:before="40" w:after="120"/>
+        <w:shd w:val="clear" w:color="auto" w:fill="F2F2F2"/>
+      </w:pPr>
+      <w:sdt>
+        <w:sdtPr>
+          <w:alias w:val="082RB13003029"/>
+          <w:id w:val="100720"/>
           <w:showingPlcHdr/>
           <w:dropDownList>
             <w:listItem w:displayText="Choose an item." w:value=""/>
@@ -43893,321 +43109,144 @@
           <w:color w:val="000000"/>
           <w:sz w:val="20"/>
         </w:rPr>
-        <w:t xml:space="preserve">RB1 - Benchmark - Index 13 - Asset class type </w:t>
-      </w:r>
-      <w:r>
-        <w:rPr>
-          <w:rFonts w:ascii="Arial" w:hAnsi="Arial" w:cs="Arial" w:eastAsia="Arial"/>
-          <w:b/>
-          <w:i w:val="0"/>
-          <w:color w:val="1C355E"/>
-          <w:sz w:val="17"/>
-        </w:rPr>
-        <w:t>-082RB13004431-</w:t>
-      </w:r>
-    </w:p>
-    <w:p>
-      <w:pPr>
-        <w:keepNext w:val="0"/>
-        <w:spacing w:before="40" w:after="120"/>
-        <w:shd w:val="clear" w:color="auto" w:fill="F2F2F2"/>
-      </w:pPr>
-      <w:sdt>
-        <w:sdtPr>
-          <w:alias w:val="082RB13004431"/>
-          <w:id w:val="100740"/>
-          <w:showingPlcHdr/>
-          <w:text/>
-        </w:sdtPr>
-        <w:sdtContent>
-          <w:r>
-            <w:t>Click or tap here to enter text.</w:t>
-          </w:r>
-        </w:sdtContent>
-      </w:sdt>
-    </w:p>
-    <w:p>
-      <w:pPr>
-        <w:keepNext/>
-        <w:spacing w:before="200" w:after="40"/>
-      </w:pPr>
-      <w:r>
-        <w:rPr>
-          <w:rFonts w:ascii="Arial" w:hAnsi="Arial" w:cs="Arial" w:eastAsia="Arial"/>
-          <w:b/>
-          <w:i w:val="0"/>
-          <w:color w:val="000000"/>
-          <w:sz w:val="20"/>
-        </w:rPr>
-        <w:t xml:space="preserve">RB1 - Benchmark - Index 13 - Yield curve segment </w:t>
-      </w:r>
-      <w:r>
-        <w:rPr>
-          <w:rFonts w:ascii="Arial" w:hAnsi="Arial" w:cs="Arial" w:eastAsia="Arial"/>
-          <w:b/>
-          <w:i w:val="0"/>
-          <w:color w:val="1C355E"/>
-          <w:sz w:val="17"/>
-        </w:rPr>
-        <w:t>-082RB13004432-</w:t>
-      </w:r>
-    </w:p>
-    <w:p>
-      <w:pPr>
-        <w:keepNext w:val="0"/>
-        <w:spacing w:before="40" w:after="120"/>
-        <w:shd w:val="clear" w:color="auto" w:fill="F2F2F2"/>
-      </w:pPr>
-      <w:sdt>
-        <w:sdtPr>
-          <w:alias w:val="082RB13004432"/>
-          <w:id w:val="100741"/>
-          <w:showingPlcHdr/>
-          <w:text/>
-        </w:sdtPr>
-        <w:sdtContent>
-          <w:r>
-            <w:t>Click or tap here to enter text.</w:t>
-          </w:r>
-        </w:sdtContent>
-      </w:sdt>
-    </w:p>
-    <w:p>
-      <w:pPr>
-        <w:keepNext/>
-        <w:spacing w:before="200" w:after="40"/>
-      </w:pPr>
-      <w:r>
-        <w:rPr>
-          <w:rFonts w:ascii="Arial" w:hAnsi="Arial" w:cs="Arial" w:eastAsia="Arial"/>
-          <w:b/>
-          <w:i w:val="0"/>
-          <w:color w:val="000000"/>
-          <w:sz w:val="20"/>
-        </w:rPr>
-        <w:t xml:space="preserve">RB1 - Benchmark - Index 13 - Geographical focus </w:t>
-      </w:r>
-      <w:r>
-        <w:rPr>
-          <w:rFonts w:ascii="Arial" w:hAnsi="Arial" w:cs="Arial" w:eastAsia="Arial"/>
-          <w:b/>
-          <w:i w:val="0"/>
-          <w:color w:val="1C355E"/>
-          <w:sz w:val="17"/>
-        </w:rPr>
-        <w:t>-082RB13004433-</w:t>
-      </w:r>
-    </w:p>
-    <w:p>
-      <w:pPr>
-        <w:keepNext w:val="0"/>
-        <w:spacing w:before="40" w:after="120"/>
-        <w:shd w:val="clear" w:color="auto" w:fill="F2F2F2"/>
-      </w:pPr>
-      <w:sdt>
-        <w:sdtPr>
-          <w:alias w:val="082RB13004433"/>
-          <w:id w:val="100742"/>
-          <w:showingPlcHdr/>
-          <w:text/>
-        </w:sdtPr>
-        <w:sdtContent>
-          <w:r>
-            <w:t>Click or tap here to enter text.</w:t>
-          </w:r>
-        </w:sdtContent>
-      </w:sdt>
-    </w:p>
-    <w:p>
-      <w:pPr>
-        <w:keepNext/>
-        <w:spacing w:before="200" w:after="40"/>
-      </w:pPr>
-      <w:r>
-        <w:rPr>
-          <w:rFonts w:ascii="Arial" w:hAnsi="Arial" w:cs="Arial" w:eastAsia="Arial"/>
-          <w:b/>
-          <w:i w:val="0"/>
-          <w:color w:val="000000"/>
-          <w:sz w:val="20"/>
-        </w:rPr>
-        <w:t xml:space="preserve">RB1 - Benchmark - Index 13 - Currency </w:t>
-      </w:r>
-      <w:r>
-        <w:rPr>
-          <w:rFonts w:ascii="Arial" w:hAnsi="Arial" w:cs="Arial" w:eastAsia="Arial"/>
-          <w:b/>
-          <w:i w:val="0"/>
-          <w:color w:val="1C355E"/>
-          <w:sz w:val="17"/>
-        </w:rPr>
-        <w:t>-082RB13004434-</w:t>
-      </w:r>
-    </w:p>
-    <w:p>
-      <w:pPr>
-        <w:keepNext w:val="0"/>
-        <w:spacing w:before="40" w:after="120"/>
-        <w:shd w:val="clear" w:color="auto" w:fill="F2F2F2"/>
-      </w:pPr>
-      <w:sdt>
-        <w:sdtPr>
-          <w:alias w:val="082RB13004434"/>
-          <w:id w:val="100743"/>
-          <w:showingPlcHdr/>
-          <w:text/>
-        </w:sdtPr>
-        <w:sdtContent>
-          <w:r>
-            <w:t>Click or tap here to enter text.</w:t>
-          </w:r>
-        </w:sdtContent>
-      </w:sdt>
-    </w:p>
-    <w:p>
-      <w:pPr>
-        <w:keepNext/>
-        <w:spacing w:before="200" w:after="40"/>
-      </w:pPr>
-      <w:r>
-        <w:rPr>
-          <w:rFonts w:ascii="Arial" w:hAnsi="Arial" w:cs="Arial" w:eastAsia="Arial"/>
-          <w:b/>
-          <w:i w:val="0"/>
-          <w:color w:val="000000"/>
-          <w:sz w:val="20"/>
-        </w:rPr>
-        <w:t xml:space="preserve">RB1 - Benchmark - Index 13 - Weight </w:t>
-      </w:r>
-      <w:r>
-        <w:rPr>
-          <w:rFonts w:ascii="Arial" w:hAnsi="Arial" w:cs="Arial" w:eastAsia="Arial"/>
-          <w:b/>
-          <w:i w:val="0"/>
-          <w:color w:val="1C355E"/>
-          <w:sz w:val="17"/>
-        </w:rPr>
-        <w:t>-082RB13004435-</w:t>
-      </w:r>
-    </w:p>
-    <w:p>
-      <w:pPr>
-        <w:keepNext/>
-        <w:spacing w:before="0" w:after="40"/>
-      </w:pPr>
-      <w:r>
-        <w:rPr>
-          <w:rFonts w:ascii="Arial" w:hAnsi="Arial" w:cs="Arial" w:eastAsia="Arial"/>
-          <w:b w:val="0"/>
-          <w:i/>
-          <w:color w:val="595959"/>
-          <w:sz w:val="18"/>
-        </w:rPr>
-        <w:t>% with 1 decimal place</w:t>
-      </w:r>
-    </w:p>
-    <w:p>
-      <w:pPr>
-        <w:keepNext w:val="0"/>
-        <w:spacing w:before="40" w:after="120"/>
-        <w:shd w:val="clear" w:color="auto" w:fill="F2F2F2"/>
-      </w:pPr>
-      <w:sdt>
-        <w:sdtPr>
-          <w:alias w:val="082RB13004435"/>
-          <w:id w:val="100744"/>
-          <w:showingPlcHdr/>
-          <w:text/>
-        </w:sdtPr>
-        <w:sdtContent>
-          <w:r>
-            <w:t>Click or tap here to enter text.</w:t>
-          </w:r>
-        </w:sdtContent>
-      </w:sdt>
-    </w:p>
-    <w:p>
-      <w:pPr>
-        <w:keepNext/>
-        <w:spacing w:before="200" w:after="40"/>
-      </w:pPr>
-      <w:r>
-        <w:rPr>
-          <w:rFonts w:ascii="Arial" w:hAnsi="Arial" w:cs="Arial" w:eastAsia="Arial"/>
-          <w:b/>
-          <w:i w:val="0"/>
-          <w:color w:val="000000"/>
-          <w:sz w:val="20"/>
-        </w:rPr>
-        <w:t xml:space="preserve">RB1 - Benchmark - Index 14 - Asset class type </w:t>
-      </w:r>
-      <w:r>
-        <w:rPr>
-          <w:rFonts w:ascii="Arial" w:hAnsi="Arial" w:cs="Arial" w:eastAsia="Arial"/>
-          <w:b/>
-          <w:i w:val="0"/>
-          <w:color w:val="1C355E"/>
-          <w:sz w:val="17"/>
-        </w:rPr>
-        <w:t>-082RB13004436-</w:t>
-      </w:r>
-    </w:p>
-    <w:p>
-      <w:pPr>
-        <w:keepNext w:val="0"/>
-        <w:spacing w:before="40" w:after="120"/>
-        <w:shd w:val="clear" w:color="auto" w:fill="F2F2F2"/>
-      </w:pPr>
-      <w:sdt>
-        <w:sdtPr>
-          <w:alias w:val="082RB13004436"/>
-          <w:id w:val="100745"/>
-          <w:showingPlcHdr/>
-          <w:text/>
-        </w:sdtPr>
-        <w:sdtContent>
-          <w:r>
-            <w:t>Click or tap here to enter text.</w:t>
-          </w:r>
-        </w:sdtContent>
-      </w:sdt>
-    </w:p>
-    <w:p>
-      <w:pPr>
-        <w:keepNext/>
-        <w:spacing w:before="200" w:after="40"/>
-      </w:pPr>
-      <w:r>
-        <w:rPr>
-          <w:rFonts w:ascii="Arial" w:hAnsi="Arial" w:cs="Arial" w:eastAsia="Arial"/>
-          <w:b/>
-          <w:i w:val="0"/>
-          <w:color w:val="000000"/>
-          <w:sz w:val="20"/>
-        </w:rPr>
-        <w:t xml:space="preserve">RB1 - Benchmark - Index 14 - Yield curve segment </w:t>
-      </w:r>
-      <w:r>
-        <w:rPr>
-          <w:rFonts w:ascii="Arial" w:hAnsi="Arial" w:cs="Arial" w:eastAsia="Arial"/>
-          <w:b/>
-          <w:i w:val="0"/>
-          <w:color w:val="1C355E"/>
-          <w:sz w:val="17"/>
-        </w:rPr>
-        <w:t>-082RB13004437-</w:t>
-      </w:r>
-    </w:p>
-    <w:p>
-      <w:pPr>
-        <w:keepNext w:val="0"/>
-        <w:spacing w:before="40" w:after="120"/>
-        <w:shd w:val="clear" w:color="auto" w:fill="F2F2F2"/>
-      </w:pPr>
-      <w:sdt>
-        <w:sdtPr>
-          <w:alias w:val="082RB13004437"/>
-          <w:id w:val="100746"/>
+        <w:t xml:space="preserve">RB1 - Benchmark - Index 9 - Yield curve segment </w:t>
+      </w:r>
+      <w:r>
+        <w:rPr>
+          <w:rFonts w:ascii="Arial" w:hAnsi="Arial" w:cs="Arial" w:eastAsia="Arial"/>
+          <w:b/>
+          <w:i w:val="0"/>
+          <w:color w:val="1C355E"/>
+          <w:sz w:val="17"/>
+        </w:rPr>
+        <w:t>-082RB13003030-</w:t>
+      </w:r>
+    </w:p>
+    <w:p>
+      <w:pPr>
+        <w:keepNext w:val="0"/>
+        <w:spacing w:before="40" w:after="120"/>
+        <w:shd w:val="clear" w:color="auto" w:fill="F2F2F2"/>
+      </w:pPr>
+      <w:sdt>
+        <w:sdtPr>
+          <w:alias w:val="082RB13003030"/>
+          <w:id w:val="100721"/>
+          <w:showingPlcHdr/>
+          <w:dropDownList>
+            <w:listItem w:displayText="Choose an item." w:value=""/>
+            <w:listItem w:displayText="1-3 years" w:value="1-3 years"/>
+            <w:listItem w:displayText="1-5 years" w:value="1-5 years"/>
+            <w:listItem w:displayText="1-10 years" w:value="1-10 years"/>
+            <w:listItem w:displayText="3-5 years" w:value="3-5 years"/>
+            <w:listItem w:displayText="Intermediate segment (e.g. 5-7 years)" w:value="Intermediate segment (e.g. 5-7 years)"/>
+            <w:listItem w:displayText="Over 10 years" w:value="Over 10 years"/>
+            <w:listItem w:displayText="All maturities" w:value="All maturities"/>
+          </w:dropDownList>
+        </w:sdtPr>
+        <w:sdtContent>
+          <w:r>
+            <w:t>Choose an item.</w:t>
+          </w:r>
+        </w:sdtContent>
+      </w:sdt>
+    </w:p>
+    <w:p>
+      <w:pPr>
+        <w:keepNext/>
+        <w:spacing w:before="200" w:after="40"/>
+      </w:pPr>
+      <w:r>
+        <w:rPr>
+          <w:rFonts w:ascii="Arial" w:hAnsi="Arial" w:cs="Arial" w:eastAsia="Arial"/>
+          <w:b/>
+          <w:i w:val="0"/>
+          <w:color w:val="000000"/>
+          <w:sz w:val="20"/>
+        </w:rPr>
+        <w:t xml:space="preserve">RB1 - Benchmark - Index 9 - Geographical focus </w:t>
+      </w:r>
+      <w:r>
+        <w:rPr>
+          <w:rFonts w:ascii="Arial" w:hAnsi="Arial" w:cs="Arial" w:eastAsia="Arial"/>
+          <w:b/>
+          <w:i w:val="0"/>
+          <w:color w:val="1C355E"/>
+          <w:sz w:val="17"/>
+        </w:rPr>
+        <w:t>-082RB13003031-</w:t>
+      </w:r>
+    </w:p>
+    <w:p>
+      <w:pPr>
+        <w:keepNext w:val="0"/>
+        <w:spacing w:before="40" w:after="120"/>
+        <w:shd w:val="clear" w:color="auto" w:fill="F2F2F2"/>
+      </w:pPr>
+      <w:sdt>
+        <w:sdtPr>
+          <w:alias w:val="082RB13003031"/>
+          <w:id w:val="100722"/>
+          <w:showingPlcHdr/>
+          <w:dropDownList>
+            <w:listItem w:displayText="Choose an item." w:value=""/>
+            <w:listItem w:displayText="Italy" w:value="Italy"/>
+            <w:listItem w:displayText="United Kingdom" w:value="United Kingdom"/>
+            <w:listItem w:displayText="Eurozone" w:value="Eurozone"/>
+            <w:listItem w:displayText="Europe" w:value="Europe"/>
+            <w:listItem w:displayText="USA" w:value="USA"/>
+            <w:listItem w:displayText="North America" w:value="North America"/>
+            <w:listItem w:displayText="Japan" w:value="Japan"/>
+            <w:listItem w:displayText="Pacific" w:value="Pacific"/>
+            <w:listItem w:displayText="Pacific ex Japan" w:value="Pacific ex Japan"/>
+            <w:listItem w:displayText="Emerging markets (EM)" w:value="Emerging markets (EM)"/>
+            <w:listItem w:displayText="Developed countries (DC)" w:value="Developed countries (DC)"/>
+            <w:listItem w:displayText="Developed countries + EM (DC + EM)" w:value="Developed countries + EM (DC + EM)"/>
+          </w:dropDownList>
+        </w:sdtPr>
+        <w:sdtContent>
+          <w:r>
+            <w:t>Choose an item.</w:t>
+          </w:r>
+        </w:sdtContent>
+      </w:sdt>
+    </w:p>
+    <w:p>
+      <w:pPr>
+        <w:keepNext/>
+        <w:spacing w:before="200" w:after="40"/>
+      </w:pPr>
+      <w:r>
+        <w:rPr>
+          <w:rFonts w:ascii="Arial" w:hAnsi="Arial" w:cs="Arial" w:eastAsia="Arial"/>
+          <w:b/>
+          <w:i w:val="0"/>
+          <w:color w:val="000000"/>
+          <w:sz w:val="20"/>
+        </w:rPr>
+        <w:t xml:space="preserve">RB1 - Benchmark - Index 9 - Currency </w:t>
+      </w:r>
+      <w:r>
+        <w:rPr>
+          <w:rFonts w:ascii="Arial" w:hAnsi="Arial" w:cs="Arial" w:eastAsia="Arial"/>
+          <w:b/>
+          <w:i w:val="0"/>
+          <w:color w:val="1C355E"/>
+          <w:sz w:val="17"/>
+        </w:rPr>
+        <w:t>-082RB13003032-</w:t>
+      </w:r>
+    </w:p>
+    <w:p>
+      <w:pPr>
+        <w:keepNext w:val="0"/>
+        <w:spacing w:before="40" w:after="120"/>
+        <w:shd w:val="clear" w:color="auto" w:fill="F2F2F2"/>
+      </w:pPr>
+      <w:sdt>
+        <w:sdtPr>
+          <w:alias w:val="082RB13003032"/>
+          <w:id w:val="100723"/>
           <w:showingPlcHdr/>
           <w:dropDownList>
             <w:listItem w:displayText="Choose an item." w:value=""/>
@@ -44237,109 +43276,17 @@
           <w:color w:val="000000"/>
           <w:sz w:val="20"/>
         </w:rPr>
-        <w:t xml:space="preserve">RB1 - Benchmark - Index 14 - Geographical focus </w:t>
-      </w:r>
-      <w:r>
-        <w:rPr>
-          <w:rFonts w:ascii="Arial" w:hAnsi="Arial" w:cs="Arial" w:eastAsia="Arial"/>
-          <w:b/>
-          <w:i w:val="0"/>
-          <w:color w:val="1C355E"/>
-          <w:sz w:val="17"/>
-        </w:rPr>
-        <w:t>-082RB13004438-</w:t>
-      </w:r>
-    </w:p>
-    <w:p>
-      <w:pPr>
-        <w:keepNext w:val="0"/>
-        <w:spacing w:before="40" w:after="120"/>
-        <w:shd w:val="clear" w:color="auto" w:fill="F2F2F2"/>
-      </w:pPr>
-      <w:sdt>
-        <w:sdtPr>
-          <w:alias w:val="082RB13004438"/>
-          <w:id w:val="100747"/>
-          <w:showingPlcHdr/>
-          <w:text/>
-        </w:sdtPr>
-        <w:sdtContent>
-          <w:r>
-            <w:t>Click or tap here to enter text.</w:t>
-          </w:r>
-        </w:sdtContent>
-      </w:sdt>
-    </w:p>
-    <w:p>
-      <w:pPr>
-        <w:keepNext/>
-        <w:spacing w:before="200" w:after="40"/>
-      </w:pPr>
-      <w:r>
-        <w:rPr>
-          <w:rFonts w:ascii="Arial" w:hAnsi="Arial" w:cs="Arial" w:eastAsia="Arial"/>
-          <w:b/>
-          <w:i w:val="0"/>
-          <w:color w:val="000000"/>
-          <w:sz w:val="20"/>
-        </w:rPr>
-        <w:t xml:space="preserve">RB1 - Benchmark - Index 14 - Currency </w:t>
-      </w:r>
-      <w:r>
-        <w:rPr>
-          <w:rFonts w:ascii="Arial" w:hAnsi="Arial" w:cs="Arial" w:eastAsia="Arial"/>
-          <w:b/>
-          <w:i w:val="0"/>
-          <w:color w:val="1C355E"/>
-          <w:sz w:val="17"/>
-        </w:rPr>
-        <w:t>-082RB13004439-</w:t>
-      </w:r>
-    </w:p>
-    <w:p>
-      <w:pPr>
-        <w:keepNext w:val="0"/>
-        <w:spacing w:before="40" w:after="120"/>
-        <w:shd w:val="clear" w:color="auto" w:fill="F2F2F2"/>
-      </w:pPr>
-      <w:sdt>
-        <w:sdtPr>
-          <w:alias w:val="082RB13004439"/>
-          <w:id w:val="100748"/>
-          <w:showingPlcHdr/>
-          <w:text/>
-        </w:sdtPr>
-        <w:sdtContent>
-          <w:r>
-            <w:t>Click or tap here to enter text.</w:t>
-          </w:r>
-        </w:sdtContent>
-      </w:sdt>
-    </w:p>
-    <w:p>
-      <w:pPr>
-        <w:keepNext/>
-        <w:spacing w:before="200" w:after="40"/>
-      </w:pPr>
-      <w:r>
-        <w:rPr>
-          <w:rFonts w:ascii="Arial" w:hAnsi="Arial" w:cs="Arial" w:eastAsia="Arial"/>
-          <w:b/>
-          <w:i w:val="0"/>
-          <w:color w:val="000000"/>
-          <w:sz w:val="20"/>
-        </w:rPr>
-        <w:t xml:space="preserve">RB1 - Benchmark - Index 14 - Weight </w:t>
-      </w:r>
-      <w:r>
-        <w:rPr>
-          <w:rFonts w:ascii="Arial" w:hAnsi="Arial" w:cs="Arial" w:eastAsia="Arial"/>
-          <w:b/>
-          <w:i w:val="0"/>
-          <w:color w:val="1C355E"/>
-          <w:sz w:val="17"/>
-        </w:rPr>
-        <w:t>-082RB13004440-</w:t>
+        <w:t xml:space="preserve">RB1 - Benchmark - Index 9 - Weight </w:t>
+      </w:r>
+      <w:r>
+        <w:rPr>
+          <w:rFonts w:ascii="Arial" w:hAnsi="Arial" w:cs="Arial" w:eastAsia="Arial"/>
+          <w:b/>
+          <w:i w:val="0"/>
+          <w:color w:val="1C355E"/>
+          <w:sz w:val="17"/>
+        </w:rPr>
+        <w:t>-082RB13003033-</w:t>
       </w:r>
     </w:p>
     <w:p>
@@ -44366,6 +43313,1426 @@
       </w:pPr>
       <w:sdt>
         <w:sdtPr>
+          <w:alias w:val="082RB13003033"/>
+          <w:id w:val="100724"/>
+          <w:showingPlcHdr/>
+          <w:text/>
+        </w:sdtPr>
+        <w:sdtContent>
+          <w:r>
+            <w:t>Click or tap here to enter text.</w:t>
+          </w:r>
+        </w:sdtContent>
+      </w:sdt>
+    </w:p>
+    <w:p>
+      <w:pPr>
+        <w:keepNext/>
+        <w:spacing w:before="200" w:after="40"/>
+      </w:pPr>
+      <w:r>
+        <w:rPr>
+          <w:rFonts w:ascii="Arial" w:hAnsi="Arial" w:cs="Arial" w:eastAsia="Arial"/>
+          <w:b/>
+          <w:i w:val="0"/>
+          <w:color w:val="000000"/>
+          <w:sz w:val="20"/>
+        </w:rPr>
+        <w:t xml:space="preserve">RB1 - Benchmark - Index 10 - Asset class type </w:t>
+      </w:r>
+      <w:r>
+        <w:rPr>
+          <w:rFonts w:ascii="Arial" w:hAnsi="Arial" w:cs="Arial" w:eastAsia="Arial"/>
+          <w:b/>
+          <w:i w:val="0"/>
+          <w:color w:val="1C355E"/>
+          <w:sz w:val="17"/>
+        </w:rPr>
+        <w:t>-082RB13004416-</w:t>
+      </w:r>
+    </w:p>
+    <w:p>
+      <w:pPr>
+        <w:keepNext w:val="0"/>
+        <w:spacing w:before="40" w:after="120"/>
+        <w:shd w:val="clear" w:color="auto" w:fill="F2F2F2"/>
+      </w:pPr>
+      <w:sdt>
+        <w:sdtPr>
+          <w:alias w:val="082RB13004416"/>
+          <w:id w:val="100725"/>
+          <w:showingPlcHdr/>
+          <w:dropDownList>
+            <w:listItem w:displayText="Choose an item." w:value=""/>
+            <w:listItem w:displayText="Cash" w:value="Cash"/>
+            <w:listItem w:displayText="Government bonds" w:value="Government bonds"/>
+            <w:listItem w:displayText="Corporate bonds IG" w:value="Corporate bonds IG"/>
+            <w:listItem w:displayText="Corporate bonds HY" w:value="Corporate bonds HY"/>
+            <w:listItem w:displayText="Broad bonds" w:value="Broad bonds"/>
+            <w:listItem w:displayText="Equities" w:value="Equities"/>
+          </w:dropDownList>
+        </w:sdtPr>
+        <w:sdtContent>
+          <w:r>
+            <w:t>Choose an item.</w:t>
+          </w:r>
+        </w:sdtContent>
+      </w:sdt>
+    </w:p>
+    <w:p>
+      <w:pPr>
+        <w:keepNext/>
+        <w:spacing w:before="200" w:after="40"/>
+      </w:pPr>
+      <w:r>
+        <w:rPr>
+          <w:rFonts w:ascii="Arial" w:hAnsi="Arial" w:cs="Arial" w:eastAsia="Arial"/>
+          <w:b/>
+          <w:i w:val="0"/>
+          <w:color w:val="000000"/>
+          <w:sz w:val="20"/>
+        </w:rPr>
+        <w:t xml:space="preserve">RB1 - Benchmark - Index 10 - Yield curve segment </w:t>
+      </w:r>
+      <w:r>
+        <w:rPr>
+          <w:rFonts w:ascii="Arial" w:hAnsi="Arial" w:cs="Arial" w:eastAsia="Arial"/>
+          <w:b/>
+          <w:i w:val="0"/>
+          <w:color w:val="1C355E"/>
+          <w:sz w:val="17"/>
+        </w:rPr>
+        <w:t>-082RB13004417-</w:t>
+      </w:r>
+    </w:p>
+    <w:p>
+      <w:pPr>
+        <w:keepNext w:val="0"/>
+        <w:spacing w:before="40" w:after="120"/>
+        <w:shd w:val="clear" w:color="auto" w:fill="F2F2F2"/>
+      </w:pPr>
+      <w:sdt>
+        <w:sdtPr>
+          <w:alias w:val="082RB13004417"/>
+          <w:id w:val="100726"/>
+          <w:showingPlcHdr/>
+          <w:dropDownList>
+            <w:listItem w:displayText="Choose an item." w:value=""/>
+            <w:listItem w:displayText="1-3 years" w:value="1-3 years"/>
+            <w:listItem w:displayText="1-5 years" w:value="1-5 years"/>
+            <w:listItem w:displayText="1-10 years" w:value="1-10 years"/>
+            <w:listItem w:displayText="3-5 years" w:value="3-5 years"/>
+            <w:listItem w:displayText="Intermediate segment (e.g. 5-7 years)" w:value="Intermediate segment (e.g. 5-7 years)"/>
+            <w:listItem w:displayText="Over 10 years" w:value="Over 10 years"/>
+            <w:listItem w:displayText="All maturities" w:value="All maturities"/>
+          </w:dropDownList>
+        </w:sdtPr>
+        <w:sdtContent>
+          <w:r>
+            <w:t>Choose an item.</w:t>
+          </w:r>
+        </w:sdtContent>
+      </w:sdt>
+    </w:p>
+    <w:p>
+      <w:pPr>
+        <w:keepNext/>
+        <w:spacing w:before="200" w:after="40"/>
+      </w:pPr>
+      <w:r>
+        <w:rPr>
+          <w:rFonts w:ascii="Arial" w:hAnsi="Arial" w:cs="Arial" w:eastAsia="Arial"/>
+          <w:b/>
+          <w:i w:val="0"/>
+          <w:color w:val="000000"/>
+          <w:sz w:val="20"/>
+        </w:rPr>
+        <w:t xml:space="preserve">RB1 - Benchmark - Index 10 - Geographical focus </w:t>
+      </w:r>
+      <w:r>
+        <w:rPr>
+          <w:rFonts w:ascii="Arial" w:hAnsi="Arial" w:cs="Arial" w:eastAsia="Arial"/>
+          <w:b/>
+          <w:i w:val="0"/>
+          <w:color w:val="1C355E"/>
+          <w:sz w:val="17"/>
+        </w:rPr>
+        <w:t>-082RB13004418-</w:t>
+      </w:r>
+    </w:p>
+    <w:p>
+      <w:pPr>
+        <w:keepNext w:val="0"/>
+        <w:spacing w:before="40" w:after="120"/>
+        <w:shd w:val="clear" w:color="auto" w:fill="F2F2F2"/>
+      </w:pPr>
+      <w:sdt>
+        <w:sdtPr>
+          <w:alias w:val="082RB13004418"/>
+          <w:id w:val="100727"/>
+          <w:showingPlcHdr/>
+          <w:dropDownList>
+            <w:listItem w:displayText="Choose an item." w:value=""/>
+            <w:listItem w:displayText="Italy" w:value="Italy"/>
+            <w:listItem w:displayText="United Kingdom" w:value="United Kingdom"/>
+            <w:listItem w:displayText="Eurozone" w:value="Eurozone"/>
+            <w:listItem w:displayText="Europe" w:value="Europe"/>
+            <w:listItem w:displayText="USA" w:value="USA"/>
+            <w:listItem w:displayText="North America" w:value="North America"/>
+            <w:listItem w:displayText="Japan" w:value="Japan"/>
+            <w:listItem w:displayText="Pacific" w:value="Pacific"/>
+            <w:listItem w:displayText="Pacific ex Japan" w:value="Pacific ex Japan"/>
+            <w:listItem w:displayText="Emerging markets (EM)" w:value="Emerging markets (EM)"/>
+            <w:listItem w:displayText="Developed countries (DC)" w:value="Developed countries (DC)"/>
+            <w:listItem w:displayText="Developed countries + EM (DC + EM)" w:value="Developed countries + EM (DC + EM)"/>
+          </w:dropDownList>
+        </w:sdtPr>
+        <w:sdtContent>
+          <w:r>
+            <w:t>Choose an item.</w:t>
+          </w:r>
+        </w:sdtContent>
+      </w:sdt>
+    </w:p>
+    <w:p>
+      <w:pPr>
+        <w:keepNext/>
+        <w:spacing w:before="200" w:after="40"/>
+      </w:pPr>
+      <w:r>
+        <w:rPr>
+          <w:rFonts w:ascii="Arial" w:hAnsi="Arial" w:cs="Arial" w:eastAsia="Arial"/>
+          <w:b/>
+          <w:i w:val="0"/>
+          <w:color w:val="000000"/>
+          <w:sz w:val="20"/>
+        </w:rPr>
+        <w:t xml:space="preserve">RB1 - Benchmark - Index 10 - Currency </w:t>
+      </w:r>
+      <w:r>
+        <w:rPr>
+          <w:rFonts w:ascii="Arial" w:hAnsi="Arial" w:cs="Arial" w:eastAsia="Arial"/>
+          <w:b/>
+          <w:i w:val="0"/>
+          <w:color w:val="1C355E"/>
+          <w:sz w:val="17"/>
+        </w:rPr>
+        <w:t>-082RB13004419-</w:t>
+      </w:r>
+    </w:p>
+    <w:p>
+      <w:pPr>
+        <w:keepNext w:val="0"/>
+        <w:spacing w:before="40" w:after="120"/>
+        <w:shd w:val="clear" w:color="auto" w:fill="F2F2F2"/>
+      </w:pPr>
+      <w:sdt>
+        <w:sdtPr>
+          <w:alias w:val="082RB13004419"/>
+          <w:id w:val="100728"/>
+          <w:showingPlcHdr/>
+          <w:dropDownList>
+            <w:listItem w:displayText="Choose an item." w:value=""/>
+            <w:listItem w:displayText="Euro" w:value="Euro"/>
+            <w:listItem w:displayText="USD" w:value="USD"/>
+            <w:listItem w:displayText="Local currency" w:value="Local currency"/>
+            <w:listItem w:displayText="Hedged in Euro" w:value="Hedged in Euro"/>
+          </w:dropDownList>
+        </w:sdtPr>
+        <w:sdtContent>
+          <w:r>
+            <w:t>Choose an item.</w:t>
+          </w:r>
+        </w:sdtContent>
+      </w:sdt>
+    </w:p>
+    <w:p>
+      <w:pPr>
+        <w:keepNext/>
+        <w:spacing w:before="200" w:after="40"/>
+      </w:pPr>
+      <w:r>
+        <w:rPr>
+          <w:rFonts w:ascii="Arial" w:hAnsi="Arial" w:cs="Arial" w:eastAsia="Arial"/>
+          <w:b/>
+          <w:i w:val="0"/>
+          <w:color w:val="000000"/>
+          <w:sz w:val="20"/>
+        </w:rPr>
+        <w:t xml:space="preserve">RB1 - Benchmark - Index 10 - Weight </w:t>
+      </w:r>
+      <w:r>
+        <w:rPr>
+          <w:rFonts w:ascii="Arial" w:hAnsi="Arial" w:cs="Arial" w:eastAsia="Arial"/>
+          <w:b/>
+          <w:i w:val="0"/>
+          <w:color w:val="1C355E"/>
+          <w:sz w:val="17"/>
+        </w:rPr>
+        <w:t>-082RB13004420-</w:t>
+      </w:r>
+    </w:p>
+    <w:p>
+      <w:pPr>
+        <w:keepNext/>
+        <w:spacing w:before="0" w:after="40"/>
+      </w:pPr>
+      <w:r>
+        <w:rPr>
+          <w:rFonts w:ascii="Arial" w:hAnsi="Arial" w:cs="Arial" w:eastAsia="Arial"/>
+          <w:b w:val="0"/>
+          <w:i/>
+          <w:color w:val="595959"/>
+          <w:sz w:val="18"/>
+        </w:rPr>
+        <w:t>% with 1 decimal place</w:t>
+      </w:r>
+    </w:p>
+    <w:p>
+      <w:pPr>
+        <w:keepNext w:val="0"/>
+        <w:spacing w:before="40" w:after="120"/>
+        <w:shd w:val="clear" w:color="auto" w:fill="F2F2F2"/>
+      </w:pPr>
+      <w:sdt>
+        <w:sdtPr>
+          <w:alias w:val="082RB13004420"/>
+          <w:id w:val="100729"/>
+          <w:showingPlcHdr/>
+          <w:dropDownList>
+            <w:listItem w:displayText="Choose an item." w:value=""/>
+            <w:listItem w:displayText="Cash" w:value="Cash"/>
+            <w:listItem w:displayText="Government bonds" w:value="Government bonds"/>
+            <w:listItem w:displayText="Corporate bonds IG" w:value="Corporate bonds IG"/>
+            <w:listItem w:displayText="Corporate bonds HY" w:value="Corporate bonds HY"/>
+            <w:listItem w:displayText="Broad bonds" w:value="Broad bonds"/>
+            <w:listItem w:displayText="Equities" w:value="Equities"/>
+          </w:dropDownList>
+        </w:sdtPr>
+        <w:sdtContent>
+          <w:r>
+            <w:t>Choose an item.</w:t>
+          </w:r>
+        </w:sdtContent>
+      </w:sdt>
+    </w:p>
+    <w:p>
+      <w:pPr>
+        <w:keepNext/>
+        <w:spacing w:before="200" w:after="40"/>
+      </w:pPr>
+      <w:r>
+        <w:rPr>
+          <w:rFonts w:ascii="Arial" w:hAnsi="Arial" w:cs="Arial" w:eastAsia="Arial"/>
+          <w:b/>
+          <w:i w:val="0"/>
+          <w:color w:val="000000"/>
+          <w:sz w:val="20"/>
+        </w:rPr>
+        <w:t xml:space="preserve">RB1 - Benchmark - Index 11 - Asset class type </w:t>
+      </w:r>
+      <w:r>
+        <w:rPr>
+          <w:rFonts w:ascii="Arial" w:hAnsi="Arial" w:cs="Arial" w:eastAsia="Arial"/>
+          <w:b/>
+          <w:i w:val="0"/>
+          <w:color w:val="1C355E"/>
+          <w:sz w:val="17"/>
+        </w:rPr>
+        <w:t>-082RB13004421-</w:t>
+      </w:r>
+    </w:p>
+    <w:p>
+      <w:pPr>
+        <w:keepNext w:val="0"/>
+        <w:spacing w:before="40" w:after="120"/>
+        <w:shd w:val="clear" w:color="auto" w:fill="F2F2F2"/>
+      </w:pPr>
+      <w:sdt>
+        <w:sdtPr>
+          <w:alias w:val="082RB13004421"/>
+          <w:id w:val="100730"/>
+          <w:showingPlcHdr/>
+          <w:dropDownList>
+            <w:listItem w:displayText="Choose an item." w:value=""/>
+            <w:listItem w:displayText="Cash" w:value="Cash"/>
+            <w:listItem w:displayText="Government bonds" w:value="Government bonds"/>
+            <w:listItem w:displayText="Corporate bonds IG" w:value="Corporate bonds IG"/>
+            <w:listItem w:displayText="Corporate bonds HY" w:value="Corporate bonds HY"/>
+            <w:listItem w:displayText="Broad bonds" w:value="Broad bonds"/>
+            <w:listItem w:displayText="Equities" w:value="Equities"/>
+          </w:dropDownList>
+        </w:sdtPr>
+        <w:sdtContent>
+          <w:r>
+            <w:t>Choose an item.</w:t>
+          </w:r>
+        </w:sdtContent>
+      </w:sdt>
+    </w:p>
+    <w:p>
+      <w:pPr>
+        <w:keepNext/>
+        <w:spacing w:before="200" w:after="40"/>
+      </w:pPr>
+      <w:r>
+        <w:rPr>
+          <w:rFonts w:ascii="Arial" w:hAnsi="Arial" w:cs="Arial" w:eastAsia="Arial"/>
+          <w:b/>
+          <w:i w:val="0"/>
+          <w:color w:val="000000"/>
+          <w:sz w:val="20"/>
+        </w:rPr>
+        <w:t xml:space="preserve">RB1 - Benchmark - Index 11 - Yield curve segment </w:t>
+      </w:r>
+      <w:r>
+        <w:rPr>
+          <w:rFonts w:ascii="Arial" w:hAnsi="Arial" w:cs="Arial" w:eastAsia="Arial"/>
+          <w:b/>
+          <w:i w:val="0"/>
+          <w:color w:val="1C355E"/>
+          <w:sz w:val="17"/>
+        </w:rPr>
+        <w:t>-082RB13004422-</w:t>
+      </w:r>
+    </w:p>
+    <w:p>
+      <w:pPr>
+        <w:keepNext w:val="0"/>
+        <w:spacing w:before="40" w:after="120"/>
+        <w:shd w:val="clear" w:color="auto" w:fill="F2F2F2"/>
+      </w:pPr>
+      <w:sdt>
+        <w:sdtPr>
+          <w:alias w:val="082RB13004422"/>
+          <w:id w:val="100731"/>
+          <w:showingPlcHdr/>
+          <w:dropDownList>
+            <w:listItem w:displayText="Choose an item." w:value=""/>
+            <w:listItem w:displayText="1-3 years" w:value="1-3 years"/>
+            <w:listItem w:displayText="1-5 years" w:value="1-5 years"/>
+            <w:listItem w:displayText="1-10 years" w:value="1-10 years"/>
+            <w:listItem w:displayText="3-5 years" w:value="3-5 years"/>
+            <w:listItem w:displayText="Intermediate segment (e.g. 5-7 years)" w:value="Intermediate segment (e.g. 5-7 years)"/>
+            <w:listItem w:displayText="Over 10 years" w:value="Over 10 years"/>
+            <w:listItem w:displayText="All maturities" w:value="All maturities"/>
+          </w:dropDownList>
+        </w:sdtPr>
+        <w:sdtContent>
+          <w:r>
+            <w:t>Choose an item.</w:t>
+          </w:r>
+        </w:sdtContent>
+      </w:sdt>
+    </w:p>
+    <w:p>
+      <w:pPr>
+        <w:keepNext/>
+        <w:spacing w:before="200" w:after="40"/>
+      </w:pPr>
+      <w:r>
+        <w:rPr>
+          <w:rFonts w:ascii="Arial" w:hAnsi="Arial" w:cs="Arial" w:eastAsia="Arial"/>
+          <w:b/>
+          <w:i w:val="0"/>
+          <w:color w:val="000000"/>
+          <w:sz w:val="20"/>
+        </w:rPr>
+        <w:t xml:space="preserve">RB1 - Benchmark - Index 11 - Geographical focus </w:t>
+      </w:r>
+      <w:r>
+        <w:rPr>
+          <w:rFonts w:ascii="Arial" w:hAnsi="Arial" w:cs="Arial" w:eastAsia="Arial"/>
+          <w:b/>
+          <w:i w:val="0"/>
+          <w:color w:val="1C355E"/>
+          <w:sz w:val="17"/>
+        </w:rPr>
+        <w:t>-082RB13004423-</w:t>
+      </w:r>
+    </w:p>
+    <w:p>
+      <w:pPr>
+        <w:keepNext w:val="0"/>
+        <w:spacing w:before="40" w:after="120"/>
+        <w:shd w:val="clear" w:color="auto" w:fill="F2F2F2"/>
+      </w:pPr>
+      <w:sdt>
+        <w:sdtPr>
+          <w:alias w:val="082RB13004423"/>
+          <w:id w:val="100732"/>
+          <w:showingPlcHdr/>
+          <w:dropDownList>
+            <w:listItem w:displayText="Choose an item." w:value=""/>
+            <w:listItem w:displayText="Italy" w:value="Italy"/>
+            <w:listItem w:displayText="United Kingdom" w:value="United Kingdom"/>
+            <w:listItem w:displayText="Eurozone" w:value="Eurozone"/>
+            <w:listItem w:displayText="Europe" w:value="Europe"/>
+            <w:listItem w:displayText="USA" w:value="USA"/>
+            <w:listItem w:displayText="North America" w:value="North America"/>
+            <w:listItem w:displayText="Japan" w:value="Japan"/>
+            <w:listItem w:displayText="Pacific" w:value="Pacific"/>
+            <w:listItem w:displayText="Pacific ex Japan" w:value="Pacific ex Japan"/>
+            <w:listItem w:displayText="Emerging markets (EM)" w:value="Emerging markets (EM)"/>
+            <w:listItem w:displayText="Developed countries (DC)" w:value="Developed countries (DC)"/>
+            <w:listItem w:displayText="Developed countries + EM (DC + EM)" w:value="Developed countries + EM (DC + EM)"/>
+          </w:dropDownList>
+        </w:sdtPr>
+        <w:sdtContent>
+          <w:r>
+            <w:t>Choose an item.</w:t>
+          </w:r>
+        </w:sdtContent>
+      </w:sdt>
+    </w:p>
+    <w:p>
+      <w:pPr>
+        <w:keepNext/>
+        <w:spacing w:before="200" w:after="40"/>
+      </w:pPr>
+      <w:r>
+        <w:rPr>
+          <w:rFonts w:ascii="Arial" w:hAnsi="Arial" w:cs="Arial" w:eastAsia="Arial"/>
+          <w:b/>
+          <w:i w:val="0"/>
+          <w:color w:val="000000"/>
+          <w:sz w:val="20"/>
+        </w:rPr>
+        <w:t xml:space="preserve">RB1 - Benchmark - Index 11 - Currency </w:t>
+      </w:r>
+      <w:r>
+        <w:rPr>
+          <w:rFonts w:ascii="Arial" w:hAnsi="Arial" w:cs="Arial" w:eastAsia="Arial"/>
+          <w:b/>
+          <w:i w:val="0"/>
+          <w:color w:val="1C355E"/>
+          <w:sz w:val="17"/>
+        </w:rPr>
+        <w:t>-082RB13004424-</w:t>
+      </w:r>
+    </w:p>
+    <w:p>
+      <w:pPr>
+        <w:keepNext w:val="0"/>
+        <w:spacing w:before="40" w:after="120"/>
+        <w:shd w:val="clear" w:color="auto" w:fill="F2F2F2"/>
+      </w:pPr>
+      <w:sdt>
+        <w:sdtPr>
+          <w:alias w:val="082RB13004424"/>
+          <w:id w:val="100733"/>
+          <w:showingPlcHdr/>
+          <w:dropDownList>
+            <w:listItem w:displayText="Choose an item." w:value=""/>
+            <w:listItem w:displayText="Euro" w:value="Euro"/>
+            <w:listItem w:displayText="USD" w:value="USD"/>
+            <w:listItem w:displayText="Local currency" w:value="Local currency"/>
+            <w:listItem w:displayText="Hedged in Euro" w:value="Hedged in Euro"/>
+          </w:dropDownList>
+        </w:sdtPr>
+        <w:sdtContent>
+          <w:r>
+            <w:t>Choose an item.</w:t>
+          </w:r>
+        </w:sdtContent>
+      </w:sdt>
+    </w:p>
+    <w:p>
+      <w:pPr>
+        <w:keepNext/>
+        <w:spacing w:before="200" w:after="40"/>
+      </w:pPr>
+      <w:r>
+        <w:rPr>
+          <w:rFonts w:ascii="Arial" w:hAnsi="Arial" w:cs="Arial" w:eastAsia="Arial"/>
+          <w:b/>
+          <w:i w:val="0"/>
+          <w:color w:val="000000"/>
+          <w:sz w:val="20"/>
+        </w:rPr>
+        <w:t xml:space="preserve">RB1 - Benchmark - Index 11 - Weight </w:t>
+      </w:r>
+      <w:r>
+        <w:rPr>
+          <w:rFonts w:ascii="Arial" w:hAnsi="Arial" w:cs="Arial" w:eastAsia="Arial"/>
+          <w:b/>
+          <w:i w:val="0"/>
+          <w:color w:val="1C355E"/>
+          <w:sz w:val="17"/>
+        </w:rPr>
+        <w:t>-082RB13004425-</w:t>
+      </w:r>
+    </w:p>
+    <w:p>
+      <w:pPr>
+        <w:keepNext/>
+        <w:spacing w:before="0" w:after="40"/>
+      </w:pPr>
+      <w:r>
+        <w:rPr>
+          <w:rFonts w:ascii="Arial" w:hAnsi="Arial" w:cs="Arial" w:eastAsia="Arial"/>
+          <w:b w:val="0"/>
+          <w:i/>
+          <w:color w:val="595959"/>
+          <w:sz w:val="18"/>
+        </w:rPr>
+        <w:t>% with 1 decimal place</w:t>
+      </w:r>
+    </w:p>
+    <w:p>
+      <w:pPr>
+        <w:keepNext w:val="0"/>
+        <w:spacing w:before="40" w:after="120"/>
+        <w:shd w:val="clear" w:color="auto" w:fill="F2F2F2"/>
+      </w:pPr>
+      <w:sdt>
+        <w:sdtPr>
+          <w:alias w:val="082RB13004425"/>
+          <w:id w:val="100734"/>
+          <w:showingPlcHdr/>
+          <w:text/>
+        </w:sdtPr>
+        <w:sdtContent>
+          <w:r>
+            <w:t>Click or tap here to enter text.</w:t>
+          </w:r>
+        </w:sdtContent>
+      </w:sdt>
+    </w:p>
+    <w:p>
+      <w:pPr>
+        <w:keepNext/>
+        <w:spacing w:before="200" w:after="40"/>
+      </w:pPr>
+      <w:r>
+        <w:rPr>
+          <w:rFonts w:ascii="Arial" w:hAnsi="Arial" w:cs="Arial" w:eastAsia="Arial"/>
+          <w:b/>
+          <w:i w:val="0"/>
+          <w:color w:val="000000"/>
+          <w:sz w:val="20"/>
+        </w:rPr>
+        <w:t xml:space="preserve">RB1 - Benchmark - Index 12 - Asset class type </w:t>
+      </w:r>
+      <w:r>
+        <w:rPr>
+          <w:rFonts w:ascii="Arial" w:hAnsi="Arial" w:cs="Arial" w:eastAsia="Arial"/>
+          <w:b/>
+          <w:i w:val="0"/>
+          <w:color w:val="1C355E"/>
+          <w:sz w:val="17"/>
+        </w:rPr>
+        <w:t>-082RB13004426-</w:t>
+      </w:r>
+    </w:p>
+    <w:p>
+      <w:pPr>
+        <w:keepNext w:val="0"/>
+        <w:spacing w:before="40" w:after="120"/>
+        <w:shd w:val="clear" w:color="auto" w:fill="F2F2F2"/>
+      </w:pPr>
+      <w:sdt>
+        <w:sdtPr>
+          <w:alias w:val="082RB13004426"/>
+          <w:id w:val="100735"/>
+          <w:showingPlcHdr/>
+          <w:text/>
+        </w:sdtPr>
+        <w:sdtContent>
+          <w:r>
+            <w:t>Click or tap here to enter text.</w:t>
+          </w:r>
+        </w:sdtContent>
+      </w:sdt>
+    </w:p>
+    <w:p>
+      <w:pPr>
+        <w:keepNext/>
+        <w:spacing w:before="200" w:after="40"/>
+      </w:pPr>
+      <w:r>
+        <w:rPr>
+          <w:rFonts w:ascii="Arial" w:hAnsi="Arial" w:cs="Arial" w:eastAsia="Arial"/>
+          <w:b/>
+          <w:i w:val="0"/>
+          <w:color w:val="000000"/>
+          <w:sz w:val="20"/>
+        </w:rPr>
+        <w:t xml:space="preserve">RB1 - Benchmark - Index 12 - Yield curve segment </w:t>
+      </w:r>
+      <w:r>
+        <w:rPr>
+          <w:rFonts w:ascii="Arial" w:hAnsi="Arial" w:cs="Arial" w:eastAsia="Arial"/>
+          <w:b/>
+          <w:i w:val="0"/>
+          <w:color w:val="1C355E"/>
+          <w:sz w:val="17"/>
+        </w:rPr>
+        <w:t>-082RB13004427-</w:t>
+      </w:r>
+    </w:p>
+    <w:p>
+      <w:pPr>
+        <w:keepNext w:val="0"/>
+        <w:spacing w:before="40" w:after="120"/>
+        <w:shd w:val="clear" w:color="auto" w:fill="F2F2F2"/>
+      </w:pPr>
+      <w:sdt>
+        <w:sdtPr>
+          <w:alias w:val="082RB13004427"/>
+          <w:id w:val="100736"/>
+          <w:showingPlcHdr/>
+          <w:dropDownList>
+            <w:listItem w:displayText="Choose an item." w:value=""/>
+            <w:listItem w:displayText="1-3 years" w:value="1-3 years"/>
+            <w:listItem w:displayText="1-5 years" w:value="1-5 years"/>
+            <w:listItem w:displayText="1-10 years" w:value="1-10 years"/>
+            <w:listItem w:displayText="3-5 years" w:value="3-5 years"/>
+            <w:listItem w:displayText="Intermediate segment (e.g. 5-7 years)" w:value="Intermediate segment (e.g. 5-7 years)"/>
+            <w:listItem w:displayText="Over 10 years" w:value="Over 10 years"/>
+            <w:listItem w:displayText="All maturities" w:value="All maturities"/>
+          </w:dropDownList>
+        </w:sdtPr>
+        <w:sdtContent>
+          <w:r>
+            <w:t>Choose an item.</w:t>
+          </w:r>
+        </w:sdtContent>
+      </w:sdt>
+    </w:p>
+    <w:p>
+      <w:pPr>
+        <w:keepNext/>
+        <w:spacing w:before="200" w:after="40"/>
+      </w:pPr>
+      <w:r>
+        <w:rPr>
+          <w:rFonts w:ascii="Arial" w:hAnsi="Arial" w:cs="Arial" w:eastAsia="Arial"/>
+          <w:b/>
+          <w:i w:val="0"/>
+          <w:color w:val="000000"/>
+          <w:sz w:val="20"/>
+        </w:rPr>
+        <w:t xml:space="preserve">RB1 - Benchmark - Index 12 - Geographical focus </w:t>
+      </w:r>
+      <w:r>
+        <w:rPr>
+          <w:rFonts w:ascii="Arial" w:hAnsi="Arial" w:cs="Arial" w:eastAsia="Arial"/>
+          <w:b/>
+          <w:i w:val="0"/>
+          <w:color w:val="1C355E"/>
+          <w:sz w:val="17"/>
+        </w:rPr>
+        <w:t>-082RB13004428-</w:t>
+      </w:r>
+    </w:p>
+    <w:p>
+      <w:pPr>
+        <w:keepNext w:val="0"/>
+        <w:spacing w:before="40" w:after="120"/>
+        <w:shd w:val="clear" w:color="auto" w:fill="F2F2F2"/>
+      </w:pPr>
+      <w:sdt>
+        <w:sdtPr>
+          <w:alias w:val="082RB13004428"/>
+          <w:id w:val="100737"/>
+          <w:showingPlcHdr/>
+          <w:dropDownList>
+            <w:listItem w:displayText="Choose an item." w:value=""/>
+            <w:listItem w:displayText="Italy" w:value="Italy"/>
+            <w:listItem w:displayText="United Kingdom" w:value="United Kingdom"/>
+            <w:listItem w:displayText="Eurozone" w:value="Eurozone"/>
+            <w:listItem w:displayText="Europe" w:value="Europe"/>
+            <w:listItem w:displayText="USA" w:value="USA"/>
+            <w:listItem w:displayText="North America" w:value="North America"/>
+            <w:listItem w:displayText="Japan" w:value="Japan"/>
+            <w:listItem w:displayText="Pacific" w:value="Pacific"/>
+            <w:listItem w:displayText="Pacific ex Japan" w:value="Pacific ex Japan"/>
+            <w:listItem w:displayText="Emerging markets (EM)" w:value="Emerging markets (EM)"/>
+            <w:listItem w:displayText="Developed countries (DC)" w:value="Developed countries (DC)"/>
+            <w:listItem w:displayText="Developed countries + EM (DC + EM)" w:value="Developed countries + EM (DC + EM)"/>
+          </w:dropDownList>
+        </w:sdtPr>
+        <w:sdtContent>
+          <w:r>
+            <w:t>Choose an item.</w:t>
+          </w:r>
+        </w:sdtContent>
+      </w:sdt>
+    </w:p>
+    <w:p>
+      <w:pPr>
+        <w:keepNext/>
+        <w:spacing w:before="200" w:after="40"/>
+      </w:pPr>
+      <w:r>
+        <w:rPr>
+          <w:rFonts w:ascii="Arial" w:hAnsi="Arial" w:cs="Arial" w:eastAsia="Arial"/>
+          <w:b/>
+          <w:i w:val="0"/>
+          <w:color w:val="000000"/>
+          <w:sz w:val="20"/>
+        </w:rPr>
+        <w:t xml:space="preserve">RB1 - Benchmark - Index 12 - Currency </w:t>
+      </w:r>
+      <w:r>
+        <w:rPr>
+          <w:rFonts w:ascii="Arial" w:hAnsi="Arial" w:cs="Arial" w:eastAsia="Arial"/>
+          <w:b/>
+          <w:i w:val="0"/>
+          <w:color w:val="1C355E"/>
+          <w:sz w:val="17"/>
+        </w:rPr>
+        <w:t>-082RB13004429-</w:t>
+      </w:r>
+    </w:p>
+    <w:p>
+      <w:pPr>
+        <w:keepNext w:val="0"/>
+        <w:spacing w:before="40" w:after="120"/>
+        <w:shd w:val="clear" w:color="auto" w:fill="F2F2F2"/>
+      </w:pPr>
+      <w:sdt>
+        <w:sdtPr>
+          <w:alias w:val="082RB13004429"/>
+          <w:id w:val="100738"/>
+          <w:showingPlcHdr/>
+          <w:dropDownList>
+            <w:listItem w:displayText="Choose an item." w:value=""/>
+            <w:listItem w:displayText="Euro" w:value="Euro"/>
+            <w:listItem w:displayText="USD" w:value="USD"/>
+            <w:listItem w:displayText="Local currency" w:value="Local currency"/>
+            <w:listItem w:displayText="Hedged in Euro" w:value="Hedged in Euro"/>
+          </w:dropDownList>
+        </w:sdtPr>
+        <w:sdtContent>
+          <w:r>
+            <w:t>Choose an item.</w:t>
+          </w:r>
+        </w:sdtContent>
+      </w:sdt>
+    </w:p>
+    <w:p>
+      <w:pPr>
+        <w:keepNext/>
+        <w:spacing w:before="200" w:after="40"/>
+      </w:pPr>
+      <w:r>
+        <w:rPr>
+          <w:rFonts w:ascii="Arial" w:hAnsi="Arial" w:cs="Arial" w:eastAsia="Arial"/>
+          <w:b/>
+          <w:i w:val="0"/>
+          <w:color w:val="000000"/>
+          <w:sz w:val="20"/>
+        </w:rPr>
+        <w:t xml:space="preserve">RB1 - Benchmark - Index 12 - Weight </w:t>
+      </w:r>
+      <w:r>
+        <w:rPr>
+          <w:rFonts w:ascii="Arial" w:hAnsi="Arial" w:cs="Arial" w:eastAsia="Arial"/>
+          <w:b/>
+          <w:i w:val="0"/>
+          <w:color w:val="1C355E"/>
+          <w:sz w:val="17"/>
+        </w:rPr>
+        <w:t>-082RB13004430-</w:t>
+      </w:r>
+    </w:p>
+    <w:p>
+      <w:pPr>
+        <w:keepNext/>
+        <w:spacing w:before="0" w:after="40"/>
+      </w:pPr>
+      <w:r>
+        <w:rPr>
+          <w:rFonts w:ascii="Arial" w:hAnsi="Arial" w:cs="Arial" w:eastAsia="Arial"/>
+          <w:b w:val="0"/>
+          <w:i/>
+          <w:color w:val="595959"/>
+          <w:sz w:val="18"/>
+        </w:rPr>
+        <w:t>% with 1 decimal place</w:t>
+      </w:r>
+    </w:p>
+    <w:p>
+      <w:pPr>
+        <w:keepNext w:val="0"/>
+        <w:spacing w:before="40" w:after="120"/>
+        <w:shd w:val="clear" w:color="auto" w:fill="F2F2F2"/>
+      </w:pPr>
+      <w:sdt>
+        <w:sdtPr>
+          <w:alias w:val="082RB13004430"/>
+          <w:id w:val="100739"/>
+          <w:showingPlcHdr/>
+          <w:dropDownList>
+            <w:listItem w:displayText="Choose an item." w:value=""/>
+            <w:listItem w:displayText="Cash" w:value="Cash"/>
+            <w:listItem w:displayText="Government bonds" w:value="Government bonds"/>
+            <w:listItem w:displayText="Corporate bonds IG" w:value="Corporate bonds IG"/>
+            <w:listItem w:displayText="Corporate bonds HY" w:value="Corporate bonds HY"/>
+            <w:listItem w:displayText="Broad bonds" w:value="Broad bonds"/>
+            <w:listItem w:displayText="Equities" w:value="Equities"/>
+          </w:dropDownList>
+        </w:sdtPr>
+        <w:sdtContent>
+          <w:r>
+            <w:t>Choose an item.</w:t>
+          </w:r>
+        </w:sdtContent>
+      </w:sdt>
+    </w:p>
+    <w:p>
+      <w:pPr>
+        <w:keepNext/>
+        <w:spacing w:before="200" w:after="40"/>
+      </w:pPr>
+      <w:r>
+        <w:rPr>
+          <w:rFonts w:ascii="Arial" w:hAnsi="Arial" w:cs="Arial" w:eastAsia="Arial"/>
+          <w:b/>
+          <w:i w:val="0"/>
+          <w:color w:val="000000"/>
+          <w:sz w:val="20"/>
+        </w:rPr>
+        <w:t xml:space="preserve">RB1 - Benchmark - Index 13 - Asset class type </w:t>
+      </w:r>
+      <w:r>
+        <w:rPr>
+          <w:rFonts w:ascii="Arial" w:hAnsi="Arial" w:cs="Arial" w:eastAsia="Arial"/>
+          <w:b/>
+          <w:i w:val="0"/>
+          <w:color w:val="1C355E"/>
+          <w:sz w:val="17"/>
+        </w:rPr>
+        <w:t>-082RB13004431-</w:t>
+      </w:r>
+    </w:p>
+    <w:p>
+      <w:pPr>
+        <w:keepNext w:val="0"/>
+        <w:spacing w:before="40" w:after="120"/>
+        <w:shd w:val="clear" w:color="auto" w:fill="F2F2F2"/>
+      </w:pPr>
+      <w:sdt>
+        <w:sdtPr>
+          <w:alias w:val="082RB13004431"/>
+          <w:id w:val="100740"/>
+          <w:showingPlcHdr/>
+          <w:dropDownList>
+            <w:listItem w:displayText="Choose an item." w:value=""/>
+            <w:listItem w:displayText="Cash" w:value="Cash"/>
+            <w:listItem w:displayText="Government bonds" w:value="Government bonds"/>
+            <w:listItem w:displayText="Corporate bonds IG" w:value="Corporate bonds IG"/>
+            <w:listItem w:displayText="Corporate bonds HY" w:value="Corporate bonds HY"/>
+            <w:listItem w:displayText="Broad bonds" w:value="Broad bonds"/>
+            <w:listItem w:displayText="Equities" w:value="Equities"/>
+          </w:dropDownList>
+        </w:sdtPr>
+        <w:sdtContent>
+          <w:r>
+            <w:t>Choose an item.</w:t>
+          </w:r>
+        </w:sdtContent>
+      </w:sdt>
+    </w:p>
+    <w:p>
+      <w:pPr>
+        <w:keepNext/>
+        <w:spacing w:before="200" w:after="40"/>
+      </w:pPr>
+      <w:r>
+        <w:rPr>
+          <w:rFonts w:ascii="Arial" w:hAnsi="Arial" w:cs="Arial" w:eastAsia="Arial"/>
+          <w:b/>
+          <w:i w:val="0"/>
+          <w:color w:val="000000"/>
+          <w:sz w:val="20"/>
+        </w:rPr>
+        <w:t xml:space="preserve">RB1 - Benchmark - Index 13 - Yield curve segment </w:t>
+      </w:r>
+      <w:r>
+        <w:rPr>
+          <w:rFonts w:ascii="Arial" w:hAnsi="Arial" w:cs="Arial" w:eastAsia="Arial"/>
+          <w:b/>
+          <w:i w:val="0"/>
+          <w:color w:val="1C355E"/>
+          <w:sz w:val="17"/>
+        </w:rPr>
+        <w:t>-082RB13004432-</w:t>
+      </w:r>
+    </w:p>
+    <w:p>
+      <w:pPr>
+        <w:keepNext w:val="0"/>
+        <w:spacing w:before="40" w:after="120"/>
+        <w:shd w:val="clear" w:color="auto" w:fill="F2F2F2"/>
+      </w:pPr>
+      <w:sdt>
+        <w:sdtPr>
+          <w:alias w:val="082RB13004432"/>
+          <w:id w:val="100741"/>
+          <w:showingPlcHdr/>
+          <w:dropDownList>
+            <w:listItem w:displayText="Choose an item." w:value=""/>
+            <w:listItem w:displayText="1-3 years" w:value="1-3 years"/>
+            <w:listItem w:displayText="1-5 years" w:value="1-5 years"/>
+            <w:listItem w:displayText="1-10 years" w:value="1-10 years"/>
+            <w:listItem w:displayText="3-5 years" w:value="3-5 years"/>
+            <w:listItem w:displayText="Intermediate segment (e.g. 5-7 years)" w:value="Intermediate segment (e.g. 5-7 years)"/>
+            <w:listItem w:displayText="Over 10 years" w:value="Over 10 years"/>
+            <w:listItem w:displayText="All maturities" w:value="All maturities"/>
+          </w:dropDownList>
+        </w:sdtPr>
+        <w:sdtContent>
+          <w:r>
+            <w:t>Choose an item.</w:t>
+          </w:r>
+        </w:sdtContent>
+      </w:sdt>
+    </w:p>
+    <w:p>
+      <w:pPr>
+        <w:keepNext/>
+        <w:spacing w:before="200" w:after="40"/>
+      </w:pPr>
+      <w:r>
+        <w:rPr>
+          <w:rFonts w:ascii="Arial" w:hAnsi="Arial" w:cs="Arial" w:eastAsia="Arial"/>
+          <w:b/>
+          <w:i w:val="0"/>
+          <w:color w:val="000000"/>
+          <w:sz w:val="20"/>
+        </w:rPr>
+        <w:t xml:space="preserve">RB1 - Benchmark - Index 13 - Geographical focus </w:t>
+      </w:r>
+      <w:r>
+        <w:rPr>
+          <w:rFonts w:ascii="Arial" w:hAnsi="Arial" w:cs="Arial" w:eastAsia="Arial"/>
+          <w:b/>
+          <w:i w:val="0"/>
+          <w:color w:val="1C355E"/>
+          <w:sz w:val="17"/>
+        </w:rPr>
+        <w:t>-082RB13004433-</w:t>
+      </w:r>
+    </w:p>
+    <w:p>
+      <w:pPr>
+        <w:keepNext w:val="0"/>
+        <w:spacing w:before="40" w:after="120"/>
+        <w:shd w:val="clear" w:color="auto" w:fill="F2F2F2"/>
+      </w:pPr>
+      <w:sdt>
+        <w:sdtPr>
+          <w:alias w:val="082RB13004433"/>
+          <w:id w:val="100742"/>
+          <w:showingPlcHdr/>
+          <w:dropDownList>
+            <w:listItem w:displayText="Choose an item." w:value=""/>
+            <w:listItem w:displayText="Italy" w:value="Italy"/>
+            <w:listItem w:displayText="United Kingdom" w:value="United Kingdom"/>
+            <w:listItem w:displayText="Eurozone" w:value="Eurozone"/>
+            <w:listItem w:displayText="Europe" w:value="Europe"/>
+            <w:listItem w:displayText="USA" w:value="USA"/>
+            <w:listItem w:displayText="North America" w:value="North America"/>
+            <w:listItem w:displayText="Japan" w:value="Japan"/>
+            <w:listItem w:displayText="Pacific" w:value="Pacific"/>
+            <w:listItem w:displayText="Pacific ex Japan" w:value="Pacific ex Japan"/>
+            <w:listItem w:displayText="Emerging markets (EM)" w:value="Emerging markets (EM)"/>
+            <w:listItem w:displayText="Developed countries (DC)" w:value="Developed countries (DC)"/>
+            <w:listItem w:displayText="Developed countries + EM (DC + EM)" w:value="Developed countries + EM (DC + EM)"/>
+          </w:dropDownList>
+        </w:sdtPr>
+        <w:sdtContent>
+          <w:r>
+            <w:t>Choose an item.</w:t>
+          </w:r>
+        </w:sdtContent>
+      </w:sdt>
+    </w:p>
+    <w:p>
+      <w:pPr>
+        <w:keepNext/>
+        <w:spacing w:before="200" w:after="40"/>
+      </w:pPr>
+      <w:r>
+        <w:rPr>
+          <w:rFonts w:ascii="Arial" w:hAnsi="Arial" w:cs="Arial" w:eastAsia="Arial"/>
+          <w:b/>
+          <w:i w:val="0"/>
+          <w:color w:val="000000"/>
+          <w:sz w:val="20"/>
+        </w:rPr>
+        <w:t xml:space="preserve">RB1 - Benchmark - Index 13 - Currency </w:t>
+      </w:r>
+      <w:r>
+        <w:rPr>
+          <w:rFonts w:ascii="Arial" w:hAnsi="Arial" w:cs="Arial" w:eastAsia="Arial"/>
+          <w:b/>
+          <w:i w:val="0"/>
+          <w:color w:val="1C355E"/>
+          <w:sz w:val="17"/>
+        </w:rPr>
+        <w:t>-082RB13004434-</w:t>
+      </w:r>
+    </w:p>
+    <w:p>
+      <w:pPr>
+        <w:keepNext w:val="0"/>
+        <w:spacing w:before="40" w:after="120"/>
+        <w:shd w:val="clear" w:color="auto" w:fill="F2F2F2"/>
+      </w:pPr>
+      <w:sdt>
+        <w:sdtPr>
+          <w:alias w:val="082RB13004434"/>
+          <w:id w:val="100743"/>
+          <w:showingPlcHdr/>
+          <w:dropDownList>
+            <w:listItem w:displayText="Choose an item." w:value=""/>
+            <w:listItem w:displayText="Euro" w:value="Euro"/>
+            <w:listItem w:displayText="USD" w:value="USD"/>
+            <w:listItem w:displayText="Local currency" w:value="Local currency"/>
+            <w:listItem w:displayText="Hedged in Euro" w:value="Hedged in Euro"/>
+          </w:dropDownList>
+        </w:sdtPr>
+        <w:sdtContent>
+          <w:r>
+            <w:t>Choose an item.</w:t>
+          </w:r>
+        </w:sdtContent>
+      </w:sdt>
+    </w:p>
+    <w:p>
+      <w:pPr>
+        <w:keepNext/>
+        <w:spacing w:before="200" w:after="40"/>
+      </w:pPr>
+      <w:r>
+        <w:rPr>
+          <w:rFonts w:ascii="Arial" w:hAnsi="Arial" w:cs="Arial" w:eastAsia="Arial"/>
+          <w:b/>
+          <w:i w:val="0"/>
+          <w:color w:val="000000"/>
+          <w:sz w:val="20"/>
+        </w:rPr>
+        <w:t xml:space="preserve">RB1 - Benchmark - Index 13 - Weight </w:t>
+      </w:r>
+      <w:r>
+        <w:rPr>
+          <w:rFonts w:ascii="Arial" w:hAnsi="Arial" w:cs="Arial" w:eastAsia="Arial"/>
+          <w:b/>
+          <w:i w:val="0"/>
+          <w:color w:val="1C355E"/>
+          <w:sz w:val="17"/>
+        </w:rPr>
+        <w:t>-082RB13004435-</w:t>
+      </w:r>
+    </w:p>
+    <w:p>
+      <w:pPr>
+        <w:keepNext/>
+        <w:spacing w:before="0" w:after="40"/>
+      </w:pPr>
+      <w:r>
+        <w:rPr>
+          <w:rFonts w:ascii="Arial" w:hAnsi="Arial" w:cs="Arial" w:eastAsia="Arial"/>
+          <w:b w:val="0"/>
+          <w:i/>
+          <w:color w:val="595959"/>
+          <w:sz w:val="18"/>
+        </w:rPr>
+        <w:t>% with 1 decimal place</w:t>
+      </w:r>
+    </w:p>
+    <w:p>
+      <w:pPr>
+        <w:keepNext w:val="0"/>
+        <w:spacing w:before="40" w:after="120"/>
+        <w:shd w:val="clear" w:color="auto" w:fill="F2F2F2"/>
+      </w:pPr>
+      <w:sdt>
+        <w:sdtPr>
+          <w:alias w:val="082RB13004435"/>
+          <w:id w:val="100744"/>
+          <w:showingPlcHdr/>
+          <w:text/>
+        </w:sdtPr>
+        <w:sdtContent>
+          <w:r>
+            <w:t>Click or tap here to enter text.</w:t>
+          </w:r>
+        </w:sdtContent>
+      </w:sdt>
+    </w:p>
+    <w:p>
+      <w:pPr>
+        <w:keepNext/>
+        <w:spacing w:before="200" w:after="40"/>
+      </w:pPr>
+      <w:r>
+        <w:rPr>
+          <w:rFonts w:ascii="Arial" w:hAnsi="Arial" w:cs="Arial" w:eastAsia="Arial"/>
+          <w:b/>
+          <w:i w:val="0"/>
+          <w:color w:val="000000"/>
+          <w:sz w:val="20"/>
+        </w:rPr>
+        <w:t xml:space="preserve">RB1 - Benchmark - Index 14 - Asset class type </w:t>
+      </w:r>
+      <w:r>
+        <w:rPr>
+          <w:rFonts w:ascii="Arial" w:hAnsi="Arial" w:cs="Arial" w:eastAsia="Arial"/>
+          <w:b/>
+          <w:i w:val="0"/>
+          <w:color w:val="1C355E"/>
+          <w:sz w:val="17"/>
+        </w:rPr>
+        <w:t>-082RB13004436-</w:t>
+      </w:r>
+    </w:p>
+    <w:p>
+      <w:pPr>
+        <w:keepNext w:val="0"/>
+        <w:spacing w:before="40" w:after="120"/>
+        <w:shd w:val="clear" w:color="auto" w:fill="F2F2F2"/>
+      </w:pPr>
+      <w:sdt>
+        <w:sdtPr>
+          <w:alias w:val="082RB13004436"/>
+          <w:id w:val="100745"/>
+          <w:showingPlcHdr/>
+          <w:dropDownList>
+            <w:listItem w:displayText="Choose an item." w:value=""/>
+            <w:listItem w:displayText="Cash" w:value="Cash"/>
+            <w:listItem w:displayText="Government bonds" w:value="Government bonds"/>
+            <w:listItem w:displayText="Corporate bonds IG" w:value="Corporate bonds IG"/>
+            <w:listItem w:displayText="Corporate bonds HY" w:value="Corporate bonds HY"/>
+            <w:listItem w:displayText="Broad bonds" w:value="Broad bonds"/>
+            <w:listItem w:displayText="Equities" w:value="Equities"/>
+          </w:dropDownList>
+        </w:sdtPr>
+        <w:sdtContent>
+          <w:r>
+            <w:t>Choose an item.</w:t>
+          </w:r>
+        </w:sdtContent>
+      </w:sdt>
+    </w:p>
+    <w:p>
+      <w:pPr>
+        <w:keepNext/>
+        <w:spacing w:before="200" w:after="40"/>
+      </w:pPr>
+      <w:r>
+        <w:rPr>
+          <w:rFonts w:ascii="Arial" w:hAnsi="Arial" w:cs="Arial" w:eastAsia="Arial"/>
+          <w:b/>
+          <w:i w:val="0"/>
+          <w:color w:val="000000"/>
+          <w:sz w:val="20"/>
+        </w:rPr>
+        <w:t xml:space="preserve">RB1 - Benchmark - Index 14 - Yield curve segment </w:t>
+      </w:r>
+      <w:r>
+        <w:rPr>
+          <w:rFonts w:ascii="Arial" w:hAnsi="Arial" w:cs="Arial" w:eastAsia="Arial"/>
+          <w:b/>
+          <w:i w:val="0"/>
+          <w:color w:val="1C355E"/>
+          <w:sz w:val="17"/>
+        </w:rPr>
+        <w:t>-082RB13004437-</w:t>
+      </w:r>
+    </w:p>
+    <w:p>
+      <w:pPr>
+        <w:keepNext w:val="0"/>
+        <w:spacing w:before="40" w:after="120"/>
+        <w:shd w:val="clear" w:color="auto" w:fill="F2F2F2"/>
+      </w:pPr>
+      <w:sdt>
+        <w:sdtPr>
+          <w:alias w:val="082RB13004437"/>
+          <w:id w:val="100746"/>
+          <w:showingPlcHdr/>
+          <w:dropDownList>
+            <w:listItem w:displayText="Choose an item." w:value=""/>
+            <w:listItem w:displayText="Euro" w:value="Euro"/>
+            <w:listItem w:displayText="USD" w:value="USD"/>
+            <w:listItem w:displayText="Local currency" w:value="Local currency"/>
+            <w:listItem w:displayText="Hedged in Euro" w:value="Hedged in Euro"/>
+          </w:dropDownList>
+        </w:sdtPr>
+        <w:sdtContent>
+          <w:r>
+            <w:t>Choose an item.</w:t>
+          </w:r>
+        </w:sdtContent>
+      </w:sdt>
+    </w:p>
+    <w:p>
+      <w:pPr>
+        <w:keepNext/>
+        <w:spacing w:before="200" w:after="40"/>
+      </w:pPr>
+      <w:r>
+        <w:rPr>
+          <w:rFonts w:ascii="Arial" w:hAnsi="Arial" w:cs="Arial" w:eastAsia="Arial"/>
+          <w:b/>
+          <w:i w:val="0"/>
+          <w:color w:val="000000"/>
+          <w:sz w:val="20"/>
+        </w:rPr>
+        <w:t xml:space="preserve">RB1 - Benchmark - Index 14 - Geographical focus </w:t>
+      </w:r>
+      <w:r>
+        <w:rPr>
+          <w:rFonts w:ascii="Arial" w:hAnsi="Arial" w:cs="Arial" w:eastAsia="Arial"/>
+          <w:b/>
+          <w:i w:val="0"/>
+          <w:color w:val="1C355E"/>
+          <w:sz w:val="17"/>
+        </w:rPr>
+        <w:t>-082RB13004438-</w:t>
+      </w:r>
+    </w:p>
+    <w:p>
+      <w:pPr>
+        <w:keepNext w:val="0"/>
+        <w:spacing w:before="40" w:after="120"/>
+        <w:shd w:val="clear" w:color="auto" w:fill="F2F2F2"/>
+      </w:pPr>
+      <w:sdt>
+        <w:sdtPr>
+          <w:alias w:val="082RB13004438"/>
+          <w:id w:val="100747"/>
+          <w:showingPlcHdr/>
+          <w:dropDownList>
+            <w:listItem w:displayText="Choose an item." w:value=""/>
+            <w:listItem w:displayText="Italy" w:value="Italy"/>
+            <w:listItem w:displayText="United Kingdom" w:value="United Kingdom"/>
+            <w:listItem w:displayText="Eurozone" w:value="Eurozone"/>
+            <w:listItem w:displayText="Europe" w:value="Europe"/>
+            <w:listItem w:displayText="USA" w:value="USA"/>
+            <w:listItem w:displayText="North America" w:value="North America"/>
+            <w:listItem w:displayText="Japan" w:value="Japan"/>
+            <w:listItem w:displayText="Pacific" w:value="Pacific"/>
+            <w:listItem w:displayText="Pacific ex Japan" w:value="Pacific ex Japan"/>
+            <w:listItem w:displayText="Emerging markets (EM)" w:value="Emerging markets (EM)"/>
+            <w:listItem w:displayText="Developed countries (DC)" w:value="Developed countries (DC)"/>
+            <w:listItem w:displayText="Developed countries + EM (DC + EM)" w:value="Developed countries + EM (DC + EM)"/>
+          </w:dropDownList>
+        </w:sdtPr>
+        <w:sdtContent>
+          <w:r>
+            <w:t>Choose an item.</w:t>
+          </w:r>
+        </w:sdtContent>
+      </w:sdt>
+    </w:p>
+    <w:p>
+      <w:pPr>
+        <w:keepNext/>
+        <w:spacing w:before="200" w:after="40"/>
+      </w:pPr>
+      <w:r>
+        <w:rPr>
+          <w:rFonts w:ascii="Arial" w:hAnsi="Arial" w:cs="Arial" w:eastAsia="Arial"/>
+          <w:b/>
+          <w:i w:val="0"/>
+          <w:color w:val="000000"/>
+          <w:sz w:val="20"/>
+        </w:rPr>
+        <w:t xml:space="preserve">RB1 - Benchmark - Index 14 - Currency </w:t>
+      </w:r>
+      <w:r>
+        <w:rPr>
+          <w:rFonts w:ascii="Arial" w:hAnsi="Arial" w:cs="Arial" w:eastAsia="Arial"/>
+          <w:b/>
+          <w:i w:val="0"/>
+          <w:color w:val="1C355E"/>
+          <w:sz w:val="17"/>
+        </w:rPr>
+        <w:t>-082RB13004439-</w:t>
+      </w:r>
+    </w:p>
+    <w:p>
+      <w:pPr>
+        <w:keepNext w:val="0"/>
+        <w:spacing w:before="40" w:after="120"/>
+        <w:shd w:val="clear" w:color="auto" w:fill="F2F2F2"/>
+      </w:pPr>
+      <w:sdt>
+        <w:sdtPr>
+          <w:alias w:val="082RB13004439"/>
+          <w:id w:val="100748"/>
+          <w:showingPlcHdr/>
+          <w:dropDownList>
+            <w:listItem w:displayText="Choose an item." w:value=""/>
+            <w:listItem w:displayText="Euro" w:value="Euro"/>
+            <w:listItem w:displayText="USD" w:value="USD"/>
+            <w:listItem w:displayText="Local currency" w:value="Local currency"/>
+            <w:listItem w:displayText="Hedged in Euro" w:value="Hedged in Euro"/>
+          </w:dropDownList>
+        </w:sdtPr>
+        <w:sdtContent>
+          <w:r>
+            <w:t>Choose an item.</w:t>
+          </w:r>
+        </w:sdtContent>
+      </w:sdt>
+    </w:p>
+    <w:p>
+      <w:pPr>
+        <w:keepNext/>
+        <w:spacing w:before="200" w:after="40"/>
+      </w:pPr>
+      <w:r>
+        <w:rPr>
+          <w:rFonts w:ascii="Arial" w:hAnsi="Arial" w:cs="Arial" w:eastAsia="Arial"/>
+          <w:b/>
+          <w:i w:val="0"/>
+          <w:color w:val="000000"/>
+          <w:sz w:val="20"/>
+        </w:rPr>
+        <w:t xml:space="preserve">RB1 - Benchmark - Index 14 - Weight </w:t>
+      </w:r>
+      <w:r>
+        <w:rPr>
+          <w:rFonts w:ascii="Arial" w:hAnsi="Arial" w:cs="Arial" w:eastAsia="Arial"/>
+          <w:b/>
+          <w:i w:val="0"/>
+          <w:color w:val="1C355E"/>
+          <w:sz w:val="17"/>
+        </w:rPr>
+        <w:t>-082RB13004440-</w:t>
+      </w:r>
+    </w:p>
+    <w:p>
+      <w:pPr>
+        <w:keepNext/>
+        <w:spacing w:before="0" w:after="40"/>
+      </w:pPr>
+      <w:r>
+        <w:rPr>
+          <w:rFonts w:ascii="Arial" w:hAnsi="Arial" w:cs="Arial" w:eastAsia="Arial"/>
+          <w:b w:val="0"/>
+          <w:i/>
+          <w:color w:val="595959"/>
+          <w:sz w:val="18"/>
+        </w:rPr>
+        <w:t>% with 1 decimal place</w:t>
+      </w:r>
+    </w:p>
+    <w:p>
+      <w:pPr>
+        <w:keepNext w:val="0"/>
+        <w:spacing w:before="40" w:after="120"/>
+        <w:shd w:val="clear" w:color="auto" w:fill="F2F2F2"/>
+      </w:pPr>
+      <w:sdt>
+        <w:sdtPr>
           <w:alias w:val="082RB13004440"/>
           <w:id w:val="100749"/>
           <w:showingPlcHdr/>
@@ -44415,11 +44782,19 @@
           <w:alias w:val="082RB13005260"/>
           <w:id w:val="100750"/>
           <w:showingPlcHdr/>
-          <w:text/>
-        </w:sdtPr>
-        <w:sdtContent>
-          <w:r>
-            <w:t>Click or tap here to enter text.</w:t>
+          <w:dropDownList>
+            <w:listItem w:displayText="Choose an item." w:value=""/>
+            <w:listItem w:displayText="Cash" w:value="Cash"/>
+            <w:listItem w:displayText="Government bonds" w:value="Government bonds"/>
+            <w:listItem w:displayText="Corporate bonds IG" w:value="Corporate bonds IG"/>
+            <w:listItem w:displayText="Corporate bonds HY" w:value="Corporate bonds HY"/>
+            <w:listItem w:displayText="Broad bonds" w:value="Broad bonds"/>
+            <w:listItem w:displayText="Equities" w:value="Equities"/>
+          </w:dropDownList>
+        </w:sdtPr>
+        <w:sdtContent>
+          <w:r>
+            <w:t>Choose an item.</w:t>
           </w:r>
         </w:sdtContent>
       </w:sdt>
@@ -44461,11 +44836,20 @@
           <w:alias w:val="082RB13005261"/>
           <w:id w:val="100751"/>
           <w:showingPlcHdr/>
-          <w:text/>
-        </w:sdtPr>
-        <w:sdtContent>
-          <w:r>
-            <w:t>Click or tap here to enter text.</w:t>
+          <w:dropDownList>
+            <w:listItem w:displayText="Choose an item." w:value=""/>
+            <w:listItem w:displayText="1-3 years" w:value="1-3 years"/>
+            <w:listItem w:displayText="1-5 years" w:value="1-5 years"/>
+            <w:listItem w:displayText="1-10 years" w:value="1-10 years"/>
+            <w:listItem w:displayText="3-5 years" w:value="3-5 years"/>
+            <w:listItem w:displayText="Intermediate segment (e.g. 5-7 years)" w:value="Intermediate segment (e.g. 5-7 years)"/>
+            <w:listItem w:displayText="Over 10 years" w:value="Over 10 years"/>
+            <w:listItem w:displayText="All maturities" w:value="All maturities"/>
+          </w:dropDownList>
+        </w:sdtPr>
+        <w:sdtContent>
+          <w:r>
+            <w:t>Choose an item.</w:t>
           </w:r>
         </w:sdtContent>
       </w:sdt>
@@ -44507,11 +44891,25 @@
           <w:alias w:val="082RB13005262"/>
           <w:id w:val="100752"/>
           <w:showingPlcHdr/>
-          <w:text/>
-        </w:sdtPr>
-        <w:sdtContent>
-          <w:r>
-            <w:t>Click or tap here to enter text.</w:t>
+          <w:dropDownList>
+            <w:listItem w:displayText="Choose an item." w:value=""/>
+            <w:listItem w:displayText="Italy" w:value="Italy"/>
+            <w:listItem w:displayText="United Kingdom" w:value="United Kingdom"/>
+            <w:listItem w:displayText="Eurozone" w:value="Eurozone"/>
+            <w:listItem w:displayText="Europe" w:value="Europe"/>
+            <w:listItem w:displayText="USA" w:value="USA"/>
+            <w:listItem w:displayText="North America" w:value="North America"/>
+            <w:listItem w:displayText="Japan" w:value="Japan"/>
+            <w:listItem w:displayText="Pacific" w:value="Pacific"/>
+            <w:listItem w:displayText="Pacific ex Japan" w:value="Pacific ex Japan"/>
+            <w:listItem w:displayText="Emerging markets (EM)" w:value="Emerging markets (EM)"/>
+            <w:listItem w:displayText="Developed countries (DC)" w:value="Developed countries (DC)"/>
+            <w:listItem w:displayText="Developed countries + EM (DC + EM)" w:value="Developed countries + EM (DC + EM)"/>
+          </w:dropDownList>
+        </w:sdtPr>
+        <w:sdtContent>
+          <w:r>
+            <w:t>Choose an item.</w:t>
           </w:r>
         </w:sdtContent>
       </w:sdt>
@@ -44553,11 +44951,17 @@
           <w:alias w:val="082RB13005263"/>
           <w:id w:val="100753"/>
           <w:showingPlcHdr/>
-          <w:text/>
-        </w:sdtPr>
-        <w:sdtContent>
-          <w:r>
-            <w:t>Click or tap here to enter text.</w:t>
+          <w:dropDownList>
+            <w:listItem w:displayText="Choose an item." w:value=""/>
+            <w:listItem w:displayText="Euro" w:value="Euro"/>
+            <w:listItem w:displayText="USD" w:value="USD"/>
+            <w:listItem w:displayText="Local currency" w:value="Local currency"/>
+            <w:listItem w:displayText="Hedged in Euro" w:value="Hedged in Euro"/>
+          </w:dropDownList>
+        </w:sdtPr>
+        <w:sdtContent>
+          <w:r>
+            <w:t>Choose an item.</w:t>
           </w:r>
         </w:sdtContent>
       </w:sdt>

</xml_diff>

<commit_message>
Fill empty dropdowns from V2 video
Add options to 8 empty dropdown fields confirmed in the V2 release video:
- Candidate/delegated company lists: 2191665, 2191699, 2191700, 2192452
- GEK 2281720 (total / particular-asset delegation mandate)
- GEK 2281737 (activity assignment list)
- RFC 1291387 and RFL 1471398 (Yes / No)

Existing options are unchanged. Dropdowns: 199 -> 207; questions: 767.

Claude-Session: https://claude.ai/code/session_01Kh4RWNEbM9iRNhAaBfutke
</commit_message>
<xml_diff>
--- a/Questionnaire_Teatro_alla_Scala_EN.docx
+++ b/Questionnaire_Teatro_alla_Scala_EN.docx
@@ -5108,282 +5108,6 @@
           <w:alias w:val="082GEK2191665"/>
           <w:id w:val="100072"/>
           <w:showingPlcHdr/>
-          <w:text/>
-        </w:sdtPr>
-        <w:sdtContent>
-          <w:r>
-            <w:t>Click or tap here to enter text.</w:t>
-          </w:r>
-        </w:sdtContent>
-      </w:sdt>
-    </w:p>
-    <w:p>
-      <w:pPr>
-        <w:keepNext/>
-        <w:spacing w:before="200" w:after="40"/>
-      </w:pPr>
-      <w:r>
-        <w:rPr>
-          <w:rFonts w:ascii="Arial" w:hAnsi="Arial" w:cs="Arial" w:eastAsia="Arial"/>
-          <w:b/>
-          <w:i w:val="0"/>
-          <w:color w:val="000000"/>
-          <w:sz w:val="20"/>
-        </w:rPr>
-        <w:t xml:space="preserve">Management delegation – 'GEC – Investment process' – Notes </w:t>
-      </w:r>
-      <w:r>
-        <w:rPr>
-          <w:rFonts w:ascii="Arial" w:hAnsi="Arial" w:cs="Arial" w:eastAsia="Arial"/>
-          <w:b/>
-          <w:i w:val="0"/>
-          <w:color w:val="1C355E"/>
-          <w:sz w:val="17"/>
-        </w:rPr>
-        <w:t>-082GEK2191666-</w:t>
-      </w:r>
-    </w:p>
-    <w:p>
-      <w:pPr>
-        <w:keepNext w:val="0"/>
-        <w:spacing w:before="40" w:after="120"/>
-        <w:shd w:val="clear" w:color="auto" w:fill="F2F2F2"/>
-      </w:pPr>
-      <w:sdt>
-        <w:sdtPr>
-          <w:alias w:val="082GEK2191666"/>
-          <w:id w:val="100073"/>
-          <w:showingPlcHdr/>
-          <w:text/>
-        </w:sdtPr>
-        <w:sdtContent>
-          <w:r>
-            <w:t>Click or tap here to enter text.</w:t>
-          </w:r>
-        </w:sdtContent>
-      </w:sdt>
-    </w:p>
-    <w:p>
-      <w:pPr>
-        <w:keepNext/>
-        <w:spacing w:before="200" w:after="40"/>
-      </w:pPr>
-      <w:r>
-        <w:rPr>
-          <w:rFonts w:ascii="Arial" w:hAnsi="Arial" w:cs="Arial" w:eastAsia="Arial"/>
-          <w:b/>
-          <w:i w:val="0"/>
-          <w:color w:val="000000"/>
-          <w:sz w:val="20"/>
-        </w:rPr>
-        <w:t xml:space="preserve">Management delegation – 'GED – Investment process, asset class: bonds' – To which company does the information contained in this section refer? </w:t>
-      </w:r>
-      <w:r>
-        <w:rPr>
-          <w:rFonts w:ascii="Arial" w:hAnsi="Arial" w:cs="Arial" w:eastAsia="Arial"/>
-          <w:b/>
-          <w:i w:val="0"/>
-          <w:color w:val="1C355E"/>
-          <w:sz w:val="17"/>
-        </w:rPr>
-        <w:t>-082GEK2191699-</w:t>
-      </w:r>
-    </w:p>
-    <w:p>
-      <w:pPr>
-        <w:keepNext w:val="0"/>
-        <w:spacing w:before="40" w:after="120"/>
-        <w:shd w:val="clear" w:color="auto" w:fill="F2F2F2"/>
-      </w:pPr>
-      <w:sdt>
-        <w:sdtPr>
-          <w:alias w:val="082GEK2191699"/>
-          <w:id w:val="100074"/>
-          <w:showingPlcHdr/>
-          <w:text/>
-        </w:sdtPr>
-        <w:sdtContent>
-          <w:r>
-            <w:t>Click or tap here to enter text.</w:t>
-          </w:r>
-        </w:sdtContent>
-      </w:sdt>
-    </w:p>
-    <w:p>
-      <w:pPr>
-        <w:keepNext/>
-        <w:spacing w:before="200" w:after="40"/>
-      </w:pPr>
-      <w:r>
-        <w:rPr>
-          <w:rFonts w:ascii="Arial" w:hAnsi="Arial" w:cs="Arial" w:eastAsia="Arial"/>
-          <w:b/>
-          <w:i w:val="0"/>
-          <w:color w:val="000000"/>
-          <w:sz w:val="20"/>
-        </w:rPr>
-        <w:t xml:space="preserve">Management delegation – 'GED – Investment process, asset class: bonds' – Notes </w:t>
-      </w:r>
-      <w:r>
-        <w:rPr>
-          <w:rFonts w:ascii="Arial" w:hAnsi="Arial" w:cs="Arial" w:eastAsia="Arial"/>
-          <w:b/>
-          <w:i w:val="0"/>
-          <w:color w:val="1C355E"/>
-          <w:sz w:val="17"/>
-        </w:rPr>
-        <w:t>-082GEK2191704-</w:t>
-      </w:r>
-    </w:p>
-    <w:p>
-      <w:pPr>
-        <w:keepNext w:val="0"/>
-        <w:spacing w:before="40" w:after="120"/>
-        <w:shd w:val="clear" w:color="auto" w:fill="F2F2F2"/>
-      </w:pPr>
-      <w:sdt>
-        <w:sdtPr>
-          <w:alias w:val="082GEK2191704"/>
-          <w:id w:val="100075"/>
-          <w:showingPlcHdr/>
-          <w:text/>
-        </w:sdtPr>
-        <w:sdtContent>
-          <w:r>
-            <w:t>Click or tap here to enter text.</w:t>
-          </w:r>
-        </w:sdtContent>
-      </w:sdt>
-    </w:p>
-    <w:p>
-      <w:pPr>
-        <w:keepNext/>
-        <w:spacing w:before="200" w:after="40"/>
-      </w:pPr>
-      <w:r>
-        <w:rPr>
-          <w:rFonts w:ascii="Arial" w:hAnsi="Arial" w:cs="Arial" w:eastAsia="Arial"/>
-          <w:b/>
-          <w:i w:val="0"/>
-          <w:color w:val="000000"/>
-          <w:sz w:val="20"/>
-        </w:rPr>
-        <w:t xml:space="preserve">Management delegation – 'GEE – Investment process, asset class: equities' – To which company does the information contained in this section refer? </w:t>
-      </w:r>
-      <w:r>
-        <w:rPr>
-          <w:rFonts w:ascii="Arial" w:hAnsi="Arial" w:cs="Arial" w:eastAsia="Arial"/>
-          <w:b/>
-          <w:i w:val="0"/>
-          <w:color w:val="1C355E"/>
-          <w:sz w:val="17"/>
-        </w:rPr>
-        <w:t>-082GEK2191700-</w:t>
-      </w:r>
-    </w:p>
-    <w:p>
-      <w:pPr>
-        <w:keepNext w:val="0"/>
-        <w:spacing w:before="40" w:after="120"/>
-        <w:shd w:val="clear" w:color="auto" w:fill="F2F2F2"/>
-      </w:pPr>
-      <w:sdt>
-        <w:sdtPr>
-          <w:alias w:val="082GEK2191700"/>
-          <w:id w:val="100076"/>
-          <w:showingPlcHdr/>
-          <w:text/>
-        </w:sdtPr>
-        <w:sdtContent>
-          <w:r>
-            <w:t>Click or tap here to enter text.</w:t>
-          </w:r>
-        </w:sdtContent>
-      </w:sdt>
-    </w:p>
-    <w:p>
-      <w:pPr>
-        <w:keepNext/>
-        <w:spacing w:before="200" w:after="40"/>
-      </w:pPr>
-      <w:r>
-        <w:rPr>
-          <w:rFonts w:ascii="Arial" w:hAnsi="Arial" w:cs="Arial" w:eastAsia="Arial"/>
-          <w:b/>
-          <w:i w:val="0"/>
-          <w:color w:val="000000"/>
-          <w:sz w:val="20"/>
-        </w:rPr>
-        <w:t xml:space="preserve">Management delegation – 'GEE – Investment process, asset class: equities' – Notes </w:t>
-      </w:r>
-      <w:r>
-        <w:rPr>
-          <w:rFonts w:ascii="Arial" w:hAnsi="Arial" w:cs="Arial" w:eastAsia="Arial"/>
-          <w:b/>
-          <w:i w:val="0"/>
-          <w:color w:val="1C355E"/>
-          <w:sz w:val="17"/>
-        </w:rPr>
-        <w:t>-082GEK2191705-</w:t>
-      </w:r>
-    </w:p>
-    <w:p>
-      <w:pPr>
-        <w:keepNext w:val="0"/>
-        <w:spacing w:before="40" w:after="120"/>
-        <w:shd w:val="clear" w:color="auto" w:fill="F2F2F2"/>
-      </w:pPr>
-      <w:sdt>
-        <w:sdtPr>
-          <w:alias w:val="082GEK2191705"/>
-          <w:id w:val="100077"/>
-          <w:showingPlcHdr/>
-          <w:text/>
-        </w:sdtPr>
-        <w:sdtContent>
-          <w:r>
-            <w:t>Click or tap here to enter text.</w:t>
-          </w:r>
-        </w:sdtContent>
-      </w:sdt>
-    </w:p>
-    <w:p>
-      <w:pPr>
-        <w:keepNext/>
-        <w:spacing w:before="200" w:after="40"/>
-      </w:pPr>
-      <w:r>
-        <w:rPr>
-          <w:rFonts w:ascii="Arial" w:hAnsi="Arial" w:cs="Arial" w:eastAsia="Arial"/>
-          <w:b/>
-          <w:i w:val="0"/>
-          <w:color w:val="000000"/>
-          <w:sz w:val="20"/>
-        </w:rPr>
-        <w:t xml:space="preserve">Management delegation – 'GEF – Execution of the investment process' – To which company does the information contained in this section refer? </w:t>
-      </w:r>
-      <w:r>
-        <w:rPr>
-          <w:rFonts w:ascii="Arial" w:hAnsi="Arial" w:cs="Arial" w:eastAsia="Arial"/>
-          <w:b/>
-          <w:i w:val="0"/>
-          <w:color w:val="1C355E"/>
-          <w:sz w:val="17"/>
-        </w:rPr>
-        <w:t>-082GEK2191701-</w:t>
-      </w:r>
-    </w:p>
-    <w:p>
-      <w:pPr>
-        <w:keepNext w:val="0"/>
-        <w:spacing w:before="40" w:after="120"/>
-        <w:shd w:val="clear" w:color="auto" w:fill="F2F2F2"/>
-      </w:pPr>
-      <w:sdt>
-        <w:sdtPr>
-          <w:alias w:val="082GEK2191701"/>
-          <w:id w:val="100078"/>
-          <w:showingPlcHdr/>
           <w:dropDownList>
             <w:listItem w:displayText="Choose an item." w:value=""/>
             <w:listItem w:displayText="Candidate company" w:value="Candidate company"/>
@@ -5410,75 +5134,75 @@
           <w:color w:val="000000"/>
           <w:sz w:val="20"/>
         </w:rPr>
-        <w:t xml:space="preserve">Management delegation – 'GEF – Execution of the investment process' – Notes </w:t>
-      </w:r>
-      <w:r>
-        <w:rPr>
-          <w:rFonts w:ascii="Arial" w:hAnsi="Arial" w:cs="Arial" w:eastAsia="Arial"/>
-          <w:b/>
-          <w:i w:val="0"/>
-          <w:color w:val="1C355E"/>
-          <w:sz w:val="17"/>
-        </w:rPr>
-        <w:t>-082GEK2191706-</w:t>
-      </w:r>
-    </w:p>
-    <w:p>
-      <w:pPr>
-        <w:keepNext w:val="0"/>
-        <w:spacing w:before="40" w:after="120"/>
-        <w:shd w:val="clear" w:color="auto" w:fill="F2F2F2"/>
-      </w:pPr>
-      <w:sdt>
-        <w:sdtPr>
-          <w:alias w:val="082GEK2191706"/>
-          <w:id w:val="100079"/>
-          <w:showingPlcHdr/>
-          <w:text/>
-        </w:sdtPr>
-        <w:sdtContent>
-          <w:r>
-            <w:t>Click or tap here to enter text.</w:t>
-          </w:r>
-        </w:sdtContent>
-      </w:sdt>
-    </w:p>
-    <w:p>
-      <w:pPr>
-        <w:keepNext/>
-        <w:spacing w:before="200" w:after="40"/>
-      </w:pPr>
-      <w:r>
-        <w:rPr>
-          <w:rFonts w:ascii="Arial" w:hAnsi="Arial" w:cs="Arial" w:eastAsia="Arial"/>
-          <w:b/>
-          <w:i w:val="0"/>
-          <w:color w:val="000000"/>
-          <w:sz w:val="20"/>
-        </w:rPr>
-        <w:t xml:space="preserve">Management delegation – 'GEG – Socially responsible investments' – To which company does the information contained in this section refer? </w:t>
-      </w:r>
-      <w:r>
-        <w:rPr>
-          <w:rFonts w:ascii="Arial" w:hAnsi="Arial" w:cs="Arial" w:eastAsia="Arial"/>
-          <w:b/>
-          <w:i w:val="0"/>
-          <w:color w:val="1C355E"/>
-          <w:sz w:val="17"/>
-        </w:rPr>
-        <w:t>-082GEK2191703-</w:t>
-      </w:r>
-    </w:p>
-    <w:p>
-      <w:pPr>
-        <w:keepNext w:val="0"/>
-        <w:spacing w:before="40" w:after="120"/>
-        <w:shd w:val="clear" w:color="auto" w:fill="F2F2F2"/>
-      </w:pPr>
-      <w:sdt>
-        <w:sdtPr>
-          <w:alias w:val="082GEK2191703"/>
-          <w:id w:val="100080"/>
+        <w:t xml:space="preserve">Management delegation – 'GEC – Investment process' – Notes </w:t>
+      </w:r>
+      <w:r>
+        <w:rPr>
+          <w:rFonts w:ascii="Arial" w:hAnsi="Arial" w:cs="Arial" w:eastAsia="Arial"/>
+          <w:b/>
+          <w:i w:val="0"/>
+          <w:color w:val="1C355E"/>
+          <w:sz w:val="17"/>
+        </w:rPr>
+        <w:t>-082GEK2191666-</w:t>
+      </w:r>
+    </w:p>
+    <w:p>
+      <w:pPr>
+        <w:keepNext w:val="0"/>
+        <w:spacing w:before="40" w:after="120"/>
+        <w:shd w:val="clear" w:color="auto" w:fill="F2F2F2"/>
+      </w:pPr>
+      <w:sdt>
+        <w:sdtPr>
+          <w:alias w:val="082GEK2191666"/>
+          <w:id w:val="100073"/>
+          <w:showingPlcHdr/>
+          <w:text/>
+        </w:sdtPr>
+        <w:sdtContent>
+          <w:r>
+            <w:t>Click or tap here to enter text.</w:t>
+          </w:r>
+        </w:sdtContent>
+      </w:sdt>
+    </w:p>
+    <w:p>
+      <w:pPr>
+        <w:keepNext/>
+        <w:spacing w:before="200" w:after="40"/>
+      </w:pPr>
+      <w:r>
+        <w:rPr>
+          <w:rFonts w:ascii="Arial" w:hAnsi="Arial" w:cs="Arial" w:eastAsia="Arial"/>
+          <w:b/>
+          <w:i w:val="0"/>
+          <w:color w:val="000000"/>
+          <w:sz w:val="20"/>
+        </w:rPr>
+        <w:t xml:space="preserve">Management delegation – 'GED – Investment process, asset class: bonds' – To which company does the information contained in this section refer? </w:t>
+      </w:r>
+      <w:r>
+        <w:rPr>
+          <w:rFonts w:ascii="Arial" w:hAnsi="Arial" w:cs="Arial" w:eastAsia="Arial"/>
+          <w:b/>
+          <w:i w:val="0"/>
+          <w:color w:val="1C355E"/>
+          <w:sz w:val="17"/>
+        </w:rPr>
+        <w:t>-082GEK2191699-</w:t>
+      </w:r>
+    </w:p>
+    <w:p>
+      <w:pPr>
+        <w:keepNext w:val="0"/>
+        <w:spacing w:before="40" w:after="120"/>
+        <w:shd w:val="clear" w:color="auto" w:fill="F2F2F2"/>
+      </w:pPr>
+      <w:sdt>
+        <w:sdtPr>
+          <w:alias w:val="082GEK2191699"/>
+          <w:id w:val="100074"/>
           <w:showingPlcHdr/>
           <w:dropDownList>
             <w:listItem w:displayText="Choose an item." w:value=""/>
@@ -5506,259 +5230,75 @@
           <w:color w:val="000000"/>
           <w:sz w:val="20"/>
         </w:rPr>
-        <w:t xml:space="preserve">Management delegation – 'GEG – Socially responsible investments' – Notes </w:t>
-      </w:r>
-      <w:r>
-        <w:rPr>
-          <w:rFonts w:ascii="Arial" w:hAnsi="Arial" w:cs="Arial" w:eastAsia="Arial"/>
-          <w:b/>
-          <w:i w:val="0"/>
-          <w:color w:val="1C355E"/>
-          <w:sz w:val="17"/>
-        </w:rPr>
-        <w:t>-082GEK2191707-</w:t>
-      </w:r>
-    </w:p>
-    <w:p>
-      <w:pPr>
-        <w:keepNext w:val="0"/>
-        <w:spacing w:before="40" w:after="120"/>
-        <w:shd w:val="clear" w:color="auto" w:fill="F2F2F2"/>
-      </w:pPr>
-      <w:sdt>
-        <w:sdtPr>
-          <w:alias w:val="082GEK2191707"/>
-          <w:id w:val="100081"/>
-          <w:showingPlcHdr/>
-          <w:text/>
-        </w:sdtPr>
-        <w:sdtContent>
-          <w:r>
-            <w:t>Click or tap here to enter text.</w:t>
-          </w:r>
-        </w:sdtContent>
-      </w:sdt>
-    </w:p>
-    <w:p>
-      <w:pPr>
-        <w:keepNext/>
-        <w:spacing w:before="200" w:after="40"/>
-      </w:pPr>
-      <w:r>
-        <w:rPr>
-          <w:rFonts w:ascii="Arial" w:hAnsi="Arial" w:cs="Arial" w:eastAsia="Arial"/>
-          <w:b/>
-          <w:i w:val="0"/>
-          <w:color w:val="000000"/>
-          <w:sz w:val="20"/>
-        </w:rPr>
-        <w:t xml:space="preserve">Management delegation – The information in Section 'GEH – Management of conflicts of interest' must necessarily refer to the candidate company </w:t>
-      </w:r>
-      <w:r>
-        <w:rPr>
-          <w:rFonts w:ascii="Arial" w:hAnsi="Arial" w:cs="Arial" w:eastAsia="Arial"/>
-          <w:b/>
-          <w:i w:val="0"/>
-          <w:color w:val="1C355E"/>
-          <w:sz w:val="17"/>
-        </w:rPr>
-        <w:t>-082GEK2191668-</w:t>
-      </w:r>
-    </w:p>
-    <w:p>
-      <w:pPr>
-        <w:keepNext w:val="0"/>
-        <w:spacing w:before="40" w:after="120"/>
-        <w:shd w:val="clear" w:color="auto" w:fill="F2F2F2"/>
-      </w:pPr>
-      <w:sdt>
-        <w:sdtPr>
-          <w:alias w:val="082GEK2191668"/>
-          <w:id w:val="100082"/>
-          <w:showingPlcHdr/>
-          <w:text/>
-        </w:sdtPr>
-        <w:sdtContent>
-          <w:r>
-            <w:t>Click or tap here to enter text.</w:t>
-          </w:r>
-        </w:sdtContent>
-      </w:sdt>
-    </w:p>
-    <w:p>
-      <w:pPr>
-        <w:keepNext/>
-        <w:spacing w:before="200" w:after="40"/>
-      </w:pPr>
-      <w:r>
-        <w:rPr>
-          <w:rFonts w:ascii="Arial" w:hAnsi="Arial" w:cs="Arial" w:eastAsia="Arial"/>
-          <w:b/>
-          <w:i w:val="0"/>
-          <w:color w:val="000000"/>
-          <w:sz w:val="20"/>
-        </w:rPr>
-        <w:t xml:space="preserve">Management delegation – The information in Section 'GEI – Reporting and investor relations' must necessarily refer to the candidate company </w:t>
-      </w:r>
-      <w:r>
-        <w:rPr>
-          <w:rFonts w:ascii="Arial" w:hAnsi="Arial" w:cs="Arial" w:eastAsia="Arial"/>
-          <w:b/>
-          <w:i w:val="0"/>
-          <w:color w:val="1C355E"/>
-          <w:sz w:val="17"/>
-        </w:rPr>
-        <w:t>-082GEK2191669-</w:t>
-      </w:r>
-    </w:p>
-    <w:p>
-      <w:pPr>
-        <w:keepNext w:val="0"/>
-        <w:spacing w:before="40" w:after="120"/>
-        <w:shd w:val="clear" w:color="auto" w:fill="F2F2F2"/>
-      </w:pPr>
-      <w:sdt>
-        <w:sdtPr>
-          <w:alias w:val="082GEK2191669"/>
-          <w:id w:val="100083"/>
-          <w:showingPlcHdr/>
-          <w:text/>
-        </w:sdtPr>
-        <w:sdtContent>
-          <w:r>
-            <w:t>Click or tap here to enter text.</w:t>
-          </w:r>
-        </w:sdtContent>
-      </w:sdt>
-    </w:p>
-    <w:p>
-      <w:pPr>
-        <w:keepNext/>
-        <w:spacing w:before="200" w:after="40"/>
-      </w:pPr>
-      <w:r>
-        <w:rPr>
-          <w:rFonts w:ascii="Arial" w:hAnsi="Arial" w:cs="Arial" w:eastAsia="Arial"/>
-          <w:b/>
-          <w:i w:val="0"/>
-          <w:color w:val="000000"/>
-          <w:sz w:val="20"/>
-        </w:rPr>
-        <w:t xml:space="preserve">Management delegation – The information in Section 'GEJ – EMIR' must necessarily refer to the candidate company </w:t>
-      </w:r>
-      <w:r>
-        <w:rPr>
-          <w:rFonts w:ascii="Arial" w:hAnsi="Arial" w:cs="Arial" w:eastAsia="Arial"/>
-          <w:b/>
-          <w:i w:val="0"/>
-          <w:color w:val="1C355E"/>
-          <w:sz w:val="17"/>
-        </w:rPr>
-        <w:t>-082GEK2191670-</w:t>
-      </w:r>
-    </w:p>
-    <w:p>
-      <w:pPr>
-        <w:keepNext w:val="0"/>
-        <w:spacing w:before="40" w:after="120"/>
-        <w:shd w:val="clear" w:color="auto" w:fill="F2F2F2"/>
-      </w:pPr>
-      <w:sdt>
-        <w:sdtPr>
-          <w:alias w:val="082GEK2191670"/>
-          <w:id w:val="100084"/>
-          <w:showingPlcHdr/>
-          <w:text/>
-        </w:sdtPr>
-        <w:sdtContent>
-          <w:r>
-            <w:t>Click or tap here to enter text.</w:t>
-          </w:r>
-        </w:sdtContent>
-      </w:sdt>
-    </w:p>
-    <w:p>
-      <w:pPr>
-        <w:keepNext/>
-        <w:spacing w:before="200" w:after="40"/>
-      </w:pPr>
-      <w:r>
-        <w:rPr>
-          <w:rFonts w:ascii="Arial" w:hAnsi="Arial" w:cs="Arial" w:eastAsia="Arial"/>
-          <w:b/>
-          <w:i w:val="0"/>
-          <w:color w:val="000000"/>
-          <w:sz w:val="20"/>
-        </w:rPr>
-        <w:t xml:space="preserve">Management delegation – 'RFA – Asset class liquidity' – To whom do the financial results figures refer? </w:t>
-      </w:r>
-      <w:r>
-        <w:rPr>
-          <w:rFonts w:ascii="Arial" w:hAnsi="Arial" w:cs="Arial" w:eastAsia="Arial"/>
-          <w:b/>
-          <w:i w:val="0"/>
-          <w:color w:val="1C355E"/>
-          <w:sz w:val="17"/>
-        </w:rPr>
-        <w:t>-082GEK2191671-</w:t>
-      </w:r>
-    </w:p>
-    <w:p>
-      <w:pPr>
-        <w:keepNext w:val="0"/>
-        <w:spacing w:before="40" w:after="120"/>
-        <w:shd w:val="clear" w:color="auto" w:fill="F2F2F2"/>
-      </w:pPr>
-      <w:sdt>
-        <w:sdtPr>
-          <w:alias w:val="082GEK2191671"/>
-          <w:id w:val="100085"/>
-          <w:showingPlcHdr/>
-          <w:text/>
-        </w:sdtPr>
-        <w:sdtContent>
-          <w:r>
-            <w:t>Click or tap here to enter text.</w:t>
-          </w:r>
-        </w:sdtContent>
-      </w:sdt>
-    </w:p>
-    <w:p>
-      <w:pPr>
-        <w:keepNext/>
-        <w:spacing w:before="200" w:after="40"/>
-      </w:pPr>
-      <w:r>
-        <w:rPr>
-          <w:rFonts w:ascii="Arial" w:hAnsi="Arial" w:cs="Arial" w:eastAsia="Arial"/>
-          <w:b/>
-          <w:i w:val="0"/>
-          <w:color w:val="000000"/>
-          <w:sz w:val="20"/>
-        </w:rPr>
-        <w:t xml:space="preserve">Management delegation – 'RFC – Asset class Govt Euro All Maturities bonds' – To whom do the financial results figures refer? </w:t>
-      </w:r>
-      <w:r>
-        <w:rPr>
-          <w:rFonts w:ascii="Arial" w:hAnsi="Arial" w:cs="Arial" w:eastAsia="Arial"/>
-          <w:b/>
-          <w:i w:val="0"/>
-          <w:color w:val="1C355E"/>
-          <w:sz w:val="17"/>
-        </w:rPr>
-        <w:t>-082GEK2191815-</w:t>
-      </w:r>
-    </w:p>
-    <w:p>
-      <w:pPr>
-        <w:keepNext w:val="0"/>
-        <w:spacing w:before="40" w:after="120"/>
-        <w:shd w:val="clear" w:color="auto" w:fill="F2F2F2"/>
-      </w:pPr>
-      <w:sdt>
-        <w:sdtPr>
-          <w:alias w:val="082GEK2191815"/>
-          <w:id w:val="100086"/>
+        <w:t xml:space="preserve">Management delegation – 'GED – Investment process, asset class: bonds' – Notes </w:t>
+      </w:r>
+      <w:r>
+        <w:rPr>
+          <w:rFonts w:ascii="Arial" w:hAnsi="Arial" w:cs="Arial" w:eastAsia="Arial"/>
+          <w:b/>
+          <w:i w:val="0"/>
+          <w:color w:val="1C355E"/>
+          <w:sz w:val="17"/>
+        </w:rPr>
+        <w:t>-082GEK2191704-</w:t>
+      </w:r>
+    </w:p>
+    <w:p>
+      <w:pPr>
+        <w:keepNext w:val="0"/>
+        <w:spacing w:before="40" w:after="120"/>
+        <w:shd w:val="clear" w:color="auto" w:fill="F2F2F2"/>
+      </w:pPr>
+      <w:sdt>
+        <w:sdtPr>
+          <w:alias w:val="082GEK2191704"/>
+          <w:id w:val="100075"/>
+          <w:showingPlcHdr/>
+          <w:text/>
+        </w:sdtPr>
+        <w:sdtContent>
+          <w:r>
+            <w:t>Click or tap here to enter text.</w:t>
+          </w:r>
+        </w:sdtContent>
+      </w:sdt>
+    </w:p>
+    <w:p>
+      <w:pPr>
+        <w:keepNext/>
+        <w:spacing w:before="200" w:after="40"/>
+      </w:pPr>
+      <w:r>
+        <w:rPr>
+          <w:rFonts w:ascii="Arial" w:hAnsi="Arial" w:cs="Arial" w:eastAsia="Arial"/>
+          <w:b/>
+          <w:i w:val="0"/>
+          <w:color w:val="000000"/>
+          <w:sz w:val="20"/>
+        </w:rPr>
+        <w:t xml:space="preserve">Management delegation – 'GEE – Investment process, asset class: equities' – To which company does the information contained in this section refer? </w:t>
+      </w:r>
+      <w:r>
+        <w:rPr>
+          <w:rFonts w:ascii="Arial" w:hAnsi="Arial" w:cs="Arial" w:eastAsia="Arial"/>
+          <w:b/>
+          <w:i w:val="0"/>
+          <w:color w:val="1C355E"/>
+          <w:sz w:val="17"/>
+        </w:rPr>
+        <w:t>-082GEK2191700-</w:t>
+      </w:r>
+    </w:p>
+    <w:p>
+      <w:pPr>
+        <w:keepNext w:val="0"/>
+        <w:spacing w:before="40" w:after="120"/>
+        <w:shd w:val="clear" w:color="auto" w:fill="F2F2F2"/>
+      </w:pPr>
+      <w:sdt>
+        <w:sdtPr>
+          <w:alias w:val="082GEK2191700"/>
+          <w:id w:val="100076"/>
           <w:showingPlcHdr/>
           <w:dropDownList>
             <w:listItem w:displayText="Choose an item." w:value=""/>
@@ -5786,75 +5326,75 @@
           <w:color w:val="000000"/>
           <w:sz w:val="20"/>
         </w:rPr>
-        <w:t xml:space="preserve">Management delegation – 'RFL – Asset class Corporate Euro bonds' – To whom do the financial results figures refer? </w:t>
-      </w:r>
-      <w:r>
-        <w:rPr>
-          <w:rFonts w:ascii="Arial" w:hAnsi="Arial" w:cs="Arial" w:eastAsia="Arial"/>
-          <w:b/>
-          <w:i w:val="0"/>
-          <w:color w:val="1C355E"/>
-          <w:sz w:val="17"/>
-        </w:rPr>
-        <w:t>-082GEK2191710-</w:t>
-      </w:r>
-    </w:p>
-    <w:p>
-      <w:pPr>
-        <w:keepNext w:val="0"/>
-        <w:spacing w:before="40" w:after="120"/>
-        <w:shd w:val="clear" w:color="auto" w:fill="F2F2F2"/>
-      </w:pPr>
-      <w:sdt>
-        <w:sdtPr>
-          <w:alias w:val="082GEK2191710"/>
-          <w:id w:val="100087"/>
-          <w:showingPlcHdr/>
-          <w:text/>
-        </w:sdtPr>
-        <w:sdtContent>
-          <w:r>
-            <w:t>Click or tap here to enter text.</w:t>
-          </w:r>
-        </w:sdtContent>
-      </w:sdt>
-    </w:p>
-    <w:p>
-      <w:pPr>
-        <w:keepNext/>
-        <w:spacing w:before="200" w:after="40"/>
-      </w:pPr>
-      <w:r>
-        <w:rPr>
-          <w:rFonts w:ascii="Arial" w:hAnsi="Arial" w:cs="Arial" w:eastAsia="Arial"/>
-          <w:b/>
-          <w:i w:val="0"/>
-          <w:color w:val="000000"/>
-          <w:sz w:val="20"/>
-        </w:rPr>
-        <w:t xml:space="preserve">Management delegation – 'RFN – Asset class Corporate HY bonds' – To whom do the financial results figures refer? </w:t>
-      </w:r>
-      <w:r>
-        <w:rPr>
-          <w:rFonts w:ascii="Arial" w:hAnsi="Arial" w:cs="Arial" w:eastAsia="Arial"/>
-          <w:b/>
-          <w:i w:val="0"/>
-          <w:color w:val="1C355E"/>
-          <w:sz w:val="17"/>
-        </w:rPr>
-        <w:t>-082GEK2191711-</w:t>
-      </w:r>
-    </w:p>
-    <w:p>
-      <w:pPr>
-        <w:keepNext w:val="0"/>
-        <w:spacing w:before="40" w:after="120"/>
-        <w:shd w:val="clear" w:color="auto" w:fill="F2F2F2"/>
-      </w:pPr>
-      <w:sdt>
-        <w:sdtPr>
-          <w:alias w:val="082GEK2191711"/>
-          <w:id w:val="100088"/>
+        <w:t xml:space="preserve">Management delegation – 'GEE – Investment process, asset class: equities' – Notes </w:t>
+      </w:r>
+      <w:r>
+        <w:rPr>
+          <w:rFonts w:ascii="Arial" w:hAnsi="Arial" w:cs="Arial" w:eastAsia="Arial"/>
+          <w:b/>
+          <w:i w:val="0"/>
+          <w:color w:val="1C355E"/>
+          <w:sz w:val="17"/>
+        </w:rPr>
+        <w:t>-082GEK2191705-</w:t>
+      </w:r>
+    </w:p>
+    <w:p>
+      <w:pPr>
+        <w:keepNext w:val="0"/>
+        <w:spacing w:before="40" w:after="120"/>
+        <w:shd w:val="clear" w:color="auto" w:fill="F2F2F2"/>
+      </w:pPr>
+      <w:sdt>
+        <w:sdtPr>
+          <w:alias w:val="082GEK2191705"/>
+          <w:id w:val="100077"/>
+          <w:showingPlcHdr/>
+          <w:text/>
+        </w:sdtPr>
+        <w:sdtContent>
+          <w:r>
+            <w:t>Click or tap here to enter text.</w:t>
+          </w:r>
+        </w:sdtContent>
+      </w:sdt>
+    </w:p>
+    <w:p>
+      <w:pPr>
+        <w:keepNext/>
+        <w:spacing w:before="200" w:after="40"/>
+      </w:pPr>
+      <w:r>
+        <w:rPr>
+          <w:rFonts w:ascii="Arial" w:hAnsi="Arial" w:cs="Arial" w:eastAsia="Arial"/>
+          <w:b/>
+          <w:i w:val="0"/>
+          <w:color w:val="000000"/>
+          <w:sz w:val="20"/>
+        </w:rPr>
+        <w:t xml:space="preserve">Management delegation – 'GEF – Execution of the investment process' – To which company does the information contained in this section refer? </w:t>
+      </w:r>
+      <w:r>
+        <w:rPr>
+          <w:rFonts w:ascii="Arial" w:hAnsi="Arial" w:cs="Arial" w:eastAsia="Arial"/>
+          <w:b/>
+          <w:i w:val="0"/>
+          <w:color w:val="1C355E"/>
+          <w:sz w:val="17"/>
+        </w:rPr>
+        <w:t>-082GEK2191701-</w:t>
+      </w:r>
+    </w:p>
+    <w:p>
+      <w:pPr>
+        <w:keepNext w:val="0"/>
+        <w:spacing w:before="40" w:after="120"/>
+        <w:shd w:val="clear" w:color="auto" w:fill="F2F2F2"/>
+      </w:pPr>
+      <w:sdt>
+        <w:sdtPr>
+          <w:alias w:val="082GEK2191701"/>
+          <w:id w:val="100078"/>
           <w:showingPlcHdr/>
           <w:dropDownList>
             <w:listItem w:displayText="Choose an item." w:value=""/>
@@ -5882,6 +5422,478 @@
           <w:color w:val="000000"/>
           <w:sz w:val="20"/>
         </w:rPr>
+        <w:t xml:space="preserve">Management delegation – 'GEF – Execution of the investment process' – Notes </w:t>
+      </w:r>
+      <w:r>
+        <w:rPr>
+          <w:rFonts w:ascii="Arial" w:hAnsi="Arial" w:cs="Arial" w:eastAsia="Arial"/>
+          <w:b/>
+          <w:i w:val="0"/>
+          <w:color w:val="1C355E"/>
+          <w:sz w:val="17"/>
+        </w:rPr>
+        <w:t>-082GEK2191706-</w:t>
+      </w:r>
+    </w:p>
+    <w:p>
+      <w:pPr>
+        <w:keepNext w:val="0"/>
+        <w:spacing w:before="40" w:after="120"/>
+        <w:shd w:val="clear" w:color="auto" w:fill="F2F2F2"/>
+      </w:pPr>
+      <w:sdt>
+        <w:sdtPr>
+          <w:alias w:val="082GEK2191706"/>
+          <w:id w:val="100079"/>
+          <w:showingPlcHdr/>
+          <w:text/>
+        </w:sdtPr>
+        <w:sdtContent>
+          <w:r>
+            <w:t>Click or tap here to enter text.</w:t>
+          </w:r>
+        </w:sdtContent>
+      </w:sdt>
+    </w:p>
+    <w:p>
+      <w:pPr>
+        <w:keepNext/>
+        <w:spacing w:before="200" w:after="40"/>
+      </w:pPr>
+      <w:r>
+        <w:rPr>
+          <w:rFonts w:ascii="Arial" w:hAnsi="Arial" w:cs="Arial" w:eastAsia="Arial"/>
+          <w:b/>
+          <w:i w:val="0"/>
+          <w:color w:val="000000"/>
+          <w:sz w:val="20"/>
+        </w:rPr>
+        <w:t xml:space="preserve">Management delegation – 'GEG – Socially responsible investments' – To which company does the information contained in this section refer? </w:t>
+      </w:r>
+      <w:r>
+        <w:rPr>
+          <w:rFonts w:ascii="Arial" w:hAnsi="Arial" w:cs="Arial" w:eastAsia="Arial"/>
+          <w:b/>
+          <w:i w:val="0"/>
+          <w:color w:val="1C355E"/>
+          <w:sz w:val="17"/>
+        </w:rPr>
+        <w:t>-082GEK2191703-</w:t>
+      </w:r>
+    </w:p>
+    <w:p>
+      <w:pPr>
+        <w:keepNext w:val="0"/>
+        <w:spacing w:before="40" w:after="120"/>
+        <w:shd w:val="clear" w:color="auto" w:fill="F2F2F2"/>
+      </w:pPr>
+      <w:sdt>
+        <w:sdtPr>
+          <w:alias w:val="082GEK2191703"/>
+          <w:id w:val="100080"/>
+          <w:showingPlcHdr/>
+          <w:dropDownList>
+            <w:listItem w:displayText="Choose an item." w:value=""/>
+            <w:listItem w:displayText="Candidate company" w:value="Candidate company"/>
+            <w:listItem w:displayText="Delegated company" w:value="Delegated company"/>
+          </w:dropDownList>
+        </w:sdtPr>
+        <w:sdtContent>
+          <w:r>
+            <w:t>Choose an item.</w:t>
+          </w:r>
+        </w:sdtContent>
+      </w:sdt>
+    </w:p>
+    <w:p>
+      <w:pPr>
+        <w:keepNext/>
+        <w:spacing w:before="200" w:after="40"/>
+      </w:pPr>
+      <w:r>
+        <w:rPr>
+          <w:rFonts w:ascii="Arial" w:hAnsi="Arial" w:cs="Arial" w:eastAsia="Arial"/>
+          <w:b/>
+          <w:i w:val="0"/>
+          <w:color w:val="000000"/>
+          <w:sz w:val="20"/>
+        </w:rPr>
+        <w:t xml:space="preserve">Management delegation – 'GEG – Socially responsible investments' – Notes </w:t>
+      </w:r>
+      <w:r>
+        <w:rPr>
+          <w:rFonts w:ascii="Arial" w:hAnsi="Arial" w:cs="Arial" w:eastAsia="Arial"/>
+          <w:b/>
+          <w:i w:val="0"/>
+          <w:color w:val="1C355E"/>
+          <w:sz w:val="17"/>
+        </w:rPr>
+        <w:t>-082GEK2191707-</w:t>
+      </w:r>
+    </w:p>
+    <w:p>
+      <w:pPr>
+        <w:keepNext w:val="0"/>
+        <w:spacing w:before="40" w:after="120"/>
+        <w:shd w:val="clear" w:color="auto" w:fill="F2F2F2"/>
+      </w:pPr>
+      <w:sdt>
+        <w:sdtPr>
+          <w:alias w:val="082GEK2191707"/>
+          <w:id w:val="100081"/>
+          <w:showingPlcHdr/>
+          <w:text/>
+        </w:sdtPr>
+        <w:sdtContent>
+          <w:r>
+            <w:t>Click or tap here to enter text.</w:t>
+          </w:r>
+        </w:sdtContent>
+      </w:sdt>
+    </w:p>
+    <w:p>
+      <w:pPr>
+        <w:keepNext/>
+        <w:spacing w:before="200" w:after="40"/>
+      </w:pPr>
+      <w:r>
+        <w:rPr>
+          <w:rFonts w:ascii="Arial" w:hAnsi="Arial" w:cs="Arial" w:eastAsia="Arial"/>
+          <w:b/>
+          <w:i w:val="0"/>
+          <w:color w:val="000000"/>
+          <w:sz w:val="20"/>
+        </w:rPr>
+        <w:t xml:space="preserve">Management delegation – The information in Section 'GEH – Management of conflicts of interest' must necessarily refer to the candidate company </w:t>
+      </w:r>
+      <w:r>
+        <w:rPr>
+          <w:rFonts w:ascii="Arial" w:hAnsi="Arial" w:cs="Arial" w:eastAsia="Arial"/>
+          <w:b/>
+          <w:i w:val="0"/>
+          <w:color w:val="1C355E"/>
+          <w:sz w:val="17"/>
+        </w:rPr>
+        <w:t>-082GEK2191668-</w:t>
+      </w:r>
+    </w:p>
+    <w:p>
+      <w:pPr>
+        <w:keepNext w:val="0"/>
+        <w:spacing w:before="40" w:after="120"/>
+        <w:shd w:val="clear" w:color="auto" w:fill="F2F2F2"/>
+      </w:pPr>
+      <w:sdt>
+        <w:sdtPr>
+          <w:alias w:val="082GEK2191668"/>
+          <w:id w:val="100082"/>
+          <w:showingPlcHdr/>
+          <w:text/>
+        </w:sdtPr>
+        <w:sdtContent>
+          <w:r>
+            <w:t>Click or tap here to enter text.</w:t>
+          </w:r>
+        </w:sdtContent>
+      </w:sdt>
+    </w:p>
+    <w:p>
+      <w:pPr>
+        <w:keepNext/>
+        <w:spacing w:before="200" w:after="40"/>
+      </w:pPr>
+      <w:r>
+        <w:rPr>
+          <w:rFonts w:ascii="Arial" w:hAnsi="Arial" w:cs="Arial" w:eastAsia="Arial"/>
+          <w:b/>
+          <w:i w:val="0"/>
+          <w:color w:val="000000"/>
+          <w:sz w:val="20"/>
+        </w:rPr>
+        <w:t xml:space="preserve">Management delegation – The information in Section 'GEI – Reporting and investor relations' must necessarily refer to the candidate company </w:t>
+      </w:r>
+      <w:r>
+        <w:rPr>
+          <w:rFonts w:ascii="Arial" w:hAnsi="Arial" w:cs="Arial" w:eastAsia="Arial"/>
+          <w:b/>
+          <w:i w:val="0"/>
+          <w:color w:val="1C355E"/>
+          <w:sz w:val="17"/>
+        </w:rPr>
+        <w:t>-082GEK2191669-</w:t>
+      </w:r>
+    </w:p>
+    <w:p>
+      <w:pPr>
+        <w:keepNext w:val="0"/>
+        <w:spacing w:before="40" w:after="120"/>
+        <w:shd w:val="clear" w:color="auto" w:fill="F2F2F2"/>
+      </w:pPr>
+      <w:sdt>
+        <w:sdtPr>
+          <w:alias w:val="082GEK2191669"/>
+          <w:id w:val="100083"/>
+          <w:showingPlcHdr/>
+          <w:text/>
+        </w:sdtPr>
+        <w:sdtContent>
+          <w:r>
+            <w:t>Click or tap here to enter text.</w:t>
+          </w:r>
+        </w:sdtContent>
+      </w:sdt>
+    </w:p>
+    <w:p>
+      <w:pPr>
+        <w:keepNext/>
+        <w:spacing w:before="200" w:after="40"/>
+      </w:pPr>
+      <w:r>
+        <w:rPr>
+          <w:rFonts w:ascii="Arial" w:hAnsi="Arial" w:cs="Arial" w:eastAsia="Arial"/>
+          <w:b/>
+          <w:i w:val="0"/>
+          <w:color w:val="000000"/>
+          <w:sz w:val="20"/>
+        </w:rPr>
+        <w:t xml:space="preserve">Management delegation – The information in Section 'GEJ – EMIR' must necessarily refer to the candidate company </w:t>
+      </w:r>
+      <w:r>
+        <w:rPr>
+          <w:rFonts w:ascii="Arial" w:hAnsi="Arial" w:cs="Arial" w:eastAsia="Arial"/>
+          <w:b/>
+          <w:i w:val="0"/>
+          <w:color w:val="1C355E"/>
+          <w:sz w:val="17"/>
+        </w:rPr>
+        <w:t>-082GEK2191670-</w:t>
+      </w:r>
+    </w:p>
+    <w:p>
+      <w:pPr>
+        <w:keepNext w:val="0"/>
+        <w:spacing w:before="40" w:after="120"/>
+        <w:shd w:val="clear" w:color="auto" w:fill="F2F2F2"/>
+      </w:pPr>
+      <w:sdt>
+        <w:sdtPr>
+          <w:alias w:val="082GEK2191670"/>
+          <w:id w:val="100084"/>
+          <w:showingPlcHdr/>
+          <w:text/>
+        </w:sdtPr>
+        <w:sdtContent>
+          <w:r>
+            <w:t>Click or tap here to enter text.</w:t>
+          </w:r>
+        </w:sdtContent>
+      </w:sdt>
+    </w:p>
+    <w:p>
+      <w:pPr>
+        <w:keepNext/>
+        <w:spacing w:before="200" w:after="40"/>
+      </w:pPr>
+      <w:r>
+        <w:rPr>
+          <w:rFonts w:ascii="Arial" w:hAnsi="Arial" w:cs="Arial" w:eastAsia="Arial"/>
+          <w:b/>
+          <w:i w:val="0"/>
+          <w:color w:val="000000"/>
+          <w:sz w:val="20"/>
+        </w:rPr>
+        <w:t xml:space="preserve">Management delegation – 'RFA – Asset class liquidity' – To whom do the financial results figures refer? </w:t>
+      </w:r>
+      <w:r>
+        <w:rPr>
+          <w:rFonts w:ascii="Arial" w:hAnsi="Arial" w:cs="Arial" w:eastAsia="Arial"/>
+          <w:b/>
+          <w:i w:val="0"/>
+          <w:color w:val="1C355E"/>
+          <w:sz w:val="17"/>
+        </w:rPr>
+        <w:t>-082GEK2191671-</w:t>
+      </w:r>
+    </w:p>
+    <w:p>
+      <w:pPr>
+        <w:keepNext w:val="0"/>
+        <w:spacing w:before="40" w:after="120"/>
+        <w:shd w:val="clear" w:color="auto" w:fill="F2F2F2"/>
+      </w:pPr>
+      <w:sdt>
+        <w:sdtPr>
+          <w:alias w:val="082GEK2191671"/>
+          <w:id w:val="100085"/>
+          <w:showingPlcHdr/>
+          <w:text/>
+        </w:sdtPr>
+        <w:sdtContent>
+          <w:r>
+            <w:t>Click or tap here to enter text.</w:t>
+          </w:r>
+        </w:sdtContent>
+      </w:sdt>
+    </w:p>
+    <w:p>
+      <w:pPr>
+        <w:keepNext/>
+        <w:spacing w:before="200" w:after="40"/>
+      </w:pPr>
+      <w:r>
+        <w:rPr>
+          <w:rFonts w:ascii="Arial" w:hAnsi="Arial" w:cs="Arial" w:eastAsia="Arial"/>
+          <w:b/>
+          <w:i w:val="0"/>
+          <w:color w:val="000000"/>
+          <w:sz w:val="20"/>
+        </w:rPr>
+        <w:t xml:space="preserve">Management delegation – 'RFC – Asset class Govt Euro All Maturities bonds' – To whom do the financial results figures refer? </w:t>
+      </w:r>
+      <w:r>
+        <w:rPr>
+          <w:rFonts w:ascii="Arial" w:hAnsi="Arial" w:cs="Arial" w:eastAsia="Arial"/>
+          <w:b/>
+          <w:i w:val="0"/>
+          <w:color w:val="1C355E"/>
+          <w:sz w:val="17"/>
+        </w:rPr>
+        <w:t>-082GEK2191815-</w:t>
+      </w:r>
+    </w:p>
+    <w:p>
+      <w:pPr>
+        <w:keepNext w:val="0"/>
+        <w:spacing w:before="40" w:after="120"/>
+        <w:shd w:val="clear" w:color="auto" w:fill="F2F2F2"/>
+      </w:pPr>
+      <w:sdt>
+        <w:sdtPr>
+          <w:alias w:val="082GEK2191815"/>
+          <w:id w:val="100086"/>
+          <w:showingPlcHdr/>
+          <w:dropDownList>
+            <w:listItem w:displayText="Choose an item." w:value=""/>
+            <w:listItem w:displayText="Candidate company" w:value="Candidate company"/>
+            <w:listItem w:displayText="Delegated company" w:value="Delegated company"/>
+          </w:dropDownList>
+        </w:sdtPr>
+        <w:sdtContent>
+          <w:r>
+            <w:t>Choose an item.</w:t>
+          </w:r>
+        </w:sdtContent>
+      </w:sdt>
+    </w:p>
+    <w:p>
+      <w:pPr>
+        <w:keepNext/>
+        <w:spacing w:before="200" w:after="40"/>
+      </w:pPr>
+      <w:r>
+        <w:rPr>
+          <w:rFonts w:ascii="Arial" w:hAnsi="Arial" w:cs="Arial" w:eastAsia="Arial"/>
+          <w:b/>
+          <w:i w:val="0"/>
+          <w:color w:val="000000"/>
+          <w:sz w:val="20"/>
+        </w:rPr>
+        <w:t xml:space="preserve">Management delegation – 'RFL – Asset class Corporate Euro bonds' – To whom do the financial results figures refer? </w:t>
+      </w:r>
+      <w:r>
+        <w:rPr>
+          <w:rFonts w:ascii="Arial" w:hAnsi="Arial" w:cs="Arial" w:eastAsia="Arial"/>
+          <w:b/>
+          <w:i w:val="0"/>
+          <w:color w:val="1C355E"/>
+          <w:sz w:val="17"/>
+        </w:rPr>
+        <w:t>-082GEK2191710-</w:t>
+      </w:r>
+    </w:p>
+    <w:p>
+      <w:pPr>
+        <w:keepNext w:val="0"/>
+        <w:spacing w:before="40" w:after="120"/>
+        <w:shd w:val="clear" w:color="auto" w:fill="F2F2F2"/>
+      </w:pPr>
+      <w:sdt>
+        <w:sdtPr>
+          <w:alias w:val="082GEK2191710"/>
+          <w:id w:val="100087"/>
+          <w:showingPlcHdr/>
+          <w:text/>
+        </w:sdtPr>
+        <w:sdtContent>
+          <w:r>
+            <w:t>Click or tap here to enter text.</w:t>
+          </w:r>
+        </w:sdtContent>
+      </w:sdt>
+    </w:p>
+    <w:p>
+      <w:pPr>
+        <w:keepNext/>
+        <w:spacing w:before="200" w:after="40"/>
+      </w:pPr>
+      <w:r>
+        <w:rPr>
+          <w:rFonts w:ascii="Arial" w:hAnsi="Arial" w:cs="Arial" w:eastAsia="Arial"/>
+          <w:b/>
+          <w:i w:val="0"/>
+          <w:color w:val="000000"/>
+          <w:sz w:val="20"/>
+        </w:rPr>
+        <w:t xml:space="preserve">Management delegation – 'RFN – Asset class Corporate HY bonds' – To whom do the financial results figures refer? </w:t>
+      </w:r>
+      <w:r>
+        <w:rPr>
+          <w:rFonts w:ascii="Arial" w:hAnsi="Arial" w:cs="Arial" w:eastAsia="Arial"/>
+          <w:b/>
+          <w:i w:val="0"/>
+          <w:color w:val="1C355E"/>
+          <w:sz w:val="17"/>
+        </w:rPr>
+        <w:t>-082GEK2191711-</w:t>
+      </w:r>
+    </w:p>
+    <w:p>
+      <w:pPr>
+        <w:keepNext w:val="0"/>
+        <w:spacing w:before="40" w:after="120"/>
+        <w:shd w:val="clear" w:color="auto" w:fill="F2F2F2"/>
+      </w:pPr>
+      <w:sdt>
+        <w:sdtPr>
+          <w:alias w:val="082GEK2191711"/>
+          <w:id w:val="100088"/>
+          <w:showingPlcHdr/>
+          <w:dropDownList>
+            <w:listItem w:displayText="Choose an item." w:value=""/>
+            <w:listItem w:displayText="Candidate company" w:value="Candidate company"/>
+            <w:listItem w:displayText="Delegated company" w:value="Delegated company"/>
+          </w:dropDownList>
+        </w:sdtPr>
+        <w:sdtContent>
+          <w:r>
+            <w:t>Choose an item.</w:t>
+          </w:r>
+        </w:sdtContent>
+      </w:sdt>
+    </w:p>
+    <w:p>
+      <w:pPr>
+        <w:keepNext/>
+        <w:spacing w:before="200" w:after="40"/>
+      </w:pPr>
+      <w:r>
+        <w:rPr>
+          <w:rFonts w:ascii="Arial" w:hAnsi="Arial" w:cs="Arial" w:eastAsia="Arial"/>
+          <w:b/>
+          <w:i w:val="0"/>
+          <w:color w:val="000000"/>
+          <w:sz w:val="20"/>
+        </w:rPr>
         <w:t xml:space="preserve">Management delegation – 'RFO – Asset class Euro area equities' – To whom do the financial results figures refer? </w:t>
       </w:r>
       <w:r>
@@ -5998,11 +6010,15 @@
           <w:alias w:val="082GEK2192452"/>
           <w:id w:val="100091"/>
           <w:showingPlcHdr/>
-          <w:text/>
-        </w:sdtPr>
-        <w:sdtContent>
-          <w:r>
-            <w:t>Click or tap here to enter text.</w:t>
+          <w:dropDownList>
+            <w:listItem w:displayText="Choose an item." w:value=""/>
+            <w:listItem w:displayText="Candidate company" w:value="Candidate company"/>
+            <w:listItem w:displayText="Delegated company" w:value="Delegated company"/>
+          </w:dropDownList>
+        </w:sdtPr>
+        <w:sdtContent>
+          <w:r>
+            <w:t>Choose an item.</w:t>
           </w:r>
         </w:sdtContent>
       </w:sdt>
@@ -6060,11 +6076,15 @@
           <w:alias w:val="082GEK2281720"/>
           <w:id w:val="100092"/>
           <w:showingPlcHdr/>
-          <w:text/>
-        </w:sdtPr>
-        <w:sdtContent>
-          <w:r>
-            <w:t>Click or tap here to enter text.</w:t>
+          <w:dropDownList>
+            <w:listItem w:displayText="Choose an item." w:value=""/>
+            <w:listItem w:displayText="A total delegation mandate" w:value="A total delegation mandate"/>
+            <w:listItem w:displayText="A delegation mandate for particular assets or markets" w:value="A delegation mandate for particular assets or markets"/>
+          </w:dropDownList>
+        </w:sdtPr>
+        <w:sdtContent>
+          <w:r>
+            <w:t>Choose an item.</w:t>
           </w:r>
         </w:sdtContent>
       </w:sdt>
@@ -6846,11 +6866,15 @@
           <w:alias w:val="082GEK2281737"/>
           <w:id w:val="100109"/>
           <w:showingPlcHdr/>
-          <w:text/>
-        </w:sdtPr>
-        <w:sdtContent>
-          <w:r>
-            <w:t>Click or tap here to enter text.</w:t>
+          <w:dropDownList>
+            <w:listItem w:displayText="Choose an item." w:value=""/>
+            <w:listItem w:displayText="The activity remains with the delegating candidate company" w:value="The activity remains with the delegating candidate company"/>
+            <w:listItem w:displayText="The activity is assigned to the delegated company" w:value="The activity is assigned to the delegated company"/>
+          </w:dropDownList>
+        </w:sdtPr>
+        <w:sdtContent>
+          <w:r>
+            <w:t>Choose an item.</w:t>
           </w:r>
         </w:sdtContent>
       </w:sdt>
@@ -32238,11 +32262,15 @@
           <w:alias w:val="082RFC1291387"/>
           <w:id w:val="100546"/>
           <w:showingPlcHdr/>
-          <w:text/>
-        </w:sdtPr>
-        <w:sdtContent>
-          <w:r>
-            <w:t>Click or tap here to enter text.</w:t>
+          <w:dropDownList>
+            <w:listItem w:displayText="Choose an item." w:value=""/>
+            <w:listItem w:displayText="Yes" w:value="Yes"/>
+            <w:listItem w:displayText="No" w:value="No"/>
+          </w:dropDownList>
+        </w:sdtPr>
+        <w:sdtContent>
+          <w:r>
+            <w:t>Choose an item.</w:t>
           </w:r>
         </w:sdtContent>
       </w:sdt>
@@ -34205,11 +34233,15 @@
           <w:alias w:val="082RFL1471398"/>
           <w:id w:val="100577"/>
           <w:showingPlcHdr/>
-          <w:text/>
-        </w:sdtPr>
-        <w:sdtContent>
-          <w:r>
-            <w:t>Click or tap here to enter text.</w:t>
+          <w:dropDownList>
+            <w:listItem w:displayText="Choose an item." w:value=""/>
+            <w:listItem w:displayText="Yes" w:value="Yes"/>
+            <w:listItem w:displayText="No" w:value="No"/>
+          </w:dropDownList>
+        </w:sdtPr>
+        <w:sdtContent>
+          <w:r>
+            <w:t>Choose an item.</w:t>
           </w:r>
         </w:sdtContent>
       </w:sdt>

</xml_diff>

<commit_message>
Set candidate/delegated company list for GEK 2191710 and 2191712
Confirmed from the V2 review: these two management delegation questions
use the Candidate company / Delegated company list. Other fields that were
reviewed (2191705, 2281734, 1101127, 1101129, RB1 weight 3028) stay as text.

Dropdowns: 207 -> 209; questions: 767; existing options unchanged.

Claude-Session: https://claude.ai/code/session_01Kh4RWNEbM9iRNhAaBfutke
</commit_message>
<xml_diff>
--- a/Questionnaire_Teatro_alla_Scala_EN.docx
+++ b/Questionnaire_Teatro_alla_Scala_EN.docx
@@ -5822,52 +5822,6 @@
           <w:alias w:val="082GEK2191710"/>
           <w:id w:val="100087"/>
           <w:showingPlcHdr/>
-          <w:text/>
-        </w:sdtPr>
-        <w:sdtContent>
-          <w:r>
-            <w:t>Click or tap here to enter text.</w:t>
-          </w:r>
-        </w:sdtContent>
-      </w:sdt>
-    </w:p>
-    <w:p>
-      <w:pPr>
-        <w:keepNext/>
-        <w:spacing w:before="200" w:after="40"/>
-      </w:pPr>
-      <w:r>
-        <w:rPr>
-          <w:rFonts w:ascii="Arial" w:hAnsi="Arial" w:cs="Arial" w:eastAsia="Arial"/>
-          <w:b/>
-          <w:i w:val="0"/>
-          <w:color w:val="000000"/>
-          <w:sz w:val="20"/>
-        </w:rPr>
-        <w:t xml:space="preserve">Management delegation – 'RFN – Asset class Corporate HY bonds' – To whom do the financial results figures refer? </w:t>
-      </w:r>
-      <w:r>
-        <w:rPr>
-          <w:rFonts w:ascii="Arial" w:hAnsi="Arial" w:cs="Arial" w:eastAsia="Arial"/>
-          <w:b/>
-          <w:i w:val="0"/>
-          <w:color w:val="1C355E"/>
-          <w:sz w:val="17"/>
-        </w:rPr>
-        <w:t>-082GEK2191711-</w:t>
-      </w:r>
-    </w:p>
-    <w:p>
-      <w:pPr>
-        <w:keepNext w:val="0"/>
-        <w:spacing w:before="40" w:after="120"/>
-        <w:shd w:val="clear" w:color="auto" w:fill="F2F2F2"/>
-      </w:pPr>
-      <w:sdt>
-        <w:sdtPr>
-          <w:alias w:val="082GEK2191711"/>
-          <w:id w:val="100088"/>
-          <w:showingPlcHdr/>
           <w:dropDownList>
             <w:listItem w:displayText="Choose an item." w:value=""/>
             <w:listItem w:displayText="Candidate company" w:value="Candidate company"/>
@@ -5894,6 +5848,56 @@
           <w:color w:val="000000"/>
           <w:sz w:val="20"/>
         </w:rPr>
+        <w:t xml:space="preserve">Management delegation – 'RFN – Asset class Corporate HY bonds' – To whom do the financial results figures refer? </w:t>
+      </w:r>
+      <w:r>
+        <w:rPr>
+          <w:rFonts w:ascii="Arial" w:hAnsi="Arial" w:cs="Arial" w:eastAsia="Arial"/>
+          <w:b/>
+          <w:i w:val="0"/>
+          <w:color w:val="1C355E"/>
+          <w:sz w:val="17"/>
+        </w:rPr>
+        <w:t>-082GEK2191711-</w:t>
+      </w:r>
+    </w:p>
+    <w:p>
+      <w:pPr>
+        <w:keepNext w:val="0"/>
+        <w:spacing w:before="40" w:after="120"/>
+        <w:shd w:val="clear" w:color="auto" w:fill="F2F2F2"/>
+      </w:pPr>
+      <w:sdt>
+        <w:sdtPr>
+          <w:alias w:val="082GEK2191711"/>
+          <w:id w:val="100088"/>
+          <w:showingPlcHdr/>
+          <w:dropDownList>
+            <w:listItem w:displayText="Choose an item." w:value=""/>
+            <w:listItem w:displayText="Candidate company" w:value="Candidate company"/>
+            <w:listItem w:displayText="Delegated company" w:value="Delegated company"/>
+          </w:dropDownList>
+        </w:sdtPr>
+        <w:sdtContent>
+          <w:r>
+            <w:t>Choose an item.</w:t>
+          </w:r>
+        </w:sdtContent>
+      </w:sdt>
+    </w:p>
+    <w:p>
+      <w:pPr>
+        <w:keepNext/>
+        <w:spacing w:before="200" w:after="40"/>
+      </w:pPr>
+      <w:r>
+        <w:rPr>
+          <w:rFonts w:ascii="Arial" w:hAnsi="Arial" w:cs="Arial" w:eastAsia="Arial"/>
+          <w:b/>
+          <w:i w:val="0"/>
+          <w:color w:val="000000"/>
+          <w:sz w:val="20"/>
+        </w:rPr>
         <w:t xml:space="preserve">Management delegation – 'RFO – Asset class Euro area equities' – To whom do the financial results figures refer? </w:t>
       </w:r>
       <w:r>
@@ -5964,11 +5968,15 @@
           <w:alias w:val="082GEK2191712"/>
           <w:id w:val="100090"/>
           <w:showingPlcHdr/>
-          <w:text/>
-        </w:sdtPr>
-        <w:sdtContent>
-          <w:r>
-            <w:t>Click or tap here to enter text.</w:t>
+          <w:dropDownList>
+            <w:listItem w:displayText="Choose an item." w:value=""/>
+            <w:listItem w:displayText="Candidate company" w:value="Candidate company"/>
+            <w:listItem w:displayText="Delegated company" w:value="Delegated company"/>
+          </w:dropDownList>
+        </w:sdtPr>
+        <w:sdtContent>
+          <w:r>
+            <w:t>Choose an item.</w:t>
           </w:r>
         </w:sdtContent>
       </w:sdt>

</xml_diff>